<commit_message>
feat: add Bab II subbab II.1 and rebuild docx with II.1 and II.3
Draft II.1 (Dokumentasi Klinis dan Klaim JKN) from four sources, with a
claim-to-page verification table and review notes. Rebuild the Utama-template
docx with II.1 and II.3 (II.2 placeholder), save the docx build and page
verification scripts under tools/, and update CONTEXT_TRANSFER.md.

Co-Authored-By: Claude Sonnet 5.5 <noreply@anthropic.com>
Claude-Session: https://claude.ai/code/session_014py9jkTgHZJ9tfrTkQ4xwY
</commit_message>
<xml_diff>
--- a/bab2/Proposal-IF4091-Capstone-Utama-2026_Draft-Bab2.docx
+++ b/bab2/Proposal-IF4091-Capstone-Utama-2026_Draft-Bab2.docx
@@ -4166,10 +4166,100 @@
       </w:pPr>
       <w:r>
         <w:rPr>
-          <w:highlight w:val="yellow"/>
-          <w:lang w:val="id-ID"/>
-        </w:rPr>
-        <w:t xml:space="preserve">[SUBBAB BELUM DITULIS. Judul ini usulan dan belum dikonfirmasi.]</w:t>
+          <w:lang w:val="id-ID"/>
+        </w:rPr>
+        <w:t xml:space="preserve">Dalam Jaminan Kesehatan Nasional (JKN), BPJS Kesehatan menangani pendaftaran peserta, pengumpulan iuran, kontrak dengan penyedia layanan, dan pemrosesan klaim. Rumah sakit dibayar per kasus menurut tarif </w:t>
+      </w:r>
+      <w:r>
+        <w:rPr>
+          <w:i/>
+          <w:lang w:val="id-ID"/>
+        </w:rPr>
+        <w:t xml:space="preserve">Indonesian Case Base Groups</w:t>
+      </w:r>
+      <w:r>
+        <w:rPr>
+          <w:lang w:val="id-ID"/>
+        </w:rPr>
+        <w:t xml:space="preserve"> (INA-CBG) untuk rawat inap maupun rawat jalan (Susilo dkk., 2025, hlm. 2), dan pembayaran prospektif berbasis INA-CBG itu berlaku sejak 2014 (Rachmawaty dkk., 2021, hlm. S613). Klaim diajukan setelah pasien selesai dirawat, lalu diverifikasi pada aspek administrasi kepesertaan, administrasi pelayanan, dan pelayanan kesehatan. Berkas pendukungnya mencakup surat eligibilitas peserta (SEP) dan resume medis yang memuat diagnosis awal serta diagnosis akhir, yang ditulis dan ditetapkan oleh dokter yang bertanggung jawab (Simbolon &amp; Gani, 2023, hlm. 72–73). Salah satu informan pada penelitian kualitatif Susilo dkk. (2025, hlm. 6) menyebut klaim </w:t>
+      </w:r>
+      <w:r>
+        <w:rPr>
+          <w:i/>
+          <w:lang w:val="id-ID"/>
+        </w:rPr>
+        <w:t xml:space="preserve">pending</w:t>
+      </w:r>
+      <w:r>
+        <w:rPr>
+          <w:lang w:val="id-ID"/>
+        </w:rPr>
+        <w:t xml:space="preserve">, perbedaan prosedur administrasi antarcabang BPJS, dan tinjauan klaim retrospektif sebagai gangguan terhadap pembiayaan rumah sakit.</w:t>
+      </w:r>
+    </w:p>
+    <w:p>
+      <w:pPr>
+        <w:rPr>
+          <w:lang w:val="id-ID"/>
+        </w:rPr>
+      </w:pPr>
+      <w:r>
+        <w:rPr>
+          <w:lang w:val="id-ID"/>
+        </w:rPr>
+        <w:t xml:space="preserve">Simbolon dan Gani (2023) merangkum lima artikel tahun 2020–2022 tentang penyebab klaim rawat inap yang </w:t>
+      </w:r>
+      <w:r>
+        <w:rPr>
+          <w:i/>
+          <w:lang w:val="id-ID"/>
+        </w:rPr>
+        <w:t xml:space="preserve">pending</w:t>
+      </w:r>
+      <w:r>
+        <w:rPr>
+          <w:lang w:val="id-ID"/>
+        </w:rPr>
+        <w:t xml:space="preserve">. Faktor yang muncul ialah pengodean yang tidak sesuai, kelengkapan berkas, dan perbedaan penegakan diagnosis antara dokter penanggung jawab pelayanan (DPJP) dan verifikator BPJS (hlm. 72, 77). Penulis mengaitkan perbedaan diagnosis itu dengan perbedaan latar belakang pendidikan dan pengetahuan kedua pihak (hlm. 77). Tabel ulasan tersebut memuat studi Muroli dkk. (2020) di RSAB Harapan Kita, Jakarta Barat. Menurut ringkasan dalam tabel itu, resume medis tidak lengkap pada 38 berkas (41,8%), pengodean tidak tepat pada 44 berkas (48,4%), dan berkas klaim tidak lengkap pada 27 berkas (29,7%) (hlm. 75). Angka tersebut berasal dari ringkasan dalam ulasan, bukan dari artikel Muroli dkk., dan ulasan itu tidak menguraikan penilaian mutu terhadap kelima artikel yang dimasukkan.</w:t>
+      </w:r>
+    </w:p>
+    <w:p>
+      <w:pPr>
+        <w:rPr>
+          <w:lang w:val="id-ID"/>
+        </w:rPr>
+      </w:pPr>
+      <w:r>
+        <w:rPr>
+          <w:lang w:val="id-ID"/>
+        </w:rPr>
+        <w:t xml:space="preserve">Dua studi lain membahas klaim JKN dari sudut berbeda. Rachmawaty dkk. (2021) menganalisis basis data e-klaim BPJS satu rumah sakit ibu dan anak di Makassar, dengan 2.870 rawat inap pada 2019 dan 1.533 pada Januari–Juni 2020. Kerugian finansial rumah sakit terjadi pada 42,9% rawat inap tahun 2019 dan 61,3% tahun 2020 (hlm. S613). Penulis mengaitkan kerugian itu terutama dengan tarif rumah sakit yang lebih tinggi daripada tarif BPJS, dan menyebut tidak adanya audit rekam medis pasien secara rutin oleh manajer sebagai salah satu alasan variasi lama rawat (hlm. S617). Studi ini tidak menilai mutu dokumentasi. Nilasari dan Soelistijanto (2026) berfokus pada kecurangan klaim. Mereka menyebut kategori Kementerian Kesehatan yang mencakup </w:t>
+      </w:r>
+      <w:r>
+        <w:rPr>
+          <w:i/>
+          <w:lang w:val="id-ID"/>
+        </w:rPr>
+        <w:t xml:space="preserve">upcoding</w:t>
+      </w:r>
+      <w:r>
+        <w:rPr>
+          <w:lang w:val="id-ID"/>
+        </w:rPr>
+        <w:t xml:space="preserve">, yaitu mengubah kode diagnosis atau prosedur agar ditagihkan pada tarif lebih tinggi tanpa dasar medis (hlm. 852), lalu merancang sistem di sisi BPJS yang memilih klaim untuk diaudit manusia dalam batas kapasitas auditor (hlm. 851). Simulasi empirisnya belum selesai dan tidak ada data yang dipakai (hlm. 855, 857).</w:t>
+      </w:r>
+    </w:p>
+    <w:p>
+      <w:pPr>
+        <w:rPr>
+          <w:lang w:val="id-ID"/>
+        </w:rPr>
+      </w:pPr>
+      <w:r>
+        <w:rPr>
+          <w:lang w:val="id-ID"/>
+        </w:rPr>
+        <w:t xml:space="preserve">Sumber-sumber tersebut menunjukkan bahwa dokumentasi medis, kode diagnosis, dan keputusan klaim saling terkait dalam JKN. Di antara sumber itu, tidak ada yang mengukur ketidaksesuaian di dalam dokumen klinis sebelum klaim diajukan. Ulasan Simbolon dan Gani (2023) merangkum faktor penyebab dari artikel lain, Rachmawaty dkk. (2021) menganalisis biaya dan mutu layanan, dan Nilasari dan Soelistijanto (2026) merancang audit di sisi BPJS tanpa evaluasi. Ringkasan Muroli dkk. (2020) dalam ulasan itu memberi proporsi berkas yang tidak lengkap atau tidak tepat, tetapi tidak merinci jenis ketidaksesuaian antardokumen, misalnya diagnosis pada resume yang tidak sejalan dengan catatan harian.</w:t>
       </w:r>
     </w:p>
     <w:p>
@@ -5234,7 +5324,7 @@
           <w:noProof/>
           <w:lang w:val="id-ID"/>
         </w:rPr>
-        <w:t xml:space="preserve">Skrabic, R., Viculin, I., Boban, Z., Kumric, M., Vilovic, M., Vrdoljak, J., &amp; Bozic, J. (2026). Large language models as second reviewers for medical errors in real-world internal medicine reports: A prospective comparative study of open- and closed-source models. </w:t>
+        <w:t xml:space="preserve">Nilasari, E. V., &amp; Soelistijanto, B. (2026). A preliminary study on mitigating upcoding in Indonesia's national health insurance using multi-agent multi-armed bandits. </w:t>
       </w:r>
       <w:r>
         <w:rPr>
@@ -5242,6 +5332,102 @@
           <w:noProof/>
           <w:lang w:val="id-ID"/>
         </w:rPr>
+        <w:t xml:space="preserve">Procedia Computer Science, 289</w:t>
+      </w:r>
+      <w:r>
+        <w:rPr>
+          <w:noProof/>
+          <w:lang w:val="id-ID"/>
+        </w:rPr>
+        <w:t xml:space="preserve">, 851–858.</w:t>
+      </w:r>
+    </w:p>
+    <w:p>
+      <w:pPr>
+        <w:spacing w:line="240" w:lineRule="auto"/>
+        <w:ind w:left="720" w:hanging="720"/>
+        <w:rPr>
+          <w:noProof/>
+          <w:lang w:val="id-ID" w:eastAsia="en-US"/>
+        </w:rPr>
+      </w:pPr>
+      <w:r>
+        <w:rPr>
+          <w:noProof/>
+          <w:lang w:val="id-ID"/>
+        </w:rPr>
+        <w:t xml:space="preserve">Rachmawaty, R., Sinrang, A. W., Wahyudin, E., &amp; Bukhari, A. (2021). Evaluation of health care quality among insured patients in Indonesian mother &amp; child hospital: A secondary data analysis. </w:t>
+      </w:r>
+      <w:r>
+        <w:rPr>
+          <w:i/>
+          <w:noProof/>
+          <w:lang w:val="id-ID"/>
+        </w:rPr>
+        <w:t xml:space="preserve">Gaceta Sanitaria, 35</w:t>
+      </w:r>
+      <w:r>
+        <w:rPr>
+          <w:noProof/>
+          <w:lang w:val="id-ID"/>
+        </w:rPr>
+        <w:t xml:space="preserve">(S2), S613–S618.</w:t>
+      </w:r>
+    </w:p>
+    <w:p>
+      <w:pPr>
+        <w:spacing w:line="240" w:lineRule="auto"/>
+        <w:ind w:left="720" w:hanging="720"/>
+        <w:rPr>
+          <w:noProof/>
+          <w:lang w:val="id-ID" w:eastAsia="en-US"/>
+        </w:rPr>
+      </w:pPr>
+      <w:r>
+        <w:rPr>
+          <w:noProof/>
+          <w:lang w:val="id-ID"/>
+        </w:rPr>
+        <w:t xml:space="preserve">Simbolon, F., &amp; Gani, A. (2023). Faktor-faktor yang mempengaruhi terjadinya pending klaim rawat inap: Literatur review. </w:t>
+      </w:r>
+      <w:r>
+        <w:rPr>
+          <w:i/>
+          <w:noProof/>
+          <w:lang w:val="id-ID"/>
+        </w:rPr>
+        <w:t xml:space="preserve">Jurnal Keperawatan dan Kesehatan, 14</w:t>
+      </w:r>
+      <w:r>
+        <w:rPr>
+          <w:noProof/>
+          <w:lang w:val="id-ID"/>
+        </w:rPr>
+        <w:t xml:space="preserve">(1), 72–78.</w:t>
+      </w:r>
+    </w:p>
+    <w:p>
+      <w:pPr>
+        <w:spacing w:line="240" w:lineRule="auto"/>
+        <w:ind w:left="720" w:hanging="720"/>
+        <w:rPr>
+          <w:noProof/>
+          <w:lang w:val="id-ID" w:eastAsia="en-US"/>
+        </w:rPr>
+      </w:pPr>
+      <w:r>
+        <w:rPr>
+          <w:noProof/>
+          <w:lang w:val="id-ID"/>
+        </w:rPr>
+        <w:t xml:space="preserve">Skrabic, R., Viculin, I., Boban, Z., Kumric, M., Vilovic, M., Vrdoljak, J., &amp; Bozic, J. (2026). Large language models as second reviewers for medical errors in real-world internal medicine reports: A prospective comparative study of open- and closed-source models. </w:t>
+      </w:r>
+      <w:r>
+        <w:rPr>
+          <w:i/>
+          <w:noProof/>
+          <w:lang w:val="id-ID"/>
+        </w:rPr>
         <w:t xml:space="preserve">International Journal of Medical Informatics, 211</w:t>
       </w:r>
       <w:r>
@@ -5250,6 +5436,38 @@
           <w:lang w:val="id-ID"/>
         </w:rPr>
         <w:t xml:space="preserve">, 106316.</w:t>
+      </w:r>
+    </w:p>
+    <w:p>
+      <w:pPr>
+        <w:spacing w:line="240" w:lineRule="auto"/>
+        <w:ind w:left="720" w:hanging="720"/>
+        <w:rPr>
+          <w:noProof/>
+          <w:lang w:val="id-ID" w:eastAsia="en-US"/>
+        </w:rPr>
+      </w:pPr>
+      <w:r>
+        <w:rPr>
+          <w:noProof/>
+          <w:lang w:val="id-ID"/>
+        </w:rPr>
+        <w:t xml:space="preserve">Susilo, D., Wulandari, L. P. L., Sukmayeti, E., Asante, A., Jan, S., Thabrany, H., Tangcharoensathien, V., Wiseman, V., &amp; Liverani, M. (2025). Can Indonesia achieve universal health coverage? Organisational and financing challenges in implementing the national health insurance system. </w:t>
+      </w:r>
+      <w:r>
+        <w:rPr>
+          <w:i/>
+          <w:noProof/>
+          <w:lang w:val="id-ID"/>
+        </w:rPr>
+        <w:t xml:space="preserve">SSM - Health Systems, 5</w:t>
+      </w:r>
+      <w:r>
+        <w:rPr>
+          <w:noProof/>
+          <w:lang w:val="id-ID"/>
+        </w:rPr>
+        <w:t xml:space="preserve">, 100138.</w:t>
       </w:r>
     </w:p>
     <w:p>

</xml_diff>

<commit_message>
feat: draft Bab II subbab II.2 (NLP dan LLM pada teks klinis) and rebuild docx
Add II.2 draft from eight source PDFs with page-verified claims (57/57),
extend verify_claims.py with the new sources and a soft-hyphen fix, move the
LLM definition from II.3 to II.2, rebuild the Utama-template docx with
II.1-II.3, and update CONTEXT_TRANSFER.md.

Co-Authored-By: Claude Sonnet 5.5 <noreply@anthropic.com>
Claude-Session: https://claude.ai/code/session_014py9jkTgHZJ9tfrTkQ4xwY
</commit_message>
<xml_diff>
--- a/bab2/Proposal-IF4091-Capstone-Utama-2026_Draft-Bab2.docx
+++ b/bab2/Proposal-IF4091-Capstone-Utama-2026_Draft-Bab2.docx
@@ -4272,16 +4272,247 @@
     </w:p>
     <w:p>
       <w:pPr>
-        <w:rPr>
-          <w:lang w:val="id-ID"/>
-        </w:rPr>
-      </w:pPr>
+        <w:pStyle w:val="Heading3"/>
+      </w:pPr>
+      <w:r>
+        <w:t xml:space="preserve">Tugas dan Model Bahasa untuk Teks Klinis</w:t>
+      </w:r>
+    </w:p>
+    <w:p>
+      <w:pPr>
+        <w:rPr>
+          <w:lang w:val="id-ID"/>
+        </w:rPr>
+      </w:pPr>
+      <w:r>
+        <w:rPr>
+          <w:lang w:val="id-ID"/>
+        </w:rPr>
+        <w:t xml:space="preserve">Pemrosesan bahasa alami (</w:t>
+      </w:r>
+      <w:r>
+        <w:rPr>
+          <w:i/>
+          <w:lang w:val="id-ID"/>
+        </w:rPr>
+        <w:t xml:space="preserve">natural language processing</w:t>
+      </w:r>
+      <w:r>
+        <w:rPr>
+          <w:lang w:val="id-ID"/>
+        </w:rPr>
+        <w:t xml:space="preserve">, NLP) klinis bertujuan mengekstraksi informasi medis yang relevan dari teks klinis tidak terstruktur (Olex &amp; McInnes, 2021, hlm. 1). Luo dkk. (2024) mensurvei penerapan model bahasa pralatih (</w:t>
+      </w:r>
+      <w:r>
+        <w:rPr>
+          <w:i/>
+          <w:lang w:val="id-ID"/>
+        </w:rPr>
+        <w:t xml:space="preserve">pre-trained language model</w:t>
+      </w:r>
+      <w:r>
+        <w:rPr>
+          <w:lang w:val="id-ID"/>
+        </w:rPr>
+        <w:t xml:space="preserve">, PLM) seperti BERT, BioBERT, dan ChatGPT pada tugas NLP medis, antara lain peringkasan teks, tanya jawab, pengenalan entitas bernama (</w:t>
+      </w:r>
+      <w:r>
+        <w:rPr>
+          <w:i/>
+          <w:lang w:val="id-ID"/>
+        </w:rPr>
+        <w:t xml:space="preserve">named entity recognition</w:t>
+      </w:r>
+      <w:r>
+        <w:rPr>
+          <w:lang w:val="id-ID"/>
+        </w:rPr>
+        <w:t xml:space="preserve">, NER), dan ekstraksi informasi (hlm. 1). Elvas dkk. (2025) meninjau 31 studi tahun 2019–2024 yang berfokus pada NER dan melaporkan bahwa pendekatan berbasis BERT, jaringan saraf, serta CRF/LSTM mendominasi dengan F1 di atas 85% (hlm. 1). Kajian itu tidak menilai mutu studi secara formal dan sengaja mengecualikan model bahasa besar (hlm. 2), sehingga tidak menggambarkan penggunaan model generatif.</w:t>
+      </w:r>
+    </w:p>
+    <w:p>
+      <w:pPr>
+        <w:rPr>
+          <w:lang w:val="id-ID"/>
+        </w:rPr>
+      </w:pPr>
+      <w:r>
+        <w:rPr>
+          <w:lang w:val="id-ID"/>
+        </w:rPr>
+        <w:t xml:space="preserve">Bukti tersebut berasal terutama dari bahasa Inggris. Dari 31 studi dalam kajian Elvas dkk., 17 memakai teks berbahasa Inggris, 9 Tionghoa, 2 Italia, 2 Jerman, dan 1 Spanyol (hlm. 4). Kumar dkk. (2026), yang menelaah 153 studi secara sistematis (hlm. 3), menyatakan bahwa kemajuan NLP klinis terpusat pada bahasa Inggris dan bahasa bersumber daya tinggi lainnya, serta bahwa alih kode, transliterasi, dan ortografi tidak baku mempersulit tokenisasi dan </w:t>
+      </w:r>
+      <w:r>
+        <w:rPr>
+          <w:i/>
+          <w:lang w:val="id-ID"/>
+        </w:rPr>
+        <w:t xml:space="preserve">parsing</w:t>
+      </w:r>
+      <w:r>
+        <w:rPr>
+          <w:lang w:val="id-ID"/>
+        </w:rPr>
+        <w:t xml:space="preserve"> (hlm. 21).</w:t>
+      </w:r>
+    </w:p>
+    <w:p>
+      <w:pPr>
+        <w:rPr>
+          <w:lang w:val="id-ID"/>
+        </w:rPr>
+      </w:pPr>
+      <w:r>
+        <w:rPr>
+          <w:lang w:val="id-ID"/>
+        </w:rPr>
+        <w:t xml:space="preserve">Pada sisi model bahasa besar (</w:t>
+      </w:r>
+      <w:r>
+        <w:rPr>
+          <w:i/>
+          <w:lang w:val="id-ID"/>
+        </w:rPr>
+        <w:t xml:space="preserve">large language model</w:t>
+      </w:r>
+      <w:r>
+        <w:rPr>
+          <w:lang w:val="id-ID"/>
+        </w:rPr>
+        <w:t xml:space="preserve">, LLM), Woo dkk. (2026) menelaah 41 studi penggunaan LLM untuk dokumentasi klinis, terutama pembuatan catatan klinis, ringkasan pulang, dan dokumentasi pertemuan tenaga kesehatan dan pasien (hlm. 1). Sebagian studi melaporkan penghematan waktu hingga 40%, tetapi ketidakakuratan faktual, halusinasi, dan penurunan kinerja pada kasus kompleks sering ditemukan (hlm. 1). Woo dkk. mencontohkan satu studi yang menemukan informasi keliru pada 36% dokumen buatan ChatGPT dan studi lain yang menemukan bahwa ringkasan pulang buatan LLM hanya mengambil 61% isinya dari catatan rawat inap (hlm. 9); kedua angka itu bersifat sekunder karena Woo dkk. mengutipnya dari studi lain. Cakupan kajian ini terbatas: 17 dari 41 studi berasal dari Amerika Serikat (hlm. 4), studi nonbahasa Inggris dikecualikan, dan menurut penulisnya sebagian besar studi dilakukan pada lingkungan terkendali atau simulasi (hlm. 11). Karena objek telaahnya adalah LLM sebagai penulis dokumen, hasil tersebut tidak menunjukkan seberapa andal LLM sebagai pembaca atau pemeriksa dokumen. Hasil itu hanya memperingatkan bahwa keluaran LLM yang berbasis teks klinis dapat memuat kesalahan faktual dan penghilangan informasi.</w:t>
+      </w:r>
+    </w:p>
+    <w:p>
+      <w:pPr>
+        <w:pStyle w:val="Heading3"/>
+      </w:pPr>
+      <w:r>
+        <w:t xml:space="preserve">Singkatan, Normalisasi Istilah, dan Penalaran Temporal</w:t>
+      </w:r>
+    </w:p>
+    <w:p>
+      <w:pPr>
+        <w:rPr>
+          <w:lang w:val="id-ID"/>
+        </w:rPr>
+      </w:pPr>
+      <w:r>
+        <w:rPr>
+          <w:lang w:val="id-ID"/>
+        </w:rPr>
+        <w:t xml:space="preserve">Jafarpour dkk. (2025) menyebut kalimat tidak gramatikal, singkatan, akronim, karakter khusus yang bermakna, negasi, dan salah ketik sesekali sebagai ciri catatan rekam medis elektronik naratif (hlm. 1). Ambiguitas singkatan menjadi salah satu persoalan praktisnya. Wei dkk. (2026) mengubah disambiguasi singkatan klinis dari pembangkitan terbuka menjadi pemilihan terbatas, yaitu model memilih satu ekspansi dari tujuh kandidat yang dibangun lewat dua jalur (hlm. 1). Pada dataset CASI berbahasa Inggris versi bersih buatan Adams, Gemma-2-9B-IT mencapai akurasi 0,9228 dan Macro-F1 0,9279, sedangkan pada versi asli yang memuat lebih banyak derau (</w:t>
+      </w:r>
+      <w:r>
+        <w:rPr>
+          <w:i/>
+          <w:lang w:val="id-ID"/>
+        </w:rPr>
+        <w:t xml:space="preserve">noise</w:t>
+      </w:r>
+      <w:r>
+        <w:rPr>
+          <w:lang w:val="id-ID"/>
+        </w:rPr>
+        <w:t xml:space="preserve">) akurasinya 0,7585 (hlm. 1, 5). Pada model dan dataset bersih yang sama, pembangkitan langsung tanpa tahap seleksi hanya mencapai akurasi 0,6304 (hlm. 7). Penulisnya menyatakan tiga keterbatasan: akurasi bergantung pada inventori makna sehingga istilah di luar inventori dan istilah baru sulit ditangani, seleksi peka terhadap mutu konteks, dan evaluasi hanya memakai satu tolok ukur sehingga korpus klinis nonbahasa Inggris belum diuji (hlm. 9). Kajian itu juga membatasi singkatan pada bentuk pendek berhuruf kapital yang berasal dari huruf atau suku kata awal (hlm. 5).</w:t>
+      </w:r>
+    </w:p>
+    <w:p>
+      <w:pPr>
+        <w:rPr>
+          <w:lang w:val="id-ID"/>
+        </w:rPr>
+      </w:pPr>
+      <w:r>
+        <w:rPr>
+          <w:lang w:val="id-ID"/>
+        </w:rPr>
+        <w:t xml:space="preserve">Normalisasi istilah ke konsep baku berkaitan erat dengan persoalan itu. Chen dkk. (2026) mensurvei </w:t>
+      </w:r>
+      <w:r>
+        <w:rPr>
+          <w:i/>
+          <w:lang w:val="id-ID"/>
+        </w:rPr>
+        <w:t xml:space="preserve">medical concept normalization</w:t>
+      </w:r>
+      <w:r>
+        <w:rPr>
+          <w:lang w:val="id-ID"/>
+        </w:rPr>
+        <w:t xml:space="preserve"> (MCN), yaitu pemetaan frasa medis informal ke konsep baku dalam basis terstandar seperti UMLS, SNOMED CT, atau MeSH (hlm. 1, 4); UMLS memuat ICD (hlm. 6). Untuk subtugas sempit seperti disambiguasi singkatan, aturan dan leksikon eksplisit dinilai masih andal (hlm. 13). Survei yang sama menilai korpus berbahasa Inggris mendominasi penelitian MCN, sedangkan penggabungan sumber multibahasa terhambat oleh pedoman anotasi yang berbeda antarbahasa, granularitas ontologi yang berbeda, dan terjemahan harfiah yang menghilangkan nuansa (hlm. 8).</w:t>
+      </w:r>
+    </w:p>
+    <w:p>
+      <w:pPr>
+        <w:rPr>
+          <w:lang w:val="id-ID"/>
+        </w:rPr>
+      </w:pPr>
+      <w:r>
+        <w:rPr>
+          <w:lang w:val="id-ID"/>
+        </w:rPr>
+        <w:t xml:space="preserve">Penalaran temporal merupakan komponen kunci NLP klinis karena pemahaman riwayat pasien sangat bergantung pada kemampuan mengidentifikasi dan menalar informasi temporal (Olex &amp; McInnes, 2021, hlm. 1). Olex dan McInnes memaparkan lima cara informasi temporal dinyatakan dalam teks menurut Lim dkk., yaitu eksplisit, implisit, relatif, kabur, dan </w:t>
+      </w:r>
+      <w:r>
+        <w:rPr>
+          <w:i/>
+          <w:lang w:val="id-ID"/>
+        </w:rPr>
+        <w:t xml:space="preserve">non-consuming</w:t>
+      </w:r>
+      <w:r>
+        <w:rPr>
+          <w:lang w:val="id-ID"/>
+        </w:rPr>
+        <w:t xml:space="preserve"> (hlm. 2); ungkapan “3 hari lalu” bergantung pada waktu pembuatan dokumen, sedangkan “2 jam setelah minum obat” bergantung pada kejadian lain (hlm. 2). Mereka menyimpulkan bahwa sistem ekstraksi lini masa belum cukup baik untuk praktik klinis; penanganan ungkapan temporal relatif dan implisit termasuk bidang yang memerlukan solusi baru (hlm. 1). Pada tugas bersama (</w:t>
+      </w:r>
+      <w:r>
+        <w:rPr>
+          <w:i/>
+          <w:lang w:val="id-ID"/>
+        </w:rPr>
+        <w:t xml:space="preserve">shared task</w:t>
+      </w:r>
+      <w:r>
+        <w:rPr>
+          <w:lang w:val="id-ID"/>
+        </w:rPr>
+        <w:t xml:space="preserve">) yang mereka tinjau, sistem berbasis aturan terbaik untuk mengenali dan menormalkan ekspresi temporal, sedangkan metode pembelajaran mesin statistik unggul untuk mengenali kejadian dan mengklasifikasi relasi temporal (hlm. 2). Tinjauan itu terbit tahun 2021 dan tidak menyebut LLM. Untuk LLM, Woo dkk. (2026) melaporkan bahwa GPT-4o dalam salah satu studi yang mereka rangkum andal pada konsultasi neurovaskular tetapi kesulitan pada lintasan pasien yang kompleks secara temporal (hlm. 9). Teks panjang menambah kesulitan: menurut Jafarpour dkk. (2025), yang menelaah deteksi kejadian tidak diharapkan di rumah sakit dengan teks berbahasa Inggris (hlm. 1, 4), laporan naratif sering melampaui batas masukan model seperti BERT, yang memproses maksimum 512 kata sekaligus. Informasi penting dapat hilang atau terpecah, dan ketiadaan informasi temporal dapat membuat model keliru membedakan kejadian sebelum dan selama rawat inap (hlm. 9).</w:t>
+      </w:r>
+    </w:p>
+    <w:p>
+      <w:pPr>
+        <w:pStyle w:val="Heading3"/>
+      </w:pPr>
+      <w:r>
+        <w:t xml:space="preserve">Sintesis dan Celah</w:t>
+      </w:r>
+    </w:p>
+    <w:p>
+      <w:pPr>
+        <w:rPr>
+          <w:lang w:val="id-ID"/>
+        </w:rPr>
+      </w:pPr>
+      <w:r>
+        <w:rPr>
+          <w:lang w:val="id-ID"/>
+        </w:rPr>
+        <w:t xml:space="preserve">Kedelapan sumber menunjukkan bahwa PLM dan LLM telah luas dipakai pada teks klinis, tetapi bukti yang tersedia memiliki tiga keterbatasan bagi penelitian ini. Pertama, tidak ada sumber yang mengevaluasi teks klinis berbahasa Indonesia, dan sebagian menyebut dominasi bahasa Inggris pada penelitian di bidangnya (Chen dkk., 2026, hlm. 8; Kumar dkk., 2026, hlm. 21). Kedua, bukti tentang LLM pada dokumentasi klinis berpusat pada pembuatan dokumen, bukan pemeriksaan kesesuaian antardokumen (Woo dkk., 2026, hlm. 1), dan keandalannya dilaporkan menurun pada kasus kompleks. Ketiga, hasil disambiguasi singkatan yang dikaji di sini berasal dari satu dataset berbahasa Inggris dan turun dari akurasi 0,9228 menjadi 0,7585 pada versi yang memuat lebih banyak derau (Wei dkk., 2026, hlm. 1, 5, 9). Akibatnya, kinerja teknik-teknik ini pada rekam medis rawat inap kebidanan dan anak berbahasa Indonesia tidak dapat diasumsikan dan perlu diukur terhadap pembanding dan ambang yang ditetapkan sebelum eksperimen </w:t>
+      </w:r>
       <w:r>
         <w:rPr>
           <w:highlight w:val="yellow"/>
           <w:lang w:val="id-ID"/>
         </w:rPr>
-        <w:t xml:space="preserve">[SUBBAB BELUM DITULIS. Judul ini usulan dan belum dikonfirmasi.]</w:t>
+        <w:t xml:space="preserve">[SESUAIKAN DENGAN BAB I: rumusan pertanyaan dan ukuran keberhasilan]</w:t>
+      </w:r>
+      <w:r>
+        <w:rPr>
+          <w:lang w:val="id-ID"/>
+        </w:rPr>
+        <w:t xml:space="preserve">.</w:t>
       </w:r>
     </w:p>
     <w:p>
@@ -4323,20 +4554,7 @@
         <w:rPr>
           <w:lang w:val="id-ID"/>
         </w:rPr>
-        <w:t xml:space="preserve">Dietrich dan Stubbert (2026) mengevaluasi empat model bahasa besar (</w:t>
-      </w:r>
-      <w:r>
-        <w:rPr>
-          <w:i/>
-          <w:lang w:val="id-ID"/>
-        </w:rPr>
-        <w:t xml:space="preserve">large language model</w:t>
-      </w:r>
-      <w:r>
-        <w:rPr>
-          <w:lang w:val="id-ID"/>
-        </w:rPr>
-        <w:t xml:space="preserve">, LLM), yaitu Claude Sonnet 4.5, Gemini 2.5 Pro, GPT-5, dan Grok 4, sebagai pemeriksa catatan pemulangan instalasi gawat darurat (IGD). Data berasal dari 600 kunjungan pada basis data MIMIC-IV-ED. Sebanyak 500 catatan masing-masing disisipi satu kesalahan dari lima kategori, dan 100 catatan lain tidak memuat kesalahan (hlm. 95–96). Keempat model menerima perintah sistem (</w:t>
+        <w:t xml:space="preserve">Dietrich dan Stubbert (2026) mengevaluasi empat LLM, yaitu Claude Sonnet 4.5, Gemini 2.5 Pro, GPT-5, dan Grok 4, sebagai pemeriksa catatan pemulangan instalasi gawat darurat (IGD). Data berasal dari 600 kunjungan pada basis data MIMIC-IV-ED. Sebanyak 500 catatan masing-masing disisipi satu kesalahan dari lima kategori, dan 100 catatan lain tidak memuat kesalahan (hlm. 95–96). Keempat model menerima perintah sistem (</w:t>
       </w:r>
       <w:r>
         <w:rPr>
@@ -5132,7 +5350,7 @@
           <w:noProof/>
           <w:lang w:val="id-ID"/>
         </w:rPr>
-        <w:t xml:space="preserve">Dietrich, N., &amp; Stubbert, B. (2026). Automated auditing of emergency department documentation using large language models. </w:t>
+        <w:t xml:space="preserve">Chen, H., Zhou, Y., Li, R., Illa, A. M., Cleveland, A., &amp; Ding, J. (2026). A comprehensive survey on medical concept normalization: Datasets, techniques, applications, and future directions. </w:t>
       </w:r>
       <w:r>
         <w:rPr>
@@ -5140,14 +5358,14 @@
           <w:noProof/>
           <w:lang w:val="id-ID"/>
         </w:rPr>
-        <w:t xml:space="preserve">American Journal of Emergency Medicine, 104</w:t>
+        <w:t xml:space="preserve">Journal of Biomedical Informatics, 178</w:t>
       </w:r>
       <w:r>
         <w:rPr>
           <w:noProof/>
           <w:lang w:val="id-ID"/>
         </w:rPr>
-        <w:t xml:space="preserve">, 95–101.</w:t>
+        <w:t xml:space="preserve">, 105005.</w:t>
       </w:r>
     </w:p>
     <w:p>
@@ -5164,7 +5382,7 @@
           <w:noProof/>
           <w:lang w:val="id-ID"/>
         </w:rPr>
-        <w:t xml:space="preserve">Du, W. (H.), Wang, G., Xu, J. (N.), &amp; Vasarhelyi, M. A. (2026). Information systems auditing of psychiatric diagnoses using context-enriched QA-based language models. </w:t>
+        <w:t xml:space="preserve">Dietrich, N., &amp; Stubbert, B. (2026). Automated auditing of emergency department documentation using large language models. </w:t>
       </w:r>
       <w:r>
         <w:rPr>
@@ -5172,14 +5390,14 @@
           <w:noProof/>
           <w:lang w:val="id-ID"/>
         </w:rPr>
-        <w:t xml:space="preserve">Data Science and Management, 9</w:t>
+        <w:t xml:space="preserve">American Journal of Emergency Medicine, 104</w:t>
       </w:r>
       <w:r>
         <w:rPr>
           <w:noProof/>
           <w:lang w:val="id-ID"/>
         </w:rPr>
-        <w:t xml:space="preserve">, 100177.</w:t>
+        <w:t xml:space="preserve">, 95–101.</w:t>
       </w:r>
     </w:p>
     <w:p>
@@ -5196,7 +5414,7 @@
           <w:noProof/>
           <w:lang w:val="id-ID"/>
         </w:rPr>
-        <w:t xml:space="preserve">Hou, W.-h., Wang, X.-k., Wang, Y.-n., Wang, J.-q., &amp; Xiao, F. (2024). Modelling long medical documents and code associations for explainable automatic ICD coding. </w:t>
+        <w:t xml:space="preserve">Du, W. (H.), Wang, G., Xu, J. (N.), &amp; Vasarhelyi, M. A. (2026). Information systems auditing of psychiatric diagnoses using context-enriched QA-based language models. </w:t>
       </w:r>
       <w:r>
         <w:rPr>
@@ -5204,14 +5422,14 @@
           <w:noProof/>
           <w:lang w:val="id-ID"/>
         </w:rPr>
-        <w:t xml:space="preserve">Expert Systems with Applications, 249</w:t>
+        <w:t xml:space="preserve">Data Science and Management, 9</w:t>
       </w:r>
       <w:r>
         <w:rPr>
           <w:noProof/>
           <w:lang w:val="id-ID"/>
         </w:rPr>
-        <w:t xml:space="preserve">, 123519.</w:t>
+        <w:t xml:space="preserve">, 100177.</w:t>
       </w:r>
     </w:p>
     <w:p>
@@ -5228,7 +5446,7 @@
           <w:noProof/>
           <w:lang w:val="id-ID"/>
         </w:rPr>
-        <w:t xml:space="preserve">Jaganathan, G. S., Kahanda, I., &amp; Kanewala, U. (2025). Metamorphic testing for robustness and fairness evaluation of LLM-based automated ICD coding applications. </w:t>
+        <w:t xml:space="preserve">Elvas, L. B., Almeida, A., &amp; Ferreira, J. C. (2025). Natural language processing in medical text processing: A scoping literature review. </w:t>
       </w:r>
       <w:r>
         <w:rPr>
@@ -5236,14 +5454,14 @@
           <w:noProof/>
           <w:lang w:val="id-ID"/>
         </w:rPr>
-        <w:t xml:space="preserve">Smart Health, 36</w:t>
+        <w:t xml:space="preserve">International Journal of Medical Informatics, 204</w:t>
       </w:r>
       <w:r>
         <w:rPr>
           <w:noProof/>
           <w:lang w:val="id-ID"/>
         </w:rPr>
-        <w:t xml:space="preserve">, 100564.</w:t>
+        <w:t xml:space="preserve">, 106049.</w:t>
       </w:r>
     </w:p>
     <w:p>
@@ -5260,7 +5478,7 @@
           <w:noProof/>
           <w:lang w:val="id-ID"/>
         </w:rPr>
-        <w:t xml:space="preserve">Lebeña, N., Casillas, A., &amp; Pérez, A. (2025). Large language models aided patient progression documentation according to the ICD standard. </w:t>
+        <w:t xml:space="preserve">Hou, W.-h., Wang, X.-k., Wang, Y.-n., Wang, J.-q., &amp; Xiao, F. (2024). Modelling long medical documents and code associations for explainable automatic ICD coding. </w:t>
       </w:r>
       <w:r>
         <w:rPr>
@@ -5268,14 +5486,14 @@
           <w:noProof/>
           <w:lang w:val="id-ID"/>
         </w:rPr>
-        <w:t xml:space="preserve">Informatics in Medicine Unlocked, 55</w:t>
+        <w:t xml:space="preserve">Expert Systems with Applications, 249</w:t>
       </w:r>
       <w:r>
         <w:rPr>
           <w:noProof/>
           <w:lang w:val="id-ID"/>
         </w:rPr>
-        <w:t xml:space="preserve">, 101637.</w:t>
+        <w:t xml:space="preserve">, 123519.</w:t>
       </w:r>
     </w:p>
     <w:p>
@@ -5292,7 +5510,7 @@
           <w:noProof/>
           <w:lang w:val="id-ID"/>
         </w:rPr>
-        <w:t xml:space="preserve">Mwogosi, A., &amp; Mambile, C. (2026). Concordance of electronic health record data with ICD classification and evidence-based treatment guidelines: A systematic review and meta-analysis. </w:t>
+        <w:t xml:space="preserve">Jafarpour, H., Wu, G., Cheligeer, C., Yan, J., Xu, Y., Southern, D. A., Eastwood, C. A., Zeng, Y., &amp; Quan, H. (2025). Preprocessing narrative texts in electronic medical records to identify hospital adverse events: A scoping review. </w:t>
       </w:r>
       <w:r>
         <w:rPr>
@@ -5300,14 +5518,14 @@
           <w:noProof/>
           <w:lang w:val="id-ID"/>
         </w:rPr>
-        <w:t xml:space="preserve">Health Policy and Technology, 15</w:t>
+        <w:t xml:space="preserve">Artificial Intelligence in Medicine, 170</w:t>
       </w:r>
       <w:r>
         <w:rPr>
           <w:noProof/>
           <w:lang w:val="id-ID"/>
         </w:rPr>
-        <w:t xml:space="preserve">, 101213.</w:t>
+        <w:t xml:space="preserve">, 103281.</w:t>
       </w:r>
     </w:p>
     <w:p>
@@ -5324,7 +5542,7 @@
           <w:noProof/>
           <w:lang w:val="id-ID"/>
         </w:rPr>
-        <w:t xml:space="preserve">Nilasari, E. V., &amp; Soelistijanto, B. (2026). A preliminary study on mitigating upcoding in Indonesia's national health insurance using multi-agent multi-armed bandits. </w:t>
+        <w:t xml:space="preserve">Jaganathan, G. S., Kahanda, I., &amp; Kanewala, U. (2025). Metamorphic testing for robustness and fairness evaluation of LLM-based automated ICD coding applications. </w:t>
       </w:r>
       <w:r>
         <w:rPr>
@@ -5332,14 +5550,14 @@
           <w:noProof/>
           <w:lang w:val="id-ID"/>
         </w:rPr>
-        <w:t xml:space="preserve">Procedia Computer Science, 289</w:t>
+        <w:t xml:space="preserve">Smart Health, 36</w:t>
       </w:r>
       <w:r>
         <w:rPr>
           <w:noProof/>
           <w:lang w:val="id-ID"/>
         </w:rPr>
-        <w:t xml:space="preserve">, 851–858.</w:t>
+        <w:t xml:space="preserve">, 100564.</w:t>
       </w:r>
     </w:p>
     <w:p>
@@ -5356,7 +5574,7 @@
           <w:noProof/>
           <w:lang w:val="id-ID"/>
         </w:rPr>
-        <w:t xml:space="preserve">Rachmawaty, R., Sinrang, A. W., Wahyudin, E., &amp; Bukhari, A. (2021). Evaluation of health care quality among insured patients in Indonesian mother &amp; child hospital: A secondary data analysis. </w:t>
+        <w:t xml:space="preserve">Kumar, D., Choudhary, N., Gupta, V., Tanwar, R., Behmani, K., Antal, S., Jarora, S., Gupta, S., Shaikh, M. S., Webster, T. J., &amp; Faiyazuddin, M. (2026). Natural language processing in healthcare: From unstructured data to clinical intelligence. </w:t>
       </w:r>
       <w:r>
         <w:rPr>
@@ -5364,14 +5582,14 @@
           <w:noProof/>
           <w:lang w:val="id-ID"/>
         </w:rPr>
-        <w:t xml:space="preserve">Gaceta Sanitaria, 35</w:t>
+        <w:t xml:space="preserve">Intelligent Systems with Applications, 31</w:t>
       </w:r>
       <w:r>
         <w:rPr>
           <w:noProof/>
           <w:lang w:val="id-ID"/>
         </w:rPr>
-        <w:t xml:space="preserve">(S2), S613–S618.</w:t>
+        <w:t xml:space="preserve">, 200698.</w:t>
       </w:r>
     </w:p>
     <w:p>
@@ -5388,7 +5606,7 @@
           <w:noProof/>
           <w:lang w:val="id-ID"/>
         </w:rPr>
-        <w:t xml:space="preserve">Simbolon, F., &amp; Gani, A. (2023). Faktor-faktor yang mempengaruhi terjadinya pending klaim rawat inap: Literatur review. </w:t>
+        <w:t xml:space="preserve">Lebeña, N., Casillas, A., &amp; Pérez, A. (2025). Large language models aided patient progression documentation according to the ICD standard. </w:t>
       </w:r>
       <w:r>
         <w:rPr>
@@ -5396,14 +5614,14 @@
           <w:noProof/>
           <w:lang w:val="id-ID"/>
         </w:rPr>
-        <w:t xml:space="preserve">Jurnal Keperawatan dan Kesehatan, 14</w:t>
+        <w:t xml:space="preserve">Informatics in Medicine Unlocked, 55</w:t>
       </w:r>
       <w:r>
         <w:rPr>
           <w:noProof/>
           <w:lang w:val="id-ID"/>
         </w:rPr>
-        <w:t xml:space="preserve">(1), 72–78.</w:t>
+        <w:t xml:space="preserve">, 101637.</w:t>
       </w:r>
     </w:p>
     <w:p>
@@ -5420,7 +5638,7 @@
           <w:noProof/>
           <w:lang w:val="id-ID"/>
         </w:rPr>
-        <w:t xml:space="preserve">Skrabic, R., Viculin, I., Boban, Z., Kumric, M., Vilovic, M., Vrdoljak, J., &amp; Bozic, J. (2026). Large language models as second reviewers for medical errors in real-world internal medicine reports: A prospective comparative study of open- and closed-source models. </w:t>
+        <w:t xml:space="preserve">Luo, X., Deng, Z., Yang, B., &amp; Luo, M. Y. (2024). Pre-trained language models in medicine: A survey. </w:t>
       </w:r>
       <w:r>
         <w:rPr>
@@ -5428,14 +5646,14 @@
           <w:noProof/>
           <w:lang w:val="id-ID"/>
         </w:rPr>
-        <w:t xml:space="preserve">International Journal of Medical Informatics, 211</w:t>
+        <w:t xml:space="preserve">Artificial Intelligence in Medicine, 154</w:t>
       </w:r>
       <w:r>
         <w:rPr>
           <w:noProof/>
           <w:lang w:val="id-ID"/>
         </w:rPr>
-        <w:t xml:space="preserve">, 106316.</w:t>
+        <w:t xml:space="preserve">, 102904.</w:t>
       </w:r>
     </w:p>
     <w:p>
@@ -5452,7 +5670,7 @@
           <w:noProof/>
           <w:lang w:val="id-ID"/>
         </w:rPr>
-        <w:t xml:space="preserve">Susilo, D., Wulandari, L. P. L., Sukmayeti, E., Asante, A., Jan, S., Thabrany, H., Tangcharoensathien, V., Wiseman, V., &amp; Liverani, M. (2025). Can Indonesia achieve universal health coverage? Organisational and financing challenges in implementing the national health insurance system. </w:t>
+        <w:t xml:space="preserve">Mwogosi, A., &amp; Mambile, C. (2026). Concordance of electronic health record data with ICD classification and evidence-based treatment guidelines: A systematic review and meta-analysis. </w:t>
       </w:r>
       <w:r>
         <w:rPr>
@@ -5460,6 +5678,198 @@
           <w:noProof/>
           <w:lang w:val="id-ID"/>
         </w:rPr>
+        <w:t xml:space="preserve">Health Policy and Technology, 15</w:t>
+      </w:r>
+      <w:r>
+        <w:rPr>
+          <w:noProof/>
+          <w:lang w:val="id-ID"/>
+        </w:rPr>
+        <w:t xml:space="preserve">, 101213.</w:t>
+      </w:r>
+    </w:p>
+    <w:p>
+      <w:pPr>
+        <w:spacing w:line="240" w:lineRule="auto"/>
+        <w:ind w:left="720" w:hanging="720"/>
+        <w:rPr>
+          <w:noProof/>
+          <w:lang w:val="id-ID" w:eastAsia="en-US"/>
+        </w:rPr>
+      </w:pPr>
+      <w:r>
+        <w:rPr>
+          <w:noProof/>
+          <w:lang w:val="id-ID"/>
+        </w:rPr>
+        <w:t xml:space="preserve">Nilasari, E. V., &amp; Soelistijanto, B. (2026). A preliminary study on mitigating upcoding in Indonesia's national health insurance using multi-agent multi-armed bandits. </w:t>
+      </w:r>
+      <w:r>
+        <w:rPr>
+          <w:i/>
+          <w:noProof/>
+          <w:lang w:val="id-ID"/>
+        </w:rPr>
+        <w:t xml:space="preserve">Procedia Computer Science, 289</w:t>
+      </w:r>
+      <w:r>
+        <w:rPr>
+          <w:noProof/>
+          <w:lang w:val="id-ID"/>
+        </w:rPr>
+        <w:t xml:space="preserve">, 851–858.</w:t>
+      </w:r>
+    </w:p>
+    <w:p>
+      <w:pPr>
+        <w:spacing w:line="240" w:lineRule="auto"/>
+        <w:ind w:left="720" w:hanging="720"/>
+        <w:rPr>
+          <w:noProof/>
+          <w:lang w:val="id-ID" w:eastAsia="en-US"/>
+        </w:rPr>
+      </w:pPr>
+      <w:r>
+        <w:rPr>
+          <w:noProof/>
+          <w:lang w:val="id-ID"/>
+        </w:rPr>
+        <w:t xml:space="preserve">Olex, A. L., &amp; McInnes, B. T. (2021). Review of temporal reasoning in the clinical domain for timeline extraction: Where we are and where we need to be. </w:t>
+      </w:r>
+      <w:r>
+        <w:rPr>
+          <w:i/>
+          <w:noProof/>
+          <w:lang w:val="id-ID"/>
+        </w:rPr>
+        <w:t xml:space="preserve">Journal of Biomedical Informatics, 118</w:t>
+      </w:r>
+      <w:r>
+        <w:rPr>
+          <w:noProof/>
+          <w:lang w:val="id-ID"/>
+        </w:rPr>
+        <w:t xml:space="preserve">, 103784.</w:t>
+      </w:r>
+    </w:p>
+    <w:p>
+      <w:pPr>
+        <w:spacing w:line="240" w:lineRule="auto"/>
+        <w:ind w:left="720" w:hanging="720"/>
+        <w:rPr>
+          <w:noProof/>
+          <w:lang w:val="id-ID" w:eastAsia="en-US"/>
+        </w:rPr>
+      </w:pPr>
+      <w:r>
+        <w:rPr>
+          <w:noProof/>
+          <w:lang w:val="id-ID"/>
+        </w:rPr>
+        <w:t xml:space="preserve">Rachmawaty, R., Sinrang, A. W., Wahyudin, E., &amp; Bukhari, A. (2021). Evaluation of health care quality among insured patients in Indonesian mother &amp; child hospital: A secondary data analysis. </w:t>
+      </w:r>
+      <w:r>
+        <w:rPr>
+          <w:i/>
+          <w:noProof/>
+          <w:lang w:val="id-ID"/>
+        </w:rPr>
+        <w:t xml:space="preserve">Gaceta Sanitaria, 35</w:t>
+      </w:r>
+      <w:r>
+        <w:rPr>
+          <w:noProof/>
+          <w:lang w:val="id-ID"/>
+        </w:rPr>
+        <w:t xml:space="preserve">(S2), S613–S618.</w:t>
+      </w:r>
+    </w:p>
+    <w:p>
+      <w:pPr>
+        <w:spacing w:line="240" w:lineRule="auto"/>
+        <w:ind w:left="720" w:hanging="720"/>
+        <w:rPr>
+          <w:noProof/>
+          <w:lang w:val="id-ID" w:eastAsia="en-US"/>
+        </w:rPr>
+      </w:pPr>
+      <w:r>
+        <w:rPr>
+          <w:noProof/>
+          <w:lang w:val="id-ID"/>
+        </w:rPr>
+        <w:t xml:space="preserve">Simbolon, F., &amp; Gani, A. (2023). Faktor-faktor yang mempengaruhi terjadinya pending klaim rawat inap: Literatur review. </w:t>
+      </w:r>
+      <w:r>
+        <w:rPr>
+          <w:i/>
+          <w:noProof/>
+          <w:lang w:val="id-ID"/>
+        </w:rPr>
+        <w:t xml:space="preserve">Jurnal Keperawatan dan Kesehatan, 14</w:t>
+      </w:r>
+      <w:r>
+        <w:rPr>
+          <w:noProof/>
+          <w:lang w:val="id-ID"/>
+        </w:rPr>
+        <w:t xml:space="preserve">(1), 72–78.</w:t>
+      </w:r>
+    </w:p>
+    <w:p>
+      <w:pPr>
+        <w:spacing w:line="240" w:lineRule="auto"/>
+        <w:ind w:left="720" w:hanging="720"/>
+        <w:rPr>
+          <w:noProof/>
+          <w:lang w:val="id-ID" w:eastAsia="en-US"/>
+        </w:rPr>
+      </w:pPr>
+      <w:r>
+        <w:rPr>
+          <w:noProof/>
+          <w:lang w:val="id-ID"/>
+        </w:rPr>
+        <w:t xml:space="preserve">Skrabic, R., Viculin, I., Boban, Z., Kumric, M., Vilovic, M., Vrdoljak, J., &amp; Bozic, J. (2026). Large language models as second reviewers for medical errors in real-world internal medicine reports: A prospective comparative study of open- and closed-source models. </w:t>
+      </w:r>
+      <w:r>
+        <w:rPr>
+          <w:i/>
+          <w:noProof/>
+          <w:lang w:val="id-ID"/>
+        </w:rPr>
+        <w:t xml:space="preserve">International Journal of Medical Informatics, 211</w:t>
+      </w:r>
+      <w:r>
+        <w:rPr>
+          <w:noProof/>
+          <w:lang w:val="id-ID"/>
+        </w:rPr>
+        <w:t xml:space="preserve">, 106316.</w:t>
+      </w:r>
+    </w:p>
+    <w:p>
+      <w:pPr>
+        <w:spacing w:line="240" w:lineRule="auto"/>
+        <w:ind w:left="720" w:hanging="720"/>
+        <w:rPr>
+          <w:noProof/>
+          <w:lang w:val="id-ID" w:eastAsia="en-US"/>
+        </w:rPr>
+      </w:pPr>
+      <w:r>
+        <w:rPr>
+          <w:noProof/>
+          <w:lang w:val="id-ID"/>
+        </w:rPr>
+        <w:t xml:space="preserve">Susilo, D., Wulandari, L. P. L., Sukmayeti, E., Asante, A., Jan, S., Thabrany, H., Tangcharoensathien, V., Wiseman, V., &amp; Liverani, M. (2025). Can Indonesia achieve universal health coverage? Organisational and financing challenges in implementing the national health insurance system. </w:t>
+      </w:r>
+      <w:r>
+        <w:rPr>
+          <w:i/>
+          <w:noProof/>
+          <w:lang w:val="id-ID"/>
+        </w:rPr>
         <w:t xml:space="preserve">SSM - Health Systems, 5</w:t>
       </w:r>
       <w:r>
@@ -5468,6 +5878,70 @@
           <w:lang w:val="id-ID"/>
         </w:rPr>
         <w:t xml:space="preserve">, 100138.</w:t>
+      </w:r>
+    </w:p>
+    <w:p>
+      <w:pPr>
+        <w:spacing w:line="240" w:lineRule="auto"/>
+        <w:ind w:left="720" w:hanging="720"/>
+        <w:rPr>
+          <w:noProof/>
+          <w:lang w:val="id-ID" w:eastAsia="en-US"/>
+        </w:rPr>
+      </w:pPr>
+      <w:r>
+        <w:rPr>
+          <w:noProof/>
+          <w:lang w:val="id-ID"/>
+        </w:rPr>
+        <w:t xml:space="preserve">Wei, S., Liu, X., &amp; Shi, Y. (2026). Selection-based prompting with synthesized candidates unlocks high-performance clinical abbreviation disambiguation via open-source LLMs. </w:t>
+      </w:r>
+      <w:r>
+        <w:rPr>
+          <w:i/>
+          <w:noProof/>
+          <w:lang w:val="id-ID"/>
+        </w:rPr>
+        <w:t xml:space="preserve">Journal of Biomedical Informatics, 181</w:t>
+      </w:r>
+      <w:r>
+        <w:rPr>
+          <w:noProof/>
+          <w:lang w:val="id-ID"/>
+        </w:rPr>
+        <w:t xml:space="preserve">, 105085.</w:t>
+      </w:r>
+    </w:p>
+    <w:p>
+      <w:pPr>
+        <w:spacing w:line="240" w:lineRule="auto"/>
+        <w:ind w:left="720" w:hanging="720"/>
+        <w:rPr>
+          <w:noProof/>
+          <w:lang w:val="id-ID" w:eastAsia="en-US"/>
+        </w:rPr>
+      </w:pPr>
+      <w:r>
+        <w:rPr>
+          <w:noProof/>
+          <w:lang w:val="id-ID"/>
+        </w:rPr>
+        <w:t xml:space="preserve">Woo, B. F. Y., Cato, K., Cho, H., You, S. B., &amp; Song, J. (2026). The use of large language models in clinical documentation: A scoping review. </w:t>
+      </w:r>
+      <w:r>
+        <w:rPr>
+          <w:i/>
+          <w:noProof/>
+          <w:lang w:val="id-ID"/>
+        </w:rPr>
+        <w:t xml:space="preserve">International Journal of Nursing Studies, 176</w:t>
+      </w:r>
+      <w:r>
+        <w:rPr>
+          <w:noProof/>
+          <w:lang w:val="id-ID"/>
+        </w:rPr>
+        <w:t xml:space="preserve">, 105322.</w:t>
       </w:r>
     </w:p>
     <w:p>

</xml_diff>

<commit_message>
feat: draft Bab II subbab II.4 (pendekatan hibrida berbasis aturan dan AI/NLP)
Add II.4 draft from Domingues, Ijadi Maghsoodi et al. plus sections of Kumar
and Chen, with page-verified claims (35/35), register II.4 in the docx build,
rebuild the Utama-template docx with II.1-II.4, and update CONTEXT_TRANSFER.md.

Co-Authored-By: Claude Sonnet 5.5 <noreply@anthropic.com>
Claude-Session: https://claude.ai/code/session_014py9jkTgHZJ9tfrTkQ4xwY
</commit_message>
<xml_diff>
--- a/bab2/Proposal-IF4091-Capstone-Utama-2026_Draft-Bab2.docx
+++ b/bab2/Proposal-IF4091-Capstone-Utama-2026_Draft-Bab2.docx
@@ -4908,6 +4908,168 @@
     </w:p>
     <w:p>
       <w:pPr>
+        <w:pStyle w:val="Heading2"/>
+      </w:pPr>
+      <w:r>
+        <w:t xml:space="preserve">Pendekatan Hibrida Berbasis Aturan dan AI/NLP</w:t>
+      </w:r>
+    </w:p>
+    <w:p>
+      <w:pPr>
+        <w:pStyle w:val="Heading3"/>
+      </w:pPr>
+      <w:r>
+        <w:t xml:space="preserve">Kekuatan dan Batas Sistem Berbasis Aturan</w:t>
+      </w:r>
+    </w:p>
+    <w:p>
+      <w:pPr>
+        <w:rPr>
+          <w:lang w:val="id-ID"/>
+        </w:rPr>
+      </w:pPr>
+      <w:r>
+        <w:rPr>
+          <w:lang w:val="id-ID"/>
+        </w:rPr>
+        <w:t xml:space="preserve">Kumar dkk. (2026) menilai sistem berbasis aturan (</w:t>
+      </w:r>
+      <w:r>
+        <w:rPr>
+          <w:i/>
+          <w:lang w:val="id-ID"/>
+        </w:rPr>
+        <w:t xml:space="preserve">rule-based</w:t>
+      </w:r>
+      <w:r>
+        <w:rPr>
+          <w:lang w:val="id-ID"/>
+        </w:rPr>
+        <w:t xml:space="preserve">) dan hibrida layak dipakai di layanan kesehatan karena transparan dan dapat ditafsirkan (hlm. 12). Keunggulan utama sistem berbasis aturan ialah hasilnya dapat diprediksi dan mudah divalidasi, terutama pada kondisi klinis yang diatur regulasi (hlm. 12). Kelemahannya, menurut Kumar dkk., sistem itu tidak dapat diskalakan lintas institusi dan spesialisasi karena perbedaan bahasa klinis harus dipelihara secara manual, dan kinerjanya umumnya buruk pada dataset baru atau kebiasaan dokumentasi yang berubah (hlm. 12). Karena itu, sistem tersebut paling cocok untuk tugas berlingkup kecil atau sebagai bagian dari </w:t>
+      </w:r>
+      <w:r>
+        <w:rPr>
+          <w:i/>
+          <w:lang w:val="id-ID"/>
+        </w:rPr>
+        <w:t xml:space="preserve">pipeline</w:t>
+      </w:r>
+      <w:r>
+        <w:rPr>
+          <w:lang w:val="id-ID"/>
+        </w:rPr>
+        <w:t xml:space="preserve"> hibrida, bukan sebagai solusi tunggal (hlm. 12). Chen dkk. (2026) sejalan dengan itu: aturan dan leksikon eksplisit masih efektif untuk subtugas sempit seperti disambiguasi singkatan (hlm. 13).</w:t>
+      </w:r>
+    </w:p>
+    <w:p>
+      <w:pPr>
+        <w:rPr>
+          <w:lang w:val="id-ID"/>
+        </w:rPr>
+      </w:pPr>
+      <w:r>
+        <w:rPr>
+          <w:lang w:val="id-ID"/>
+        </w:rPr>
+        <w:t xml:space="preserve">Domingues (2026) menunjukkan sisi keterlacakan sistem berbasis aturan lewat OnCATs, sistem pendukung keputusan klinis untuk kanker prostat yang mengubah 23 pedoman internasional menjadi 1.236 aturan dalam format JSON (hlm. 1, 2). Setiap rekomendasi disertai jejak pembenaran yang menyebut aturan dan sumber pedoman yang aktif (hlm. 2). Sistem itu diuji pada sepuluh laporan kasus terbitan, dan penulisnya menyebut pengujian itu sebagai uji kelayakan teknis, bukan validasi klinis (hlm. 3, 5). Penulis mengaitkan ketidaksesuaian hasil dengan model harapan hidup yang disederhanakan dan data kasus yang tidak lengkap (hlm. 1), serta memperingatkan bahwa imputasi variabel yang hilang dapat membiaskan rekomendasi dan bahwa pembaruan basis pengetahuan secara manual berisiko tertinggal dari praktik klinis (hlm. 7). Meskipun judul artikelnya menyebut metode berbasis aturan dan AI, yang diuji hanya lapisan berbasis aturan; penulis sendiri menyebut sistemnya "</w:t>
+      </w:r>
+      <w:r>
+        <w:rPr>
+          <w:i/>
+          <w:lang w:val="id-ID"/>
+        </w:rPr>
+        <w:t xml:space="preserve">hybrid-ready</w:t>
+      </w:r>
+      <w:r>
+        <w:rPr>
+          <w:lang w:val="id-ID"/>
+        </w:rPr>
+        <w:t xml:space="preserve">", dengan modul pembelajaran mesin baru direncanakan (hlm. 2). Artikel ini karenanya tidak memberi bukti tentang kinerja sistem hibrida, dan domainnya ialah pedoman terapi onkologi, bukan audit dokumentasi.</w:t>
+      </w:r>
+    </w:p>
+    <w:p>
+      <w:pPr>
+        <w:pStyle w:val="Heading3"/>
+      </w:pPr>
+      <w:r>
+        <w:t xml:space="preserve">Pola Hibrida dan Bukti yang Tersedia</w:t>
+      </w:r>
+    </w:p>
+    <w:p>
+      <w:pPr>
+        <w:rPr>
+          <w:lang w:val="id-ID"/>
+        </w:rPr>
+      </w:pPr>
+      <w:r>
+        <w:rPr>
+          <w:lang w:val="id-ID"/>
+        </w:rPr>
+        <w:t xml:space="preserve">Ijadi Maghsoodi dkk. (2026) menyusun tinjauan naratif kritis atas 101 sumber yang dipilih dari 3.892 rekaman, dengan fokus pada sistem hibrida yang lapisan simboliknya, yaitu aturan, ontologi, atau batasan, disusun atau disetujui pemangku kepentingan (hlm. 1, 4). Salah satu dari setidaknya lima pola rancangan yang mereka identifikasi ialah ekstraksi saraf disertai validasi simbolik, tempat pemeriksaan konsistensi dan aturan dokumentasi memvalidasi keluaran model NLP atau model fondasi untuk abstraksi laporan, pengodean, dan pencatatan registri (hlm. 5). Tinjauan itu menyimpulkan bahwa desain hibrida tampak paling kredibel pada situasi yang terikat aturan, peka terhadap audit, dan bergantung pada alur kerja, termasuk validasi dokumentasi (hlm. 1), serta bahwa bukti empiris lebih kuat untuk tugas terbatas seperti validasi laporan dan ekstraksi informasi daripada untuk klaim yang ambisius tentang penalaran klinis, kalibrasi kepercayaan, atau perbaikan luaran pasien (hlm. 7). Untuk dokumentasi buatan model generatif, penulisnya berargumen bahwa validasi hibrida dapat menegakkan elemen wajib dan mendeteksi inkonsistensi (hlm. 7); ini argumen konseptual, bukan hasil uji.</w:t>
+      </w:r>
+    </w:p>
+    <w:p>
+      <w:pPr>
+        <w:rPr>
+          <w:lang w:val="id-ID"/>
+        </w:rPr>
+      </w:pPr>
+      <w:r>
+        <w:rPr>
+          <w:lang w:val="id-ID"/>
+        </w:rPr>
+        <w:t xml:space="preserve">Penulisnya sendiri membatasi kesimpulan itu. Basis empiris masih terbatas dan bukti prospektif jarang (hlm. 1), dan klaim tentang dampak pada mutu keputusan sebaiknya dibaca sebagai pembangkit hipotesis, bukan temuan konfirmatif (hlm. 6). Lapisan simbolik menimbulkan beban akuisisi pengetahuan, ketidakselarasan ontologi, konflik aturan, dan pemeliharaan (hlm. 1, 9). Proses penyaringan tinjauan itu mengecualikan rekaman nonbahasa Inggris (hlm. 2), dan literaturnya terkonsentrasi pada sistem kesehatan berpendapatan tinggi dan matang secara digital (hlm. 9).</w:t>
+      </w:r>
+    </w:p>
+    <w:p>
+      <w:pPr>
+        <w:pStyle w:val="Heading3"/>
+      </w:pPr>
+      <w:r>
+        <w:t xml:space="preserve">Sintesis dan Celah</w:t>
+      </w:r>
+    </w:p>
+    <w:p>
+      <w:pPr>
+        <w:rPr>
+          <w:lang w:val="id-ID"/>
+        </w:rPr>
+      </w:pPr>
+      <w:r>
+        <w:rPr>
+          <w:lang w:val="id-ID"/>
+        </w:rPr>
+        <w:t xml:space="preserve">Sumber-sumber di atas mendukung dua hal yang terbatas: sistem berbasis aturan unggul dalam penelusuran dan validasi tetapi mahal dipelihara, dan kombinasi dengan komponen pembelajaran dinilai paling kredibel untuk validasi dokumentasi menurut satu tinjauan naratif. Keterbatasannya ada tiga. Pertama, di antara sumber yang dibaca, tidak ada yang membandingkan konfigurasi aturan saja dengan aturan ditambah AI/NLP pada audit dokumentasi klinis; satu-satunya sistem yang diuji (Domingues, 2026) hanya berbasis aturan, di bidang onkologi, pada sepuluh kasus. Kedua, dukungan terkuat untuk validasi dokumentasi bersifat konseptual (Ijadi Maghsoodi dkk., 2026, hlm. 7). Ketiga, tidak ada sumber yang menyangkut aturan atau dokumen klaim berbahasa Indonesia. Satu artikel pada daftar sumber, yang judulnya menyebut model hibrida pembelajaran mesin dan sistem pakar untuk identifikasi pemotongan klaim asuransi, belum dapat dibaca karena berkasnya tidak tersedia </w:t>
+      </w:r>
+      <w:r>
+        <w:rPr>
+          <w:highlight w:val="yellow"/>
+          <w:lang w:val="id-ID"/>
+        </w:rPr>
+        <w:t xml:space="preserve">[PERLU VERIFIKASI SUMBER]</w:t>
+      </w:r>
+      <w:r>
+        <w:rPr>
+          <w:lang w:val="id-ID"/>
+        </w:rPr>
+        <w:t xml:space="preserve">. Akibatnya, pembagian kerja antara aturan dan AI/NLP pada penelitian ini merupakan pilihan rancangan yang perlu dibenarkan lewat perbandingan konfigurasi aturan saja dengan aturan ditambah AI/NLP, dengan ukuran dan ambang kegagalan yang ditetapkan sebelum eksperimen </w:t>
+      </w:r>
+      <w:r>
+        <w:rPr>
+          <w:highlight w:val="yellow"/>
+          <w:lang w:val="id-ID"/>
+        </w:rPr>
+        <w:t xml:space="preserve">[SESUAIKAN DENGAN BAB I: rumusan pertanyaan dan ukuran keberhasilan]</w:t>
+      </w:r>
+      <w:r>
+        <w:rPr>
+          <w:lang w:val="id-ID"/>
+        </w:rPr>
+        <w:t xml:space="preserve">.</w:t>
+      </w:r>
+    </w:p>
+    <w:p>
+      <w:pPr>
         <w:pStyle w:val="Heading1"/>
       </w:pPr>
       <w:r>
@@ -5414,7 +5576,7 @@
           <w:noProof/>
           <w:lang w:val="id-ID"/>
         </w:rPr>
-        <w:t xml:space="preserve">Du, W. (H.), Wang, G., Xu, J. (N.), &amp; Vasarhelyi, M. A. (2026). Information systems auditing of psychiatric diagnoses using context-enriched QA-based language models. </w:t>
+        <w:t xml:space="preserve">Domingues, N. S. (2026). A hybrid decision support system using rule-based and AI methods: The OnCATs knowledge-based framework. </w:t>
       </w:r>
       <w:r>
         <w:rPr>
@@ -5422,14 +5584,14 @@
           <w:noProof/>
           <w:lang w:val="id-ID"/>
         </w:rPr>
-        <w:t xml:space="preserve">Data Science and Management, 9</w:t>
+        <w:t xml:space="preserve">International Journal of Medical Informatics, 206</w:t>
       </w:r>
       <w:r>
         <w:rPr>
           <w:noProof/>
           <w:lang w:val="id-ID"/>
         </w:rPr>
-        <w:t xml:space="preserve">, 100177.</w:t>
+        <w:t xml:space="preserve">, 106144.</w:t>
       </w:r>
     </w:p>
     <w:p>
@@ -5446,7 +5608,7 @@
           <w:noProof/>
           <w:lang w:val="id-ID"/>
         </w:rPr>
-        <w:t xml:space="preserve">Elvas, L. B., Almeida, A., &amp; Ferreira, J. C. (2025). Natural language processing in medical text processing: A scoping literature review. </w:t>
+        <w:t xml:space="preserve">Du, W. (H.), Wang, G., Xu, J. (N.), &amp; Vasarhelyi, M. A. (2026). Information systems auditing of psychiatric diagnoses using context-enriched QA-based language models. </w:t>
       </w:r>
       <w:r>
         <w:rPr>
@@ -5454,14 +5616,14 @@
           <w:noProof/>
           <w:lang w:val="id-ID"/>
         </w:rPr>
-        <w:t xml:space="preserve">International Journal of Medical Informatics, 204</w:t>
+        <w:t xml:space="preserve">Data Science and Management, 9</w:t>
       </w:r>
       <w:r>
         <w:rPr>
           <w:noProof/>
           <w:lang w:val="id-ID"/>
         </w:rPr>
-        <w:t xml:space="preserve">, 106049.</w:t>
+        <w:t xml:space="preserve">, 100177.</w:t>
       </w:r>
     </w:p>
     <w:p>
@@ -5478,7 +5640,7 @@
           <w:noProof/>
           <w:lang w:val="id-ID"/>
         </w:rPr>
-        <w:t xml:space="preserve">Hou, W.-h., Wang, X.-k., Wang, Y.-n., Wang, J.-q., &amp; Xiao, F. (2024). Modelling long medical documents and code associations for explainable automatic ICD coding. </w:t>
+        <w:t xml:space="preserve">Elvas, L. B., Almeida, A., &amp; Ferreira, J. C. (2025). Natural language processing in medical text processing: A scoping literature review. </w:t>
       </w:r>
       <w:r>
         <w:rPr>
@@ -5486,6 +5648,38 @@
           <w:noProof/>
           <w:lang w:val="id-ID"/>
         </w:rPr>
+        <w:t xml:space="preserve">International Journal of Medical Informatics, 204</w:t>
+      </w:r>
+      <w:r>
+        <w:rPr>
+          <w:noProof/>
+          <w:lang w:val="id-ID"/>
+        </w:rPr>
+        <w:t xml:space="preserve">, 106049.</w:t>
+      </w:r>
+    </w:p>
+    <w:p>
+      <w:pPr>
+        <w:spacing w:line="240" w:lineRule="auto"/>
+        <w:ind w:left="720" w:hanging="720"/>
+        <w:rPr>
+          <w:noProof/>
+          <w:lang w:val="id-ID" w:eastAsia="en-US"/>
+        </w:rPr>
+      </w:pPr>
+      <w:r>
+        <w:rPr>
+          <w:noProof/>
+          <w:lang w:val="id-ID"/>
+        </w:rPr>
+        <w:t xml:space="preserve">Hou, W.-h., Wang, X.-k., Wang, Y.-n., Wang, J.-q., &amp; Xiao, F. (2024). Modelling long medical documents and code associations for explainable automatic ICD coding. </w:t>
+      </w:r>
+      <w:r>
+        <w:rPr>
+          <w:i/>
+          <w:noProof/>
+          <w:lang w:val="id-ID"/>
+        </w:rPr>
         <w:t xml:space="preserve">Expert Systems with Applications, 249</w:t>
       </w:r>
       <w:r>
@@ -5494,6 +5688,38 @@
           <w:lang w:val="id-ID"/>
         </w:rPr>
         <w:t xml:space="preserve">, 123519.</w:t>
+      </w:r>
+    </w:p>
+    <w:p>
+      <w:pPr>
+        <w:spacing w:line="240" w:lineRule="auto"/>
+        <w:ind w:left="720" w:hanging="720"/>
+        <w:rPr>
+          <w:noProof/>
+          <w:lang w:val="id-ID" w:eastAsia="en-US"/>
+        </w:rPr>
+      </w:pPr>
+      <w:r>
+        <w:rPr>
+          <w:noProof/>
+          <w:lang w:val="id-ID"/>
+        </w:rPr>
+        <w:t xml:space="preserve">Ijadi Maghsoodi, A., Kurz, J., Lawrenson, R., Parsons, M., Walker, C., O'Sullivan, M., &amp; Rouse, P. (2026). Artificial intelligence for decision-making in healthcare: A critical review of decision-maker-governed hybrid systems across clinical, operational, and policy settings. </w:t>
+      </w:r>
+      <w:r>
+        <w:rPr>
+          <w:i/>
+          <w:noProof/>
+          <w:lang w:val="id-ID"/>
+        </w:rPr>
+        <w:t xml:space="preserve">Health Policy and Technology, 15</w:t>
+      </w:r>
+      <w:r>
+        <w:rPr>
+          <w:noProof/>
+          <w:lang w:val="id-ID"/>
+        </w:rPr>
+        <w:t xml:space="preserve">, 101292.</w:t>
       </w:r>
     </w:p>
     <w:p>

</xml_diff>

<commit_message>
feat: draft Bab II subbab II.5 (RAG, penjangkaran bukti, dan halusinasi)
Add II.5 draft from eight source PDFs with page-verified claims (64/64),
register II.5 in the docx build, rebuild the Utama-template docx with
II.1-II.5, and update CONTEXT_TRANSFER.md.

Co-Authored-By: Claude Sonnet 5.5 <noreply@anthropic.com>
Claude-Session: https://claude.ai/code/session_014py9jkTgHZJ9tfrTkQ4xwY
</commit_message>
<xml_diff>
--- a/bab2/Proposal-IF4091-Capstone-Utama-2026_Draft-Bab2.docx
+++ b/bab2/Proposal-IF4091-Capstone-Utama-2026_Draft-Bab2.docx
@@ -5070,6 +5070,344 @@
     </w:p>
     <w:p>
       <w:pPr>
+        <w:pStyle w:val="Heading2"/>
+      </w:pPr>
+      <w:r>
+        <w:t xml:space="preserve">RAG, Penjangkaran Bukti, dan Halusinasi</w:t>
+      </w:r>
+    </w:p>
+    <w:p>
+      <w:pPr>
+        <w:pStyle w:val="Heading3"/>
+      </w:pPr>
+      <w:r>
+        <w:t xml:space="preserve">RAG pada Teks Klinis</w:t>
+      </w:r>
+    </w:p>
+    <w:p>
+      <w:pPr>
+        <w:rPr>
+          <w:lang w:val="id-ID"/>
+        </w:rPr>
+      </w:pPr>
+      <w:r>
+        <w:rPr>
+          <w:i/>
+          <w:lang w:val="id-ID"/>
+        </w:rPr>
+        <w:t xml:space="preserve">Retrieval-augmented generation</w:t>
+      </w:r>
+      <w:r>
+        <w:rPr>
+          <w:lang w:val="id-ID"/>
+        </w:rPr>
+        <w:t xml:space="preserve"> (RAG) menyisipkan bukti yang diambil dari sumber luar ke dalam masukan LLM sebelum model membangkitkan jawaban. Yang dkk. (2026) menelaah 251 studi RAG di bidang medis dan menemukan bahwa aplikasinya terkonsentrasi pada tanya jawab, pembuatan laporan, peringkasan teks, dan ekstraksi informasi (hlm. 2). Sumber pengetahuan yang paling sering dipakai ialah korpus ilmiah biomedis (88 studi), pedoman klinis (67 studi), dan rekam medis elektronik (33 studi) (hlm. 3). Dari 188 studi yang memakai </w:t>
+      </w:r>
+      <w:r>
+        <w:rPr>
+          <w:i/>
+          <w:lang w:val="id-ID"/>
+        </w:rPr>
+        <w:t xml:space="preserve">retrieval</w:t>
+      </w:r>
+      <w:r>
+        <w:rPr>
+          <w:lang w:val="id-ID"/>
+        </w:rPr>
+        <w:t xml:space="preserve"> padat, hanya 24 yang secara eksplisit memakai model </w:t>
+      </w:r>
+      <w:r>
+        <w:rPr>
+          <w:i/>
+          <w:lang w:val="id-ID"/>
+        </w:rPr>
+        <w:t xml:space="preserve">embedding</w:t>
+      </w:r>
+      <w:r>
+        <w:rPr>
+          <w:lang w:val="id-ID"/>
+        </w:rPr>
+        <w:t xml:space="preserve"> multibahasa; sisanya memakai model yang berpusat pada bahasa Inggris (hlm. 4). Penulisnya menilai RAG medis masih berada pada tahap awal dan memerlukan validasi klinis serta adaptasi lintas bahasa (hlm. 2). Landolsi dkk. (2026) menelaah 57 studi pada sepuluh bidang medis; hanya enam di antaranya yang memakai sumber nonbarat atau nonbahasa Inggris, dan hanya empat yang divalidasi lintas institusi (hlm. 6, 19).</w:t>
+      </w:r>
+    </w:p>
+    <w:p>
+      <w:pPr>
+        <w:rPr>
+          <w:lang w:val="id-ID"/>
+        </w:rPr>
+      </w:pPr>
+      <w:r>
+        <w:rPr>
+          <w:lang w:val="id-ID"/>
+        </w:rPr>
+        <w:t xml:space="preserve">Zhang dkk. (2026) memberi bukti yang paling dekat dengan catatan klinis sehari-hari. Mereka membandingkan enam strategi </w:t>
+      </w:r>
+      <w:r>
+        <w:rPr>
+          <w:i/>
+          <w:lang w:val="id-ID"/>
+        </w:rPr>
+        <w:t xml:space="preserve">retrieval</w:t>
+      </w:r>
+      <w:r>
+        <w:rPr>
+          <w:lang w:val="id-ID"/>
+        </w:rPr>
+        <w:t xml:space="preserve"> pada catatan keperawatan fasilitas perawatan lansia di Australia, dengan Llama 3.1 8B sebagai pembangkit dan indeks yang dibangun dari segmen catatan itu sendiri, untuk dua tugas ekstraksi entitas yang masing-masing diuji pada 208 rekaman (hlm. 1, 5). Tanpa </w:t>
+      </w:r>
+      <w:r>
+        <w:rPr>
+          <w:i/>
+          <w:lang w:val="id-ID"/>
+        </w:rPr>
+        <w:t xml:space="preserve">retrieval</w:t>
+      </w:r>
+      <w:r>
+        <w:rPr>
+          <w:lang w:val="id-ID"/>
+        </w:rPr>
+        <w:t xml:space="preserve">, F1 jawaban ialah 0,702 untuk gejala agitasi pada demensia dan 0,722 untuk faktor risiko malnutrisi; dengan </w:t>
+      </w:r>
+      <w:r>
+        <w:rPr>
+          <w:i/>
+          <w:lang w:val="id-ID"/>
+        </w:rPr>
+        <w:t xml:space="preserve">dense reranking</w:t>
+      </w:r>
+      <w:r>
+        <w:rPr>
+          <w:lang w:val="id-ID"/>
+        </w:rPr>
+        <w:t xml:space="preserve">, angkanya 0,946 dan 0,953 (hlm. 6). F1 jawaban itu dihitung dengan BERTScore, yaitu kemiripan semantik terhadap anotasi acuan (hlm. 3), bukan kecocokan label persis. Galat yang paling sering ialah fabrikasi intrinsik, yaitu model memutarbalikkan informasi yang ada di teks sumber, disusul fabrikasi ekstrinsik dan negatif palsu (hlm. 8, 9). Penulisnya membatasi kesimpulan pada dua tugas berbasis skema; ekstraksi relasi, penalaran temporal, dan tanya jawab terbuka tidak dievaluasi (hlm. 11). Jia dkk. (2026) menguji agen dengan </w:t>
+      </w:r>
+      <w:r>
+        <w:rPr>
+          <w:i/>
+          <w:lang w:val="id-ID"/>
+        </w:rPr>
+        <w:t xml:space="preserve">retrieval</w:t>
+      </w:r>
+      <w:r>
+        <w:rPr>
+          <w:lang w:val="id-ID"/>
+        </w:rPr>
+        <w:t xml:space="preserve">, </w:t>
+      </w:r>
+      <w:r>
+        <w:rPr>
+          <w:i/>
+          <w:lang w:val="id-ID"/>
+        </w:rPr>
+        <w:t xml:space="preserve">reranking</w:t>
+      </w:r>
+      <w:r>
+        <w:rPr>
+          <w:lang w:val="id-ID"/>
+        </w:rPr>
+        <w:t xml:space="preserve">, dan penjangkaran bukti pada tolok ukur tanya jawab berformat ujian dan melaporkan akurasi 82,98% pada USMLE Step 1, di atas 80,67% untuk GPT-4 (hlm. 2).</w:t>
+      </w:r>
+    </w:p>
+    <w:p>
+      <w:pPr>
+        <w:pStyle w:val="Heading3"/>
+      </w:pPr>
+      <w:r>
+        <w:t xml:space="preserve">Penjangkaran Bukti dan Pengecekan Keluaran</w:t>
+      </w:r>
+    </w:p>
+    <w:p>
+      <w:pPr>
+        <w:rPr>
+          <w:lang w:val="id-ID"/>
+        </w:rPr>
+      </w:pPr>
+      <w:r>
+        <w:rPr>
+          <w:lang w:val="id-ID"/>
+        </w:rPr>
+        <w:t xml:space="preserve">Waqas dkk. (2026) membedakan halusinasi faktual, </w:t>
+      </w:r>
+      <w:r>
+        <w:rPr>
+          <w:i/>
+          <w:lang w:val="id-ID"/>
+        </w:rPr>
+        <w:t xml:space="preserve">faithful</w:t>
+      </w:r>
+      <w:r>
+        <w:rPr>
+          <w:lang w:val="id-ID"/>
+        </w:rPr>
+        <w:t xml:space="preserve"> (tidak sesuai dengan masukan), logis, dan temporal (hlm. 4). Survei atas 90 publikasi itu, yang tidak memakai penilaian risiko bias formal (hlm. 4), mengutip RAGTruth bahwa halusinasi tetap terjadi ketika konteks ambigu atau </w:t>
+      </w:r>
+      <w:r>
+        <w:rPr>
+          <w:i/>
+          <w:lang w:val="id-ID"/>
+        </w:rPr>
+        <w:t xml:space="preserve">retrieval</w:t>
+      </w:r>
+      <w:r>
+        <w:rPr>
+          <w:lang w:val="id-ID"/>
+        </w:rPr>
+        <w:t xml:space="preserve"> gagal menemukan semua bukti yang relevan (hlm. 10), dan menyatakan bahwa bidang kesehatan membutuhkan laju positif palsu yang sangat rendah (hlm. 18). Sun dkk. (2025) menelaah 55 artikel, 15 di antaranya tentang halusinasi, dan menemukan bahwa mitigasi halusinasi sebagian besar dikaji pada tugas tanya jawab, dataset deteksi halusinasi langka, serta evaluasinya bergantung pada penilaian pakar tanpa kerangka baku (hlm. 15, 18).</w:t>
+      </w:r>
+    </w:p>
+    <w:p>
+      <w:pPr>
+        <w:rPr>
+          <w:lang w:val="id-ID"/>
+        </w:rPr>
+      </w:pPr>
+      <w:r>
+        <w:rPr>
+          <w:lang w:val="id-ID"/>
+        </w:rPr>
+        <w:t xml:space="preserve">Li dkk. (2026) mencontohkan penjangkaran bukti pada pendukung keputusan bedah tulang belakang. Pangkalan pengetahuannya memuat pedoman dan literatur yang masing-masing diberi ID, sumber, tahun, dan tingkat bukti, dan diperbarui tiap enam bulan dengan penanda versi (hlm. 3, 4). Empat paragraf teratas disisipkan ke masukan model, keluaran berformat “rekomendasi + paragraf kutipan”, dan model diinstruksikan menjawab </w:t>
+      </w:r>
+      <w:r>
+        <w:rPr>
+          <w:i/>
+          <w:lang w:val="id-ID"/>
+        </w:rPr>
+        <w:t xml:space="preserve">“no clear conclusions available”</w:t>
+      </w:r>
+      <w:r>
+        <w:rPr>
+          <w:lang w:val="id-ID"/>
+        </w:rPr>
+        <w:t xml:space="preserve"> bila literatur tidak memberi jawaban pasti (hlm. 4). Lima ahli bedah menilai 200 kasus dengan rubrik 11 dimensi, termasuk ketepatan bukti yang dikutip (hlm. 1, 5). Namun yang dibandingkan ialah empat agen LLM dalam satu kerangka RAG di satu pusat, bukan RAG terhadap tanpa RAG (hlm. 9), dan artikelnya tidak menguraikan pemeriksaan kutipan otomatis.</w:t>
+      </w:r>
+    </w:p>
+    <w:p>
+      <w:pPr>
+        <w:rPr>
+          <w:lang w:val="id-ID"/>
+        </w:rPr>
+      </w:pPr>
+      <w:r>
+        <w:rPr>
+          <w:lang w:val="id-ID"/>
+        </w:rPr>
+        <w:t xml:space="preserve">Zeba dkk. (2026) menempuh cara lain: modul pemeriksa fakta tanpa LLM yang memeriksa keluaran LLM terhadap rekam medis sumber (hlm. 1). Ringkasan dan rekam medis dipecah menjadi proposisi atomik (hlm. 7), lalu setiap proposisi diberi vonis Didukung atau Tidak Didukung melalui pemeriksaan negasi, implikasi, konsistensi temporal, eksklusivitas bersama, kecocokan numerik, dan keberadaan (hlm. 6, 14). Pada 104 ringkasan yang diekstrak menjadi 3.786 proposisi dan divalidasi dokter, modul itu mencapai presisi 0,8904, </w:t>
+      </w:r>
+      <w:r>
+        <w:rPr>
+          <w:i/>
+          <w:lang w:val="id-ID"/>
+        </w:rPr>
+        <w:t xml:space="preserve">recall</w:t>
+      </w:r>
+      <w:r>
+        <w:rPr>
+          <w:lang w:val="id-ID"/>
+        </w:rPr>
+        <w:t xml:space="preserve"> 0,8234, dan F1 0,8556 (hlm. 1). Tanpa pemeriksaan negasi dan numerik, presisinya turun lebih dari 8% (hlm. 14). Datanya berasal dari MIMIC-III, rekam medis unit perawatan intensif (hlm. 10), dan penulisnya menyatakan sistem kurang andal pada bidang yang kurang terwakili, termasuk gangguan metabolik anak, serta hanya memberi vonis biner tanpa usul perbaikan (hlm. 15).</w:t>
+      </w:r>
+    </w:p>
+    <w:p>
+      <w:pPr>
+        <w:pStyle w:val="Heading3"/>
+      </w:pPr>
+      <w:r>
+        <w:t xml:space="preserve">Sintesis dan Celah</w:t>
+      </w:r>
+    </w:p>
+    <w:p>
+      <w:pPr>
+        <w:rPr>
+          <w:lang w:val="id-ID"/>
+        </w:rPr>
+      </w:pPr>
+      <w:r>
+        <w:rPr>
+          <w:lang w:val="id-ID"/>
+        </w:rPr>
+        <w:t xml:space="preserve">Sumber-sumber di atas menunjukkan bahwa </w:t>
+      </w:r>
+      <w:r>
+        <w:rPr>
+          <w:i/>
+          <w:lang w:val="id-ID"/>
+        </w:rPr>
+        <w:t xml:space="preserve">retrieval</w:t>
+      </w:r>
+      <w:r>
+        <w:rPr>
+          <w:lang w:val="id-ID"/>
+        </w:rPr>
+        <w:t xml:space="preserve"> menaikkan kinerja ekstraksi pada catatan klinis dan bahwa keluaran dapat ditautkan serta diperiksa terhadap sumbernya, tetapi ada empat celah bagi penelitian ini. Pertama, aplikasi RAG terkonsentrasi pada tanya jawab, pembuatan laporan, peringkasan, dan ekstraksi (Yang dkk., 2026, hlm. 2), dan bukti kinerja yang paling mencolok berasal dari soal ujian (Jia dkk., 2026, hlm. 2); di antara sumber yang dibaca, tidak ada yang menguji RAG untuk memeriksa kesesuaian antardokumen dalam satu episode rawat. Kedua, tidak ada sumber yang menguji teks klinis berbahasa Indonesia, dan </w:t>
+      </w:r>
+      <w:r>
+        <w:rPr>
+          <w:i/>
+          <w:lang w:val="id-ID"/>
+        </w:rPr>
+        <w:t xml:space="preserve">retrieval</w:t>
+      </w:r>
+      <w:r>
+        <w:rPr>
+          <w:lang w:val="id-ID"/>
+        </w:rPr>
+        <w:t xml:space="preserve"> umumnya memakai model berpusat pada bahasa Inggris (Yang dkk., 2026, hlm. 4; Landolsi dkk., 2026, hlm. 19). Ketiga, pemeriksaan keluaran terhadap sumber baru didemonstrasikan pada ringkasan LLM atas rekam medis berbahasa Inggris (Zeba dkk., 2026), sedangkan ketepatan kutipan pada Li dkk. (2026) dinilai ahli. Keempat, kontribusi </w:t>
+      </w:r>
+      <w:r>
+        <w:rPr>
+          <w:i/>
+          <w:lang w:val="id-ID"/>
+        </w:rPr>
+        <w:t xml:space="preserve">retrieval</w:t>
+      </w:r>
+      <w:r>
+        <w:rPr>
+          <w:lang w:val="id-ID"/>
+        </w:rPr>
+        <w:t xml:space="preserve"> dibandingkan dengan kondisi tanpa </w:t>
+      </w:r>
+      <w:r>
+        <w:rPr>
+          <w:i/>
+          <w:lang w:val="id-ID"/>
+        </w:rPr>
+        <w:t xml:space="preserve">retrieval</w:t>
+      </w:r>
+      <w:r>
+        <w:rPr>
+          <w:lang w:val="id-ID"/>
+        </w:rPr>
+        <w:t xml:space="preserve"> hanya pada dua tugas ekstraksi berbasis skema (Zhang dkk., 2026, hlm. 6, 11); pada audit, kontribusinya terhadap mutu temuan dan biaya positif palsunya belum diukur. Akibatnya, manfaat RAG pada audit dokumentasi rawat inap kebidanan dan anak perlu diuji dengan membandingkan konfigurasi dengan dan tanpa </w:t>
+      </w:r>
+      <w:r>
+        <w:rPr>
+          <w:i/>
+          <w:lang w:val="id-ID"/>
+        </w:rPr>
+        <w:t xml:space="preserve">retrieval</w:t>
+      </w:r>
+      <w:r>
+        <w:rPr>
+          <w:lang w:val="id-ID"/>
+        </w:rPr>
+        <w:t xml:space="preserve">, memakai ukuran dan ambang kegagalan yang ditetapkan sebelum eksperimen </w:t>
+      </w:r>
+      <w:r>
+        <w:rPr>
+          <w:highlight w:val="yellow"/>
+          <w:lang w:val="id-ID"/>
+        </w:rPr>
+        <w:t xml:space="preserve">[SESUAIKAN DENGAN BAB I: rumusan pertanyaan dan ukuran keberhasilan]</w:t>
+      </w:r>
+      <w:r>
+        <w:rPr>
+          <w:lang w:val="id-ID"/>
+        </w:rPr>
+        <w:t xml:space="preserve">.</w:t>
+      </w:r>
+    </w:p>
+    <w:p>
+      <w:pPr>
         <w:pStyle w:val="Heading1"/>
       </w:pPr>
       <w:r>
@@ -5800,7 +6138,7 @@
           <w:noProof/>
           <w:lang w:val="id-ID"/>
         </w:rPr>
-        <w:t xml:space="preserve">Kumar, D., Choudhary, N., Gupta, V., Tanwar, R., Behmani, K., Antal, S., Jarora, S., Gupta, S., Shaikh, M. S., Webster, T. J., &amp; Faiyazuddin, M. (2026). Natural language processing in healthcare: From unstructured data to clinical intelligence. </w:t>
+        <w:t xml:space="preserve">Jia, S., Bit, S., Jasodanand, V. H., Liu, Y., &amp; Kolachalama, V. B. (2026). Agentic memory-augmented retrieval and evidence grounding for medical question-answering tasks. </w:t>
       </w:r>
       <w:r>
         <w:rPr>
@@ -5808,14 +6146,14 @@
           <w:noProof/>
           <w:lang w:val="id-ID"/>
         </w:rPr>
-        <w:t xml:space="preserve">Intelligent Systems with Applications, 31</w:t>
-      </w:r>
-      <w:r>
-        <w:rPr>
-          <w:noProof/>
-          <w:lang w:val="id-ID"/>
-        </w:rPr>
-        <w:t xml:space="preserve">, 200698.</w:t>
+        <w:t xml:space="preserve">International Journal of Medical Informatics, 212</w:t>
+      </w:r>
+      <w:r>
+        <w:rPr>
+          <w:noProof/>
+          <w:lang w:val="id-ID"/>
+        </w:rPr>
+        <w:t xml:space="preserve">, 106339.</w:t>
       </w:r>
     </w:p>
     <w:p>
@@ -5832,7 +6170,7 @@
           <w:noProof/>
           <w:lang w:val="id-ID"/>
         </w:rPr>
-        <w:t xml:space="preserve">Lebeña, N., Casillas, A., &amp; Pérez, A. (2025). Large language models aided patient progression documentation according to the ICD standard. </w:t>
+        <w:t xml:space="preserve">Kumar, D., Choudhary, N., Gupta, V., Tanwar, R., Behmani, K., Antal, S., Jarora, S., Gupta, S., Shaikh, M. S., Webster, T. J., &amp; Faiyazuddin, M. (2026). Natural language processing in healthcare: From unstructured data to clinical intelligence. </w:t>
       </w:r>
       <w:r>
         <w:rPr>
@@ -5840,14 +6178,14 @@
           <w:noProof/>
           <w:lang w:val="id-ID"/>
         </w:rPr>
-        <w:t xml:space="preserve">Informatics in Medicine Unlocked, 55</w:t>
-      </w:r>
-      <w:r>
-        <w:rPr>
-          <w:noProof/>
-          <w:lang w:val="id-ID"/>
-        </w:rPr>
-        <w:t xml:space="preserve">, 101637.</w:t>
+        <w:t xml:space="preserve">Intelligent Systems with Applications, 31</w:t>
+      </w:r>
+      <w:r>
+        <w:rPr>
+          <w:noProof/>
+          <w:lang w:val="id-ID"/>
+        </w:rPr>
+        <w:t xml:space="preserve">, 200698.</w:t>
       </w:r>
     </w:p>
     <w:p>
@@ -5864,7 +6202,7 @@
           <w:noProof/>
           <w:lang w:val="id-ID"/>
         </w:rPr>
-        <w:t xml:space="preserve">Luo, X., Deng, Z., Yang, B., &amp; Luo, M. Y. (2024). Pre-trained language models in medicine: A survey. </w:t>
+        <w:t xml:space="preserve">Landolsi, M. Y., Fadhli, I., Boufaied, A., &amp; Ben Romdhane, L. (2026). Recent trends of retrieval-augmented generation in healthcare: A systematic review. </w:t>
       </w:r>
       <w:r>
         <w:rPr>
@@ -5872,14 +6210,14 @@
           <w:noProof/>
           <w:lang w:val="id-ID"/>
         </w:rPr>
-        <w:t xml:space="preserve">Artificial Intelligence in Medicine, 154</w:t>
-      </w:r>
-      <w:r>
-        <w:rPr>
-          <w:noProof/>
-          <w:lang w:val="id-ID"/>
-        </w:rPr>
-        <w:t xml:space="preserve">, 102904.</w:t>
+        <w:t xml:space="preserve">Engineering Applications of Artificial Intelligence, 182</w:t>
+      </w:r>
+      <w:r>
+        <w:rPr>
+          <w:noProof/>
+          <w:lang w:val="id-ID"/>
+        </w:rPr>
+        <w:t xml:space="preserve">, 115912.</w:t>
       </w:r>
     </w:p>
     <w:p>
@@ -5896,7 +6234,7 @@
           <w:noProof/>
           <w:lang w:val="id-ID"/>
         </w:rPr>
-        <w:t xml:space="preserve">Mwogosi, A., &amp; Mambile, C. (2026). Concordance of electronic health record data with ICD classification and evidence-based treatment guidelines: A systematic review and meta-analysis. </w:t>
+        <w:t xml:space="preserve">Lebeña, N., Casillas, A., &amp; Pérez, A. (2025). Large language models aided patient progression documentation according to the ICD standard. </w:t>
       </w:r>
       <w:r>
         <w:rPr>
@@ -5904,14 +6242,14 @@
           <w:noProof/>
           <w:lang w:val="id-ID"/>
         </w:rPr>
-        <w:t xml:space="preserve">Health Policy and Technology, 15</w:t>
-      </w:r>
-      <w:r>
-        <w:rPr>
-          <w:noProof/>
-          <w:lang w:val="id-ID"/>
-        </w:rPr>
-        <w:t xml:space="preserve">, 101213.</w:t>
+        <w:t xml:space="preserve">Informatics in Medicine Unlocked, 55</w:t>
+      </w:r>
+      <w:r>
+        <w:rPr>
+          <w:noProof/>
+          <w:lang w:val="id-ID"/>
+        </w:rPr>
+        <w:t xml:space="preserve">, 101637.</w:t>
       </w:r>
     </w:p>
     <w:p>
@@ -5928,7 +6266,7 @@
           <w:noProof/>
           <w:lang w:val="id-ID"/>
         </w:rPr>
-        <w:t xml:space="preserve">Nilasari, E. V., &amp; Soelistijanto, B. (2026). A preliminary study on mitigating upcoding in Indonesia's national health insurance using multi-agent multi-armed bandits. </w:t>
+        <w:t xml:space="preserve">Li, Y., Lv, M., Cheng, L., Xie, Y., Gu, Q., He, H., Chen, Z., Fang, D., &amp; Zhou, X. (2026). Explainable and evidence-linked recommendations for spine surgery via a retrieval-augmented LLM agent. </w:t>
       </w:r>
       <w:r>
         <w:rPr>
@@ -5936,14 +6274,14 @@
           <w:noProof/>
           <w:lang w:val="id-ID"/>
         </w:rPr>
-        <w:t xml:space="preserve">Procedia Computer Science, 289</w:t>
-      </w:r>
-      <w:r>
-        <w:rPr>
-          <w:noProof/>
-          <w:lang w:val="id-ID"/>
-        </w:rPr>
-        <w:t xml:space="preserve">, 851–858.</w:t>
+        <w:t xml:space="preserve">European Journal of Radiology, 197</w:t>
+      </w:r>
+      <w:r>
+        <w:rPr>
+          <w:noProof/>
+          <w:lang w:val="id-ID"/>
+        </w:rPr>
+        <w:t xml:space="preserve">, 112734.</w:t>
       </w:r>
     </w:p>
     <w:p>
@@ -5960,7 +6298,7 @@
           <w:noProof/>
           <w:lang w:val="id-ID"/>
         </w:rPr>
-        <w:t xml:space="preserve">Olex, A. L., &amp; McInnes, B. T. (2021). Review of temporal reasoning in the clinical domain for timeline extraction: Where we are and where we need to be. </w:t>
+        <w:t xml:space="preserve">Luo, X., Deng, Z., Yang, B., &amp; Luo, M. Y. (2024). Pre-trained language models in medicine: A survey. </w:t>
       </w:r>
       <w:r>
         <w:rPr>
@@ -5968,14 +6306,14 @@
           <w:noProof/>
           <w:lang w:val="id-ID"/>
         </w:rPr>
-        <w:t xml:space="preserve">Journal of Biomedical Informatics, 118</w:t>
-      </w:r>
-      <w:r>
-        <w:rPr>
-          <w:noProof/>
-          <w:lang w:val="id-ID"/>
-        </w:rPr>
-        <w:t xml:space="preserve">, 103784.</w:t>
+        <w:t xml:space="preserve">Artificial Intelligence in Medicine, 154</w:t>
+      </w:r>
+      <w:r>
+        <w:rPr>
+          <w:noProof/>
+          <w:lang w:val="id-ID"/>
+        </w:rPr>
+        <w:t xml:space="preserve">, 102904.</w:t>
       </w:r>
     </w:p>
     <w:p>
@@ -5992,7 +6330,7 @@
           <w:noProof/>
           <w:lang w:val="id-ID"/>
         </w:rPr>
-        <w:t xml:space="preserve">Rachmawaty, R., Sinrang, A. W., Wahyudin, E., &amp; Bukhari, A. (2021). Evaluation of health care quality among insured patients in Indonesian mother &amp; child hospital: A secondary data analysis. </w:t>
+        <w:t xml:space="preserve">Mwogosi, A., &amp; Mambile, C. (2026). Concordance of electronic health record data with ICD classification and evidence-based treatment guidelines: A systematic review and meta-analysis. </w:t>
       </w:r>
       <w:r>
         <w:rPr>
@@ -6000,14 +6338,14 @@
           <w:noProof/>
           <w:lang w:val="id-ID"/>
         </w:rPr>
-        <w:t xml:space="preserve">Gaceta Sanitaria, 35</w:t>
-      </w:r>
-      <w:r>
-        <w:rPr>
-          <w:noProof/>
-          <w:lang w:val="id-ID"/>
-        </w:rPr>
-        <w:t xml:space="preserve">(S2), S613–S618.</w:t>
+        <w:t xml:space="preserve">Health Policy and Technology, 15</w:t>
+      </w:r>
+      <w:r>
+        <w:rPr>
+          <w:noProof/>
+          <w:lang w:val="id-ID"/>
+        </w:rPr>
+        <w:t xml:space="preserve">, 101213.</w:t>
       </w:r>
     </w:p>
     <w:p>
@@ -6024,7 +6362,7 @@
           <w:noProof/>
           <w:lang w:val="id-ID"/>
         </w:rPr>
-        <w:t xml:space="preserve">Simbolon, F., &amp; Gani, A. (2023). Faktor-faktor yang mempengaruhi terjadinya pending klaim rawat inap: Literatur review. </w:t>
+        <w:t xml:space="preserve">Nilasari, E. V., &amp; Soelistijanto, B. (2026). A preliminary study on mitigating upcoding in Indonesia's national health insurance using multi-agent multi-armed bandits. </w:t>
       </w:r>
       <w:r>
         <w:rPr>
@@ -6032,14 +6370,14 @@
           <w:noProof/>
           <w:lang w:val="id-ID"/>
         </w:rPr>
-        <w:t xml:space="preserve">Jurnal Keperawatan dan Kesehatan, 14</w:t>
-      </w:r>
-      <w:r>
-        <w:rPr>
-          <w:noProof/>
-          <w:lang w:val="id-ID"/>
-        </w:rPr>
-        <w:t xml:space="preserve">(1), 72–78.</w:t>
+        <w:t xml:space="preserve">Procedia Computer Science, 289</w:t>
+      </w:r>
+      <w:r>
+        <w:rPr>
+          <w:noProof/>
+          <w:lang w:val="id-ID"/>
+        </w:rPr>
+        <w:t xml:space="preserve">, 851–858.</w:t>
       </w:r>
     </w:p>
     <w:p>
@@ -6056,7 +6394,7 @@
           <w:noProof/>
           <w:lang w:val="id-ID"/>
         </w:rPr>
-        <w:t xml:space="preserve">Skrabic, R., Viculin, I., Boban, Z., Kumric, M., Vilovic, M., Vrdoljak, J., &amp; Bozic, J. (2026). Large language models as second reviewers for medical errors in real-world internal medicine reports: A prospective comparative study of open- and closed-source models. </w:t>
+        <w:t xml:space="preserve">Olex, A. L., &amp; McInnes, B. T. (2021). Review of temporal reasoning in the clinical domain for timeline extraction: Where we are and where we need to be. </w:t>
       </w:r>
       <w:r>
         <w:rPr>
@@ -6064,14 +6402,14 @@
           <w:noProof/>
           <w:lang w:val="id-ID"/>
         </w:rPr>
-        <w:t xml:space="preserve">International Journal of Medical Informatics, 211</w:t>
-      </w:r>
-      <w:r>
-        <w:rPr>
-          <w:noProof/>
-          <w:lang w:val="id-ID"/>
-        </w:rPr>
-        <w:t xml:space="preserve">, 106316.</w:t>
+        <w:t xml:space="preserve">Journal of Biomedical Informatics, 118</w:t>
+      </w:r>
+      <w:r>
+        <w:rPr>
+          <w:noProof/>
+          <w:lang w:val="id-ID"/>
+        </w:rPr>
+        <w:t xml:space="preserve">, 103784.</w:t>
       </w:r>
     </w:p>
     <w:p>
@@ -6088,7 +6426,7 @@
           <w:noProof/>
           <w:lang w:val="id-ID"/>
         </w:rPr>
-        <w:t xml:space="preserve">Susilo, D., Wulandari, L. P. L., Sukmayeti, E., Asante, A., Jan, S., Thabrany, H., Tangcharoensathien, V., Wiseman, V., &amp; Liverani, M. (2025). Can Indonesia achieve universal health coverage? Organisational and financing challenges in implementing the national health insurance system. </w:t>
+        <w:t xml:space="preserve">Rachmawaty, R., Sinrang, A. W., Wahyudin, E., &amp; Bukhari, A. (2021). Evaluation of health care quality among insured patients in Indonesian mother &amp; child hospital: A secondary data analysis. </w:t>
       </w:r>
       <w:r>
         <w:rPr>
@@ -6096,14 +6434,14 @@
           <w:noProof/>
           <w:lang w:val="id-ID"/>
         </w:rPr>
-        <w:t xml:space="preserve">SSM - Health Systems, 5</w:t>
-      </w:r>
-      <w:r>
-        <w:rPr>
-          <w:noProof/>
-          <w:lang w:val="id-ID"/>
-        </w:rPr>
-        <w:t xml:space="preserve">, 100138.</w:t>
+        <w:t xml:space="preserve">Gaceta Sanitaria, 35</w:t>
+      </w:r>
+      <w:r>
+        <w:rPr>
+          <w:noProof/>
+          <w:lang w:val="id-ID"/>
+        </w:rPr>
+        <w:t xml:space="preserve">(S2), S613–S618.</w:t>
       </w:r>
     </w:p>
     <w:p>
@@ -6120,7 +6458,7 @@
           <w:noProof/>
           <w:lang w:val="id-ID"/>
         </w:rPr>
-        <w:t xml:space="preserve">Wei, S., Liu, X., &amp; Shi, Y. (2026). Selection-based prompting with synthesized candidates unlocks high-performance clinical abbreviation disambiguation via open-source LLMs. </w:t>
+        <w:t xml:space="preserve">Simbolon, F., &amp; Gani, A. (2023). Faktor-faktor yang mempengaruhi terjadinya pending klaim rawat inap: Literatur review. </w:t>
       </w:r>
       <w:r>
         <w:rPr>
@@ -6128,14 +6466,14 @@
           <w:noProof/>
           <w:lang w:val="id-ID"/>
         </w:rPr>
-        <w:t xml:space="preserve">Journal of Biomedical Informatics, 181</w:t>
-      </w:r>
-      <w:r>
-        <w:rPr>
-          <w:noProof/>
-          <w:lang w:val="id-ID"/>
-        </w:rPr>
-        <w:t xml:space="preserve">, 105085.</w:t>
+        <w:t xml:space="preserve">Jurnal Keperawatan dan Kesehatan, 14</w:t>
+      </w:r>
+      <w:r>
+        <w:rPr>
+          <w:noProof/>
+          <w:lang w:val="id-ID"/>
+        </w:rPr>
+        <w:t xml:space="preserve">(1), 72–78.</w:t>
       </w:r>
     </w:p>
     <w:p>
@@ -6152,6 +6490,166 @@
           <w:noProof/>
           <w:lang w:val="id-ID"/>
         </w:rPr>
+        <w:t xml:space="preserve">Skrabic, R., Viculin, I., Boban, Z., Kumric, M., Vilovic, M., Vrdoljak, J., &amp; Bozic, J. (2026). Large language models as second reviewers for medical errors in real-world internal medicine reports: A prospective comparative study of open- and closed-source models. </w:t>
+      </w:r>
+      <w:r>
+        <w:rPr>
+          <w:i/>
+          <w:noProof/>
+          <w:lang w:val="id-ID"/>
+        </w:rPr>
+        <w:t xml:space="preserve">International Journal of Medical Informatics, 211</w:t>
+      </w:r>
+      <w:r>
+        <w:rPr>
+          <w:noProof/>
+          <w:lang w:val="id-ID"/>
+        </w:rPr>
+        <w:t xml:space="preserve">, 106316.</w:t>
+      </w:r>
+    </w:p>
+    <w:p>
+      <w:pPr>
+        <w:spacing w:line="240" w:lineRule="auto"/>
+        <w:ind w:left="720" w:hanging="720"/>
+        <w:rPr>
+          <w:noProof/>
+          <w:lang w:val="id-ID" w:eastAsia="en-US"/>
+        </w:rPr>
+      </w:pPr>
+      <w:r>
+        <w:rPr>
+          <w:noProof/>
+          <w:lang w:val="id-ID"/>
+        </w:rPr>
+        <w:t xml:space="preserve">Sun, Z., Yim, W.-W., Uzuner, Ö., Xia, F., &amp; Yetisgen, M. (2025). A scoping review of natural language processing in addressing medically inaccurate information: Errors, misinformation, and hallucination. </w:t>
+      </w:r>
+      <w:r>
+        <w:rPr>
+          <w:i/>
+          <w:noProof/>
+          <w:lang w:val="id-ID"/>
+        </w:rPr>
+        <w:t xml:space="preserve">Journal of Biomedical Informatics, 169</w:t>
+      </w:r>
+      <w:r>
+        <w:rPr>
+          <w:noProof/>
+          <w:lang w:val="id-ID"/>
+        </w:rPr>
+        <w:t xml:space="preserve">, 104866.</w:t>
+      </w:r>
+    </w:p>
+    <w:p>
+      <w:pPr>
+        <w:spacing w:line="240" w:lineRule="auto"/>
+        <w:ind w:left="720" w:hanging="720"/>
+        <w:rPr>
+          <w:noProof/>
+          <w:lang w:val="id-ID" w:eastAsia="en-US"/>
+        </w:rPr>
+      </w:pPr>
+      <w:r>
+        <w:rPr>
+          <w:noProof/>
+          <w:lang w:val="id-ID"/>
+        </w:rPr>
+        <w:t xml:space="preserve">Susilo, D., Wulandari, L. P. L., Sukmayeti, E., Asante, A., Jan, S., Thabrany, H., Tangcharoensathien, V., Wiseman, V., &amp; Liverani, M. (2025). Can Indonesia achieve universal health coverage? Organisational and financing challenges in implementing the national health insurance system. </w:t>
+      </w:r>
+      <w:r>
+        <w:rPr>
+          <w:i/>
+          <w:noProof/>
+          <w:lang w:val="id-ID"/>
+        </w:rPr>
+        <w:t xml:space="preserve">SSM - Health Systems, 5</w:t>
+      </w:r>
+      <w:r>
+        <w:rPr>
+          <w:noProof/>
+          <w:lang w:val="id-ID"/>
+        </w:rPr>
+        <w:t xml:space="preserve">, 100138.</w:t>
+      </w:r>
+    </w:p>
+    <w:p>
+      <w:pPr>
+        <w:spacing w:line="240" w:lineRule="auto"/>
+        <w:ind w:left="720" w:hanging="720"/>
+        <w:rPr>
+          <w:noProof/>
+          <w:lang w:val="id-ID" w:eastAsia="en-US"/>
+        </w:rPr>
+      </w:pPr>
+      <w:r>
+        <w:rPr>
+          <w:noProof/>
+          <w:lang w:val="id-ID"/>
+        </w:rPr>
+        <w:t xml:space="preserve">Waqas, S. M., Umer, Z., Alim, A., Arham, M., Su'ud, M. M., Kazmi, S. J. A., &amp; Alam, M. M. (2026). Hallucination detection, verification, and correction in generative AI: A comprehensive survey. </w:t>
+      </w:r>
+      <w:r>
+        <w:rPr>
+          <w:i/>
+          <w:noProof/>
+          <w:lang w:val="id-ID"/>
+        </w:rPr>
+        <w:t xml:space="preserve">Natural Language Processing Journal, 16</w:t>
+      </w:r>
+      <w:r>
+        <w:rPr>
+          <w:noProof/>
+          <w:lang w:val="id-ID"/>
+        </w:rPr>
+        <w:t xml:space="preserve">, 100231.</w:t>
+      </w:r>
+    </w:p>
+    <w:p>
+      <w:pPr>
+        <w:spacing w:line="240" w:lineRule="auto"/>
+        <w:ind w:left="720" w:hanging="720"/>
+        <w:rPr>
+          <w:noProof/>
+          <w:lang w:val="id-ID" w:eastAsia="en-US"/>
+        </w:rPr>
+      </w:pPr>
+      <w:r>
+        <w:rPr>
+          <w:noProof/>
+          <w:lang w:val="id-ID"/>
+        </w:rPr>
+        <w:t xml:space="preserve">Wei, S., Liu, X., &amp; Shi, Y. (2026). Selection-based prompting with synthesized candidates unlocks high-performance clinical abbreviation disambiguation via open-source LLMs. </w:t>
+      </w:r>
+      <w:r>
+        <w:rPr>
+          <w:i/>
+          <w:noProof/>
+          <w:lang w:val="id-ID"/>
+        </w:rPr>
+        <w:t xml:space="preserve">Journal of Biomedical Informatics, 181</w:t>
+      </w:r>
+      <w:r>
+        <w:rPr>
+          <w:noProof/>
+          <w:lang w:val="id-ID"/>
+        </w:rPr>
+        <w:t xml:space="preserve">, 105085.</w:t>
+      </w:r>
+    </w:p>
+    <w:p>
+      <w:pPr>
+        <w:spacing w:line="240" w:lineRule="auto"/>
+        <w:ind w:left="720" w:hanging="720"/>
+        <w:rPr>
+          <w:noProof/>
+          <w:lang w:val="id-ID" w:eastAsia="en-US"/>
+        </w:rPr>
+      </w:pPr>
+      <w:r>
+        <w:rPr>
+          <w:noProof/>
+          <w:lang w:val="id-ID"/>
+        </w:rPr>
         <w:t xml:space="preserve">Woo, B. F. Y., Cato, K., Cho, H., You, S. B., &amp; Song, J. (2026). The use of large language models in clinical documentation: A scoping review. </w:t>
       </w:r>
       <w:r>
@@ -6168,6 +6666,116 @@
           <w:lang w:val="id-ID"/>
         </w:rPr>
         <w:t xml:space="preserve">, 105322.</w:t>
+      </w:r>
+    </w:p>
+    <w:p>
+      <w:pPr>
+        <w:spacing w:line="240" w:lineRule="auto"/>
+        <w:ind w:left="720" w:hanging="720"/>
+        <w:rPr>
+          <w:noProof/>
+          <w:lang w:val="id-ID" w:eastAsia="en-US"/>
+        </w:rPr>
+      </w:pPr>
+      <w:r>
+        <w:rPr>
+          <w:noProof/>
+          <w:lang w:val="id-ID"/>
+        </w:rPr>
+        <w:t xml:space="preserve">Yang, R., </w:t>
+      </w:r>
+      <w:r>
+        <w:rPr>
+          <w:highlight w:val="yellow"/>
+          <w:lang w:val="id-ID"/>
+        </w:rPr>
+        <w:t xml:space="preserve">[PERLU VERIFIKASI SUMBER: penulis lain; daftar pada halaman judul PDF terpotong]</w:t>
+      </w:r>
+      <w:r>
+        <w:rPr>
+          <w:noProof/>
+          <w:lang w:val="id-ID"/>
+        </w:rPr>
+        <w:t xml:space="preserve">, &amp; Liu, N. (2026). Retrieval-augmented generation in medicine: A scoping review of technical implementations, clinical applications, and ethical considerations. </w:t>
+      </w:r>
+      <w:r>
+        <w:rPr>
+          <w:i/>
+          <w:noProof/>
+          <w:lang w:val="id-ID"/>
+        </w:rPr>
+        <w:t xml:space="preserve">Cell Reports Medicine, 7</w:t>
+      </w:r>
+      <w:r>
+        <w:rPr>
+          <w:noProof/>
+          <w:lang w:val="id-ID"/>
+        </w:rPr>
+        <w:t xml:space="preserve">, 102927.</w:t>
+      </w:r>
+    </w:p>
+    <w:p>
+      <w:pPr>
+        <w:spacing w:line="240" w:lineRule="auto"/>
+        <w:ind w:left="720" w:hanging="720"/>
+        <w:rPr>
+          <w:noProof/>
+          <w:lang w:val="id-ID" w:eastAsia="en-US"/>
+        </w:rPr>
+      </w:pPr>
+      <w:r>
+        <w:rPr>
+          <w:noProof/>
+          <w:lang w:val="id-ID"/>
+        </w:rPr>
+        <w:t xml:space="preserve">Zeba, M., Al Mamun, A., Tithee, K. J., Sutradhar, D., Raiaan, M. A. K., Mukta, S., Mohamed, R. E., Islam, M. R., Sebastian, Y., Hussain, M., &amp; Azam, S. (2026). Mitigating hallucinations in healthcare LLMs with granular fact-checking and domain-specific adaptation. </w:t>
+      </w:r>
+      <w:r>
+        <w:rPr>
+          <w:i/>
+          <w:noProof/>
+          <w:lang w:val="id-ID"/>
+        </w:rPr>
+        <w:t xml:space="preserve">Expert Systems with Applications, 329</w:t>
+      </w:r>
+      <w:r>
+        <w:rPr>
+          <w:noProof/>
+          <w:lang w:val="id-ID"/>
+        </w:rPr>
+        <w:t xml:space="preserve">, 132966.</w:t>
+      </w:r>
+    </w:p>
+    <w:p>
+      <w:pPr>
+        <w:spacing w:line="240" w:lineRule="auto"/>
+        <w:ind w:left="720" w:hanging="720"/>
+        <w:rPr>
+          <w:noProof/>
+          <w:lang w:val="id-ID" w:eastAsia="en-US"/>
+        </w:rPr>
+      </w:pPr>
+      <w:r>
+        <w:rPr>
+          <w:noProof/>
+          <w:lang w:val="id-ID"/>
+        </w:rPr>
+        <w:t xml:space="preserve">Zhang, H., Vithanage, D., Deng, C., &amp; Yu, P. (2026). Optimising clinical information extraction: A comparative study of retrieval-augmented generation techniques in clinical notes. </w:t>
+      </w:r>
+      <w:r>
+        <w:rPr>
+          <w:i/>
+          <w:noProof/>
+          <w:lang w:val="id-ID"/>
+        </w:rPr>
+        <w:t xml:space="preserve">Journal of Biomedical Informatics, 180</w:t>
+      </w:r>
+      <w:r>
+        <w:rPr>
+          <w:noProof/>
+          <w:lang w:val="id-ID"/>
+        </w:rPr>
+        <w:t xml:space="preserve">, 105053.</w:t>
       </w:r>
     </w:p>
     <w:p>

</xml_diff>

<commit_message>
feat: draft Bab II subbab II.6 (de-identifikasi untuk layanan AI eksternal)
Add II.6 draft from Faustini, Azzam and Tchouka with page-verified claims
(37/37), register II.6 in the docx build, rebuild the Utama-template docx
with II.1-II.6, and update CONTEXT_TRANSFER.md.

Co-Authored-By: Claude Sonnet 5.5 <noreply@anthropic.com>
Claude-Session: https://claude.ai/code/session_014py9jkTgHZJ9tfrTkQ4xwY
</commit_message>
<xml_diff>
--- a/bab2/Proposal-IF4091-Capstone-Utama-2026_Draft-Bab2.docx
+++ b/bab2/Proposal-IF4091-Capstone-Utama-2026_Draft-Bab2.docx
@@ -5408,6 +5408,147 @@
     </w:p>
     <w:p>
       <w:pPr>
+        <w:pStyle w:val="Heading2"/>
+      </w:pPr>
+      <w:r>
+        <w:t xml:space="preserve">De-identifikasi untuk Layanan AI Eksternal</w:t>
+      </w:r>
+    </w:p>
+    <w:p>
+      <w:pPr>
+        <w:pStyle w:val="Heading3"/>
+      </w:pPr>
+      <w:r>
+        <w:t xml:space="preserve">Pendekatan De-identifikasi dan Bukti yang Tersedia</w:t>
+      </w:r>
+    </w:p>
+    <w:p>
+      <w:pPr>
+        <w:rPr>
+          <w:lang w:val="id-ID"/>
+        </w:rPr>
+      </w:pPr>
+      <w:r>
+        <w:rPr>
+          <w:lang w:val="id-ID"/>
+        </w:rPr>
+        <w:t xml:space="preserve">Faustini dkk. (2026) menelaah 83 artikel yang dipilih dari 734 tentang de-identifikasi data klinis berbasis NLP pada tahun 2015–2024, dengan de-identifikasi didefinisikan sebagai pendeteksian, penggantian, atau penghapusan informasi kesehatan yang dilindungi (</w:t>
+      </w:r>
+      <w:r>
+        <w:rPr>
+          <w:i/>
+          <w:lang w:val="id-ID"/>
+        </w:rPr>
+        <w:t xml:space="preserve">protected health information</w:t>
+      </w:r>
+      <w:r>
+        <w:rPr>
+          <w:lang w:val="id-ID"/>
+        </w:rPr>
+        <w:t xml:space="preserve">, PHI) (hlm. 1, 2). Mereka menyimpulkan bahwa penggunaan model bahasa meningkat, bahwa perkakas siap pakai sering perlu disesuaikan, dan bahwa sebagian besar studi menggarap konten berbahasa Inggris karena dataset yang tersedia berbahasa Inggris (hlm. 1). Metode berbasis aturan tetap umum di luar bahasa Inggris (hlm. 6), sedangkan tantangan utamanya ialah campur kode dan kelangkaan dataset yang dapat direproduksi (hlm. 1). Faustini dkk. juga melaporkan temuan studi lain bahwa Presidio kesulitan mengenali nama Slavia serta nama Asia Tengah dan Asia Tenggara dibandingkan nama Inggris (hlm. 5), dan bahwa F1 sebuah LLM dapat turun serendah 0,33 tanpa contoh dan instruksi rinci pada perintah (</w:t>
+      </w:r>
+      <w:r>
+        <w:rPr>
+          <w:i/>
+          <w:lang w:val="id-ID"/>
+        </w:rPr>
+        <w:t xml:space="preserve">prompt</w:t>
+      </w:r>
+      <w:r>
+        <w:rPr>
+          <w:lang w:val="id-ID"/>
+        </w:rPr>
+        <w:t xml:space="preserve">), dibandingkan 0,98 dengan perintah rinci (hlm. 6).</w:t>
+      </w:r>
+    </w:p>
+    <w:p>
+      <w:pPr>
+        <w:rPr>
+          <w:lang w:val="id-ID"/>
+        </w:rPr>
+      </w:pPr>
+      <w:r>
+        <w:rPr>
+          <w:lang w:val="id-ID"/>
+        </w:rPr>
+        <w:t xml:space="preserve">Azzam dkk. (2026) mengusulkan sistem agentik yang memisahkan lingkungan pemrosesan: LLM yang dihosting lokal menangani semua langkah sensitif, sedangkan LLM publik hanya menalar atas masukan yang sudah dianonimkan (hlm. 1), dengan pemetaan lokal untuk mengembalikan identitas pada jawaban (hlm. 10). Pada dataset rekam medis sintetis, sistem itu mencapai presisi 1,000 dan </w:t>
+      </w:r>
+      <w:r>
+        <w:rPr>
+          <w:i/>
+          <w:lang w:val="id-ID"/>
+        </w:rPr>
+        <w:t xml:space="preserve">recall</w:t>
+      </w:r>
+      <w:r>
+        <w:rPr>
+          <w:lang w:val="id-ID"/>
+        </w:rPr>
+        <w:t xml:space="preserve"> 0,936, sedangkan spaCy dan Presidio berpresisi 0,329 dan 0,405 dengan </w:t>
+      </w:r>
+      <w:r>
+        <w:rPr>
+          <w:i/>
+          <w:lang w:val="id-ID"/>
+        </w:rPr>
+        <w:t xml:space="preserve">recall</w:t>
+      </w:r>
+      <w:r>
+        <w:rPr>
+          <w:lang w:val="id-ID"/>
+        </w:rPr>
+        <w:t xml:space="preserve"> sekitar 0,89 (hlm. 12). Pada 100 catatan MIMIC-III, 98,6% penanda redaksi bawaan dataset berubah bersih; penanda itu dipakai sebagai pengganti label acuan karena catatannya sudah dide-identifikasi (hlm. 1, 15). Kelestarian informasi klinis tidak penuh: sebutan obat terjaga 0,974, tetapi dosis hanya 0,769 (hlm. 12). Penulisnya menyatakan sistem baru mendukung masukan berbahasa Inggris (hlm. 19).</w:t>
+      </w:r>
+    </w:p>
+    <w:p>
+      <w:pPr>
+        <w:rPr>
+          <w:lang w:val="id-ID"/>
+        </w:rPr>
+      </w:pPr>
+      <w:r>
+        <w:rPr>
+          <w:lang w:val="id-ID"/>
+        </w:rPr>
+        <w:t xml:space="preserve">Tchouka dkk. (2024) menguji de-identifikasi pada dokumen medis berbahasa Prancis di sebuah rumah sakit publik, dengan seluruh eksperimen dilakukan di lokasi rumah sakit tanpa ada data yang dibawa keluar (hlm. 2). Tanggal, usia, dan lokasi diganti dengan privasi diferensial lokal berbasis metrik agar aspek kronologis dan geografisnya tidak hilang (hlm. 1, 7). Manfaatnya diukur lewat tugas asosiasi kode ICD-10: skor F1 turun sekitar 12% terhadap korpus asli bila setiap entitas diganti dengan labelnya, yaitu cara yang dinilai paling tahan terhadap serangan re-identifikasi tetapi membuang nilai entitas, dan 6,8% dengan pendekatan itu (hlm. 2, 12, 13). Penulisnya mengingatkan bahwa dataset hasil de-identifikasi tetap tidak kebal terhadap serangan re-identifikasi dan keanggotaan, sehingga tidak dapat disebarluaskan (hlm. 13).</w:t>
+      </w:r>
+    </w:p>
+    <w:p>
+      <w:pPr>
+        <w:pStyle w:val="Heading3"/>
+      </w:pPr>
+      <w:r>
+        <w:t xml:space="preserve">Sintesis dan Celah</w:t>
+      </w:r>
+    </w:p>
+    <w:p>
+      <w:pPr>
+        <w:rPr>
+          <w:lang w:val="id-ID"/>
+        </w:rPr>
+      </w:pPr>
+      <w:r>
+        <w:rPr>
+          <w:lang w:val="id-ID"/>
+        </w:rPr>
+        <w:t xml:space="preserve">Sumber-sumber di atas mendukung dua hal yang terbatas: de-identifikasi oleh LLM lokal dapat memisahkan data sensitif dari LLM publik pada pengujian awal, dan penggantian yang memperhatikan utilitas mengurangi kehilangan kinerja pada tugas hilir berbasis kode. Keterbatasannya ada tiga. Pertama, tidak ada sumber yang menguji teks klinis berbahasa Indonesia atau pengenal khas Indonesia seperti NIK dan nomor rekam medis; temuan tentang nama Asia Tenggara bersifat sekunder dan menyangkut perkakas yang diuji pada data lain (Faustini dkk., 2026, hlm. 5). Kedua, bukti untuk pendekatan berbasis LLM lokal berasal dari data sintetis dan catatan berbahasa Inggris yang sudah dide-identifikasi (Azzam dkk., 2026, hlm. 15), sehingga kebocoran PHI pada catatan baru yang belum diredaksi belum terukur. Ketiga, kehilangan utilitas baru diukur pada asosiasi kode ICD-10 (Tchouka dkk., 2024, hlm. 13) atau pada sebutan obat dan dosis (Azzam dkk., 2026, hlm. 12); dampak de-identifikasi terhadap temuan audit yang bergantung pada tanggal, dosis, dan urutan waktu belum diukur. Akibatnya, de-identifikasi pada penelitian ini perlu diuji pada data berbahasa Indonesia, dengan ukuran kebocoran pengenal dan dampaknya pada mutu temuan serta ambang kegagalan yang ditetapkan sebelum eksperimen </w:t>
+      </w:r>
+      <w:r>
+        <w:rPr>
+          <w:highlight w:val="yellow"/>
+          <w:lang w:val="id-ID"/>
+        </w:rPr>
+        <w:t xml:space="preserve">[SESUAIKAN DENGAN BAB I: rumusan pertanyaan dan ukuran keberhasilan]</w:t>
+      </w:r>
+      <w:r>
+        <w:rPr>
+          <w:lang w:val="id-ID"/>
+        </w:rPr>
+        <w:t xml:space="preserve">.</w:t>
+      </w:r>
+    </w:p>
+    <w:p>
+      <w:pPr>
         <w:pStyle w:val="Heading1"/>
       </w:pPr>
       <w:r>
@@ -5850,7 +5991,7 @@
           <w:noProof/>
           <w:lang w:val="id-ID"/>
         </w:rPr>
-        <w:t xml:space="preserve">Chen, H., Zhou, Y., Li, R., Illa, A. M., Cleveland, A., &amp; Ding, J. (2026). A comprehensive survey on medical concept normalization: Datasets, techniques, applications, and future directions. </w:t>
+        <w:t xml:space="preserve">Azzam, R., Musamih, A., Gebreab, S., Salah, K., &amp; Omar, M. (2026). Agentic LLM for anonymizing healthcare data with contextual awareness. </w:t>
       </w:r>
       <w:r>
         <w:rPr>
@@ -5858,14 +5999,14 @@
           <w:noProof/>
           <w:lang w:val="id-ID"/>
         </w:rPr>
-        <w:t xml:space="preserve">Journal of Biomedical Informatics, 178</w:t>
-      </w:r>
-      <w:r>
-        <w:rPr>
-          <w:noProof/>
-          <w:lang w:val="id-ID"/>
-        </w:rPr>
-        <w:t xml:space="preserve">, 105005.</w:t>
+        <w:t xml:space="preserve">Knowledge-Based Systems, 343</w:t>
+      </w:r>
+      <w:r>
+        <w:rPr>
+          <w:noProof/>
+          <w:lang w:val="id-ID"/>
+        </w:rPr>
+        <w:t xml:space="preserve">, 116034.</w:t>
       </w:r>
     </w:p>
     <w:p>
@@ -5882,7 +6023,7 @@
           <w:noProof/>
           <w:lang w:val="id-ID"/>
         </w:rPr>
-        <w:t xml:space="preserve">Dietrich, N., &amp; Stubbert, B. (2026). Automated auditing of emergency department documentation using large language models. </w:t>
+        <w:t xml:space="preserve">Chen, H., Zhou, Y., Li, R., Illa, A. M., Cleveland, A., &amp; Ding, J. (2026). A comprehensive survey on medical concept normalization: Datasets, techniques, applications, and future directions. </w:t>
       </w:r>
       <w:r>
         <w:rPr>
@@ -5890,14 +6031,14 @@
           <w:noProof/>
           <w:lang w:val="id-ID"/>
         </w:rPr>
-        <w:t xml:space="preserve">American Journal of Emergency Medicine, 104</w:t>
-      </w:r>
-      <w:r>
-        <w:rPr>
-          <w:noProof/>
-          <w:lang w:val="id-ID"/>
-        </w:rPr>
-        <w:t xml:space="preserve">, 95–101.</w:t>
+        <w:t xml:space="preserve">Journal of Biomedical Informatics, 178</w:t>
+      </w:r>
+      <w:r>
+        <w:rPr>
+          <w:noProof/>
+          <w:lang w:val="id-ID"/>
+        </w:rPr>
+        <w:t xml:space="preserve">, 105005.</w:t>
       </w:r>
     </w:p>
     <w:p>
@@ -5914,7 +6055,7 @@
           <w:noProof/>
           <w:lang w:val="id-ID"/>
         </w:rPr>
-        <w:t xml:space="preserve">Domingues, N. S. (2026). A hybrid decision support system using rule-based and AI methods: The OnCATs knowledge-based framework. </w:t>
+        <w:t xml:space="preserve">Dietrich, N., &amp; Stubbert, B. (2026). Automated auditing of emergency department documentation using large language models. </w:t>
       </w:r>
       <w:r>
         <w:rPr>
@@ -5922,14 +6063,14 @@
           <w:noProof/>
           <w:lang w:val="id-ID"/>
         </w:rPr>
-        <w:t xml:space="preserve">International Journal of Medical Informatics, 206</w:t>
-      </w:r>
-      <w:r>
-        <w:rPr>
-          <w:noProof/>
-          <w:lang w:val="id-ID"/>
-        </w:rPr>
-        <w:t xml:space="preserve">, 106144.</w:t>
+        <w:t xml:space="preserve">American Journal of Emergency Medicine, 104</w:t>
+      </w:r>
+      <w:r>
+        <w:rPr>
+          <w:noProof/>
+          <w:lang w:val="id-ID"/>
+        </w:rPr>
+        <w:t xml:space="preserve">, 95–101.</w:t>
       </w:r>
     </w:p>
     <w:p>
@@ -5946,7 +6087,7 @@
           <w:noProof/>
           <w:lang w:val="id-ID"/>
         </w:rPr>
-        <w:t xml:space="preserve">Du, W. (H.), Wang, G., Xu, J. (N.), &amp; Vasarhelyi, M. A. (2026). Information systems auditing of psychiatric diagnoses using context-enriched QA-based language models. </w:t>
+        <w:t xml:space="preserve">Domingues, N. S. (2026). A hybrid decision support system using rule-based and AI methods: The OnCATs knowledge-based framework. </w:t>
       </w:r>
       <w:r>
         <w:rPr>
@@ -5954,14 +6095,14 @@
           <w:noProof/>
           <w:lang w:val="id-ID"/>
         </w:rPr>
-        <w:t xml:space="preserve">Data Science and Management, 9</w:t>
-      </w:r>
-      <w:r>
-        <w:rPr>
-          <w:noProof/>
-          <w:lang w:val="id-ID"/>
-        </w:rPr>
-        <w:t xml:space="preserve">, 100177.</w:t>
+        <w:t xml:space="preserve">International Journal of Medical Informatics, 206</w:t>
+      </w:r>
+      <w:r>
+        <w:rPr>
+          <w:noProof/>
+          <w:lang w:val="id-ID"/>
+        </w:rPr>
+        <w:t xml:space="preserve">, 106144.</w:t>
       </w:r>
     </w:p>
     <w:p>
@@ -5978,7 +6119,7 @@
           <w:noProof/>
           <w:lang w:val="id-ID"/>
         </w:rPr>
-        <w:t xml:space="preserve">Elvas, L. B., Almeida, A., &amp; Ferreira, J. C. (2025). Natural language processing in medical text processing: A scoping literature review. </w:t>
+        <w:t xml:space="preserve">Du, W. (H.), Wang, G., Xu, J. (N.), &amp; Vasarhelyi, M. A. (2026). Information systems auditing of psychiatric diagnoses using context-enriched QA-based language models. </w:t>
       </w:r>
       <w:r>
         <w:rPr>
@@ -5986,14 +6127,14 @@
           <w:noProof/>
           <w:lang w:val="id-ID"/>
         </w:rPr>
-        <w:t xml:space="preserve">International Journal of Medical Informatics, 204</w:t>
-      </w:r>
-      <w:r>
-        <w:rPr>
-          <w:noProof/>
-          <w:lang w:val="id-ID"/>
-        </w:rPr>
-        <w:t xml:space="preserve">, 106049.</w:t>
+        <w:t xml:space="preserve">Data Science and Management, 9</w:t>
+      </w:r>
+      <w:r>
+        <w:rPr>
+          <w:noProof/>
+          <w:lang w:val="id-ID"/>
+        </w:rPr>
+        <w:t xml:space="preserve">, 100177.</w:t>
       </w:r>
     </w:p>
     <w:p>
@@ -6010,7 +6151,7 @@
           <w:noProof/>
           <w:lang w:val="id-ID"/>
         </w:rPr>
-        <w:t xml:space="preserve">Hou, W.-h., Wang, X.-k., Wang, Y.-n., Wang, J.-q., &amp; Xiao, F. (2024). Modelling long medical documents and code associations for explainable automatic ICD coding. </w:t>
+        <w:t xml:space="preserve">Elvas, L. B., Almeida, A., &amp; Ferreira, J. C. (2025). Natural language processing in medical text processing: A scoping literature review. </w:t>
       </w:r>
       <w:r>
         <w:rPr>
@@ -6018,14 +6159,14 @@
           <w:noProof/>
           <w:lang w:val="id-ID"/>
         </w:rPr>
-        <w:t xml:space="preserve">Expert Systems with Applications, 249</w:t>
-      </w:r>
-      <w:r>
-        <w:rPr>
-          <w:noProof/>
-          <w:lang w:val="id-ID"/>
-        </w:rPr>
-        <w:t xml:space="preserve">, 123519.</w:t>
+        <w:t xml:space="preserve">International Journal of Medical Informatics, 204</w:t>
+      </w:r>
+      <w:r>
+        <w:rPr>
+          <w:noProof/>
+          <w:lang w:val="id-ID"/>
+        </w:rPr>
+        <w:t xml:space="preserve">, 106049.</w:t>
       </w:r>
     </w:p>
     <w:p>
@@ -6042,7 +6183,7 @@
           <w:noProof/>
           <w:lang w:val="id-ID"/>
         </w:rPr>
-        <w:t xml:space="preserve">Ijadi Maghsoodi, A., Kurz, J., Lawrenson, R., Parsons, M., Walker, C., O'Sullivan, M., &amp; Rouse, P. (2026). Artificial intelligence for decision-making in healthcare: A critical review of decision-maker-governed hybrid systems across clinical, operational, and policy settings. </w:t>
+        <w:t xml:space="preserve">Faustini, P., McIver, A., Sullivan, R., &amp; Dras, M. (2026). De-identification of clinical data: A systematic review of free text, image and tabular data approaches. </w:t>
       </w:r>
       <w:r>
         <w:rPr>
@@ -6050,14 +6191,14 @@
           <w:noProof/>
           <w:lang w:val="id-ID"/>
         </w:rPr>
-        <w:t xml:space="preserve">Health Policy and Technology, 15</w:t>
-      </w:r>
-      <w:r>
-        <w:rPr>
-          <w:noProof/>
-          <w:lang w:val="id-ID"/>
-        </w:rPr>
-        <w:t xml:space="preserve">, 101292.</w:t>
+        <w:t xml:space="preserve">International Journal of Medical Informatics, 208</w:t>
+      </w:r>
+      <w:r>
+        <w:rPr>
+          <w:noProof/>
+          <w:lang w:val="id-ID"/>
+        </w:rPr>
+        <w:t xml:space="preserve">, 106225.</w:t>
       </w:r>
     </w:p>
     <w:p>
@@ -6074,7 +6215,7 @@
           <w:noProof/>
           <w:lang w:val="id-ID"/>
         </w:rPr>
-        <w:t xml:space="preserve">Jafarpour, H., Wu, G., Cheligeer, C., Yan, J., Xu, Y., Southern, D. A., Eastwood, C. A., Zeng, Y., &amp; Quan, H. (2025). Preprocessing narrative texts in electronic medical records to identify hospital adverse events: A scoping review. </w:t>
+        <w:t xml:space="preserve">Hou, W.-h., Wang, X.-k., Wang, Y.-n., Wang, J.-q., &amp; Xiao, F. (2024). Modelling long medical documents and code associations for explainable automatic ICD coding. </w:t>
       </w:r>
       <w:r>
         <w:rPr>
@@ -6082,14 +6223,14 @@
           <w:noProof/>
           <w:lang w:val="id-ID"/>
         </w:rPr>
-        <w:t xml:space="preserve">Artificial Intelligence in Medicine, 170</w:t>
-      </w:r>
-      <w:r>
-        <w:rPr>
-          <w:noProof/>
-          <w:lang w:val="id-ID"/>
-        </w:rPr>
-        <w:t xml:space="preserve">, 103281.</w:t>
+        <w:t xml:space="preserve">Expert Systems with Applications, 249</w:t>
+      </w:r>
+      <w:r>
+        <w:rPr>
+          <w:noProof/>
+          <w:lang w:val="id-ID"/>
+        </w:rPr>
+        <w:t xml:space="preserve">, 123519.</w:t>
       </w:r>
     </w:p>
     <w:p>
@@ -6106,7 +6247,7 @@
           <w:noProof/>
           <w:lang w:val="id-ID"/>
         </w:rPr>
-        <w:t xml:space="preserve">Jaganathan, G. S., Kahanda, I., &amp; Kanewala, U. (2025). Metamorphic testing for robustness and fairness evaluation of LLM-based automated ICD coding applications. </w:t>
+        <w:t xml:space="preserve">Ijadi Maghsoodi, A., Kurz, J., Lawrenson, R., Parsons, M., Walker, C., O'Sullivan, M., &amp; Rouse, P. (2026). Artificial intelligence for decision-making in healthcare: A critical review of decision-maker-governed hybrid systems across clinical, operational, and policy settings. </w:t>
       </w:r>
       <w:r>
         <w:rPr>
@@ -6114,14 +6255,14 @@
           <w:noProof/>
           <w:lang w:val="id-ID"/>
         </w:rPr>
-        <w:t xml:space="preserve">Smart Health, 36</w:t>
-      </w:r>
-      <w:r>
-        <w:rPr>
-          <w:noProof/>
-          <w:lang w:val="id-ID"/>
-        </w:rPr>
-        <w:t xml:space="preserve">, 100564.</w:t>
+        <w:t xml:space="preserve">Health Policy and Technology, 15</w:t>
+      </w:r>
+      <w:r>
+        <w:rPr>
+          <w:noProof/>
+          <w:lang w:val="id-ID"/>
+        </w:rPr>
+        <w:t xml:space="preserve">, 101292.</w:t>
       </w:r>
     </w:p>
     <w:p>
@@ -6138,7 +6279,7 @@
           <w:noProof/>
           <w:lang w:val="id-ID"/>
         </w:rPr>
-        <w:t xml:space="preserve">Jia, S., Bit, S., Jasodanand, V. H., Liu, Y., &amp; Kolachalama, V. B. (2026). Agentic memory-augmented retrieval and evidence grounding for medical question-answering tasks. </w:t>
+        <w:t xml:space="preserve">Jafarpour, H., Wu, G., Cheligeer, C., Yan, J., Xu, Y., Southern, D. A., Eastwood, C. A., Zeng, Y., &amp; Quan, H. (2025). Preprocessing narrative texts in electronic medical records to identify hospital adverse events: A scoping review. </w:t>
       </w:r>
       <w:r>
         <w:rPr>
@@ -6146,14 +6287,14 @@
           <w:noProof/>
           <w:lang w:val="id-ID"/>
         </w:rPr>
-        <w:t xml:space="preserve">International Journal of Medical Informatics, 212</w:t>
-      </w:r>
-      <w:r>
-        <w:rPr>
-          <w:noProof/>
-          <w:lang w:val="id-ID"/>
-        </w:rPr>
-        <w:t xml:space="preserve">, 106339.</w:t>
+        <w:t xml:space="preserve">Artificial Intelligence in Medicine, 170</w:t>
+      </w:r>
+      <w:r>
+        <w:rPr>
+          <w:noProof/>
+          <w:lang w:val="id-ID"/>
+        </w:rPr>
+        <w:t xml:space="preserve">, 103281.</w:t>
       </w:r>
     </w:p>
     <w:p>
@@ -6170,7 +6311,7 @@
           <w:noProof/>
           <w:lang w:val="id-ID"/>
         </w:rPr>
-        <w:t xml:space="preserve">Kumar, D., Choudhary, N., Gupta, V., Tanwar, R., Behmani, K., Antal, S., Jarora, S., Gupta, S., Shaikh, M. S., Webster, T. J., &amp; Faiyazuddin, M. (2026). Natural language processing in healthcare: From unstructured data to clinical intelligence. </w:t>
+        <w:t xml:space="preserve">Jaganathan, G. S., Kahanda, I., &amp; Kanewala, U. (2025). Metamorphic testing for robustness and fairness evaluation of LLM-based automated ICD coding applications. </w:t>
       </w:r>
       <w:r>
         <w:rPr>
@@ -6178,14 +6319,14 @@
           <w:noProof/>
           <w:lang w:val="id-ID"/>
         </w:rPr>
-        <w:t xml:space="preserve">Intelligent Systems with Applications, 31</w:t>
-      </w:r>
-      <w:r>
-        <w:rPr>
-          <w:noProof/>
-          <w:lang w:val="id-ID"/>
-        </w:rPr>
-        <w:t xml:space="preserve">, 200698.</w:t>
+        <w:t xml:space="preserve">Smart Health, 36</w:t>
+      </w:r>
+      <w:r>
+        <w:rPr>
+          <w:noProof/>
+          <w:lang w:val="id-ID"/>
+        </w:rPr>
+        <w:t xml:space="preserve">, 100564.</w:t>
       </w:r>
     </w:p>
     <w:p>
@@ -6202,7 +6343,7 @@
           <w:noProof/>
           <w:lang w:val="id-ID"/>
         </w:rPr>
-        <w:t xml:space="preserve">Landolsi, M. Y., Fadhli, I., Boufaied, A., &amp; Ben Romdhane, L. (2026). Recent trends of retrieval-augmented generation in healthcare: A systematic review. </w:t>
+        <w:t xml:space="preserve">Jia, S., Bit, S., Jasodanand, V. H., Liu, Y., &amp; Kolachalama, V. B. (2026). Agentic memory-augmented retrieval and evidence grounding for medical question-answering tasks. </w:t>
       </w:r>
       <w:r>
         <w:rPr>
@@ -6210,14 +6351,14 @@
           <w:noProof/>
           <w:lang w:val="id-ID"/>
         </w:rPr>
-        <w:t xml:space="preserve">Engineering Applications of Artificial Intelligence, 182</w:t>
-      </w:r>
-      <w:r>
-        <w:rPr>
-          <w:noProof/>
-          <w:lang w:val="id-ID"/>
-        </w:rPr>
-        <w:t xml:space="preserve">, 115912.</w:t>
+        <w:t xml:space="preserve">International Journal of Medical Informatics, 212</w:t>
+      </w:r>
+      <w:r>
+        <w:rPr>
+          <w:noProof/>
+          <w:lang w:val="id-ID"/>
+        </w:rPr>
+        <w:t xml:space="preserve">, 106339.</w:t>
       </w:r>
     </w:p>
     <w:p>
@@ -6234,7 +6375,7 @@
           <w:noProof/>
           <w:lang w:val="id-ID"/>
         </w:rPr>
-        <w:t xml:space="preserve">Lebeña, N., Casillas, A., &amp; Pérez, A. (2025). Large language models aided patient progression documentation according to the ICD standard. </w:t>
+        <w:t xml:space="preserve">Kumar, D., Choudhary, N., Gupta, V., Tanwar, R., Behmani, K., Antal, S., Jarora, S., Gupta, S., Shaikh, M. S., Webster, T. J., &amp; Faiyazuddin, M. (2026). Natural language processing in healthcare: From unstructured data to clinical intelligence. </w:t>
       </w:r>
       <w:r>
         <w:rPr>
@@ -6242,14 +6383,14 @@
           <w:noProof/>
           <w:lang w:val="id-ID"/>
         </w:rPr>
-        <w:t xml:space="preserve">Informatics in Medicine Unlocked, 55</w:t>
-      </w:r>
-      <w:r>
-        <w:rPr>
-          <w:noProof/>
-          <w:lang w:val="id-ID"/>
-        </w:rPr>
-        <w:t xml:space="preserve">, 101637.</w:t>
+        <w:t xml:space="preserve">Intelligent Systems with Applications, 31</w:t>
+      </w:r>
+      <w:r>
+        <w:rPr>
+          <w:noProof/>
+          <w:lang w:val="id-ID"/>
+        </w:rPr>
+        <w:t xml:space="preserve">, 200698.</w:t>
       </w:r>
     </w:p>
     <w:p>
@@ -6266,7 +6407,7 @@
           <w:noProof/>
           <w:lang w:val="id-ID"/>
         </w:rPr>
-        <w:t xml:space="preserve">Li, Y., Lv, M., Cheng, L., Xie, Y., Gu, Q., He, H., Chen, Z., Fang, D., &amp; Zhou, X. (2026). Explainable and evidence-linked recommendations for spine surgery via a retrieval-augmented LLM agent. </w:t>
+        <w:t xml:space="preserve">Landolsi, M. Y., Fadhli, I., Boufaied, A., &amp; Ben Romdhane, L. (2026). Recent trends of retrieval-augmented generation in healthcare: A systematic review. </w:t>
       </w:r>
       <w:r>
         <w:rPr>
@@ -6274,14 +6415,14 @@
           <w:noProof/>
           <w:lang w:val="id-ID"/>
         </w:rPr>
-        <w:t xml:space="preserve">European Journal of Radiology, 197</w:t>
-      </w:r>
-      <w:r>
-        <w:rPr>
-          <w:noProof/>
-          <w:lang w:val="id-ID"/>
-        </w:rPr>
-        <w:t xml:space="preserve">, 112734.</w:t>
+        <w:t xml:space="preserve">Engineering Applications of Artificial Intelligence, 182</w:t>
+      </w:r>
+      <w:r>
+        <w:rPr>
+          <w:noProof/>
+          <w:lang w:val="id-ID"/>
+        </w:rPr>
+        <w:t xml:space="preserve">, 115912.</w:t>
       </w:r>
     </w:p>
     <w:p>
@@ -6298,7 +6439,7 @@
           <w:noProof/>
           <w:lang w:val="id-ID"/>
         </w:rPr>
-        <w:t xml:space="preserve">Luo, X., Deng, Z., Yang, B., &amp; Luo, M. Y. (2024). Pre-trained language models in medicine: A survey. </w:t>
+        <w:t xml:space="preserve">Lebeña, N., Casillas, A., &amp; Pérez, A. (2025). Large language models aided patient progression documentation according to the ICD standard. </w:t>
       </w:r>
       <w:r>
         <w:rPr>
@@ -6306,14 +6447,14 @@
           <w:noProof/>
           <w:lang w:val="id-ID"/>
         </w:rPr>
-        <w:t xml:space="preserve">Artificial Intelligence in Medicine, 154</w:t>
-      </w:r>
-      <w:r>
-        <w:rPr>
-          <w:noProof/>
-          <w:lang w:val="id-ID"/>
-        </w:rPr>
-        <w:t xml:space="preserve">, 102904.</w:t>
+        <w:t xml:space="preserve">Informatics in Medicine Unlocked, 55</w:t>
+      </w:r>
+      <w:r>
+        <w:rPr>
+          <w:noProof/>
+          <w:lang w:val="id-ID"/>
+        </w:rPr>
+        <w:t xml:space="preserve">, 101637.</w:t>
       </w:r>
     </w:p>
     <w:p>
@@ -6330,7 +6471,7 @@
           <w:noProof/>
           <w:lang w:val="id-ID"/>
         </w:rPr>
-        <w:t xml:space="preserve">Mwogosi, A., &amp; Mambile, C. (2026). Concordance of electronic health record data with ICD classification and evidence-based treatment guidelines: A systematic review and meta-analysis. </w:t>
+        <w:t xml:space="preserve">Li, Y., Lv, M., Cheng, L., Xie, Y., Gu, Q., He, H., Chen, Z., Fang, D., &amp; Zhou, X. (2026). Explainable and evidence-linked recommendations for spine surgery via a retrieval-augmented LLM agent. </w:t>
       </w:r>
       <w:r>
         <w:rPr>
@@ -6338,14 +6479,14 @@
           <w:noProof/>
           <w:lang w:val="id-ID"/>
         </w:rPr>
-        <w:t xml:space="preserve">Health Policy and Technology, 15</w:t>
-      </w:r>
-      <w:r>
-        <w:rPr>
-          <w:noProof/>
-          <w:lang w:val="id-ID"/>
-        </w:rPr>
-        <w:t xml:space="preserve">, 101213.</w:t>
+        <w:t xml:space="preserve">European Journal of Radiology, 197</w:t>
+      </w:r>
+      <w:r>
+        <w:rPr>
+          <w:noProof/>
+          <w:lang w:val="id-ID"/>
+        </w:rPr>
+        <w:t xml:space="preserve">, 112734.</w:t>
       </w:r>
     </w:p>
     <w:p>
@@ -6362,7 +6503,7 @@
           <w:noProof/>
           <w:lang w:val="id-ID"/>
         </w:rPr>
-        <w:t xml:space="preserve">Nilasari, E. V., &amp; Soelistijanto, B. (2026). A preliminary study on mitigating upcoding in Indonesia's national health insurance using multi-agent multi-armed bandits. </w:t>
+        <w:t xml:space="preserve">Luo, X., Deng, Z., Yang, B., &amp; Luo, M. Y. (2024). Pre-trained language models in medicine: A survey. </w:t>
       </w:r>
       <w:r>
         <w:rPr>
@@ -6370,14 +6511,14 @@
           <w:noProof/>
           <w:lang w:val="id-ID"/>
         </w:rPr>
-        <w:t xml:space="preserve">Procedia Computer Science, 289</w:t>
-      </w:r>
-      <w:r>
-        <w:rPr>
-          <w:noProof/>
-          <w:lang w:val="id-ID"/>
-        </w:rPr>
-        <w:t xml:space="preserve">, 851–858.</w:t>
+        <w:t xml:space="preserve">Artificial Intelligence in Medicine, 154</w:t>
+      </w:r>
+      <w:r>
+        <w:rPr>
+          <w:noProof/>
+          <w:lang w:val="id-ID"/>
+        </w:rPr>
+        <w:t xml:space="preserve">, 102904.</w:t>
       </w:r>
     </w:p>
     <w:p>
@@ -6394,7 +6535,7 @@
           <w:noProof/>
           <w:lang w:val="id-ID"/>
         </w:rPr>
-        <w:t xml:space="preserve">Olex, A. L., &amp; McInnes, B. T. (2021). Review of temporal reasoning in the clinical domain for timeline extraction: Where we are and where we need to be. </w:t>
+        <w:t xml:space="preserve">Mwogosi, A., &amp; Mambile, C. (2026). Concordance of electronic health record data with ICD classification and evidence-based treatment guidelines: A systematic review and meta-analysis. </w:t>
       </w:r>
       <w:r>
         <w:rPr>
@@ -6402,14 +6543,14 @@
           <w:noProof/>
           <w:lang w:val="id-ID"/>
         </w:rPr>
-        <w:t xml:space="preserve">Journal of Biomedical Informatics, 118</w:t>
-      </w:r>
-      <w:r>
-        <w:rPr>
-          <w:noProof/>
-          <w:lang w:val="id-ID"/>
-        </w:rPr>
-        <w:t xml:space="preserve">, 103784.</w:t>
+        <w:t xml:space="preserve">Health Policy and Technology, 15</w:t>
+      </w:r>
+      <w:r>
+        <w:rPr>
+          <w:noProof/>
+          <w:lang w:val="id-ID"/>
+        </w:rPr>
+        <w:t xml:space="preserve">, 101213.</w:t>
       </w:r>
     </w:p>
     <w:p>
@@ -6426,7 +6567,7 @@
           <w:noProof/>
           <w:lang w:val="id-ID"/>
         </w:rPr>
-        <w:t xml:space="preserve">Rachmawaty, R., Sinrang, A. W., Wahyudin, E., &amp; Bukhari, A. (2021). Evaluation of health care quality among insured patients in Indonesian mother &amp; child hospital: A secondary data analysis. </w:t>
+        <w:t xml:space="preserve">Nilasari, E. V., &amp; Soelistijanto, B. (2026). A preliminary study on mitigating upcoding in Indonesia's national health insurance using multi-agent multi-armed bandits. </w:t>
       </w:r>
       <w:r>
         <w:rPr>
@@ -6434,14 +6575,14 @@
           <w:noProof/>
           <w:lang w:val="id-ID"/>
         </w:rPr>
-        <w:t xml:space="preserve">Gaceta Sanitaria, 35</w:t>
-      </w:r>
-      <w:r>
-        <w:rPr>
-          <w:noProof/>
-          <w:lang w:val="id-ID"/>
-        </w:rPr>
-        <w:t xml:space="preserve">(S2), S613–S618.</w:t>
+        <w:t xml:space="preserve">Procedia Computer Science, 289</w:t>
+      </w:r>
+      <w:r>
+        <w:rPr>
+          <w:noProof/>
+          <w:lang w:val="id-ID"/>
+        </w:rPr>
+        <w:t xml:space="preserve">, 851–858.</w:t>
       </w:r>
     </w:p>
     <w:p>
@@ -6458,7 +6599,7 @@
           <w:noProof/>
           <w:lang w:val="id-ID"/>
         </w:rPr>
-        <w:t xml:space="preserve">Simbolon, F., &amp; Gani, A. (2023). Faktor-faktor yang mempengaruhi terjadinya pending klaim rawat inap: Literatur review. </w:t>
+        <w:t xml:space="preserve">Olex, A. L., &amp; McInnes, B. T. (2021). Review of temporal reasoning in the clinical domain for timeline extraction: Where we are and where we need to be. </w:t>
       </w:r>
       <w:r>
         <w:rPr>
@@ -6466,14 +6607,14 @@
           <w:noProof/>
           <w:lang w:val="id-ID"/>
         </w:rPr>
-        <w:t xml:space="preserve">Jurnal Keperawatan dan Kesehatan, 14</w:t>
-      </w:r>
-      <w:r>
-        <w:rPr>
-          <w:noProof/>
-          <w:lang w:val="id-ID"/>
-        </w:rPr>
-        <w:t xml:space="preserve">(1), 72–78.</w:t>
+        <w:t xml:space="preserve">Journal of Biomedical Informatics, 118</w:t>
+      </w:r>
+      <w:r>
+        <w:rPr>
+          <w:noProof/>
+          <w:lang w:val="id-ID"/>
+        </w:rPr>
+        <w:t xml:space="preserve">, 103784.</w:t>
       </w:r>
     </w:p>
     <w:p>
@@ -6490,7 +6631,7 @@
           <w:noProof/>
           <w:lang w:val="id-ID"/>
         </w:rPr>
-        <w:t xml:space="preserve">Skrabic, R., Viculin, I., Boban, Z., Kumric, M., Vilovic, M., Vrdoljak, J., &amp; Bozic, J. (2026). Large language models as second reviewers for medical errors in real-world internal medicine reports: A prospective comparative study of open- and closed-source models. </w:t>
+        <w:t xml:space="preserve">Rachmawaty, R., Sinrang, A. W., Wahyudin, E., &amp; Bukhari, A. (2021). Evaluation of health care quality among insured patients in Indonesian mother &amp; child hospital: A secondary data analysis. </w:t>
       </w:r>
       <w:r>
         <w:rPr>
@@ -6498,14 +6639,14 @@
           <w:noProof/>
           <w:lang w:val="id-ID"/>
         </w:rPr>
-        <w:t xml:space="preserve">International Journal of Medical Informatics, 211</w:t>
-      </w:r>
-      <w:r>
-        <w:rPr>
-          <w:noProof/>
-          <w:lang w:val="id-ID"/>
-        </w:rPr>
-        <w:t xml:space="preserve">, 106316.</w:t>
+        <w:t xml:space="preserve">Gaceta Sanitaria, 35</w:t>
+      </w:r>
+      <w:r>
+        <w:rPr>
+          <w:noProof/>
+          <w:lang w:val="id-ID"/>
+        </w:rPr>
+        <w:t xml:space="preserve">(S2), S613–S618.</w:t>
       </w:r>
     </w:p>
     <w:p>
@@ -6522,7 +6663,7 @@
           <w:noProof/>
           <w:lang w:val="id-ID"/>
         </w:rPr>
-        <w:t xml:space="preserve">Sun, Z., Yim, W.-W., Uzuner, Ö., Xia, F., &amp; Yetisgen, M. (2025). A scoping review of natural language processing in addressing medically inaccurate information: Errors, misinformation, and hallucination. </w:t>
+        <w:t xml:space="preserve">Simbolon, F., &amp; Gani, A. (2023). Faktor-faktor yang mempengaruhi terjadinya pending klaim rawat inap: Literatur review. </w:t>
       </w:r>
       <w:r>
         <w:rPr>
@@ -6530,14 +6671,14 @@
           <w:noProof/>
           <w:lang w:val="id-ID"/>
         </w:rPr>
-        <w:t xml:space="preserve">Journal of Biomedical Informatics, 169</w:t>
-      </w:r>
-      <w:r>
-        <w:rPr>
-          <w:noProof/>
-          <w:lang w:val="id-ID"/>
-        </w:rPr>
-        <w:t xml:space="preserve">, 104866.</w:t>
+        <w:t xml:space="preserve">Jurnal Keperawatan dan Kesehatan, 14</w:t>
+      </w:r>
+      <w:r>
+        <w:rPr>
+          <w:noProof/>
+          <w:lang w:val="id-ID"/>
+        </w:rPr>
+        <w:t xml:space="preserve">(1), 72–78.</w:t>
       </w:r>
     </w:p>
     <w:p>
@@ -6554,6 +6695,70 @@
           <w:noProof/>
           <w:lang w:val="id-ID"/>
         </w:rPr>
+        <w:t xml:space="preserve">Skrabic, R., Viculin, I., Boban, Z., Kumric, M., Vilovic, M., Vrdoljak, J., &amp; Bozic, J. (2026). Large language models as second reviewers for medical errors in real-world internal medicine reports: A prospective comparative study of open- and closed-source models. </w:t>
+      </w:r>
+      <w:r>
+        <w:rPr>
+          <w:i/>
+          <w:noProof/>
+          <w:lang w:val="id-ID"/>
+        </w:rPr>
+        <w:t xml:space="preserve">International Journal of Medical Informatics, 211</w:t>
+      </w:r>
+      <w:r>
+        <w:rPr>
+          <w:noProof/>
+          <w:lang w:val="id-ID"/>
+        </w:rPr>
+        <w:t xml:space="preserve">, 106316.</w:t>
+      </w:r>
+    </w:p>
+    <w:p>
+      <w:pPr>
+        <w:spacing w:line="240" w:lineRule="auto"/>
+        <w:ind w:left="720" w:hanging="720"/>
+        <w:rPr>
+          <w:noProof/>
+          <w:lang w:val="id-ID" w:eastAsia="en-US"/>
+        </w:rPr>
+      </w:pPr>
+      <w:r>
+        <w:rPr>
+          <w:noProof/>
+          <w:lang w:val="id-ID"/>
+        </w:rPr>
+        <w:t xml:space="preserve">Sun, Z., Yim, W.-W., Uzuner, Ö., Xia, F., &amp; Yetisgen, M. (2025). A scoping review of natural language processing in addressing medically inaccurate information: Errors, misinformation, and hallucination. </w:t>
+      </w:r>
+      <w:r>
+        <w:rPr>
+          <w:i/>
+          <w:noProof/>
+          <w:lang w:val="id-ID"/>
+        </w:rPr>
+        <w:t xml:space="preserve">Journal of Biomedical Informatics, 169</w:t>
+      </w:r>
+      <w:r>
+        <w:rPr>
+          <w:noProof/>
+          <w:lang w:val="id-ID"/>
+        </w:rPr>
+        <w:t xml:space="preserve">, 104866.</w:t>
+      </w:r>
+    </w:p>
+    <w:p>
+      <w:pPr>
+        <w:spacing w:line="240" w:lineRule="auto"/>
+        <w:ind w:left="720" w:hanging="720"/>
+        <w:rPr>
+          <w:noProof/>
+          <w:lang w:val="id-ID" w:eastAsia="en-US"/>
+        </w:rPr>
+      </w:pPr>
+      <w:r>
+        <w:rPr>
+          <w:noProof/>
+          <w:lang w:val="id-ID"/>
+        </w:rPr>
         <w:t xml:space="preserve">Susilo, D., Wulandari, L. P. L., Sukmayeti, E., Asante, A., Jan, S., Thabrany, H., Tangcharoensathien, V., Wiseman, V., &amp; Liverani, M. (2025). Can Indonesia achieve universal health coverage? Organisational and financing challenges in implementing the national health insurance system. </w:t>
       </w:r>
       <w:r>
@@ -6570,6 +6775,38 @@
           <w:lang w:val="id-ID"/>
         </w:rPr>
         <w:t xml:space="preserve">, 100138.</w:t>
+      </w:r>
+    </w:p>
+    <w:p>
+      <w:pPr>
+        <w:spacing w:line="240" w:lineRule="auto"/>
+        <w:ind w:left="720" w:hanging="720"/>
+        <w:rPr>
+          <w:noProof/>
+          <w:lang w:val="id-ID" w:eastAsia="en-US"/>
+        </w:rPr>
+      </w:pPr>
+      <w:r>
+        <w:rPr>
+          <w:noProof/>
+          <w:lang w:val="id-ID"/>
+        </w:rPr>
+        <w:t xml:space="preserve">Tchouka, Y., Couchot, J.-F., Laiymani, D., Selles, P., &amp; Rahmani, A. (2024). Differentially private de-identifying textual medical document is compliant with challenging NLP analyses: Example of privacy-preserving ICD-10 code association. </w:t>
+      </w:r>
+      <w:r>
+        <w:rPr>
+          <w:i/>
+          <w:noProof/>
+          <w:lang w:val="id-ID"/>
+        </w:rPr>
+        <w:t xml:space="preserve">Intelligent Systems with Applications, 23</w:t>
+      </w:r>
+      <w:r>
+        <w:rPr>
+          <w:noProof/>
+          <w:lang w:val="id-ID"/>
+        </w:rPr>
+        <w:t xml:space="preserve">, 200416.</w:t>
       </w:r>
     </w:p>
     <w:p>

</xml_diff>

<commit_message>
feat: draft Bab II subbab II.7 and II.8, add table support to docx build
II.7 (evaluation of clinical NLP systems) from Becker et al. and van
Koevorden et al. with page-verified claims (33/33). II.8 summarises II.1-II.7
into a comparison table and four research gaps. build_docx.py now renders
Markdown tables and table captions; docx rebuilt with II.1-II.8 (34 refs).
CONTEXT_TRANSFER.md updated.

Co-Authored-By: Claude Sonnet 5.5 <noreply@anthropic.com>
Claude-Session: https://claude.ai/code/session_014py9jkTgHZ9tfrTkQ4xwY
</commit_message>
<xml_diff>
--- a/bab2/Proposal-IF4091-Capstone-Utama-2026_Draft-Bab2.docx
+++ b/bab2/Proposal-IF4091-Capstone-Utama-2026_Draft-Bab2.docx
@@ -5549,6 +5549,1141 @@
     </w:p>
     <w:p>
       <w:pPr>
+        <w:pStyle w:val="Heading2"/>
+      </w:pPr>
+      <w:r>
+        <w:t xml:space="preserve">Evaluasi Sistem NLP Klinis</w:t>
+      </w:r>
+    </w:p>
+    <w:p>
+      <w:pPr>
+        <w:pStyle w:val="Heading3"/>
+      </w:pPr>
+      <w:r>
+        <w:t xml:space="preserve">Acuan Penilaian dan Variabilitas Penilai</w:t>
+      </w:r>
+    </w:p>
+    <w:p>
+      <w:pPr>
+        <w:rPr>
+          <w:lang w:val="id-ID"/>
+        </w:rPr>
+      </w:pPr>
+      <w:r>
+        <w:rPr>
+          <w:lang w:val="id-ID"/>
+        </w:rPr>
+        <w:t xml:space="preserve">Becker dkk. (2025) memperluas korpus CARDIO:DE, yaitu 500 surat dokter berbahasa Jerman di bidang kardiovaskular (hlm. 2), dengan lima label entitas: diagnosis, tindakan diagnostik, obat, temuan medis, dan terapi (hlm. 1). Seorang apoteker dan seorang ekonom kesehatan mula-mula menganotasi sekitar 15% korpus secara tumpang tindih, membahas ketidaksesuaiannya, lalu menganotasi 5% tambahan secara tumpang tindih, dengan ambang kesepakatan Krippendorff's alpha </w:t>
+      </w:r>
+      <w:r>
+        <w:rPr>
+          <w:i/>
+          <w:lang w:val="id-ID"/>
+        </w:rPr>
+        <w:t xml:space="preserve">unitizing</w:t>
+      </w:r>
+      <w:r>
+        <w:rPr>
+          <w:lang w:val="id-ID"/>
+        </w:rPr>
+        <w:t xml:space="preserve"> 0,85 yang ditetapkan sebelumnya (hlm. 2). Kesepakatan mencapai 0,98 pada beberapa subset (hlm. 1), tetapi seluruh proses memakan tujuh bulan dan 10–40 menit per dokumen (hlm. 2). Empat model diuji dengan pencocokan entitas yang sangat menekankan batas entitas (hlm. 4), dan TinyLlama menghasilkan F1 makro 0,845 (hlm. 1). Semua model sering menukar temuan medis dengan diagnosis (hlm. 4), dan penulisnya menunjukkan bahwa frasa seperti "80 % main stem stenosis" dapat dilabeli keduanya bergantung pada konteks (hlm. 3).</w:t>
+      </w:r>
+    </w:p>
+    <w:p>
+      <w:pPr>
+        <w:rPr>
+          <w:lang w:val="id-ID"/>
+        </w:rPr>
+      </w:pPr>
+      <w:r>
+        <w:rPr>
+          <w:lang w:val="id-ID"/>
+        </w:rPr>
+        <w:t xml:space="preserve">van Koevorden dkk. (2026) memvalidasi ekstraksi data oleh LLM sumber terbuka pada 1.482 halaman dokumen klinis 60 pasien onkologi kepala dan leher untuk 29 kategori, dengan enam pakar menilai 2.555 nilai: penilaian cocok atau tidak cocok secara buta, lalu pengkategorian galat (hlm. 1). Akurasi per kategori berkisar 74% sampai 90%, dan penulis menegaskan bahwa metrik itu adalah metrik yang ditetapkan pakar karena keluaran model berupa teks bebas, bukan prediksi kategorikal (hlm. 1, 4). Dua dokter yang mengekstraksi secara independen berselisih pada 29,0% nilai, sedangkan LLM berselisih dari konsensus mereka pada 41,4% dalam pemetaan awal (hlm. 4). Setelah peninjauan, lebih dari separuh keluaran LLM yang semula dinilai berbeda dinyatakan cocok (hlm. 5), dan dari 65 keluaran yang semula dikategorikan halusinasi hanya empat yang terkonfirmasi setelah dicek ke dokumen asli (hlm. 6). Penilaian dampak galat juga tidak seragam: satu dari enam penilai menandai 61 dari 68 galat sebagai berdampak tinggi (hlm. 5). Penulisnya menyimpulkan bahwa taksonomi galat dan metrik saja tidak cukup untuk menilai konsekuensi klinis (hlm. 5), dan bahwa jumlah ekstraktor manusia yang kecil membatasi estimasi variabilitas antarpenilai (hlm. 7). Sun dkk. (2025) juga mencatat bahwa evaluasi halusinasi bergantung pada penilaian pakar yang dapat bersifat subjektif dan berbeda antarstudi (hlm. 18).</w:t>
+      </w:r>
+    </w:p>
+    <w:p>
+      <w:pPr>
+        <w:pStyle w:val="Heading3"/>
+      </w:pPr>
+      <w:r>
+        <w:t xml:space="preserve">Sintesis dan Celah</w:t>
+      </w:r>
+    </w:p>
+    <w:p>
+      <w:pPr>
+        <w:rPr>
+          <w:lang w:val="id-ID"/>
+        </w:rPr>
+      </w:pPr>
+      <w:r>
+        <w:rPr>
+          <w:lang w:val="id-ID"/>
+        </w:rPr>
+        <w:t xml:space="preserve">Kedua sumber menunjukkan bahwa acuan penilaian perlu dirancang dan diukur, bukan diasumsikan: kesepakatan antarpenilai dapat diukur dengan ambang yang ditetapkan sebelumnya (Becker dkk., 2025, hlm. 2), dan ketidaksepakatan antarmanusia dapat mencapai 29,0% pada ekstraksi klinis (van Koevorden dkk., 2026, hlm. 4). Keterbatasannya ada tiga. Pertama, keduanya mengevaluasi ekstraksi entitas atau nilai dari satu dokumen, bukan temuan ketidaksesuaian antardokumen. Kedua, teks yang dievaluasi berbahasa Jerman dan Belanda (Becker dkk., 2025, hlm. 2; van Koevorden dkk., 2026, hlm. 7), bukan Indonesia, dan van Koevorden dkk. membatasi generalisasi pada satu pusat rujukan tersier (hlm. 8). Ketiga, hanya Becker dkk. yang mengukur kesepakatan antarpenilai secara formal; pada van Koevorden dkk. jumlah penilai manusia terlalu kecil untuk estimasi itu. Akibatnya, evaluasi audit dokumentasi perlu menetapkan unit temuan, perlakuan kasus ambigu, ukuran kesepakatan penilai, serta ukuran dan ambang kegagalan sebelum eksperimen; acuan yang ditetapkan satu penilai tidak dapat memperkirakan variabilitas antarpenilai </w:t>
+      </w:r>
+      <w:r>
+        <w:rPr>
+          <w:highlight w:val="yellow"/>
+          <w:lang w:val="id-ID"/>
+        </w:rPr>
+        <w:t xml:space="preserve">[SESUAIKAN DENGAN BAB I: rumusan pertanyaan dan ukuran keberhasilan]</w:t>
+      </w:r>
+      <w:r>
+        <w:rPr>
+          <w:lang w:val="id-ID"/>
+        </w:rPr>
+        <w:t xml:space="preserve">.</w:t>
+      </w:r>
+    </w:p>
+    <w:p>
+      <w:pPr>
+        <w:pStyle w:val="Heading2"/>
+      </w:pPr>
+      <w:r>
+        <w:t xml:space="preserve">Perbandingan Karya Terdahulu dan Celah Penelitian</w:t>
+      </w:r>
+    </w:p>
+    <w:p>
+      <w:pPr>
+        <w:pStyle w:val="Heading3"/>
+      </w:pPr>
+      <w:r>
+        <w:t xml:space="preserve">Perbandingan Karya Terdahulu</w:t>
+      </w:r>
+    </w:p>
+    <w:p>
+      <w:pPr>
+        <w:rPr>
+          <w:lang w:val="id-ID"/>
+        </w:rPr>
+      </w:pPr>
+      <w:r>
+        <w:rPr>
+          <w:lang w:val="id-ID"/>
+        </w:rPr>
+        <w:t xml:space="preserve">Karya yang paling dekat dengan masalah penelitian ini pada tiap tema subbab sebelumnya dirangkum pada Tabel II.1. Perbandingan memakai data dan metode, hasil utama, dan keterbatasan karya itu bagi penelitian ini. Rincian dan halaman sumber ada pada subbab asal.</w:t>
+      </w:r>
+    </w:p>
+    <w:p>
+      <w:pPr>
+        <w:pStyle w:val="Caption"/>
+        <w:keepNext/>
+        <w:spacing w:before="120" w:after="80"/>
+        <w:ind w:left="0" w:firstLine="0"/>
+        <w:jc w:val="left"/>
+      </w:pPr>
+      <w:r>
+        <w:rPr>
+          <w:b/>
+          <w:lang w:val="id-ID"/>
+        </w:rPr>
+        <w:t xml:space="preserve">Tabel II.1. Perbandingan karya terdahulu yang terdekat dengan penelitian ini</w:t>
+      </w:r>
+    </w:p>
+    <w:tbl>
+      <w:tblPr>
+        <w:tblStyle w:val="TableGrid"/>
+        <w:tblW w:w="8306" w:type="dxa"/>
+        <w:jc w:val="center"/>
+        <w:tblLayout w:type="fixed"/>
+        <w:tblCellMar>
+          <w:left w:w="70" w:type="dxa"/>
+          <w:right w:w="70" w:type="dxa"/>
+        </w:tblCellMar>
+        <w:tblLook w:val="04A0" w:firstRow="1" w:lastRow="0" w:firstColumn="1" w:lastColumn="0" w:noHBand="0" w:noVBand="1"/>
+      </w:tblPr>
+      <w:tblGrid>
+        <w:gridCol w:w="1750"/>
+        <w:gridCol w:w="2300"/>
+        <w:gridCol w:w="2150"/>
+        <w:gridCol w:w="2106"/>
+      </w:tblGrid>
+      <w:tr>
+        <w:trPr>
+          <w:cantSplit/>
+          <w:tblHeader/>
+        </w:trPr>
+        <w:tc>
+          <w:tcPr>
+            <w:tcW w:w="1750" w:type="dxa"/>
+            <w:shd w:val="clear" w:color="auto" w:fill="D9D9D9"/>
+          </w:tcPr>
+          <w:p>
+            <w:pPr>
+              <w:spacing w:before="20" w:after="20" w:line="240" w:lineRule="auto"/>
+              <w:jc w:val="left"/>
+            </w:pPr>
+            <w:r>
+              <w:rPr>
+                <w:b/>
+                <w:sz w:val="20"/>
+                <w:szCs w:val="20"/>
+                <w:lang w:val="id-ID"/>
+              </w:rPr>
+              <w:t xml:space="preserve">Karya</w:t>
+            </w:r>
+          </w:p>
+        </w:tc>
+        <w:tc>
+          <w:tcPr>
+            <w:tcW w:w="2300" w:type="dxa"/>
+            <w:shd w:val="clear" w:color="auto" w:fill="D9D9D9"/>
+          </w:tcPr>
+          <w:p>
+            <w:pPr>
+              <w:spacing w:before="20" w:after="20" w:line="240" w:lineRule="auto"/>
+              <w:jc w:val="left"/>
+            </w:pPr>
+            <w:r>
+              <w:rPr>
+                <w:b/>
+                <w:sz w:val="20"/>
+                <w:szCs w:val="20"/>
+                <w:lang w:val="id-ID"/>
+              </w:rPr>
+              <w:t xml:space="preserve">Data dan metode</w:t>
+            </w:r>
+          </w:p>
+        </w:tc>
+        <w:tc>
+          <w:tcPr>
+            <w:tcW w:w="2150" w:type="dxa"/>
+            <w:shd w:val="clear" w:color="auto" w:fill="D9D9D9"/>
+          </w:tcPr>
+          <w:p>
+            <w:pPr>
+              <w:spacing w:before="20" w:after="20" w:line="240" w:lineRule="auto"/>
+              <w:jc w:val="left"/>
+            </w:pPr>
+            <w:r>
+              <w:rPr>
+                <w:b/>
+                <w:sz w:val="20"/>
+                <w:szCs w:val="20"/>
+                <w:lang w:val="id-ID"/>
+              </w:rPr>
+              <w:t xml:space="preserve">Hasil utama</w:t>
+            </w:r>
+          </w:p>
+        </w:tc>
+        <w:tc>
+          <w:tcPr>
+            <w:tcW w:w="2106" w:type="dxa"/>
+            <w:shd w:val="clear" w:color="auto" w:fill="D9D9D9"/>
+          </w:tcPr>
+          <w:p>
+            <w:pPr>
+              <w:spacing w:before="20" w:after="20" w:line="240" w:lineRule="auto"/>
+              <w:jc w:val="left"/>
+            </w:pPr>
+            <w:r>
+              <w:rPr>
+                <w:b/>
+                <w:sz w:val="20"/>
+                <w:szCs w:val="20"/>
+                <w:lang w:val="id-ID"/>
+              </w:rPr>
+              <w:t xml:space="preserve">Keterbatasan bagi penelitian ini</w:t>
+            </w:r>
+          </w:p>
+        </w:tc>
+      </w:tr>
+      <w:tr>
+        <w:trPr>
+          <w:cantSplit/>
+        </w:trPr>
+        <w:tc>
+          <w:tcPr>
+            <w:tcW w:w="1750" w:type="dxa"/>
+          </w:tcPr>
+          <w:p>
+            <w:pPr>
+              <w:spacing w:before="20" w:after="20" w:line="240" w:lineRule="auto"/>
+              <w:jc w:val="left"/>
+            </w:pPr>
+            <w:r>
+              <w:rPr>
+                <w:sz w:val="20"/>
+                <w:szCs w:val="20"/>
+                <w:lang w:val="id-ID"/>
+              </w:rPr>
+              <w:t xml:space="preserve">Simbolon &amp; Gani (2023)</w:t>
+            </w:r>
+          </w:p>
+        </w:tc>
+        <w:tc>
+          <w:tcPr>
+            <w:tcW w:w="2300" w:type="dxa"/>
+          </w:tcPr>
+          <w:p>
+            <w:pPr>
+              <w:spacing w:before="20" w:after="20" w:line="240" w:lineRule="auto"/>
+              <w:jc w:val="left"/>
+            </w:pPr>
+            <w:r>
+              <w:rPr>
+                <w:sz w:val="20"/>
+                <w:szCs w:val="20"/>
+                <w:lang w:val="id-ID"/>
+              </w:rPr>
+              <w:t xml:space="preserve">Ulasan lima artikel tentang klaim rawat inap JKN yang </w:t>
+            </w:r>
+            <w:r>
+              <w:rPr>
+                <w:i/>
+                <w:sz w:val="20"/>
+                <w:szCs w:val="20"/>
+                <w:lang w:val="id-ID"/>
+              </w:rPr>
+              <w:t xml:space="preserve">pending</w:t>
+            </w:r>
+          </w:p>
+        </w:tc>
+        <w:tc>
+          <w:tcPr>
+            <w:tcW w:w="2150" w:type="dxa"/>
+          </w:tcPr>
+          <w:p>
+            <w:pPr>
+              <w:spacing w:before="20" w:after="20" w:line="240" w:lineRule="auto"/>
+              <w:jc w:val="left"/>
+            </w:pPr>
+            <w:r>
+              <w:rPr>
+                <w:sz w:val="20"/>
+                <w:szCs w:val="20"/>
+                <w:lang w:val="id-ID"/>
+              </w:rPr>
+              <w:t xml:space="preserve">Pengodean tidak sesuai, berkas tidak lengkap, dan beda diagnosis DPJP–verifikator</w:t>
+            </w:r>
+          </w:p>
+        </w:tc>
+        <w:tc>
+          <w:tcPr>
+            <w:tcW w:w="2106" w:type="dxa"/>
+          </w:tcPr>
+          <w:p>
+            <w:pPr>
+              <w:spacing w:before="20" w:after="20" w:line="240" w:lineRule="auto"/>
+              <w:jc w:val="left"/>
+            </w:pPr>
+            <w:r>
+              <w:rPr>
+                <w:sz w:val="20"/>
+                <w:szCs w:val="20"/>
+                <w:lang w:val="id-ID"/>
+              </w:rPr>
+              <w:t xml:space="preserve">Ringkasan sekunder; jenis ketidaksesuaian antardokumen tidak dirinci</w:t>
+            </w:r>
+          </w:p>
+        </w:tc>
+      </w:tr>
+      <w:tr>
+        <w:trPr>
+          <w:cantSplit/>
+        </w:trPr>
+        <w:tc>
+          <w:tcPr>
+            <w:tcW w:w="1750" w:type="dxa"/>
+          </w:tcPr>
+          <w:p>
+            <w:pPr>
+              <w:spacing w:before="20" w:after="20" w:line="240" w:lineRule="auto"/>
+              <w:jc w:val="left"/>
+            </w:pPr>
+            <w:r>
+              <w:rPr>
+                <w:sz w:val="20"/>
+                <w:szCs w:val="20"/>
+                <w:lang w:val="id-ID"/>
+              </w:rPr>
+              <w:t xml:space="preserve">Dietrich &amp; Stubbert (2026)</w:t>
+            </w:r>
+          </w:p>
+        </w:tc>
+        <w:tc>
+          <w:tcPr>
+            <w:tcW w:w="2300" w:type="dxa"/>
+          </w:tcPr>
+          <w:p>
+            <w:pPr>
+              <w:spacing w:before="20" w:after="20" w:line="240" w:lineRule="auto"/>
+              <w:jc w:val="left"/>
+            </w:pPr>
+            <w:r>
+              <w:rPr>
+                <w:sz w:val="20"/>
+                <w:szCs w:val="20"/>
+                <w:lang w:val="id-ID"/>
+              </w:rPr>
+              <w:t xml:space="preserve">600 catatan pemulangan IGD (MIMIC-IV-ED); empat LLM</w:t>
+            </w:r>
+          </w:p>
+        </w:tc>
+        <w:tc>
+          <w:tcPr>
+            <w:tcW w:w="2150" w:type="dxa"/>
+          </w:tcPr>
+          <w:p>
+            <w:pPr>
+              <w:spacing w:before="20" w:after="20" w:line="240" w:lineRule="auto"/>
+              <w:jc w:val="left"/>
+            </w:pPr>
+            <w:r>
+              <w:rPr>
+                <w:sz w:val="20"/>
+                <w:szCs w:val="20"/>
+                <w:lang w:val="id-ID"/>
+              </w:rPr>
+              <w:t xml:space="preserve">Akurasi 93,2–94,2%; temuan klinis tersulit</w:t>
+            </w:r>
+          </w:p>
+        </w:tc>
+        <w:tc>
+          <w:tcPr>
+            <w:tcW w:w="2106" w:type="dxa"/>
+          </w:tcPr>
+          <w:p>
+            <w:pPr>
+              <w:spacing w:before="20" w:after="20" w:line="240" w:lineRule="auto"/>
+              <w:jc w:val="left"/>
+            </w:pPr>
+            <w:r>
+              <w:rPr>
+                <w:sz w:val="20"/>
+                <w:szCs w:val="20"/>
+                <w:lang w:val="id-ID"/>
+              </w:rPr>
+              <w:t xml:space="preserve">500 dari 600 catatan bersisipan kesalahan; satu dokumen; tanpa pedoman</w:t>
+            </w:r>
+          </w:p>
+        </w:tc>
+      </w:tr>
+      <w:tr>
+        <w:trPr>
+          <w:cantSplit/>
+        </w:trPr>
+        <w:tc>
+          <w:tcPr>
+            <w:tcW w:w="1750" w:type="dxa"/>
+          </w:tcPr>
+          <w:p>
+            <w:pPr>
+              <w:spacing w:before="20" w:after="20" w:line="240" w:lineRule="auto"/>
+              <w:jc w:val="left"/>
+            </w:pPr>
+            <w:r>
+              <w:rPr>
+                <w:sz w:val="20"/>
+                <w:szCs w:val="20"/>
+                <w:lang w:val="id-ID"/>
+              </w:rPr>
+              <w:t xml:space="preserve">Skrabic dkk. (2026)</w:t>
+            </w:r>
+          </w:p>
+        </w:tc>
+        <w:tc>
+          <w:tcPr>
+            <w:tcW w:w="2300" w:type="dxa"/>
+          </w:tcPr>
+          <w:p>
+            <w:pPr>
+              <w:spacing w:before="20" w:after="20" w:line="240" w:lineRule="auto"/>
+              <w:jc w:val="left"/>
+            </w:pPr>
+            <w:r>
+              <w:rPr>
+                <w:sz w:val="20"/>
+                <w:szCs w:val="20"/>
+                <w:lang w:val="id-ID"/>
+              </w:rPr>
+              <w:t xml:space="preserve">102 laporan IGD; tiga model penalaran vs tiga dokter</w:t>
+            </w:r>
+          </w:p>
+        </w:tc>
+        <w:tc>
+          <w:tcPr>
+            <w:tcW w:w="2150" w:type="dxa"/>
+          </w:tcPr>
+          <w:p>
+            <w:pPr>
+              <w:spacing w:before="20" w:after="20" w:line="240" w:lineRule="auto"/>
+              <w:jc w:val="left"/>
+            </w:pPr>
+            <w:r>
+              <w:rPr>
+                <w:sz w:val="20"/>
+                <w:szCs w:val="20"/>
+                <w:lang w:val="id-ID"/>
+              </w:rPr>
+              <w:t xml:space="preserve">Lokasi benar 65,7–79,2% vs dokter 48,0%</w:t>
+            </w:r>
+          </w:p>
+        </w:tc>
+        <w:tc>
+          <w:tcPr>
+            <w:tcW w:w="2106" w:type="dxa"/>
+          </w:tcPr>
+          <w:p>
+            <w:pPr>
+              <w:spacing w:before="20" w:after="20" w:line="240" w:lineRule="auto"/>
+              <w:jc w:val="left"/>
+            </w:pPr>
+            <w:r>
+              <w:rPr>
+                <w:sz w:val="20"/>
+                <w:szCs w:val="20"/>
+                <w:lang w:val="id-ID"/>
+              </w:rPr>
+              <w:t xml:space="preserve">Tanpa catatan bebas kesalahan, sehingga positif palsu tidak terukur</w:t>
+            </w:r>
+          </w:p>
+        </w:tc>
+      </w:tr>
+      <w:tr>
+        <w:trPr>
+          <w:cantSplit/>
+        </w:trPr>
+        <w:tc>
+          <w:tcPr>
+            <w:tcW w:w="1750" w:type="dxa"/>
+          </w:tcPr>
+          <w:p>
+            <w:pPr>
+              <w:spacing w:before="20" w:after="20" w:line="240" w:lineRule="auto"/>
+              <w:jc w:val="left"/>
+            </w:pPr>
+            <w:r>
+              <w:rPr>
+                <w:sz w:val="20"/>
+                <w:szCs w:val="20"/>
+                <w:lang w:val="id-ID"/>
+              </w:rPr>
+              <w:t xml:space="preserve">Jaganathan dkk. (2025)</w:t>
+            </w:r>
+          </w:p>
+        </w:tc>
+        <w:tc>
+          <w:tcPr>
+            <w:tcW w:w="2300" w:type="dxa"/>
+          </w:tcPr>
+          <w:p>
+            <w:pPr>
+              <w:spacing w:before="20" w:after="20" w:line="240" w:lineRule="auto"/>
+              <w:jc w:val="left"/>
+            </w:pPr>
+            <w:r>
+              <w:rPr>
+                <w:sz w:val="20"/>
+                <w:szCs w:val="20"/>
+                <w:lang w:val="id-ID"/>
+              </w:rPr>
+              <w:t xml:space="preserve">3.372 catatan MIMIC-III; pengujian metamorfik pada model pengodean ICD</w:t>
+            </w:r>
+          </w:p>
+        </w:tc>
+        <w:tc>
+          <w:tcPr>
+            <w:tcW w:w="2150" w:type="dxa"/>
+          </w:tcPr>
+          <w:p>
+            <w:pPr>
+              <w:spacing w:before="20" w:after="20" w:line="240" w:lineRule="auto"/>
+              <w:jc w:val="left"/>
+            </w:pPr>
+            <w:r>
+              <w:rPr>
+                <w:sz w:val="20"/>
+                <w:szCs w:val="20"/>
+                <w:lang w:val="id-ID"/>
+              </w:rPr>
+              <w:t xml:space="preserve">Lima kode teratas berubah pada 70–81% catatan</w:t>
+            </w:r>
+          </w:p>
+        </w:tc>
+        <w:tc>
+          <w:tcPr>
+            <w:tcW w:w="2106" w:type="dxa"/>
+          </w:tcPr>
+          <w:p>
+            <w:pPr>
+              <w:spacing w:before="20" w:after="20" w:line="240" w:lineRule="auto"/>
+              <w:jc w:val="left"/>
+            </w:pPr>
+            <w:r>
+              <w:rPr>
+                <w:sz w:val="20"/>
+                <w:szCs w:val="20"/>
+                <w:lang w:val="id-ID"/>
+              </w:rPr>
+              <w:t xml:space="preserve">Satu model; mengukur stabilitas, bukan kebenaran</w:t>
+            </w:r>
+          </w:p>
+        </w:tc>
+      </w:tr>
+      <w:tr>
+        <w:trPr>
+          <w:cantSplit/>
+        </w:trPr>
+        <w:tc>
+          <w:tcPr>
+            <w:tcW w:w="1750" w:type="dxa"/>
+          </w:tcPr>
+          <w:p>
+            <w:pPr>
+              <w:spacing w:before="20" w:after="20" w:line="240" w:lineRule="auto"/>
+              <w:jc w:val="left"/>
+            </w:pPr>
+            <w:r>
+              <w:rPr>
+                <w:sz w:val="20"/>
+                <w:szCs w:val="20"/>
+                <w:lang w:val="id-ID"/>
+              </w:rPr>
+              <w:t xml:space="preserve">Wei dkk. (2026)</w:t>
+            </w:r>
+          </w:p>
+        </w:tc>
+        <w:tc>
+          <w:tcPr>
+            <w:tcW w:w="2300" w:type="dxa"/>
+          </w:tcPr>
+          <w:p>
+            <w:pPr>
+              <w:spacing w:before="20" w:after="20" w:line="240" w:lineRule="auto"/>
+              <w:jc w:val="left"/>
+            </w:pPr>
+            <w:r>
+              <w:rPr>
+                <w:sz w:val="20"/>
+                <w:szCs w:val="20"/>
+                <w:lang w:val="id-ID"/>
+              </w:rPr>
+              <w:t xml:space="preserve">Disambiguasi singkatan; dataset CASI berbahasa Inggris</w:t>
+            </w:r>
+          </w:p>
+        </w:tc>
+        <w:tc>
+          <w:tcPr>
+            <w:tcW w:w="2150" w:type="dxa"/>
+          </w:tcPr>
+          <w:p>
+            <w:pPr>
+              <w:spacing w:before="20" w:after="20" w:line="240" w:lineRule="auto"/>
+              <w:jc w:val="left"/>
+            </w:pPr>
+            <w:r>
+              <w:rPr>
+                <w:sz w:val="20"/>
+                <w:szCs w:val="20"/>
+                <w:lang w:val="id-ID"/>
+              </w:rPr>
+              <w:t xml:space="preserve">Akurasi 0,9228 (bersih) dan 0,7585 (asli)</w:t>
+            </w:r>
+          </w:p>
+        </w:tc>
+        <w:tc>
+          <w:tcPr>
+            <w:tcW w:w="2106" w:type="dxa"/>
+          </w:tcPr>
+          <w:p>
+            <w:pPr>
+              <w:spacing w:before="20" w:after="20" w:line="240" w:lineRule="auto"/>
+              <w:jc w:val="left"/>
+            </w:pPr>
+            <w:r>
+              <w:rPr>
+                <w:sz w:val="20"/>
+                <w:szCs w:val="20"/>
+                <w:lang w:val="id-ID"/>
+              </w:rPr>
+              <w:t xml:space="preserve">Satu tolok ukur Inggris; bergantung pada inventori makna</w:t>
+            </w:r>
+          </w:p>
+        </w:tc>
+      </w:tr>
+      <w:tr>
+        <w:trPr>
+          <w:cantSplit/>
+        </w:trPr>
+        <w:tc>
+          <w:tcPr>
+            <w:tcW w:w="1750" w:type="dxa"/>
+          </w:tcPr>
+          <w:p>
+            <w:pPr>
+              <w:spacing w:before="20" w:after="20" w:line="240" w:lineRule="auto"/>
+              <w:jc w:val="left"/>
+            </w:pPr>
+            <w:r>
+              <w:rPr>
+                <w:sz w:val="20"/>
+                <w:szCs w:val="20"/>
+                <w:lang w:val="id-ID"/>
+              </w:rPr>
+              <w:t xml:space="preserve">Ijadi Maghsoodi dkk. (2026); Domingues (2026)</w:t>
+            </w:r>
+          </w:p>
+        </w:tc>
+        <w:tc>
+          <w:tcPr>
+            <w:tcW w:w="2300" w:type="dxa"/>
+          </w:tcPr>
+          <w:p>
+            <w:pPr>
+              <w:spacing w:before="20" w:after="20" w:line="240" w:lineRule="auto"/>
+              <w:jc w:val="left"/>
+            </w:pPr>
+            <w:r>
+              <w:rPr>
+                <w:sz w:val="20"/>
+                <w:szCs w:val="20"/>
+                <w:lang w:val="id-ID"/>
+              </w:rPr>
+              <w:t xml:space="preserve">Tinjauan naratif hibrida; sistem berbasis aturan untuk onkologi prostat</w:t>
+            </w:r>
+          </w:p>
+        </w:tc>
+        <w:tc>
+          <w:tcPr>
+            <w:tcW w:w="2150" w:type="dxa"/>
+          </w:tcPr>
+          <w:p>
+            <w:pPr>
+              <w:spacing w:before="20" w:after="20" w:line="240" w:lineRule="auto"/>
+              <w:jc w:val="left"/>
+            </w:pPr>
+            <w:r>
+              <w:rPr>
+                <w:sz w:val="20"/>
+                <w:szCs w:val="20"/>
+                <w:lang w:val="id-ID"/>
+              </w:rPr>
+              <w:t xml:space="preserve">Hibrida paling kredibel pada validasi dokumentasi; bukti prospektif jarang</w:t>
+            </w:r>
+          </w:p>
+        </w:tc>
+        <w:tc>
+          <w:tcPr>
+            <w:tcW w:w="2106" w:type="dxa"/>
+          </w:tcPr>
+          <w:p>
+            <w:pPr>
+              <w:spacing w:before="20" w:after="20" w:line="240" w:lineRule="auto"/>
+              <w:jc w:val="left"/>
+            </w:pPr>
+            <w:r>
+              <w:rPr>
+                <w:sz w:val="20"/>
+                <w:szCs w:val="20"/>
+                <w:lang w:val="id-ID"/>
+              </w:rPr>
+              <w:t xml:space="preserve">Konseptual; yang diuji hanya aturan; tanpa perbandingan aturan vs aturan + AI</w:t>
+            </w:r>
+          </w:p>
+        </w:tc>
+      </w:tr>
+      <w:tr>
+        <w:trPr>
+          <w:cantSplit/>
+        </w:trPr>
+        <w:tc>
+          <w:tcPr>
+            <w:tcW w:w="1750" w:type="dxa"/>
+          </w:tcPr>
+          <w:p>
+            <w:pPr>
+              <w:spacing w:before="20" w:after="20" w:line="240" w:lineRule="auto"/>
+              <w:jc w:val="left"/>
+            </w:pPr>
+            <w:r>
+              <w:rPr>
+                <w:sz w:val="20"/>
+                <w:szCs w:val="20"/>
+                <w:lang w:val="id-ID"/>
+              </w:rPr>
+              <w:t xml:space="preserve">Zhang dkk. (2026)</w:t>
+            </w:r>
+          </w:p>
+        </w:tc>
+        <w:tc>
+          <w:tcPr>
+            <w:tcW w:w="2300" w:type="dxa"/>
+          </w:tcPr>
+          <w:p>
+            <w:pPr>
+              <w:spacing w:before="20" w:after="20" w:line="240" w:lineRule="auto"/>
+              <w:jc w:val="left"/>
+            </w:pPr>
+            <w:r>
+              <w:rPr>
+                <w:sz w:val="20"/>
+                <w:szCs w:val="20"/>
+                <w:lang w:val="id-ID"/>
+              </w:rPr>
+              <w:t xml:space="preserve">RAG pada catatan perawatan lansia; Llama 3.1 8B</w:t>
+            </w:r>
+          </w:p>
+        </w:tc>
+        <w:tc>
+          <w:tcPr>
+            <w:tcW w:w="2150" w:type="dxa"/>
+          </w:tcPr>
+          <w:p>
+            <w:pPr>
+              <w:spacing w:before="20" w:after="20" w:line="240" w:lineRule="auto"/>
+              <w:jc w:val="left"/>
+            </w:pPr>
+            <w:r>
+              <w:rPr>
+                <w:sz w:val="20"/>
+                <w:szCs w:val="20"/>
+                <w:lang w:val="id-ID"/>
+              </w:rPr>
+              <w:t xml:space="preserve">F1 jawaban 0,702/0,722 menjadi 0,946/0,953</w:t>
+            </w:r>
+          </w:p>
+        </w:tc>
+        <w:tc>
+          <w:tcPr>
+            <w:tcW w:w="2106" w:type="dxa"/>
+          </w:tcPr>
+          <w:p>
+            <w:pPr>
+              <w:spacing w:before="20" w:after="20" w:line="240" w:lineRule="auto"/>
+              <w:jc w:val="left"/>
+            </w:pPr>
+            <w:r>
+              <w:rPr>
+                <w:sz w:val="20"/>
+                <w:szCs w:val="20"/>
+                <w:lang w:val="id-ID"/>
+              </w:rPr>
+              <w:t xml:space="preserve">Dua tugas ekstraksi berbasis skema; tanpa penalaran temporal</w:t>
+            </w:r>
+          </w:p>
+        </w:tc>
+      </w:tr>
+      <w:tr>
+        <w:trPr>
+          <w:cantSplit/>
+        </w:trPr>
+        <w:tc>
+          <w:tcPr>
+            <w:tcW w:w="1750" w:type="dxa"/>
+          </w:tcPr>
+          <w:p>
+            <w:pPr>
+              <w:spacing w:before="20" w:after="20" w:line="240" w:lineRule="auto"/>
+              <w:jc w:val="left"/>
+            </w:pPr>
+            <w:r>
+              <w:rPr>
+                <w:sz w:val="20"/>
+                <w:szCs w:val="20"/>
+                <w:lang w:val="id-ID"/>
+              </w:rPr>
+              <w:t xml:space="preserve">Zeba dkk. (2026)</w:t>
+            </w:r>
+          </w:p>
+        </w:tc>
+        <w:tc>
+          <w:tcPr>
+            <w:tcW w:w="2300" w:type="dxa"/>
+          </w:tcPr>
+          <w:p>
+            <w:pPr>
+              <w:spacing w:before="20" w:after="20" w:line="240" w:lineRule="auto"/>
+              <w:jc w:val="left"/>
+            </w:pPr>
+            <w:r>
+              <w:rPr>
+                <w:sz w:val="20"/>
+                <w:szCs w:val="20"/>
+                <w:lang w:val="id-ID"/>
+              </w:rPr>
+              <w:t xml:space="preserve">Pemeriksa fakta tanpa LLM; 3.786 proposisi MIMIC-III</w:t>
+            </w:r>
+          </w:p>
+        </w:tc>
+        <w:tc>
+          <w:tcPr>
+            <w:tcW w:w="2150" w:type="dxa"/>
+          </w:tcPr>
+          <w:p>
+            <w:pPr>
+              <w:spacing w:before="20" w:after="20" w:line="240" w:lineRule="auto"/>
+              <w:jc w:val="left"/>
+            </w:pPr>
+            <w:r>
+              <w:rPr>
+                <w:sz w:val="20"/>
+                <w:szCs w:val="20"/>
+                <w:lang w:val="id-ID"/>
+              </w:rPr>
+              <w:t xml:space="preserve">Presisi 0,8904; </w:t>
+            </w:r>
+            <w:r>
+              <w:rPr>
+                <w:i/>
+                <w:sz w:val="20"/>
+                <w:szCs w:val="20"/>
+                <w:lang w:val="id-ID"/>
+              </w:rPr>
+              <w:t xml:space="preserve">recall</w:t>
+            </w:r>
+            <w:r>
+              <w:rPr>
+                <w:sz w:val="20"/>
+                <w:szCs w:val="20"/>
+                <w:lang w:val="id-ID"/>
+              </w:rPr>
+              <w:t xml:space="preserve"> 0,8234; F1 0,8556</w:t>
+            </w:r>
+          </w:p>
+        </w:tc>
+        <w:tc>
+          <w:tcPr>
+            <w:tcW w:w="2106" w:type="dxa"/>
+          </w:tcPr>
+          <w:p>
+            <w:pPr>
+              <w:spacing w:before="20" w:after="20" w:line="240" w:lineRule="auto"/>
+              <w:jc w:val="left"/>
+            </w:pPr>
+            <w:r>
+              <w:rPr>
+                <w:sz w:val="20"/>
+                <w:szCs w:val="20"/>
+                <w:lang w:val="id-ID"/>
+              </w:rPr>
+              <w:t xml:space="preserve">Bahasa Inggris, ICU; vonis biner</w:t>
+            </w:r>
+          </w:p>
+        </w:tc>
+      </w:tr>
+      <w:tr>
+        <w:trPr>
+          <w:cantSplit/>
+        </w:trPr>
+        <w:tc>
+          <w:tcPr>
+            <w:tcW w:w="1750" w:type="dxa"/>
+          </w:tcPr>
+          <w:p>
+            <w:pPr>
+              <w:spacing w:before="20" w:after="20" w:line="240" w:lineRule="auto"/>
+              <w:jc w:val="left"/>
+            </w:pPr>
+            <w:r>
+              <w:rPr>
+                <w:sz w:val="20"/>
+                <w:szCs w:val="20"/>
+                <w:lang w:val="id-ID"/>
+              </w:rPr>
+              <w:t xml:space="preserve">Azzam dkk. (2026)</w:t>
+            </w:r>
+          </w:p>
+        </w:tc>
+        <w:tc>
+          <w:tcPr>
+            <w:tcW w:w="2300" w:type="dxa"/>
+          </w:tcPr>
+          <w:p>
+            <w:pPr>
+              <w:spacing w:before="20" w:after="20" w:line="240" w:lineRule="auto"/>
+              <w:jc w:val="left"/>
+            </w:pPr>
+            <w:r>
+              <w:rPr>
+                <w:sz w:val="20"/>
+                <w:szCs w:val="20"/>
+                <w:lang w:val="id-ID"/>
+              </w:rPr>
+              <w:t xml:space="preserve">Anonimisasi oleh LLM lokal; data sintetis dan MIMIC-III</w:t>
+            </w:r>
+          </w:p>
+        </w:tc>
+        <w:tc>
+          <w:tcPr>
+            <w:tcW w:w="2150" w:type="dxa"/>
+          </w:tcPr>
+          <w:p>
+            <w:pPr>
+              <w:spacing w:before="20" w:after="20" w:line="240" w:lineRule="auto"/>
+              <w:jc w:val="left"/>
+            </w:pPr>
+            <w:r>
+              <w:rPr>
+                <w:sz w:val="20"/>
+                <w:szCs w:val="20"/>
+                <w:lang w:val="id-ID"/>
+              </w:rPr>
+              <w:t xml:space="preserve">Presisi 1,000 dan </w:t>
+            </w:r>
+            <w:r>
+              <w:rPr>
+                <w:i/>
+                <w:sz w:val="20"/>
+                <w:szCs w:val="20"/>
+                <w:lang w:val="id-ID"/>
+              </w:rPr>
+              <w:t xml:space="preserve">recall</w:t>
+            </w:r>
+            <w:r>
+              <w:rPr>
+                <w:sz w:val="20"/>
+                <w:szCs w:val="20"/>
+                <w:lang w:val="id-ID"/>
+              </w:rPr>
+              <w:t xml:space="preserve"> 0,936 (sintetis)</w:t>
+            </w:r>
+          </w:p>
+        </w:tc>
+        <w:tc>
+          <w:tcPr>
+            <w:tcW w:w="2106" w:type="dxa"/>
+          </w:tcPr>
+          <w:p>
+            <w:pPr>
+              <w:spacing w:before="20" w:after="20" w:line="240" w:lineRule="auto"/>
+              <w:jc w:val="left"/>
+            </w:pPr>
+            <w:r>
+              <w:rPr>
+                <w:sz w:val="20"/>
+                <w:szCs w:val="20"/>
+                <w:lang w:val="id-ID"/>
+              </w:rPr>
+              <w:t xml:space="preserve">Hanya bahasa Inggris; data sintetis atau sudah diredaksi</w:t>
+            </w:r>
+          </w:p>
+        </w:tc>
+      </w:tr>
+      <w:tr>
+        <w:trPr>
+          <w:cantSplit/>
+        </w:trPr>
+        <w:tc>
+          <w:tcPr>
+            <w:tcW w:w="1750" w:type="dxa"/>
+          </w:tcPr>
+          <w:p>
+            <w:pPr>
+              <w:spacing w:before="20" w:after="20" w:line="240" w:lineRule="auto"/>
+              <w:jc w:val="left"/>
+            </w:pPr>
+            <w:r>
+              <w:rPr>
+                <w:sz w:val="20"/>
+                <w:szCs w:val="20"/>
+                <w:lang w:val="id-ID"/>
+              </w:rPr>
+              <w:t xml:space="preserve">van Koevorden dkk. (2026)</w:t>
+            </w:r>
+          </w:p>
+        </w:tc>
+        <w:tc>
+          <w:tcPr>
+            <w:tcW w:w="2300" w:type="dxa"/>
+          </w:tcPr>
+          <w:p>
+            <w:pPr>
+              <w:spacing w:before="20" w:after="20" w:line="240" w:lineRule="auto"/>
+              <w:jc w:val="left"/>
+            </w:pPr>
+            <w:r>
+              <w:rPr>
+                <w:sz w:val="20"/>
+                <w:szCs w:val="20"/>
+                <w:lang w:val="id-ID"/>
+              </w:rPr>
+              <w:t xml:space="preserve">Ekstraksi LLM vs konsensus dua dokter; 60 pasien</w:t>
+            </w:r>
+          </w:p>
+        </w:tc>
+        <w:tc>
+          <w:tcPr>
+            <w:tcW w:w="2150" w:type="dxa"/>
+          </w:tcPr>
+          <w:p>
+            <w:pPr>
+              <w:spacing w:before="20" w:after="20" w:line="240" w:lineRule="auto"/>
+              <w:jc w:val="left"/>
+            </w:pPr>
+            <w:r>
+              <w:rPr>
+                <w:sz w:val="20"/>
+                <w:szCs w:val="20"/>
+                <w:lang w:val="id-ID"/>
+              </w:rPr>
+              <w:t xml:space="preserve">Akurasi 74–90%; beda dokter–dokter 29,0%</w:t>
+            </w:r>
+          </w:p>
+        </w:tc>
+        <w:tc>
+          <w:tcPr>
+            <w:tcW w:w="2106" w:type="dxa"/>
+          </w:tcPr>
+          <w:p>
+            <w:pPr>
+              <w:spacing w:before="20" w:after="20" w:line="240" w:lineRule="auto"/>
+              <w:jc w:val="left"/>
+            </w:pPr>
+            <w:r>
+              <w:rPr>
+                <w:sz w:val="20"/>
+                <w:szCs w:val="20"/>
+                <w:lang w:val="id-ID"/>
+              </w:rPr>
+              <w:t xml:space="preserve">Ekstraksi nilai; bahasa Belanda; satu pusat</w:t>
+            </w:r>
+          </w:p>
+        </w:tc>
+      </w:tr>
+    </w:tbl>
+    <w:p>
+      <w:pPr>
+        <w:spacing w:before="0" w:after="0" w:line="120" w:lineRule="exact"/>
+      </w:pPr>
+    </w:p>
+    <w:p>
+      <w:pPr>
+        <w:pStyle w:val="Heading3"/>
+      </w:pPr>
+      <w:r>
+        <w:t xml:space="preserve">Celah Penelitian</w:t>
+      </w:r>
+    </w:p>
+    <w:p>
+      <w:pPr>
+        <w:rPr>
+          <w:lang w:val="id-ID"/>
+        </w:rPr>
+      </w:pPr>
+      <w:r>
+        <w:rPr>
+          <w:lang w:val="id-ID"/>
+        </w:rPr>
+        <w:t xml:space="preserve">Dari 34 sumber yang dirujuk dalam bab ini, empat celah berulang. Pertama, tidak ada studi NLP atau AI yang menguji teks klinis berbahasa Indonesia, termasuk singkatan dan pengenal lokalnya (subbab II.2, II.3, II.6). Kedua, tidak ada yang memeriksa kesesuaian antardokumen dalam satu episode rawat inap sebelum klaim diajukan, misalnya membandingkan catatan perkembangan harian dengan ringkasan akhir atau memakai pedoman sebagai dasar temuan (II.1, II.3, II.5). Ketiga, di antara sumber yang dibaca, tidak ada yang membandingkan konfigurasi aturan saja dengan aturan ditambah AI/NLP berbasis RAG pada tugas ini, dan ketepatan kutipan bukti belum diperiksa secara otomatis (II.4, II.5). Keempat, acuan penilaian untuk audit, yaitu unit temuan, perlakuan kasus ambigu, dan ukuran kesepakatan penilai, belum dirancang pada sumber mana pun, padahal ketidaksepakatan antarpenilai dapat mencapai 29,0% pada ekstraksi klinis (II.7). Pernyataan "tidak ada" ini berlaku pada 34 sumber tersebut, bukan pada seluruh literatur. Penelitian ini mengisi celah itu dengan menguji audit dokumentasi rawat inap kebidanan dan anak berbahasa Indonesia terhadap pembanding, ukuran, dan ambang kegagalan yang ditetapkan sebelum eksperimen </w:t>
+      </w:r>
+      <w:r>
+        <w:rPr>
+          <w:highlight w:val="yellow"/>
+          <w:lang w:val="id-ID"/>
+        </w:rPr>
+        <w:t xml:space="preserve">[SESUAIKAN DENGAN BAB I: rumusan pertanyaan dan ukuran keberhasilan]</w:t>
+      </w:r>
+      <w:r>
+        <w:rPr>
+          <w:lang w:val="id-ID"/>
+        </w:rPr>
+        <w:t xml:space="preserve">.</w:t>
+      </w:r>
+    </w:p>
+    <w:p>
+      <w:pPr>
         <w:pStyle w:val="Heading1"/>
       </w:pPr>
       <w:r>
@@ -6023,7 +7158,7 @@
           <w:noProof/>
           <w:lang w:val="id-ID"/>
         </w:rPr>
-        <w:t xml:space="preserve">Chen, H., Zhou, Y., Li, R., Illa, A. M., Cleveland, A., &amp; Ding, J. (2026). A comprehensive survey on medical concept normalization: Datasets, techniques, applications, and future directions. </w:t>
+        <w:t xml:space="preserve">Becker, M., Krumscheid, M., Knobelspies, A., Seydel, M., Richter-Pechanski, P., &amp; Karl, A. (2025). Extending CARDIO:DE: Additional annotation guidelines and evaluation of NLP approaches for clinical applications. </w:t>
       </w:r>
       <w:r>
         <w:rPr>
@@ -6031,14 +7166,14 @@
           <w:noProof/>
           <w:lang w:val="id-ID"/>
         </w:rPr>
-        <w:t xml:space="preserve">Journal of Biomedical Informatics, 178</w:t>
-      </w:r>
-      <w:r>
-        <w:rPr>
-          <w:noProof/>
-          <w:lang w:val="id-ID"/>
-        </w:rPr>
-        <w:t xml:space="preserve">, 105005.</w:t>
+        <w:t xml:space="preserve">International Journal of Medical Informatics, 203</w:t>
+      </w:r>
+      <w:r>
+        <w:rPr>
+          <w:noProof/>
+          <w:lang w:val="id-ID"/>
+        </w:rPr>
+        <w:t xml:space="preserve">, 106009.</w:t>
       </w:r>
     </w:p>
     <w:p>
@@ -6055,7 +7190,7 @@
           <w:noProof/>
           <w:lang w:val="id-ID"/>
         </w:rPr>
-        <w:t xml:space="preserve">Dietrich, N., &amp; Stubbert, B. (2026). Automated auditing of emergency department documentation using large language models. </w:t>
+        <w:t xml:space="preserve">Chen, H., Zhou, Y., Li, R., Illa, A. M., Cleveland, A., &amp; Ding, J. (2026). A comprehensive survey on medical concept normalization: Datasets, techniques, applications, and future directions. </w:t>
       </w:r>
       <w:r>
         <w:rPr>
@@ -6063,14 +7198,14 @@
           <w:noProof/>
           <w:lang w:val="id-ID"/>
         </w:rPr>
-        <w:t xml:space="preserve">American Journal of Emergency Medicine, 104</w:t>
-      </w:r>
-      <w:r>
-        <w:rPr>
-          <w:noProof/>
-          <w:lang w:val="id-ID"/>
-        </w:rPr>
-        <w:t xml:space="preserve">, 95–101.</w:t>
+        <w:t xml:space="preserve">Journal of Biomedical Informatics, 178</w:t>
+      </w:r>
+      <w:r>
+        <w:rPr>
+          <w:noProof/>
+          <w:lang w:val="id-ID"/>
+        </w:rPr>
+        <w:t xml:space="preserve">, 105005.</w:t>
       </w:r>
     </w:p>
     <w:p>
@@ -6087,7 +7222,7 @@
           <w:noProof/>
           <w:lang w:val="id-ID"/>
         </w:rPr>
-        <w:t xml:space="preserve">Domingues, N. S. (2026). A hybrid decision support system using rule-based and AI methods: The OnCATs knowledge-based framework. </w:t>
+        <w:t xml:space="preserve">Dietrich, N., &amp; Stubbert, B. (2026). Automated auditing of emergency department documentation using large language models. </w:t>
       </w:r>
       <w:r>
         <w:rPr>
@@ -6095,14 +7230,14 @@
           <w:noProof/>
           <w:lang w:val="id-ID"/>
         </w:rPr>
-        <w:t xml:space="preserve">International Journal of Medical Informatics, 206</w:t>
-      </w:r>
-      <w:r>
-        <w:rPr>
-          <w:noProof/>
-          <w:lang w:val="id-ID"/>
-        </w:rPr>
-        <w:t xml:space="preserve">, 106144.</w:t>
+        <w:t xml:space="preserve">American Journal of Emergency Medicine, 104</w:t>
+      </w:r>
+      <w:r>
+        <w:rPr>
+          <w:noProof/>
+          <w:lang w:val="id-ID"/>
+        </w:rPr>
+        <w:t xml:space="preserve">, 95–101.</w:t>
       </w:r>
     </w:p>
     <w:p>
@@ -6119,7 +7254,7 @@
           <w:noProof/>
           <w:lang w:val="id-ID"/>
         </w:rPr>
-        <w:t xml:space="preserve">Du, W. (H.), Wang, G., Xu, J. (N.), &amp; Vasarhelyi, M. A. (2026). Information systems auditing of psychiatric diagnoses using context-enriched QA-based language models. </w:t>
+        <w:t xml:space="preserve">Domingues, N. S. (2026). A hybrid decision support system using rule-based and AI methods: The OnCATs knowledge-based framework. </w:t>
       </w:r>
       <w:r>
         <w:rPr>
@@ -6127,14 +7262,14 @@
           <w:noProof/>
           <w:lang w:val="id-ID"/>
         </w:rPr>
-        <w:t xml:space="preserve">Data Science and Management, 9</w:t>
-      </w:r>
-      <w:r>
-        <w:rPr>
-          <w:noProof/>
-          <w:lang w:val="id-ID"/>
-        </w:rPr>
-        <w:t xml:space="preserve">, 100177.</w:t>
+        <w:t xml:space="preserve">International Journal of Medical Informatics, 206</w:t>
+      </w:r>
+      <w:r>
+        <w:rPr>
+          <w:noProof/>
+          <w:lang w:val="id-ID"/>
+        </w:rPr>
+        <w:t xml:space="preserve">, 106144.</w:t>
       </w:r>
     </w:p>
     <w:p>
@@ -6151,7 +7286,7 @@
           <w:noProof/>
           <w:lang w:val="id-ID"/>
         </w:rPr>
-        <w:t xml:space="preserve">Elvas, L. B., Almeida, A., &amp; Ferreira, J. C. (2025). Natural language processing in medical text processing: A scoping literature review. </w:t>
+        <w:t xml:space="preserve">Du, W. (H.), Wang, G., Xu, J. (N.), &amp; Vasarhelyi, M. A. (2026). Information systems auditing of psychiatric diagnoses using context-enriched QA-based language models. </w:t>
       </w:r>
       <w:r>
         <w:rPr>
@@ -6159,14 +7294,14 @@
           <w:noProof/>
           <w:lang w:val="id-ID"/>
         </w:rPr>
-        <w:t xml:space="preserve">International Journal of Medical Informatics, 204</w:t>
-      </w:r>
-      <w:r>
-        <w:rPr>
-          <w:noProof/>
-          <w:lang w:val="id-ID"/>
-        </w:rPr>
-        <w:t xml:space="preserve">, 106049.</w:t>
+        <w:t xml:space="preserve">Data Science and Management, 9</w:t>
+      </w:r>
+      <w:r>
+        <w:rPr>
+          <w:noProof/>
+          <w:lang w:val="id-ID"/>
+        </w:rPr>
+        <w:t xml:space="preserve">, 100177.</w:t>
       </w:r>
     </w:p>
     <w:p>
@@ -6183,7 +7318,7 @@
           <w:noProof/>
           <w:lang w:val="id-ID"/>
         </w:rPr>
-        <w:t xml:space="preserve">Faustini, P., McIver, A., Sullivan, R., &amp; Dras, M. (2026). De-identification of clinical data: A systematic review of free text, image and tabular data approaches. </w:t>
+        <w:t xml:space="preserve">Elvas, L. B., Almeida, A., &amp; Ferreira, J. C. (2025). Natural language processing in medical text processing: A scoping literature review. </w:t>
       </w:r>
       <w:r>
         <w:rPr>
@@ -6191,14 +7326,14 @@
           <w:noProof/>
           <w:lang w:val="id-ID"/>
         </w:rPr>
-        <w:t xml:space="preserve">International Journal of Medical Informatics, 208</w:t>
-      </w:r>
-      <w:r>
-        <w:rPr>
-          <w:noProof/>
-          <w:lang w:val="id-ID"/>
-        </w:rPr>
-        <w:t xml:space="preserve">, 106225.</w:t>
+        <w:t xml:space="preserve">International Journal of Medical Informatics, 204</w:t>
+      </w:r>
+      <w:r>
+        <w:rPr>
+          <w:noProof/>
+          <w:lang w:val="id-ID"/>
+        </w:rPr>
+        <w:t xml:space="preserve">, 106049.</w:t>
       </w:r>
     </w:p>
     <w:p>
@@ -6215,7 +7350,7 @@
           <w:noProof/>
           <w:lang w:val="id-ID"/>
         </w:rPr>
-        <w:t xml:space="preserve">Hou, W.-h., Wang, X.-k., Wang, Y.-n., Wang, J.-q., &amp; Xiao, F. (2024). Modelling long medical documents and code associations for explainable automatic ICD coding. </w:t>
+        <w:t xml:space="preserve">Faustini, P., McIver, A., Sullivan, R., &amp; Dras, M. (2026). De-identification of clinical data: A systematic review of free text, image and tabular data approaches. </w:t>
       </w:r>
       <w:r>
         <w:rPr>
@@ -6223,14 +7358,14 @@
           <w:noProof/>
           <w:lang w:val="id-ID"/>
         </w:rPr>
-        <w:t xml:space="preserve">Expert Systems with Applications, 249</w:t>
-      </w:r>
-      <w:r>
-        <w:rPr>
-          <w:noProof/>
-          <w:lang w:val="id-ID"/>
-        </w:rPr>
-        <w:t xml:space="preserve">, 123519.</w:t>
+        <w:t xml:space="preserve">International Journal of Medical Informatics, 208</w:t>
+      </w:r>
+      <w:r>
+        <w:rPr>
+          <w:noProof/>
+          <w:lang w:val="id-ID"/>
+        </w:rPr>
+        <w:t xml:space="preserve">, 106225.</w:t>
       </w:r>
     </w:p>
     <w:p>
@@ -6247,7 +7382,7 @@
           <w:noProof/>
           <w:lang w:val="id-ID"/>
         </w:rPr>
-        <w:t xml:space="preserve">Ijadi Maghsoodi, A., Kurz, J., Lawrenson, R., Parsons, M., Walker, C., O'Sullivan, M., &amp; Rouse, P. (2026). Artificial intelligence for decision-making in healthcare: A critical review of decision-maker-governed hybrid systems across clinical, operational, and policy settings. </w:t>
+        <w:t xml:space="preserve">Hou, W.-h., Wang, X.-k., Wang, Y.-n., Wang, J.-q., &amp; Xiao, F. (2024). Modelling long medical documents and code associations for explainable automatic ICD coding. </w:t>
       </w:r>
       <w:r>
         <w:rPr>
@@ -6255,14 +7390,14 @@
           <w:noProof/>
           <w:lang w:val="id-ID"/>
         </w:rPr>
-        <w:t xml:space="preserve">Health Policy and Technology, 15</w:t>
-      </w:r>
-      <w:r>
-        <w:rPr>
-          <w:noProof/>
-          <w:lang w:val="id-ID"/>
-        </w:rPr>
-        <w:t xml:space="preserve">, 101292.</w:t>
+        <w:t xml:space="preserve">Expert Systems with Applications, 249</w:t>
+      </w:r>
+      <w:r>
+        <w:rPr>
+          <w:noProof/>
+          <w:lang w:val="id-ID"/>
+        </w:rPr>
+        <w:t xml:space="preserve">, 123519.</w:t>
       </w:r>
     </w:p>
     <w:p>
@@ -6279,7 +7414,7 @@
           <w:noProof/>
           <w:lang w:val="id-ID"/>
         </w:rPr>
-        <w:t xml:space="preserve">Jafarpour, H., Wu, G., Cheligeer, C., Yan, J., Xu, Y., Southern, D. A., Eastwood, C. A., Zeng, Y., &amp; Quan, H. (2025). Preprocessing narrative texts in electronic medical records to identify hospital adverse events: A scoping review. </w:t>
+        <w:t xml:space="preserve">Ijadi Maghsoodi, A., Kurz, J., Lawrenson, R., Parsons, M., Walker, C., O'Sullivan, M., &amp; Rouse, P. (2026). Artificial intelligence for decision-making in healthcare: A critical review of decision-maker-governed hybrid systems across clinical, operational, and policy settings. </w:t>
       </w:r>
       <w:r>
         <w:rPr>
@@ -6287,14 +7422,14 @@
           <w:noProof/>
           <w:lang w:val="id-ID"/>
         </w:rPr>
-        <w:t xml:space="preserve">Artificial Intelligence in Medicine, 170</w:t>
-      </w:r>
-      <w:r>
-        <w:rPr>
-          <w:noProof/>
-          <w:lang w:val="id-ID"/>
-        </w:rPr>
-        <w:t xml:space="preserve">, 103281.</w:t>
+        <w:t xml:space="preserve">Health Policy and Technology, 15</w:t>
+      </w:r>
+      <w:r>
+        <w:rPr>
+          <w:noProof/>
+          <w:lang w:val="id-ID"/>
+        </w:rPr>
+        <w:t xml:space="preserve">, 101292.</w:t>
       </w:r>
     </w:p>
     <w:p>
@@ -6311,7 +7446,7 @@
           <w:noProof/>
           <w:lang w:val="id-ID"/>
         </w:rPr>
-        <w:t xml:space="preserve">Jaganathan, G. S., Kahanda, I., &amp; Kanewala, U. (2025). Metamorphic testing for robustness and fairness evaluation of LLM-based automated ICD coding applications. </w:t>
+        <w:t xml:space="preserve">Jafarpour, H., Wu, G., Cheligeer, C., Yan, J., Xu, Y., Southern, D. A., Eastwood, C. A., Zeng, Y., &amp; Quan, H. (2025). Preprocessing narrative texts in electronic medical records to identify hospital adverse events: A scoping review. </w:t>
       </w:r>
       <w:r>
         <w:rPr>
@@ -6319,14 +7454,14 @@
           <w:noProof/>
           <w:lang w:val="id-ID"/>
         </w:rPr>
-        <w:t xml:space="preserve">Smart Health, 36</w:t>
-      </w:r>
-      <w:r>
-        <w:rPr>
-          <w:noProof/>
-          <w:lang w:val="id-ID"/>
-        </w:rPr>
-        <w:t xml:space="preserve">, 100564.</w:t>
+        <w:t xml:space="preserve">Artificial Intelligence in Medicine, 170</w:t>
+      </w:r>
+      <w:r>
+        <w:rPr>
+          <w:noProof/>
+          <w:lang w:val="id-ID"/>
+        </w:rPr>
+        <w:t xml:space="preserve">, 103281.</w:t>
       </w:r>
     </w:p>
     <w:p>
@@ -6343,7 +7478,7 @@
           <w:noProof/>
           <w:lang w:val="id-ID"/>
         </w:rPr>
-        <w:t xml:space="preserve">Jia, S., Bit, S., Jasodanand, V. H., Liu, Y., &amp; Kolachalama, V. B. (2026). Agentic memory-augmented retrieval and evidence grounding for medical question-answering tasks. </w:t>
+        <w:t xml:space="preserve">Jaganathan, G. S., Kahanda, I., &amp; Kanewala, U. (2025). Metamorphic testing for robustness and fairness evaluation of LLM-based automated ICD coding applications. </w:t>
       </w:r>
       <w:r>
         <w:rPr>
@@ -6351,14 +7486,14 @@
           <w:noProof/>
           <w:lang w:val="id-ID"/>
         </w:rPr>
-        <w:t xml:space="preserve">International Journal of Medical Informatics, 212</w:t>
-      </w:r>
-      <w:r>
-        <w:rPr>
-          <w:noProof/>
-          <w:lang w:val="id-ID"/>
-        </w:rPr>
-        <w:t xml:space="preserve">, 106339.</w:t>
+        <w:t xml:space="preserve">Smart Health, 36</w:t>
+      </w:r>
+      <w:r>
+        <w:rPr>
+          <w:noProof/>
+          <w:lang w:val="id-ID"/>
+        </w:rPr>
+        <w:t xml:space="preserve">, 100564.</w:t>
       </w:r>
     </w:p>
     <w:p>
@@ -6375,7 +7510,7 @@
           <w:noProof/>
           <w:lang w:val="id-ID"/>
         </w:rPr>
-        <w:t xml:space="preserve">Kumar, D., Choudhary, N., Gupta, V., Tanwar, R., Behmani, K., Antal, S., Jarora, S., Gupta, S., Shaikh, M. S., Webster, T. J., &amp; Faiyazuddin, M. (2026). Natural language processing in healthcare: From unstructured data to clinical intelligence. </w:t>
+        <w:t xml:space="preserve">Jia, S., Bit, S., Jasodanand, V. H., Liu, Y., &amp; Kolachalama, V. B. (2026). Agentic memory-augmented retrieval and evidence grounding for medical question-answering tasks. </w:t>
       </w:r>
       <w:r>
         <w:rPr>
@@ -6383,14 +7518,14 @@
           <w:noProof/>
           <w:lang w:val="id-ID"/>
         </w:rPr>
-        <w:t xml:space="preserve">Intelligent Systems with Applications, 31</w:t>
-      </w:r>
-      <w:r>
-        <w:rPr>
-          <w:noProof/>
-          <w:lang w:val="id-ID"/>
-        </w:rPr>
-        <w:t xml:space="preserve">, 200698.</w:t>
+        <w:t xml:space="preserve">International Journal of Medical Informatics, 212</w:t>
+      </w:r>
+      <w:r>
+        <w:rPr>
+          <w:noProof/>
+          <w:lang w:val="id-ID"/>
+        </w:rPr>
+        <w:t xml:space="preserve">, 106339.</w:t>
       </w:r>
     </w:p>
     <w:p>
@@ -6407,7 +7542,7 @@
           <w:noProof/>
           <w:lang w:val="id-ID"/>
         </w:rPr>
-        <w:t xml:space="preserve">Landolsi, M. Y., Fadhli, I., Boufaied, A., &amp; Ben Romdhane, L. (2026). Recent trends of retrieval-augmented generation in healthcare: A systematic review. </w:t>
+        <w:t xml:space="preserve">Kumar, D., Choudhary, N., Gupta, V., Tanwar, R., Behmani, K., Antal, S., Jarora, S., Gupta, S., Shaikh, M. S., Webster, T. J., &amp; Faiyazuddin, M. (2026). Natural language processing in healthcare: From unstructured data to clinical intelligence. </w:t>
       </w:r>
       <w:r>
         <w:rPr>
@@ -6415,14 +7550,14 @@
           <w:noProof/>
           <w:lang w:val="id-ID"/>
         </w:rPr>
-        <w:t xml:space="preserve">Engineering Applications of Artificial Intelligence, 182</w:t>
-      </w:r>
-      <w:r>
-        <w:rPr>
-          <w:noProof/>
-          <w:lang w:val="id-ID"/>
-        </w:rPr>
-        <w:t xml:space="preserve">, 115912.</w:t>
+        <w:t xml:space="preserve">Intelligent Systems with Applications, 31</w:t>
+      </w:r>
+      <w:r>
+        <w:rPr>
+          <w:noProof/>
+          <w:lang w:val="id-ID"/>
+        </w:rPr>
+        <w:t xml:space="preserve">, 200698.</w:t>
       </w:r>
     </w:p>
     <w:p>
@@ -6439,7 +7574,7 @@
           <w:noProof/>
           <w:lang w:val="id-ID"/>
         </w:rPr>
-        <w:t xml:space="preserve">Lebeña, N., Casillas, A., &amp; Pérez, A. (2025). Large language models aided patient progression documentation according to the ICD standard. </w:t>
+        <w:t xml:space="preserve">Landolsi, M. Y., Fadhli, I., Boufaied, A., &amp; Ben Romdhane, L. (2026). Recent trends of retrieval-augmented generation in healthcare: A systematic review. </w:t>
       </w:r>
       <w:r>
         <w:rPr>
@@ -6447,14 +7582,14 @@
           <w:noProof/>
           <w:lang w:val="id-ID"/>
         </w:rPr>
-        <w:t xml:space="preserve">Informatics in Medicine Unlocked, 55</w:t>
-      </w:r>
-      <w:r>
-        <w:rPr>
-          <w:noProof/>
-          <w:lang w:val="id-ID"/>
-        </w:rPr>
-        <w:t xml:space="preserve">, 101637.</w:t>
+        <w:t xml:space="preserve">Engineering Applications of Artificial Intelligence, 182</w:t>
+      </w:r>
+      <w:r>
+        <w:rPr>
+          <w:noProof/>
+          <w:lang w:val="id-ID"/>
+        </w:rPr>
+        <w:t xml:space="preserve">, 115912.</w:t>
       </w:r>
     </w:p>
     <w:p>
@@ -6471,7 +7606,7 @@
           <w:noProof/>
           <w:lang w:val="id-ID"/>
         </w:rPr>
-        <w:t xml:space="preserve">Li, Y., Lv, M., Cheng, L., Xie, Y., Gu, Q., He, H., Chen, Z., Fang, D., &amp; Zhou, X. (2026). Explainable and evidence-linked recommendations for spine surgery via a retrieval-augmented LLM agent. </w:t>
+        <w:t xml:space="preserve">Lebeña, N., Casillas, A., &amp; Pérez, A. (2025). Large language models aided patient progression documentation according to the ICD standard. </w:t>
       </w:r>
       <w:r>
         <w:rPr>
@@ -6479,14 +7614,14 @@
           <w:noProof/>
           <w:lang w:val="id-ID"/>
         </w:rPr>
-        <w:t xml:space="preserve">European Journal of Radiology, 197</w:t>
-      </w:r>
-      <w:r>
-        <w:rPr>
-          <w:noProof/>
-          <w:lang w:val="id-ID"/>
-        </w:rPr>
-        <w:t xml:space="preserve">, 112734.</w:t>
+        <w:t xml:space="preserve">Informatics in Medicine Unlocked, 55</w:t>
+      </w:r>
+      <w:r>
+        <w:rPr>
+          <w:noProof/>
+          <w:lang w:val="id-ID"/>
+        </w:rPr>
+        <w:t xml:space="preserve">, 101637.</w:t>
       </w:r>
     </w:p>
     <w:p>
@@ -6503,7 +7638,7 @@
           <w:noProof/>
           <w:lang w:val="id-ID"/>
         </w:rPr>
-        <w:t xml:space="preserve">Luo, X., Deng, Z., Yang, B., &amp; Luo, M. Y. (2024). Pre-trained language models in medicine: A survey. </w:t>
+        <w:t xml:space="preserve">Li, Y., Lv, M., Cheng, L., Xie, Y., Gu, Q., He, H., Chen, Z., Fang, D., &amp; Zhou, X. (2026). Explainable and evidence-linked recommendations for spine surgery via a retrieval-augmented LLM agent. </w:t>
       </w:r>
       <w:r>
         <w:rPr>
@@ -6511,14 +7646,14 @@
           <w:noProof/>
           <w:lang w:val="id-ID"/>
         </w:rPr>
-        <w:t xml:space="preserve">Artificial Intelligence in Medicine, 154</w:t>
-      </w:r>
-      <w:r>
-        <w:rPr>
-          <w:noProof/>
-          <w:lang w:val="id-ID"/>
-        </w:rPr>
-        <w:t xml:space="preserve">, 102904.</w:t>
+        <w:t xml:space="preserve">European Journal of Radiology, 197</w:t>
+      </w:r>
+      <w:r>
+        <w:rPr>
+          <w:noProof/>
+          <w:lang w:val="id-ID"/>
+        </w:rPr>
+        <w:t xml:space="preserve">, 112734.</w:t>
       </w:r>
     </w:p>
     <w:p>
@@ -6535,7 +7670,7 @@
           <w:noProof/>
           <w:lang w:val="id-ID"/>
         </w:rPr>
-        <w:t xml:space="preserve">Mwogosi, A., &amp; Mambile, C. (2026). Concordance of electronic health record data with ICD classification and evidence-based treatment guidelines: A systematic review and meta-analysis. </w:t>
+        <w:t xml:space="preserve">Luo, X., Deng, Z., Yang, B., &amp; Luo, M. Y. (2024). Pre-trained language models in medicine: A survey. </w:t>
       </w:r>
       <w:r>
         <w:rPr>
@@ -6543,14 +7678,14 @@
           <w:noProof/>
           <w:lang w:val="id-ID"/>
         </w:rPr>
-        <w:t xml:space="preserve">Health Policy and Technology, 15</w:t>
-      </w:r>
-      <w:r>
-        <w:rPr>
-          <w:noProof/>
-          <w:lang w:val="id-ID"/>
-        </w:rPr>
-        <w:t xml:space="preserve">, 101213.</w:t>
+        <w:t xml:space="preserve">Artificial Intelligence in Medicine, 154</w:t>
+      </w:r>
+      <w:r>
+        <w:rPr>
+          <w:noProof/>
+          <w:lang w:val="id-ID"/>
+        </w:rPr>
+        <w:t xml:space="preserve">, 102904.</w:t>
       </w:r>
     </w:p>
     <w:p>
@@ -6567,7 +7702,7 @@
           <w:noProof/>
           <w:lang w:val="id-ID"/>
         </w:rPr>
-        <w:t xml:space="preserve">Nilasari, E. V., &amp; Soelistijanto, B. (2026). A preliminary study on mitigating upcoding in Indonesia's national health insurance using multi-agent multi-armed bandits. </w:t>
+        <w:t xml:space="preserve">Mwogosi, A., &amp; Mambile, C. (2026). Concordance of electronic health record data with ICD classification and evidence-based treatment guidelines: A systematic review and meta-analysis. </w:t>
       </w:r>
       <w:r>
         <w:rPr>
@@ -6575,14 +7710,14 @@
           <w:noProof/>
           <w:lang w:val="id-ID"/>
         </w:rPr>
-        <w:t xml:space="preserve">Procedia Computer Science, 289</w:t>
-      </w:r>
-      <w:r>
-        <w:rPr>
-          <w:noProof/>
-          <w:lang w:val="id-ID"/>
-        </w:rPr>
-        <w:t xml:space="preserve">, 851–858.</w:t>
+        <w:t xml:space="preserve">Health Policy and Technology, 15</w:t>
+      </w:r>
+      <w:r>
+        <w:rPr>
+          <w:noProof/>
+          <w:lang w:val="id-ID"/>
+        </w:rPr>
+        <w:t xml:space="preserve">, 101213.</w:t>
       </w:r>
     </w:p>
     <w:p>
@@ -6599,7 +7734,7 @@
           <w:noProof/>
           <w:lang w:val="id-ID"/>
         </w:rPr>
-        <w:t xml:space="preserve">Olex, A. L., &amp; McInnes, B. T. (2021). Review of temporal reasoning in the clinical domain for timeline extraction: Where we are and where we need to be. </w:t>
+        <w:t xml:space="preserve">Nilasari, E. V., &amp; Soelistijanto, B. (2026). A preliminary study on mitigating upcoding in Indonesia's national health insurance using multi-agent multi-armed bandits. </w:t>
       </w:r>
       <w:r>
         <w:rPr>
@@ -6607,14 +7742,14 @@
           <w:noProof/>
           <w:lang w:val="id-ID"/>
         </w:rPr>
-        <w:t xml:space="preserve">Journal of Biomedical Informatics, 118</w:t>
-      </w:r>
-      <w:r>
-        <w:rPr>
-          <w:noProof/>
-          <w:lang w:val="id-ID"/>
-        </w:rPr>
-        <w:t xml:space="preserve">, 103784.</w:t>
+        <w:t xml:space="preserve">Procedia Computer Science, 289</w:t>
+      </w:r>
+      <w:r>
+        <w:rPr>
+          <w:noProof/>
+          <w:lang w:val="id-ID"/>
+        </w:rPr>
+        <w:t xml:space="preserve">, 851–858.</w:t>
       </w:r>
     </w:p>
     <w:p>
@@ -6631,7 +7766,7 @@
           <w:noProof/>
           <w:lang w:val="id-ID"/>
         </w:rPr>
-        <w:t xml:space="preserve">Rachmawaty, R., Sinrang, A. W., Wahyudin, E., &amp; Bukhari, A. (2021). Evaluation of health care quality among insured patients in Indonesian mother &amp; child hospital: A secondary data analysis. </w:t>
+        <w:t xml:space="preserve">Olex, A. L., &amp; McInnes, B. T. (2021). Review of temporal reasoning in the clinical domain for timeline extraction: Where we are and where we need to be. </w:t>
       </w:r>
       <w:r>
         <w:rPr>
@@ -6639,14 +7774,14 @@
           <w:noProof/>
           <w:lang w:val="id-ID"/>
         </w:rPr>
-        <w:t xml:space="preserve">Gaceta Sanitaria, 35</w:t>
-      </w:r>
-      <w:r>
-        <w:rPr>
-          <w:noProof/>
-          <w:lang w:val="id-ID"/>
-        </w:rPr>
-        <w:t xml:space="preserve">(S2), S613–S618.</w:t>
+        <w:t xml:space="preserve">Journal of Biomedical Informatics, 118</w:t>
+      </w:r>
+      <w:r>
+        <w:rPr>
+          <w:noProof/>
+          <w:lang w:val="id-ID"/>
+        </w:rPr>
+        <w:t xml:space="preserve">, 103784.</w:t>
       </w:r>
     </w:p>
     <w:p>
@@ -6663,7 +7798,7 @@
           <w:noProof/>
           <w:lang w:val="id-ID"/>
         </w:rPr>
-        <w:t xml:space="preserve">Simbolon, F., &amp; Gani, A. (2023). Faktor-faktor yang mempengaruhi terjadinya pending klaim rawat inap: Literatur review. </w:t>
+        <w:t xml:space="preserve">Rachmawaty, R., Sinrang, A. W., Wahyudin, E., &amp; Bukhari, A. (2021). Evaluation of health care quality among insured patients in Indonesian mother &amp; child hospital: A secondary data analysis. </w:t>
       </w:r>
       <w:r>
         <w:rPr>
@@ -6671,14 +7806,14 @@
           <w:noProof/>
           <w:lang w:val="id-ID"/>
         </w:rPr>
-        <w:t xml:space="preserve">Jurnal Keperawatan dan Kesehatan, 14</w:t>
-      </w:r>
-      <w:r>
-        <w:rPr>
-          <w:noProof/>
-          <w:lang w:val="id-ID"/>
-        </w:rPr>
-        <w:t xml:space="preserve">(1), 72–78.</w:t>
+        <w:t xml:space="preserve">Gaceta Sanitaria, 35</w:t>
+      </w:r>
+      <w:r>
+        <w:rPr>
+          <w:noProof/>
+          <w:lang w:val="id-ID"/>
+        </w:rPr>
+        <w:t xml:space="preserve">(S2), S613–S618.</w:t>
       </w:r>
     </w:p>
     <w:p>
@@ -6695,7 +7830,7 @@
           <w:noProof/>
           <w:lang w:val="id-ID"/>
         </w:rPr>
-        <w:t xml:space="preserve">Skrabic, R., Viculin, I., Boban, Z., Kumric, M., Vilovic, M., Vrdoljak, J., &amp; Bozic, J. (2026). Large language models as second reviewers for medical errors in real-world internal medicine reports: A prospective comparative study of open- and closed-source models. </w:t>
+        <w:t xml:space="preserve">Simbolon, F., &amp; Gani, A. (2023). Faktor-faktor yang mempengaruhi terjadinya pending klaim rawat inap: Literatur review. </w:t>
       </w:r>
       <w:r>
         <w:rPr>
@@ -6703,14 +7838,14 @@
           <w:noProof/>
           <w:lang w:val="id-ID"/>
         </w:rPr>
-        <w:t xml:space="preserve">International Journal of Medical Informatics, 211</w:t>
-      </w:r>
-      <w:r>
-        <w:rPr>
-          <w:noProof/>
-          <w:lang w:val="id-ID"/>
-        </w:rPr>
-        <w:t xml:space="preserve">, 106316.</w:t>
+        <w:t xml:space="preserve">Jurnal Keperawatan dan Kesehatan, 14</w:t>
+      </w:r>
+      <w:r>
+        <w:rPr>
+          <w:noProof/>
+          <w:lang w:val="id-ID"/>
+        </w:rPr>
+        <w:t xml:space="preserve">(1), 72–78.</w:t>
       </w:r>
     </w:p>
     <w:p>
@@ -6727,7 +7862,7 @@
           <w:noProof/>
           <w:lang w:val="id-ID"/>
         </w:rPr>
-        <w:t xml:space="preserve">Sun, Z., Yim, W.-W., Uzuner, Ö., Xia, F., &amp; Yetisgen, M. (2025). A scoping review of natural language processing in addressing medically inaccurate information: Errors, misinformation, and hallucination. </w:t>
+        <w:t xml:space="preserve">Skrabic, R., Viculin, I., Boban, Z., Kumric, M., Vilovic, M., Vrdoljak, J., &amp; Bozic, J. (2026). Large language models as second reviewers for medical errors in real-world internal medicine reports: A prospective comparative study of open- and closed-source models. </w:t>
       </w:r>
       <w:r>
         <w:rPr>
@@ -6735,14 +7870,14 @@
           <w:noProof/>
           <w:lang w:val="id-ID"/>
         </w:rPr>
-        <w:t xml:space="preserve">Journal of Biomedical Informatics, 169</w:t>
-      </w:r>
-      <w:r>
-        <w:rPr>
-          <w:noProof/>
-          <w:lang w:val="id-ID"/>
-        </w:rPr>
-        <w:t xml:space="preserve">, 104866.</w:t>
+        <w:t xml:space="preserve">International Journal of Medical Informatics, 211</w:t>
+      </w:r>
+      <w:r>
+        <w:rPr>
+          <w:noProof/>
+          <w:lang w:val="id-ID"/>
+        </w:rPr>
+        <w:t xml:space="preserve">, 106316.</w:t>
       </w:r>
     </w:p>
     <w:p>
@@ -6759,7 +7894,7 @@
           <w:noProof/>
           <w:lang w:val="id-ID"/>
         </w:rPr>
-        <w:t xml:space="preserve">Susilo, D., Wulandari, L. P. L., Sukmayeti, E., Asante, A., Jan, S., Thabrany, H., Tangcharoensathien, V., Wiseman, V., &amp; Liverani, M. (2025). Can Indonesia achieve universal health coverage? Organisational and financing challenges in implementing the national health insurance system. </w:t>
+        <w:t xml:space="preserve">Sun, Z., Yim, W.-W., Uzuner, Ö., Xia, F., &amp; Yetisgen, M. (2025). A scoping review of natural language processing in addressing medically inaccurate information: Errors, misinformation, and hallucination. </w:t>
       </w:r>
       <w:r>
         <w:rPr>
@@ -6767,14 +7902,14 @@
           <w:noProof/>
           <w:lang w:val="id-ID"/>
         </w:rPr>
-        <w:t xml:space="preserve">SSM - Health Systems, 5</w:t>
-      </w:r>
-      <w:r>
-        <w:rPr>
-          <w:noProof/>
-          <w:lang w:val="id-ID"/>
-        </w:rPr>
-        <w:t xml:space="preserve">, 100138.</w:t>
+        <w:t xml:space="preserve">Journal of Biomedical Informatics, 169</w:t>
+      </w:r>
+      <w:r>
+        <w:rPr>
+          <w:noProof/>
+          <w:lang w:val="id-ID"/>
+        </w:rPr>
+        <w:t xml:space="preserve">, 104866.</w:t>
       </w:r>
     </w:p>
     <w:p>
@@ -6791,6 +7926,38 @@
           <w:noProof/>
           <w:lang w:val="id-ID"/>
         </w:rPr>
+        <w:t xml:space="preserve">Susilo, D., Wulandari, L. P. L., Sukmayeti, E., Asante, A., Jan, S., Thabrany, H., Tangcharoensathien, V., Wiseman, V., &amp; Liverani, M. (2025). Can Indonesia achieve universal health coverage? Organisational and financing challenges in implementing the national health insurance system. </w:t>
+      </w:r>
+      <w:r>
+        <w:rPr>
+          <w:i/>
+          <w:noProof/>
+          <w:lang w:val="id-ID"/>
+        </w:rPr>
+        <w:t xml:space="preserve">SSM - Health Systems, 5</w:t>
+      </w:r>
+      <w:r>
+        <w:rPr>
+          <w:noProof/>
+          <w:lang w:val="id-ID"/>
+        </w:rPr>
+        <w:t xml:space="preserve">, 100138.</w:t>
+      </w:r>
+    </w:p>
+    <w:p>
+      <w:pPr>
+        <w:spacing w:line="240" w:lineRule="auto"/>
+        <w:ind w:left="720" w:hanging="720"/>
+        <w:rPr>
+          <w:noProof/>
+          <w:lang w:val="id-ID" w:eastAsia="en-US"/>
+        </w:rPr>
+      </w:pPr>
+      <w:r>
+        <w:rPr>
+          <w:noProof/>
+          <w:lang w:val="id-ID"/>
+        </w:rPr>
         <w:t xml:space="preserve">Tchouka, Y., Couchot, J.-F., Laiymani, D., Selles, P., &amp; Rahmani, A. (2024). Differentially private de-identifying textual medical document is compliant with challenging NLP analyses: Example of privacy-preserving ICD-10 code association. </w:t>
       </w:r>
       <w:r>
@@ -6807,6 +7974,38 @@
           <w:lang w:val="id-ID"/>
         </w:rPr>
         <w:t xml:space="preserve">, 200416.</w:t>
+      </w:r>
+    </w:p>
+    <w:p>
+      <w:pPr>
+        <w:spacing w:line="240" w:lineRule="auto"/>
+        <w:ind w:left="720" w:hanging="720"/>
+        <w:rPr>
+          <w:noProof/>
+          <w:lang w:val="id-ID" w:eastAsia="en-US"/>
+        </w:rPr>
+      </w:pPr>
+      <w:r>
+        <w:rPr>
+          <w:noProof/>
+          <w:lang w:val="id-ID"/>
+        </w:rPr>
+        <w:t xml:space="preserve">van Koevorden, J. W., Aben, N., Struben, V., Rollings, A., Kurban, M., Wessels, L., van der Noort, V., Burger, A. V. M., van Dijk, S. W., Karssemakers, L., Smeele, L., Wouters, M. W. J. M., &amp; Dirven, R. (2026). Validating large language model-assisted data extraction from clinical notes. </w:t>
+      </w:r>
+      <w:r>
+        <w:rPr>
+          <w:i/>
+          <w:noProof/>
+          <w:lang w:val="id-ID"/>
+        </w:rPr>
+        <w:t xml:space="preserve">ESMO Real World Data and Digital Oncology, 12</w:t>
+      </w:r>
+      <w:r>
+        <w:rPr>
+          <w:noProof/>
+          <w:lang w:val="id-ID"/>
+        </w:rPr>
+        <w:t xml:space="preserve">, 100718.</w:t>
       </w:r>
     </w:p>
     <w:p>

</xml_diff>

<commit_message>
refactor: trim Bab II to 18.6 pages and add opening paragraph (draft 2)
Remove Lebena et al. from II.3 and condense two other passages, replace the
template guidance text with a short opening paragraph (Pembuka_Bab_II.md),
vary repeated closing sentences in II.2/II.4/II.5/II.6, update source counts
(33 refs), rebuild the Utama-template docx and update CONTEXT_TRANSFER.md.

Co-Authored-By: Claude Sonnet 5.5 <noreply@anthropic.com>
Claude-Session: https://claude.ai/code/session_014py9jkTgHZ9tfrTkQ4xwY
</commit_message>
<xml_diff>
--- a/bab2/Proposal-IF4091-Capstone-Utama-2026_Draft-Bab2.docx
+++ b/bab2/Proposal-IF4091-Capstone-Utama-2026_Draft-Bab2.docx
@@ -4026,128 +4026,132 @@
         <w:rPr>
           <w:lang w:val="id-ID"/>
         </w:rPr>
-        <w:t xml:space="preserve">Bab Kajian Pustaka digunakan untuk </w:t>
-      </w:r>
-      <w:r>
-        <w:t xml:space="preserve">mendeskripsikan kajian literatur yang terkait langsung dengan persoalan dan solusi yang melibatkan cakupan dan peran seluruh anggota tim </w:t>
-      </w:r>
-      <w:r>
-        <w:rPr>
-          <w:lang w:val="id-ID"/>
-        </w:rPr>
-        <w:t>t</w:t>
-      </w:r>
-      <w:r>
-        <w:t xml:space="preserve">ugas </w:t>
-      </w:r>
-      <w:r>
-        <w:rPr>
-          <w:lang w:val="id-ID"/>
-        </w:rPr>
-        <w:t>a</w:t>
-      </w:r>
-      <w:r>
-        <w:t xml:space="preserve">khir capstone. Tujuan kajian pustaka </w:t>
-      </w:r>
-      <w:r>
-        <w:rPr>
-          <w:lang w:val="id-ID"/>
-        </w:rPr>
-        <w:t>adalah:</w:t>
-      </w:r>
-    </w:p>
-    <w:p>
-      <w:pPr>
-        <w:pStyle w:val="ListParagraph"/>
-        <w:numPr>
-          <w:ilvl w:val="0"/>
-          <w:numId w:val="21"/>
-        </w:numPr>
-        <w:ind w:left="426" w:hanging="426"/>
-        <w:rPr>
-          <w:lang w:val="en-US"/>
-        </w:rPr>
-      </w:pPr>
-      <w:r>
-        <w:rPr>
-          <w:lang w:val="en-US"/>
-        </w:rPr>
-        <w:t xml:space="preserve">memberikan pemahaman yang cukup kepada pembaca tentang teori </w:t>
-      </w:r>
-      <w:r>
-        <w:rPr>
-          <w:lang w:val="id-ID"/>
-        </w:rPr>
-        <w:t xml:space="preserve">atau pekerjaan </w:t>
-      </w:r>
-      <w:r>
-        <w:rPr>
-          <w:lang w:val="en-US"/>
-        </w:rPr>
-        <w:t xml:space="preserve">yang </w:t>
-      </w:r>
-      <w:r>
-        <w:rPr>
-          <w:lang w:val="id-ID"/>
-        </w:rPr>
-        <w:t>terkait</w:t>
-      </w:r>
-      <w:r>
-        <w:rPr>
-          <w:lang w:val="en-US"/>
-        </w:rPr>
-        <w:t xml:space="preserve"> langsung dengan penyelesaian persoalan umum tugas akhir capstone </w:t>
-      </w:r>
-    </w:p>
-    <w:p>
-      <w:pPr>
-        <w:pStyle w:val="ListParagraph"/>
-        <w:numPr>
-          <w:ilvl w:val="0"/>
-          <w:numId w:val="21"/>
-        </w:numPr>
-        <w:ind w:left="426" w:hanging="426"/>
-        <w:rPr>
-          <w:lang w:val="en-US"/>
-        </w:rPr>
-      </w:pPr>
-      <w:r>
-        <w:rPr>
-          <w:lang w:val="en-US"/>
-        </w:rPr>
-        <w:t xml:space="preserve">menyampaikan informasi apa saja yang sudah ditulis/dilaporkan oleh pihak lain (peneliti/Tugas Akhir/Tesis) tentang hasil penelitian/pekerjaan mereka yang sama/mirip/erat kaitannya dengan persoalan tugas akhir capstone </w:t>
-      </w:r>
-    </w:p>
-    <w:p>
-      <w:pPr>
-        <w:pStyle w:val="ListParagraph"/>
-        <w:numPr>
-          <w:ilvl w:val="0"/>
-          <w:numId w:val="21"/>
-        </w:numPr>
-        <w:ind w:left="426" w:hanging="426"/>
-        <w:rPr>
-          <w:lang w:val="en-US"/>
-        </w:rPr>
-      </w:pPr>
-      <w:r>
-        <w:rPr>
-          <w:lang w:val="en-US"/>
-        </w:rPr>
-        <w:t xml:space="preserve">menunjukkan kepada pembaca adanya </w:t>
+        <w:t xml:space="preserve">Bab ini menelaah literatur yang terkait langsung dengan pemeriksaan dokumentasi klaim rawat inap sebelum diajukan ke BPJS Kesehatan, dengan fokus pada komponen AI/NLP untuk kasus kebidanan dan anak </w:t>
+      </w:r>
+      <w:r>
+        <w:rPr>
+          <w:highlight w:val="yellow"/>
+          <w:lang w:val="id-ID"/>
+        </w:rPr>
+        <w:t xml:space="preserve">[SESUAIKAN DENGAN BAB II GABUNGAN TIM: kajian komponen antarmuka dan basis data ditulis oleh anggota tim lain]</w:t>
+      </w:r>
+      <w:r>
+        <w:rPr>
+          <w:lang w:val="id-ID"/>
+        </w:rPr>
+        <w:t xml:space="preserve">. Subbab II.1 membahas dokumentasi klinis dan klaim JKN. Subbab II.2 sampai II.7 membahas NLP dan LLM pada teks klinis, audit otomatis dokumentasi dan kode diagnosis, pendekatan hibrida berbasis aturan dan AI/NLP, RAG dan halusinasi, de-identifikasi, serta evaluasi. Subbab II.8 membandingkan karya terdahulu yang terdekat dan menyatakan celah yang menjadi sasaran penelitian ini.</w:t>
+      </w:r>
+    </w:p>
+    <w:p>
+      <w:pPr>
+        <w:pStyle w:val="Heading2"/>
+      </w:pPr>
+      <w:r>
+        <w:t xml:space="preserve">Dokumentasi Klinis dan Klaim JKN</w:t>
+      </w:r>
+    </w:p>
+    <w:p>
+      <w:pPr>
+        <w:rPr>
+          <w:lang w:val="id-ID"/>
+        </w:rPr>
+      </w:pPr>
+      <w:r>
+        <w:rPr>
+          <w:lang w:val="id-ID"/>
+        </w:rPr>
+        <w:t xml:space="preserve">Dalam Jaminan Kesehatan Nasional (JKN), BPJS Kesehatan menangani pendaftaran peserta, pengumpulan iuran, kontrak dengan penyedia layanan, dan pemrosesan klaim. Rumah sakit dibayar per kasus menurut tarif </w:t>
       </w:r>
       <w:r>
         <w:rPr>
           <w:i/>
-          <w:lang w:val="en-US"/>
-        </w:rPr>
-        <w:t>gap</w:t>
-      </w:r>
-      <w:r>
-        <w:rPr>
-          <w:lang w:val="en-US"/>
-        </w:rPr>
-        <w:t xml:space="preserve"> seperti pada rumusan masalah yang memang belum terselesaikan. </w:t>
+          <w:lang w:val="id-ID"/>
+        </w:rPr>
+        <w:t xml:space="preserve">Indonesian Case Base Groups</w:t>
+      </w:r>
+      <w:r>
+        <w:rPr>
+          <w:lang w:val="id-ID"/>
+        </w:rPr>
+        <w:t xml:space="preserve"> (INA-CBG) untuk rawat inap maupun rawat jalan (Susilo dkk., 2025, hlm. 2), dan pembayaran prospektif berbasis INA-CBG itu berlaku sejak 2014 (Rachmawaty dkk., 2021, hlm. S613). Klaim diajukan setelah pasien selesai dirawat, lalu diverifikasi pada aspek administrasi kepesertaan, administrasi pelayanan, dan pelayanan kesehatan. Berkas pendukungnya mencakup surat eligibilitas peserta (SEP) dan resume medis yang memuat diagnosis awal serta diagnosis akhir, yang ditulis dan ditetapkan oleh dokter yang bertanggung jawab (Simbolon &amp; Gani, 2023, hlm. 72–73). Salah satu informan pada penelitian kualitatif Susilo dkk. (2025, hlm. 6) menyebut klaim </w:t>
+      </w:r>
+      <w:r>
+        <w:rPr>
+          <w:i/>
+          <w:lang w:val="id-ID"/>
+        </w:rPr>
+        <w:t xml:space="preserve">pending</w:t>
+      </w:r>
+      <w:r>
+        <w:rPr>
+          <w:lang w:val="id-ID"/>
+        </w:rPr>
+        <w:t xml:space="preserve">, perbedaan prosedur administrasi antarcabang BPJS, dan tinjauan klaim retrospektif sebagai gangguan terhadap pembiayaan rumah sakit.</w:t>
+      </w:r>
+    </w:p>
+    <w:p>
+      <w:pPr>
+        <w:rPr>
+          <w:lang w:val="id-ID"/>
+        </w:rPr>
+      </w:pPr>
+      <w:r>
+        <w:rPr>
+          <w:lang w:val="id-ID"/>
+        </w:rPr>
+        <w:t xml:space="preserve">Simbolon dan Gani (2023) merangkum lima artikel tahun 2020–2022 tentang penyebab klaim rawat inap yang </w:t>
+      </w:r>
+      <w:r>
+        <w:rPr>
+          <w:i/>
+          <w:lang w:val="id-ID"/>
+        </w:rPr>
+        <w:t xml:space="preserve">pending</w:t>
+      </w:r>
+      <w:r>
+        <w:rPr>
+          <w:lang w:val="id-ID"/>
+        </w:rPr>
+        <w:t xml:space="preserve">. Faktor yang muncul ialah pengodean yang tidak sesuai, kelengkapan berkas, dan perbedaan penegakan diagnosis antara dokter penanggung jawab pelayanan (DPJP) dan verifikator BPJS (hlm. 72, 77). Penulis mengaitkan perbedaan diagnosis itu dengan perbedaan latar belakang pendidikan dan pengetahuan kedua pihak (hlm. 77). Tabel ulasan tersebut memuat studi Muroli dkk. (2020) di RSAB Harapan Kita, Jakarta Barat. Menurut ringkasan dalam tabel itu, resume medis tidak lengkap pada 38 berkas (41,8%), pengodean tidak tepat pada 44 berkas (48,4%), dan berkas klaim tidak lengkap pada 27 berkas (29,7%) (hlm. 75). Angka tersebut berasal dari ringkasan dalam ulasan, bukan dari artikel Muroli dkk., dan ulasan itu tidak menguraikan penilaian mutu terhadap kelima artikel yang dimasukkan.</w:t>
+      </w:r>
+    </w:p>
+    <w:p>
+      <w:pPr>
+        <w:rPr>
+          <w:lang w:val="id-ID"/>
+        </w:rPr>
+      </w:pPr>
+      <w:r>
+        <w:rPr>
+          <w:lang w:val="id-ID"/>
+        </w:rPr>
+        <w:t xml:space="preserve">Dua studi lain membahas klaim JKN dari sudut berbeda. Rachmawaty dkk. (2021) menganalisis basis data e-klaim BPJS satu rumah sakit ibu dan anak di Makassar, dengan 2.870 rawat inap pada 2019 dan 1.533 pada Januari–Juni 2020. Kerugian finansial rumah sakit terjadi pada 42,9% rawat inap tahun 2019 dan 61,3% tahun 2020 (hlm. S613). Penulis mengaitkan kerugian itu terutama dengan tarif rumah sakit yang lebih tinggi daripada tarif BPJS, dan menyebut tidak adanya audit rekam medis pasien secara rutin oleh manajer sebagai salah satu alasan variasi lama rawat (hlm. S617). Studi ini tidak menilai mutu dokumentasi. Nilasari dan Soelistijanto (2026) berfokus pada kecurangan klaim. Mereka menyebut kategori Kementerian Kesehatan yang mencakup </w:t>
+      </w:r>
+      <w:r>
+        <w:rPr>
+          <w:i/>
+          <w:lang w:val="id-ID"/>
+        </w:rPr>
+        <w:t xml:space="preserve">upcoding</w:t>
+      </w:r>
+      <w:r>
+        <w:rPr>
+          <w:lang w:val="id-ID"/>
+        </w:rPr>
+        <w:t xml:space="preserve">, yaitu mengubah kode diagnosis atau prosedur agar ditagihkan pada tarif lebih tinggi tanpa dasar medis (hlm. 852), lalu merancang sistem di sisi BPJS yang memilih klaim untuk diaudit manusia dalam batas kapasitas auditor (hlm. 851). Simulasi empirisnya belum selesai dan tidak ada data yang dipakai (hlm. 855, 857).</w:t>
+      </w:r>
+    </w:p>
+    <w:p>
+      <w:pPr>
+        <w:rPr>
+          <w:lang w:val="id-ID"/>
+        </w:rPr>
+      </w:pPr>
+      <w:r>
+        <w:rPr>
+          <w:lang w:val="id-ID"/>
+        </w:rPr>
+        <w:t xml:space="preserve">Sumber-sumber tersebut menunjukkan bahwa dokumentasi medis, kode diagnosis, dan keputusan klaim saling terkait dalam JKN. Di antara sumber itu, tidak ada yang mengukur ketidaksesuaian di dalam dokumen klinis sebelum klaim diajukan. Ulasan Simbolon dan Gani (2023) merangkum faktor penyebab dari artikel lain, Rachmawaty dkk. (2021) menganalisis biaya dan mutu layanan, dan Nilasari dan Soelistijanto (2026) merancang audit di sisi BPJS tanpa evaluasi. Ringkasan Muroli dkk. (2020) dalam ulasan itu memberi proporsi berkas yang tidak lengkap atau tidak tepat, tetapi tidak merinci jenis ketidaksesuaian antardokumen, misalnya diagnosis pada resume yang tidak sejalan dengan catatan harian.</w:t>
       </w:r>
     </w:p>
     <w:p>
@@ -4155,111 +4159,252 @@
         <w:pStyle w:val="Heading2"/>
       </w:pPr>
       <w:r>
-        <w:t xml:space="preserve">Dokumentasi Klinis dan Klaim JKN</w:t>
-      </w:r>
-    </w:p>
-    <w:p>
-      <w:pPr>
-        <w:rPr>
-          <w:lang w:val="id-ID"/>
-        </w:rPr>
-      </w:pPr>
-      <w:r>
-        <w:rPr>
-          <w:lang w:val="id-ID"/>
-        </w:rPr>
-        <w:t xml:space="preserve">Dalam Jaminan Kesehatan Nasional (JKN), BPJS Kesehatan menangani pendaftaran peserta, pengumpulan iuran, kontrak dengan penyedia layanan, dan pemrosesan klaim. Rumah sakit dibayar per kasus menurut tarif </w:t>
+        <w:t xml:space="preserve">NLP dan LLM pada Teks Klinis</w:t>
+      </w:r>
+    </w:p>
+    <w:p>
+      <w:pPr>
+        <w:pStyle w:val="Heading3"/>
+      </w:pPr>
+      <w:r>
+        <w:t xml:space="preserve">Tugas dan Model Bahasa untuk Teks Klinis</w:t>
+      </w:r>
+    </w:p>
+    <w:p>
+      <w:pPr>
+        <w:rPr>
+          <w:lang w:val="id-ID"/>
+        </w:rPr>
+      </w:pPr>
+      <w:r>
+        <w:rPr>
+          <w:lang w:val="id-ID"/>
+        </w:rPr>
+        <w:t xml:space="preserve">Pemrosesan bahasa alami (</w:t>
       </w:r>
       <w:r>
         <w:rPr>
           <w:i/>
           <w:lang w:val="id-ID"/>
         </w:rPr>
-        <w:t xml:space="preserve">Indonesian Case Base Groups</w:t>
-      </w:r>
-      <w:r>
-        <w:rPr>
-          <w:lang w:val="id-ID"/>
-        </w:rPr>
-        <w:t xml:space="preserve"> (INA-CBG) untuk rawat inap maupun rawat jalan (Susilo dkk., 2025, hlm. 2), dan pembayaran prospektif berbasis INA-CBG itu berlaku sejak 2014 (Rachmawaty dkk., 2021, hlm. S613). Klaim diajukan setelah pasien selesai dirawat, lalu diverifikasi pada aspek administrasi kepesertaan, administrasi pelayanan, dan pelayanan kesehatan. Berkas pendukungnya mencakup surat eligibilitas peserta (SEP) dan resume medis yang memuat diagnosis awal serta diagnosis akhir, yang ditulis dan ditetapkan oleh dokter yang bertanggung jawab (Simbolon &amp; Gani, 2023, hlm. 72–73). Salah satu informan pada penelitian kualitatif Susilo dkk. (2025, hlm. 6) menyebut klaim </w:t>
+        <w:t xml:space="preserve">natural language processing</w:t>
+      </w:r>
+      <w:r>
+        <w:rPr>
+          <w:lang w:val="id-ID"/>
+        </w:rPr>
+        <w:t xml:space="preserve">, NLP) klinis bertujuan mengekstraksi informasi medis yang relevan dari teks klinis tidak terstruktur (Olex &amp; McInnes, 2021, hlm. 1). Luo dkk. (2024) mensurvei penerapan model bahasa pralatih (</w:t>
       </w:r>
       <w:r>
         <w:rPr>
           <w:i/>
           <w:lang w:val="id-ID"/>
         </w:rPr>
-        <w:t xml:space="preserve">pending</w:t>
-      </w:r>
-      <w:r>
-        <w:rPr>
-          <w:lang w:val="id-ID"/>
-        </w:rPr>
-        <w:t xml:space="preserve">, perbedaan prosedur administrasi antarcabang BPJS, dan tinjauan klaim retrospektif sebagai gangguan terhadap pembiayaan rumah sakit.</w:t>
-      </w:r>
-    </w:p>
-    <w:p>
-      <w:pPr>
-        <w:rPr>
-          <w:lang w:val="id-ID"/>
-        </w:rPr>
-      </w:pPr>
-      <w:r>
-        <w:rPr>
-          <w:lang w:val="id-ID"/>
-        </w:rPr>
-        <w:t xml:space="preserve">Simbolon dan Gani (2023) merangkum lima artikel tahun 2020–2022 tentang penyebab klaim rawat inap yang </w:t>
+        <w:t xml:space="preserve">pre-trained language model</w:t>
+      </w:r>
+      <w:r>
+        <w:rPr>
+          <w:lang w:val="id-ID"/>
+        </w:rPr>
+        <w:t xml:space="preserve">, PLM) seperti BERT, BioBERT, dan ChatGPT pada tugas NLP medis, antara lain peringkasan teks, tanya jawab, pengenalan entitas bernama (</w:t>
       </w:r>
       <w:r>
         <w:rPr>
           <w:i/>
           <w:lang w:val="id-ID"/>
         </w:rPr>
-        <w:t xml:space="preserve">pending</w:t>
-      </w:r>
-      <w:r>
-        <w:rPr>
-          <w:lang w:val="id-ID"/>
-        </w:rPr>
-        <w:t xml:space="preserve">. Faktor yang muncul ialah pengodean yang tidak sesuai, kelengkapan berkas, dan perbedaan penegakan diagnosis antara dokter penanggung jawab pelayanan (DPJP) dan verifikator BPJS (hlm. 72, 77). Penulis mengaitkan perbedaan diagnosis itu dengan perbedaan latar belakang pendidikan dan pengetahuan kedua pihak (hlm. 77). Tabel ulasan tersebut memuat studi Muroli dkk. (2020) di RSAB Harapan Kita, Jakarta Barat. Menurut ringkasan dalam tabel itu, resume medis tidak lengkap pada 38 berkas (41,8%), pengodean tidak tepat pada 44 berkas (48,4%), dan berkas klaim tidak lengkap pada 27 berkas (29,7%) (hlm. 75). Angka tersebut berasal dari ringkasan dalam ulasan, bukan dari artikel Muroli dkk., dan ulasan itu tidak menguraikan penilaian mutu terhadap kelima artikel yang dimasukkan.</w:t>
-      </w:r>
-    </w:p>
-    <w:p>
-      <w:pPr>
-        <w:rPr>
-          <w:lang w:val="id-ID"/>
-        </w:rPr>
-      </w:pPr>
-      <w:r>
-        <w:rPr>
-          <w:lang w:val="id-ID"/>
-        </w:rPr>
-        <w:t xml:space="preserve">Dua studi lain membahas klaim JKN dari sudut berbeda. Rachmawaty dkk. (2021) menganalisis basis data e-klaim BPJS satu rumah sakit ibu dan anak di Makassar, dengan 2.870 rawat inap pada 2019 dan 1.533 pada Januari–Juni 2020. Kerugian finansial rumah sakit terjadi pada 42,9% rawat inap tahun 2019 dan 61,3% tahun 2020 (hlm. S613). Penulis mengaitkan kerugian itu terutama dengan tarif rumah sakit yang lebih tinggi daripada tarif BPJS, dan menyebut tidak adanya audit rekam medis pasien secara rutin oleh manajer sebagai salah satu alasan variasi lama rawat (hlm. S617). Studi ini tidak menilai mutu dokumentasi. Nilasari dan Soelistijanto (2026) berfokus pada kecurangan klaim. Mereka menyebut kategori Kementerian Kesehatan yang mencakup </w:t>
+        <w:t xml:space="preserve">named entity recognition</w:t>
+      </w:r>
+      <w:r>
+        <w:rPr>
+          <w:lang w:val="id-ID"/>
+        </w:rPr>
+        <w:t xml:space="preserve">, NER), dan ekstraksi informasi (hlm. 1). Elvas dkk. (2025) meninjau 31 studi tahun 2019–2024 yang berfokus pada NER dan melaporkan bahwa pendekatan berbasis BERT, jaringan saraf, serta CRF/LSTM mendominasi dengan F1 di atas 85% (hlm. 1). Kajian itu tidak menilai mutu studi secara formal dan sengaja mengecualikan model bahasa besar (hlm. 2), sehingga tidak menggambarkan penggunaan model generatif.</w:t>
+      </w:r>
+    </w:p>
+    <w:p>
+      <w:pPr>
+        <w:rPr>
+          <w:lang w:val="id-ID"/>
+        </w:rPr>
+      </w:pPr>
+      <w:r>
+        <w:rPr>
+          <w:lang w:val="id-ID"/>
+        </w:rPr>
+        <w:t xml:space="preserve">Bukti tersebut berasal terutama dari bahasa Inggris. Dari 31 studi dalam kajian Elvas dkk., 17 memakai teks berbahasa Inggris, 9 Tionghoa, 2 Italia, 2 Jerman, dan 1 Spanyol (hlm. 4). Kumar dkk. (2026), yang menelaah 153 studi secara sistematis (hlm. 3), menyatakan bahwa kemajuan NLP klinis terpusat pada bahasa Inggris dan bahasa bersumber daya tinggi lainnya, serta bahwa alih kode, transliterasi, dan ortografi tidak baku mempersulit tokenisasi dan </w:t>
       </w:r>
       <w:r>
         <w:rPr>
           <w:i/>
           <w:lang w:val="id-ID"/>
         </w:rPr>
-        <w:t xml:space="preserve">upcoding</w:t>
-      </w:r>
-      <w:r>
-        <w:rPr>
-          <w:lang w:val="id-ID"/>
-        </w:rPr>
-        <w:t xml:space="preserve">, yaitu mengubah kode diagnosis atau prosedur agar ditagihkan pada tarif lebih tinggi tanpa dasar medis (hlm. 852), lalu merancang sistem di sisi BPJS yang memilih klaim untuk diaudit manusia dalam batas kapasitas auditor (hlm. 851). Simulasi empirisnya belum selesai dan tidak ada data yang dipakai (hlm. 855, 857).</w:t>
-      </w:r>
-    </w:p>
-    <w:p>
-      <w:pPr>
-        <w:rPr>
-          <w:lang w:val="id-ID"/>
-        </w:rPr>
-      </w:pPr>
-      <w:r>
-        <w:rPr>
-          <w:lang w:val="id-ID"/>
-        </w:rPr>
-        <w:t xml:space="preserve">Sumber-sumber tersebut menunjukkan bahwa dokumentasi medis, kode diagnosis, dan keputusan klaim saling terkait dalam JKN. Di antara sumber itu, tidak ada yang mengukur ketidaksesuaian di dalam dokumen klinis sebelum klaim diajukan. Ulasan Simbolon dan Gani (2023) merangkum faktor penyebab dari artikel lain, Rachmawaty dkk. (2021) menganalisis biaya dan mutu layanan, dan Nilasari dan Soelistijanto (2026) merancang audit di sisi BPJS tanpa evaluasi. Ringkasan Muroli dkk. (2020) dalam ulasan itu memberi proporsi berkas yang tidak lengkap atau tidak tepat, tetapi tidak merinci jenis ketidaksesuaian antardokumen, misalnya diagnosis pada resume yang tidak sejalan dengan catatan harian.</w:t>
+        <w:t xml:space="preserve">parsing</w:t>
+      </w:r>
+      <w:r>
+        <w:rPr>
+          <w:lang w:val="id-ID"/>
+        </w:rPr>
+        <w:t xml:space="preserve"> (hlm. 21).</w:t>
+      </w:r>
+    </w:p>
+    <w:p>
+      <w:pPr>
+        <w:rPr>
+          <w:lang w:val="id-ID"/>
+        </w:rPr>
+      </w:pPr>
+      <w:r>
+        <w:rPr>
+          <w:lang w:val="id-ID"/>
+        </w:rPr>
+        <w:t xml:space="preserve">Pada sisi model bahasa besar (</w:t>
+      </w:r>
+      <w:r>
+        <w:rPr>
+          <w:i/>
+          <w:lang w:val="id-ID"/>
+        </w:rPr>
+        <w:t xml:space="preserve">large language model</w:t>
+      </w:r>
+      <w:r>
+        <w:rPr>
+          <w:lang w:val="id-ID"/>
+        </w:rPr>
+        <w:t xml:space="preserve">, LLM), Woo dkk. (2026) menelaah 41 studi penggunaan LLM untuk dokumentasi klinis, terutama pembuatan catatan klinis, ringkasan pulang, dan dokumentasi pertemuan tenaga kesehatan dan pasien (hlm. 1). Sebagian studi melaporkan penghematan waktu hingga 40%, tetapi ketidakakuratan faktual, halusinasi, dan penurunan kinerja pada kasus kompleks sering ditemukan (hlm. 1). Woo dkk. mencontohkan satu studi yang menemukan informasi keliru pada 36% dokumen buatan ChatGPT dan studi lain yang menemukan bahwa ringkasan pulang buatan LLM hanya mengambil 61% isinya dari catatan rawat inap (hlm. 9); kedua angka itu bersifat sekunder karena Woo dkk. mengutipnya dari studi lain. Cakupan kajian ini terbatas: 17 dari 41 studi berasal dari Amerika Serikat (hlm. 4), studi nonbahasa Inggris dikecualikan, dan menurut penulisnya sebagian besar studi dilakukan pada lingkungan terkendali atau simulasi (hlm. 11). Karena objek telaahnya adalah LLM sebagai penulis dokumen, hasil tersebut tidak menunjukkan seberapa andal LLM sebagai pembaca atau pemeriksa dokumen. Hasil itu hanya memperingatkan bahwa keluaran LLM yang berbasis teks klinis dapat memuat kesalahan faktual dan penghilangan informasi.</w:t>
+      </w:r>
+    </w:p>
+    <w:p>
+      <w:pPr>
+        <w:pStyle w:val="Heading3"/>
+      </w:pPr>
+      <w:r>
+        <w:t xml:space="preserve">Singkatan, Normalisasi Istilah, dan Penalaran Temporal</w:t>
+      </w:r>
+    </w:p>
+    <w:p>
+      <w:pPr>
+        <w:rPr>
+          <w:lang w:val="id-ID"/>
+        </w:rPr>
+      </w:pPr>
+      <w:r>
+        <w:rPr>
+          <w:lang w:val="id-ID"/>
+        </w:rPr>
+        <w:t xml:space="preserve">Jafarpour dkk. (2025) menyebut kalimat tidak gramatikal, singkatan, akronim, karakter khusus yang bermakna, negasi, dan salah ketik sesekali sebagai ciri catatan rekam medis elektronik naratif (hlm. 1). Ambiguitas singkatan menjadi salah satu persoalan praktisnya. Wei dkk. (2026) mengubah disambiguasi singkatan klinis dari pembangkitan terbuka menjadi pemilihan terbatas, yaitu model memilih satu ekspansi dari tujuh kandidat yang dibangun lewat dua jalur (hlm. 1). Pada dataset CASI berbahasa Inggris versi bersih buatan Adams, Gemma-2-9B-IT mencapai akurasi 0,9228 dan Macro-F1 0,9279, sedangkan pada versi asli yang memuat lebih banyak derau (</w:t>
+      </w:r>
+      <w:r>
+        <w:rPr>
+          <w:i/>
+          <w:lang w:val="id-ID"/>
+        </w:rPr>
+        <w:t xml:space="preserve">noise</w:t>
+      </w:r>
+      <w:r>
+        <w:rPr>
+          <w:lang w:val="id-ID"/>
+        </w:rPr>
+        <w:t xml:space="preserve">) akurasinya 0,7585 (hlm. 1, 5). Pada model dan dataset bersih yang sama, pembangkitan langsung tanpa tahap seleksi hanya mencapai akurasi 0,6304 (hlm. 7). Penulisnya menyatakan tiga keterbatasan: akurasi bergantung pada inventori makna sehingga istilah di luar inventori dan istilah baru sulit ditangani, seleksi peka terhadap mutu konteks, dan evaluasi hanya memakai satu tolok ukur sehingga korpus klinis nonbahasa Inggris belum diuji (hlm. 9). Kajian itu juga membatasi singkatan pada bentuk pendek berhuruf kapital yang berasal dari huruf atau suku kata awal (hlm. 5).</w:t>
+      </w:r>
+    </w:p>
+    <w:p>
+      <w:pPr>
+        <w:rPr>
+          <w:lang w:val="id-ID"/>
+        </w:rPr>
+      </w:pPr>
+      <w:r>
+        <w:rPr>
+          <w:lang w:val="id-ID"/>
+        </w:rPr>
+        <w:t xml:space="preserve">Normalisasi istilah ke konsep baku berkaitan erat dengan persoalan itu. Chen dkk. (2026) mensurvei </w:t>
+      </w:r>
+      <w:r>
+        <w:rPr>
+          <w:i/>
+          <w:lang w:val="id-ID"/>
+        </w:rPr>
+        <w:t xml:space="preserve">medical concept normalization</w:t>
+      </w:r>
+      <w:r>
+        <w:rPr>
+          <w:lang w:val="id-ID"/>
+        </w:rPr>
+        <w:t xml:space="preserve"> (MCN), yaitu pemetaan frasa medis informal ke konsep baku dalam basis terstandar seperti UMLS, SNOMED CT, atau MeSH (hlm. 1, 4); UMLS memuat ICD (hlm. 6). Untuk subtugas sempit seperti disambiguasi singkatan, aturan dan leksikon eksplisit dinilai masih andal (hlm. 13). Survei yang sama menilai korpus berbahasa Inggris mendominasi penelitian MCN, sedangkan penggabungan sumber multibahasa terhambat oleh pedoman anotasi yang berbeda antarbahasa, granularitas ontologi yang berbeda, dan terjemahan harfiah yang menghilangkan nuansa (hlm. 8).</w:t>
+      </w:r>
+    </w:p>
+    <w:p>
+      <w:pPr>
+        <w:rPr>
+          <w:lang w:val="id-ID"/>
+        </w:rPr>
+      </w:pPr>
+      <w:r>
+        <w:rPr>
+          <w:lang w:val="id-ID"/>
+        </w:rPr>
+        <w:t xml:space="preserve">Penalaran temporal merupakan komponen kunci NLP klinis karena pemahaman riwayat pasien sangat bergantung pada kemampuan mengidentifikasi dan menalar informasi temporal (Olex &amp; McInnes, 2021, hlm. 1). Olex dan McInnes memaparkan lima cara informasi temporal dinyatakan dalam teks menurut Lim dkk., yaitu eksplisit, implisit, relatif, kabur, dan </w:t>
+      </w:r>
+      <w:r>
+        <w:rPr>
+          <w:i/>
+          <w:lang w:val="id-ID"/>
+        </w:rPr>
+        <w:t xml:space="preserve">non-consuming</w:t>
+      </w:r>
+      <w:r>
+        <w:rPr>
+          <w:lang w:val="id-ID"/>
+        </w:rPr>
+        <w:t xml:space="preserve"> (hlm. 2); ungkapan “3 hari lalu” bergantung pada waktu pembuatan dokumen, sedangkan “2 jam setelah minum obat” bergantung pada kejadian lain (hlm. 2). Mereka menyimpulkan bahwa sistem ekstraksi lini masa belum cukup baik untuk praktik klinis; penanganan ungkapan temporal relatif dan implisit termasuk bidang yang memerlukan solusi baru (hlm. 1). Pada tugas bersama (</w:t>
+      </w:r>
+      <w:r>
+        <w:rPr>
+          <w:i/>
+          <w:lang w:val="id-ID"/>
+        </w:rPr>
+        <w:t xml:space="preserve">shared task</w:t>
+      </w:r>
+      <w:r>
+        <w:rPr>
+          <w:lang w:val="id-ID"/>
+        </w:rPr>
+        <w:t xml:space="preserve">) yang mereka tinjau, sistem berbasis aturan terbaik untuk mengenali dan menormalkan ekspresi temporal, sedangkan metode pembelajaran mesin statistik unggul untuk mengenali kejadian dan mengklasifikasi relasi temporal (hlm. 2). Tinjauan itu terbit tahun 2021 dan tidak menyebut LLM. Untuk LLM, Woo dkk. (2026) melaporkan bahwa GPT-4o dalam salah satu studi yang mereka rangkum andal pada konsultasi neurovaskular tetapi kesulitan pada lintasan pasien yang kompleks secara temporal (hlm. 9). Teks panjang menambah kesulitan: menurut Jafarpour dkk. (2025), yang menelaah deteksi kejadian tidak diharapkan di rumah sakit dengan teks berbahasa Inggris (hlm. 1, 4), laporan naratif sering melampaui batas masukan model seperti BERT, yang memproses maksimum 512 kata sekaligus. Informasi penting dapat hilang atau terpecah, dan ketiadaan informasi temporal dapat membuat model keliru membedakan kejadian sebelum dan selama rawat inap (hlm. 9).</w:t>
+      </w:r>
+    </w:p>
+    <w:p>
+      <w:pPr>
+        <w:pStyle w:val="Heading3"/>
+      </w:pPr>
+      <w:r>
+        <w:t xml:space="preserve">Sintesis dan Celah</w:t>
+      </w:r>
+    </w:p>
+    <w:p>
+      <w:pPr>
+        <w:rPr>
+          <w:lang w:val="id-ID"/>
+        </w:rPr>
+      </w:pPr>
+      <w:r>
+        <w:rPr>
+          <w:lang w:val="id-ID"/>
+        </w:rPr>
+        <w:t xml:space="preserve">Kedelapan sumber menunjukkan bahwa PLM dan LLM telah luas dipakai pada teks klinis, tetapi bukti yang tersedia memiliki tiga keterbatasan bagi penelitian ini. Pertama, tidak ada sumber yang mengevaluasi teks klinis berbahasa Indonesia, dan sebagian menyebut dominasi bahasa Inggris pada penelitian di bidangnya (Chen dkk., 2026, hlm. 8; Kumar dkk., 2026, hlm. 21). Kedua, bukti tentang LLM pada dokumentasi klinis berpusat pada pembuatan dokumen, bukan pemeriksaan kesesuaian antardokumen (Woo dkk., 2026, hlm. 1), dan keandalannya dilaporkan menurun pada kasus kompleks. Ketiga, hasil disambiguasi singkatan yang dikaji di sini berasal dari satu dataset berbahasa Inggris dan turun dari akurasi 0,9228 menjadi 0,7585 pada versi yang memuat lebih banyak derau (Wei dkk., 2026, hlm. 1, 5, 9). Karena itu, kinerja teknik-teknik ini pada rekam medis rawat inap kebidanan dan anak berbahasa Indonesia tidak dapat diasumsikan dan harus diukur langsung pada data tersebut </w:t>
+      </w:r>
+      <w:r>
+        <w:rPr>
+          <w:highlight w:val="yellow"/>
+          <w:lang w:val="id-ID"/>
+        </w:rPr>
+        <w:t xml:space="preserve">[SESUAIKAN DENGAN BAB I: rumusan pertanyaan dan ukuran keberhasilan]</w:t>
+      </w:r>
+      <w:r>
+        <w:rPr>
+          <w:lang w:val="id-ID"/>
+        </w:rPr>
+        <w:t xml:space="preserve">.</w:t>
       </w:r>
     </w:p>
     <w:p>
@@ -4267,7 +4412,20 @@
         <w:pStyle w:val="Heading2"/>
       </w:pPr>
       <w:r>
-        <w:t xml:space="preserve">NLP dan LLM pada Teks Klinis</w:t>
+        <w:t xml:space="preserve">Audit Otomatis Dokumentasi Klinis dan Kode Diagnosis</w:t>
+      </w:r>
+    </w:p>
+    <w:p>
+      <w:pPr>
+        <w:rPr>
+          <w:lang w:val="id-ID"/>
+        </w:rPr>
+      </w:pPr>
+      <w:r>
+        <w:rPr>
+          <w:lang w:val="id-ID"/>
+        </w:rPr>
+        <w:t xml:space="preserve">Subbab ini menelaah enam studi yang memeriksa dokumentasi klinis atau kode diagnosis secara otomatis. Telaah dipusatkan pada jenis ketidaksesuaian yang diuji, cara kinerja diukur, dan batas penerapan hasilnya pada dokumentasi rawat inap kebidanan dan anak.</w:t>
       </w:r>
     </w:p>
     <w:p>
@@ -4275,111 +4433,184 @@
         <w:pStyle w:val="Heading3"/>
       </w:pPr>
       <w:r>
-        <w:t xml:space="preserve">Tugas dan Model Bahasa untuk Teks Klinis</w:t>
-      </w:r>
-    </w:p>
-    <w:p>
-      <w:pPr>
-        <w:rPr>
-          <w:lang w:val="id-ID"/>
-        </w:rPr>
-      </w:pPr>
-      <w:r>
-        <w:rPr>
-          <w:lang w:val="id-ID"/>
-        </w:rPr>
-        <w:t xml:space="preserve">Pemrosesan bahasa alami (</w:t>
+        <w:t xml:space="preserve">Model Bahasa Besar sebagai Pemeriksa Dokumentasi</w:t>
+      </w:r>
+    </w:p>
+    <w:p>
+      <w:pPr>
+        <w:rPr>
+          <w:lang w:val="id-ID"/>
+        </w:rPr>
+      </w:pPr>
+      <w:r>
+        <w:rPr>
+          <w:lang w:val="id-ID"/>
+        </w:rPr>
+        <w:t xml:space="preserve">Dietrich dan Stubbert (2026) mengevaluasi empat LLM, yaitu Claude Sonnet 4.5, Gemini 2.5 Pro, GPT-5, dan Grok 4, sebagai pemeriksa catatan pemulangan instalasi gawat darurat (IGD). Data berasal dari 600 kunjungan pada basis data MIMIC-IV-ED. Sebanyak 500 catatan masing-masing disisipi satu kesalahan dari lima kategori, dan 100 catatan lain tidak memuat kesalahan (hlm. 95–96). Keempat model menerima perintah sistem (</w:t>
       </w:r>
       <w:r>
         <w:rPr>
           <w:i/>
           <w:lang w:val="id-ID"/>
         </w:rPr>
-        <w:t xml:space="preserve">natural language processing</w:t>
-      </w:r>
-      <w:r>
-        <w:rPr>
-          <w:lang w:val="id-ID"/>
-        </w:rPr>
-        <w:t xml:space="preserve">, NLP) klinis bertujuan mengekstraksi informasi medis yang relevan dari teks klinis tidak terstruktur (Olex &amp; McInnes, 2021, hlm. 1). Luo dkk. (2024) mensurvei penerapan model bahasa pralatih (</w:t>
+        <w:t xml:space="preserve">prompt</w:t>
+      </w:r>
+      <w:r>
+        <w:rPr>
+          <w:lang w:val="id-ID"/>
+        </w:rPr>
+        <w:t xml:space="preserve">) yang sama, berisi definisi kelima kategori dan kriteria klasifikasi positif maupun negatif (hlm. 97). Akurasi deteksi kesalahan apa pun berkisar 93,2–94,2%, presisi 98,3–99,1%, dan spesifisitas 92,0–96,0% (hlm. 98). Kinerja berbeda menurut kategori. Ketidaksesuaian identitas atau waktu kunjungan serta kesalahan obat dan alergi terdeteksi dengan F1 ≥0,96, sedangkan ketidaksesuaian antara tanda vital atau pemeriksaan fisik dan interpretasi naratif paling sulit, dengan F1 0,75–0,84 yang terutama disebabkan oleh rendahnya </w:t>
       </w:r>
       <w:r>
         <w:rPr>
           <w:i/>
           <w:lang w:val="id-ID"/>
         </w:rPr>
-        <w:t xml:space="preserve">pre-trained language model</w:t>
-      </w:r>
-      <w:r>
-        <w:rPr>
-          <w:lang w:val="id-ID"/>
-        </w:rPr>
-        <w:t xml:space="preserve">, PLM) seperti BERT, BioBERT, dan ChatGPT pada tugas NLP medis, antara lain peringkasan teks, tanya jawab, pengenalan entitas bernama (</w:t>
+        <w:t xml:space="preserve">recall</w:t>
+      </w:r>
+      <w:r>
+        <w:rPr>
+          <w:lang w:val="id-ID"/>
+        </w:rPr>
+        <w:t xml:space="preserve"> (hlm. 98).</w:t>
+      </w:r>
+    </w:p>
+    <w:p>
+      <w:pPr>
+        <w:rPr>
+          <w:lang w:val="id-ID"/>
+        </w:rPr>
+      </w:pPr>
+      <w:r>
+        <w:rPr>
+          <w:lang w:val="id-ID"/>
+        </w:rPr>
+        <w:t xml:space="preserve">Rancangan itu membatasi cakupan kesimpulannya. Kesalahan disisipkan oleh peneliti, bukan muncul secara alami, dan seluruh data berasal dari satu institusi (hlm. 100). Setiap catatan hanya memuat satu kesalahan, dan catatan yang dinilai adalah satu dokumen yang disusun dari elemen data terstruktur kunjungan (hlm. 96). Karena 500 dari 600 catatan memuat kesalahan (hlm. 95), presisi yang tinggi itu tidak dapat langsung dipindahkan ke populasi dengan proporsi ketidaksesuaian yang lebih rendah. Penulis sendiri menyebut kerangka audit berbasis agen yang mengambil pedoman dan memeriksa konsistensi lintas dokumen sebagai arah penelitian lanjutan (hlm. 100).</w:t>
+      </w:r>
+    </w:p>
+    <w:p>
+      <w:pPr>
+        <w:rPr>
+          <w:lang w:val="id-ID"/>
+        </w:rPr>
+      </w:pPr>
+      <w:r>
+        <w:rPr>
+          <w:lang w:val="id-ID"/>
+        </w:rPr>
+        <w:t xml:space="preserve">Skrabic dkk. (2026) menguji tiga model penalaran, yaitu o3, DeepSeek-v3-R1, dan GPT-OSS-120B, sebagai pemeriksa kedua (</w:t>
       </w:r>
       <w:r>
         <w:rPr>
           <w:i/>
           <w:lang w:val="id-ID"/>
         </w:rPr>
-        <w:t xml:space="preserve">named entity recognition</w:t>
-      </w:r>
-      <w:r>
-        <w:rPr>
-          <w:lang w:val="id-ID"/>
-        </w:rPr>
-        <w:t xml:space="preserve">, NER), dan ekstraksi informasi (hlm. 1). Elvas dkk. (2025) meninjau 31 studi tahun 2019–2024 yang berfokus pada NER dan melaporkan bahwa pendekatan berbasis BERT, jaringan saraf, serta CRF/LSTM mendominasi dengan F1 di atas 85% (hlm. 1). Kajian itu tidak menilai mutu studi secara formal dan sengaja mengecualikan model bahasa besar (hlm. 2), sehingga tidak menggambarkan penggunaan model generatif.</w:t>
-      </w:r>
-    </w:p>
-    <w:p>
-      <w:pPr>
-        <w:rPr>
-          <w:lang w:val="id-ID"/>
-        </w:rPr>
-      </w:pPr>
-      <w:r>
-        <w:rPr>
-          <w:lang w:val="id-ID"/>
-        </w:rPr>
-        <w:t xml:space="preserve">Bukti tersebut berasal terutama dari bahasa Inggris. Dari 31 studi dalam kajian Elvas dkk., 17 memakai teks berbahasa Inggris, 9 Tionghoa, 2 Italia, 2 Jerman, dan 1 Spanyol (hlm. 4). Kumar dkk. (2026), yang menelaah 153 studi secara sistematis (hlm. 3), menyatakan bahwa kemajuan NLP klinis terpusat pada bahasa Inggris dan bahasa bersumber daya tinggi lainnya, serta bahwa alih kode, transliterasi, dan ortografi tidak baku mempersulit tokenisasi dan </w:t>
+        <w:t xml:space="preserve">second reviewer</w:t>
+      </w:r>
+      <w:r>
+        <w:rPr>
+          <w:lang w:val="id-ID"/>
+        </w:rPr>
+        <w:t xml:space="preserve">) pada 102 laporan unit gawat darurat penyakit dalam yang identitasnya telah dihapus (hlm. 1–2). Dua dokter spesialis menyisipkan 99 kesalahan yang realistis dan menandai tiga kesalahan yang sudah ada dalam laporan asli (hlm. 2). Model menerima satu perintah seragam tanpa pengambilan referensi atau pemanggilan fungsi (hlm. 3). Model menemukan lokasi kesalahan dengan benar pada 65,7–79,2% laporan, sedangkan tiga dokter pembanding, yang masing-masing meninjau sepertiga kasus, menemukan 48,0% (hlm. 4). Kategori diagnostik dan pemeriksaan penunjang paling sulit bagi ketiga model (hlm. 4). Selain itu, hampir semua laporan memperoleh isu tambahan yang dinilai berguna secara klinis. Penulis mengingatkan risiko kelelahan terhadap peringatan (</w:t>
       </w:r>
       <w:r>
         <w:rPr>
           <w:i/>
           <w:lang w:val="id-ID"/>
         </w:rPr>
-        <w:t xml:space="preserve">parsing</w:t>
-      </w:r>
-      <w:r>
-        <w:rPr>
-          <w:lang w:val="id-ID"/>
-        </w:rPr>
-        <w:t xml:space="preserve"> (hlm. 21).</w:t>
-      </w:r>
-    </w:p>
-    <w:p>
-      <w:pPr>
-        <w:rPr>
-          <w:lang w:val="id-ID"/>
-        </w:rPr>
-      </w:pPr>
-      <w:r>
-        <w:rPr>
-          <w:lang w:val="id-ID"/>
-        </w:rPr>
-        <w:t xml:space="preserve">Pada sisi model bahasa besar (</w:t>
+        <w:t xml:space="preserve">alert fatigue</w:t>
+      </w:r>
+      <w:r>
+        <w:rPr>
+          <w:lang w:val="id-ID"/>
+        </w:rPr>
+        <w:t xml:space="preserve">) bila isu itu tidak diprioritaskan (hlm. 5). Studi ini tidak menyertakan catatan tanpa kesalahan sehingga perilaku positif palsu belum dapat dipastikan, dan datanya berasal dari satu pusat layanan (hlm. 6).</w:t>
+      </w:r>
+    </w:p>
+    <w:p>
+      <w:pPr>
+        <w:pStyle w:val="Heading3"/>
+      </w:pPr>
+      <w:r>
+        <w:t xml:space="preserve">Audit Label Diagnosis dan Kesesuaian Kode dengan Catatan Klinis</w:t>
+      </w:r>
+    </w:p>
+    <w:p>
+      <w:pPr>
+        <w:rPr>
+          <w:lang w:val="id-ID"/>
+        </w:rPr>
+      </w:pPr>
+      <w:r>
+        <w:rPr>
+          <w:lang w:val="id-ID"/>
+        </w:rPr>
+        <w:t xml:space="preserve">Du dkk. (2026) memeriksa label diagnosis, bukan kesalahan yang disisipkan. Penelitian itu mengubah klasifikasi multilabel kode diagnosis psikiatri menjadi tugas tanya jawab dan menambahkan deskripsi serta penjelasan kode ke masukan model (hlm. 1, 4). Data berupa 48.492 rekam dari 7.000 pasien di satu klinik psikiatri (hlm. 3, 12), sebagian dikonversi melalui pengenalan karakter optik (</w:t>
       </w:r>
       <w:r>
         <w:rPr>
           <w:i/>
           <w:lang w:val="id-ID"/>
         </w:rPr>
-        <w:t xml:space="preserve">large language model</w:t>
-      </w:r>
-      <w:r>
-        <w:rPr>
-          <w:lang w:val="id-ID"/>
-        </w:rPr>
-        <w:t xml:space="preserve">, LLM), Woo dkk. (2026) menelaah 41 studi penggunaan LLM untuk dokumentasi klinis, terutama pembuatan catatan klinis, ringkasan pulang, dan dokumentasi pertemuan tenaga kesehatan dan pasien (hlm. 1). Sebagian studi melaporkan penghematan waktu hingga 40%, tetapi ketidakakuratan faktual, halusinasi, dan penurunan kinerja pada kasus kompleks sering ditemukan (hlm. 1). Woo dkk. mencontohkan satu studi yang menemukan informasi keliru pada 36% dokumen buatan ChatGPT dan studi lain yang menemukan bahwa ringkasan pulang buatan LLM hanya mengambil 61% isinya dari catatan rawat inap (hlm. 9); kedua angka itu bersifat sekunder karena Woo dkk. mengutipnya dari studi lain. Cakupan kajian ini terbatas: 17 dari 41 studi berasal dari Amerika Serikat (hlm. 4), studi nonbahasa Inggris dikecualikan, dan menurut penulisnya sebagian besar studi dilakukan pada lingkungan terkendali atau simulasi (hlm. 11). Karena objek telaahnya adalah LLM sebagai penulis dokumen, hasil tersebut tidak menunjukkan seberapa andal LLM sebagai pembaca atau pemeriksa dokumen. Hasil itu hanya memperingatkan bahwa keluaran LLM yang berbasis teks klinis dapat memuat kesalahan faktual dan penghilangan informasi.</w:t>
+        <w:t xml:space="preserve">optical character recognition</w:t>
+      </w:r>
+      <w:r>
+        <w:rPr>
+          <w:lang w:val="id-ID"/>
+        </w:rPr>
+        <w:t xml:space="preserve">, OCR) (hlm. 3). Model tanya jawab berbasis BART yang diperkaya penjelasan kode memperoleh sum-F1, yaitu ukuran F1 berbasis ROUGE rancangan penulis (hlm. 6), sebesar 0,7417. Nilai itu terbaik di antara model yang dibandingkan, tetapi hanya 0,013 di atas BERT yang diperkaya penjelasan kode (0,7287), sedangkan Llama 3.3 yang dijalankan tanpa pelatihan tambahan (</w:t>
+      </w:r>
+      <w:r>
+        <w:rPr>
+          <w:i/>
+          <w:lang w:val="id-ID"/>
+        </w:rPr>
+        <w:t xml:space="preserve">zero-shot</w:t>
+      </w:r>
+      <w:r>
+        <w:rPr>
+          <w:lang w:val="id-ID"/>
+        </w:rPr>
+        <w:t xml:space="preserve">) hanya mencapai 0,3785 (hlm. 8). Selisih antara kode klinisi dan keluaran model dikelompokkan menjadi risiko rendah (36,99%), sedang (45,9%), dan tinggi (17,11%) untuk menentukan kasus yang perlu ditinjau manusia (hlm. 7).</w:t>
+      </w:r>
+    </w:p>
+    <w:p>
+      <w:pPr>
+        <w:rPr>
+          <w:lang w:val="id-ID"/>
+        </w:rPr>
+      </w:pPr>
+      <w:r>
+        <w:rPr>
+          <w:lang w:val="id-ID"/>
+        </w:rPr>
+        <w:t xml:space="preserve">Keterbatasan studi ini menentukan kegunaannya sebagai acuan. Acuan penilaiannya adalah diagnosis yang dicatat klinisi, yang menurut penulis dapat mengandung derau (</w:t>
+      </w:r>
+      <w:r>
+        <w:rPr>
+          <w:i/>
+          <w:lang w:val="id-ID"/>
+        </w:rPr>
+        <w:t xml:space="preserve">label noise</w:t>
+      </w:r>
+      <w:r>
+        <w:rPr>
+          <w:lang w:val="id-ID"/>
+        </w:rPr>
+        <w:t xml:space="preserve">), tidak stabil dari waktu ke waktu, dan dipengaruhi tuntutan penagihan serta dokumentasi; derau itu tidak dimodelkan secara eksplisit (hlm. 12). Tingkat risikonya bersifat heuristik dan disusun tanpa keterlibatan psikiater, sedangkan mutu penjelasan model tidak dinilai klinisi (hlm. 13). Pengetahuan acuan yang dimasukkan pun statis, yaitu deskripsi sepuluh kelompok kode yang selalu ditambahkan dalam urutan tetap (hlm. 5), bukan referensi yang diambil sesuai kasus.</w:t>
+      </w:r>
+    </w:p>
+    <w:p>
+      <w:pPr>
+        <w:rPr>
+          <w:lang w:val="id-ID"/>
+        </w:rPr>
+      </w:pPr>
+      <w:r>
+        <w:rPr>
+          <w:lang w:val="id-ID"/>
+        </w:rPr>
+        <w:t xml:space="preserve">Mwogosi dan Mambile (2026) menelaah dari sisi lain, yaitu kesesuaian kode ICD dalam rekam medis elektronik dengan acuan klinis. Tinjauan sistematis dan metaanalisis ini merangkum 17 studi validasi (hlm. 1). Spesifisitas dan nilai prediktif positif kode konsisten tinggi, sering melebihi 90%, tetapi sensitivitas rata-rata hanya 64,5%, dengan catatan sebagian estimasi memakai prevalensi pengodean sebagai proksi sensitivitas (hlm. 1). Mengandalkan kode saja juga membuat kepatuhan terhadap pedoman tampak lebih tinggi daripada hasil penelusuran catatan (hlm. 1). Penulis menyimpulkan bahwa pendekatan hibrida yang menggabungkan kode, data klinis, dan narasi diperlukan (hlm. 1), tetapi acuan validasinya, yaitu penelusuran rekam medis, juga dapat bias akibat penyalinan teks dan terbawanya diagnosis usang (hlm. 11). Seluruh studi yang ditinjau berasal dari negara berpenghasilan tinggi (hlm. 4–5).</w:t>
       </w:r>
     </w:p>
     <w:p>
@@ -4387,98 +4618,166 @@
         <w:pStyle w:val="Heading3"/>
       </w:pPr>
       <w:r>
-        <w:t xml:space="preserve">Singkatan, Normalisasi Istilah, dan Penalaran Temporal</w:t>
-      </w:r>
-    </w:p>
-    <w:p>
-      <w:pPr>
-        <w:rPr>
-          <w:lang w:val="id-ID"/>
-        </w:rPr>
-      </w:pPr>
-      <w:r>
-        <w:rPr>
-          <w:lang w:val="id-ID"/>
-        </w:rPr>
-        <w:t xml:space="preserve">Jafarpour dkk. (2025) menyebut kalimat tidak gramatikal, singkatan, akronim, karakter khusus yang bermakna, negasi, dan salah ketik sesekali sebagai ciri catatan rekam medis elektronik naratif (hlm. 1). Ambiguitas singkatan menjadi salah satu persoalan praktisnya. Wei dkk. (2026) mengubah disambiguasi singkatan klinis dari pembangkitan terbuka menjadi pemilihan terbatas, yaitu model memilih satu ekspansi dari tujuh kandidat yang dibangun lewat dua jalur (hlm. 1). Pada dataset CASI berbahasa Inggris versi bersih buatan Adams, Gemma-2-9B-IT mencapai akurasi 0,9228 dan Macro-F1 0,9279, sedangkan pada versi asli yang memuat lebih banyak derau (</w:t>
+        <w:t xml:space="preserve">Pengodean ICD Otomatis dan Ketahanannya terhadap Variasi Teks</w:t>
+      </w:r>
+    </w:p>
+    <w:p>
+      <w:pPr>
+        <w:rPr>
+          <w:lang w:val="id-ID"/>
+        </w:rPr>
+      </w:pPr>
+      <w:r>
+        <w:rPr>
+          <w:lang w:val="id-ID"/>
+        </w:rPr>
+        <w:t xml:space="preserve">Hou dkk. (2024) menyatakan bahwa pengodean otomatis umumnya diperlakukan sebagai klasifikasi teks multilabel, yaitu menetapkan kode ICD pada dokumen klinis (hlm. 1). Mereka memakai Clinical-Longformer, penyandi (</w:t>
       </w:r>
       <w:r>
         <w:rPr>
           <w:i/>
           <w:lang w:val="id-ID"/>
         </w:rPr>
-        <w:t xml:space="preserve">noise</w:t>
-      </w:r>
-      <w:r>
-        <w:rPr>
-          <w:lang w:val="id-ID"/>
-        </w:rPr>
-        <w:t xml:space="preserve">) akurasinya 0,7585 (hlm. 1, 5). Pada model dan dataset bersih yang sama, pembangkitan langsung tanpa tahap seleksi hanya mencapai akurasi 0,6304 (hlm. 7). Penulisnya menyatakan tiga keterbatasan: akurasi bergantung pada inventori makna sehingga istilah di luar inventori dan istilah baru sulit ditangani, seleksi peka terhadap mutu konteks, dan evaluasi hanya memakai satu tolok ukur sehingga korpus klinis nonbahasa Inggris belum diuji (hlm. 9). Kajian itu juga membatasi singkatan pada bentuk pendek berhuruf kapital yang berasal dari huruf atau suku kata awal (hlm. 5).</w:t>
-      </w:r>
-    </w:p>
-    <w:p>
-      <w:pPr>
-        <w:rPr>
-          <w:lang w:val="id-ID"/>
-        </w:rPr>
-      </w:pPr>
-      <w:r>
-        <w:rPr>
-          <w:lang w:val="id-ID"/>
-        </w:rPr>
-        <w:t xml:space="preserve">Normalisasi istilah ke konsep baku berkaitan erat dengan persoalan itu. Chen dkk. (2026) mensurvei </w:t>
+        <w:t xml:space="preserve">encoder</w:t>
+      </w:r>
+      <w:r>
+        <w:rPr>
+          <w:lang w:val="id-ID"/>
+        </w:rPr>
+        <w:t xml:space="preserve">) yang dapat memproses hingga 4.096 token, untuk dokumen panjang, serta mekanisme perhatian per label (</w:t>
       </w:r>
       <w:r>
         <w:rPr>
           <w:i/>
           <w:lang w:val="id-ID"/>
         </w:rPr>
-        <w:t xml:space="preserve">medical concept normalization</w:t>
-      </w:r>
-      <w:r>
-        <w:rPr>
-          <w:lang w:val="id-ID"/>
-        </w:rPr>
-        <w:t xml:space="preserve"> (MCN), yaitu pemetaan frasa medis informal ke konsep baku dalam basis terstandar seperti UMLS, SNOMED CT, atau MeSH (hlm. 1, 4); UMLS memuat ICD (hlm. 6). Untuk subtugas sempit seperti disambiguasi singkatan, aturan dan leksikon eksplisit dinilai masih andal (hlm. 13). Survei yang sama menilai korpus berbahasa Inggris mendominasi penelitian MCN, sedangkan penggabungan sumber multibahasa terhambat oleh pedoman anotasi yang berbeda antarbahasa, granularitas ontologi yang berbeda, dan terjemahan harfiah yang menghilangkan nuansa (hlm. 8).</w:t>
-      </w:r>
-    </w:p>
-    <w:p>
-      <w:pPr>
-        <w:rPr>
-          <w:lang w:val="id-ID"/>
-        </w:rPr>
-      </w:pPr>
-      <w:r>
-        <w:rPr>
-          <w:lang w:val="id-ID"/>
-        </w:rPr>
-        <w:t xml:space="preserve">Penalaran temporal merupakan komponen kunci NLP klinis karena pemahaman riwayat pasien sangat bergantung pada kemampuan mengidentifikasi dan menalar informasi temporal (Olex &amp; McInnes, 2021, hlm. 1). Olex dan McInnes memaparkan lima cara informasi temporal dinyatakan dalam teks menurut Lim dkk., yaitu eksplisit, implisit, relatif, kabur, dan </w:t>
+        <w:t xml:space="preserve">label-wise attention</w:t>
+      </w:r>
+      <w:r>
+        <w:rPr>
+          <w:lang w:val="id-ID"/>
+        </w:rPr>
+        <w:t xml:space="preserve">) agar prediksi dapat diinterpretasi (hlm. 1–2). Pada 50 kode ICD-9 teratas di MIMIC-III, model memperoleh F1 makro 0,688 dan F1 mikro 0,727 (hlm. 2). Penulis menempatkan model ini sebagai alat bantu bagi pemberi kode (hlm. 1–2). Mereka menilai pendekatan berbasis aturan kurang fleksibel dan sulit diperluas karena aturan dapat saling bertentangan seiring bertambahnya kode, dan menyebut bahwa pemotongan dokumen menjadi 512 token pada model sebelumnya menimbulkan kehilangan informasi (hlm. 2).</w:t>
+      </w:r>
+    </w:p>
+    <w:p>
+      <w:pPr>
+        <w:rPr>
+          <w:lang w:val="id-ID"/>
+        </w:rPr>
+      </w:pPr>
+      <w:r>
+        <w:rPr>
+          <w:lang w:val="id-ID"/>
+        </w:rPr>
+        <w:t xml:space="preserve">Jaganathan dkk. (2025) menguji ketahanan model pengode ICD, yaitu PLM-ICD, dengan pengujian metamorfik (</w:t>
       </w:r>
       <w:r>
         <w:rPr>
           <w:i/>
           <w:lang w:val="id-ID"/>
         </w:rPr>
-        <w:t xml:space="preserve">non-consuming</w:t>
-      </w:r>
-      <w:r>
-        <w:rPr>
-          <w:lang w:val="id-ID"/>
-        </w:rPr>
-        <w:t xml:space="preserve"> (hlm. 2); ungkapan “3 hari lalu” bergantung pada waktu pembuatan dokumen, sedangkan “2 jam setelah minum obat” bergantung pada kejadian lain (hlm. 2). Mereka menyimpulkan bahwa sistem ekstraksi lini masa belum cukup baik untuk praktik klinis; penanganan ungkapan temporal relatif dan implisit termasuk bidang yang memerlukan solusi baru (hlm. 1). Pada tugas bersama (</w:t>
+        <w:t xml:space="preserve">metamorphic testing</w:t>
+      </w:r>
+      <w:r>
+        <w:rPr>
+          <w:lang w:val="id-ID"/>
+        </w:rPr>
+        <w:t xml:space="preserve">). Catatan diubah secara sederhana, lalu daftar kode keluarannya dibandingkan dengan keluaran catatan asli. Pada 3.372 catatan uji MIMIC-III, penggantian akronim, penghapusan kata, dan salah ketik menyebabkan perbedaan pada lima kode teratas di 70–81% catatan (hlm. 4); penggantian dua puluh akronim yang paling sering muncul mencapai 80,7% (hlm. 5). Kriteria kegagalannya ketat, yaitu setiap perbedaan pada himpunan lima kode teratas (hlm. 4), sehingga angka itu menunjukkan ketidakstabilan keluaran, bukan persentase kode yang salah. Hanya satu aplikasi yang dapat diuji (hlm. 3).</w:t>
+      </w:r>
+    </w:p>
+    <w:p>
+      <w:pPr>
+        <w:pStyle w:val="Heading3"/>
+      </w:pPr>
+      <w:r>
+        <w:t xml:space="preserve">Sintesis dan Posisi Penelitian</w:t>
+      </w:r>
+    </w:p>
+    <w:p>
+      <w:pPr>
+        <w:rPr>
+          <w:lang w:val="id-ID"/>
+        </w:rPr>
+      </w:pPr>
+      <w:r>
+        <w:rPr>
+          <w:lang w:val="id-ID"/>
+        </w:rPr>
+        <w:t xml:space="preserve">Dua studi yang membedakan kategori kesalahan menunjukkan pola yang sama: pemeriksaan otomatis lebih baik pada kesalahan eksplisit dalam satu dokumen daripada pada kesalahan yang menuntut penilaian klinis. Pada Dietrich dan Stubbert (2026, hlm. 98), ketidaksesuaian temuan klinis memiliki </w:t>
       </w:r>
       <w:r>
         <w:rPr>
           <w:i/>
           <w:lang w:val="id-ID"/>
         </w:rPr>
-        <w:t xml:space="preserve">shared task</w:t>
-      </w:r>
-      <w:r>
-        <w:rPr>
-          <w:lang w:val="id-ID"/>
-        </w:rPr>
-        <w:t xml:space="preserve">) yang mereka tinjau, sistem berbasis aturan terbaik untuk mengenali dan menormalkan ekspresi temporal, sedangkan metode pembelajaran mesin statistik unggul untuk mengenali kejadian dan mengklasifikasi relasi temporal (hlm. 2). Tinjauan itu terbit tahun 2021 dan tidak menyebut LLM. Untuk LLM, Woo dkk. (2026) melaporkan bahwa GPT-4o dalam salah satu studi yang mereka rangkum andal pada konsultasi neurovaskular tetapi kesulitan pada lintasan pasien yang kompleks secara temporal (hlm. 9). Teks panjang menambah kesulitan: menurut Jafarpour dkk. (2025), yang menelaah deteksi kejadian tidak diharapkan di rumah sakit dengan teks berbahasa Inggris (hlm. 1, 4), laporan naratif sering melampaui batas masukan model seperti BERT, yang memproses maksimum 512 kata sekaligus. Informasi penting dapat hilang atau terpecah, dan ketiadaan informasi temporal dapat membuat model keliru membedakan kejadian sebelum dan selama rawat inap (hlm. 9).</w:t>
+        <w:t xml:space="preserve">recall</w:t>
+      </w:r>
+      <w:r>
+        <w:rPr>
+          <w:lang w:val="id-ID"/>
+        </w:rPr>
+        <w:t xml:space="preserve"> terendah, dan pada Skrabic dkk. (2026, hlm. 4), kategori diagnostik dan pemeriksaan penunjang paling sulit. Kategori sejenis, misalnya diagnosis yang tidak sejalan dengan catatan harian, termasuk yang direncanakan ditangani komponen AI/NLP dalam penelitian ini </w:t>
+      </w:r>
+      <w:r>
+        <w:rPr>
+          <w:highlight w:val="yellow"/>
+          <w:lang w:val="id-ID"/>
+        </w:rPr>
+        <w:t xml:space="preserve">[SESUAIKAN DENGAN BAB I]</w:t>
+      </w:r>
+      <w:r>
+        <w:rPr>
+          <w:lang w:val="id-ID"/>
+        </w:rPr>
+        <w:t xml:space="preserve">.</w:t>
+      </w:r>
+    </w:p>
+    <w:p>
+      <w:pPr>
+        <w:rPr>
+          <w:lang w:val="id-ID"/>
+        </w:rPr>
+      </w:pPr>
+      <w:r>
+        <w:rPr>
+          <w:lang w:val="id-ID"/>
+        </w:rPr>
+        <w:t xml:space="preserve">Bukti tentang positif palsu (</w:t>
+      </w:r>
+      <w:r>
+        <w:rPr>
+          <w:i/>
+          <w:lang w:val="id-ID"/>
+        </w:rPr>
+        <w:t xml:space="preserve">false positive</w:t>
+      </w:r>
+      <w:r>
+        <w:rPr>
+          <w:lang w:val="id-ID"/>
+        </w:rPr>
+        <w:t xml:space="preserve">) belum seragam. Hanya Dietrich dan Stubbert (2026, hlm. 95) menyertakan catatan tanpa kesalahan, sebanyak 100 catatan. Skrabic dkk. (2026, hlm. 6) tidak menyertakannya, dan Du dkk. (2026, hlm. 7, 12) menilai selisih terhadap label klinisi yang sendiri dapat mengandung derau. Karena itu, angka presisi dari ketiga studi tidak sebanding. Ketidakstabilan satu model klasifikasi kode terhadap akronim dan salah ketik (Jaganathan dkk., 2025, hlm. 4–5) juga menunjukkan bahwa ketahanan terhadap variasi penulisan, termasuk singkatan lokal, perlu diuji secara khusus, meskipun hasilnya belum tentu berlaku bagi LLM.</w:t>
+      </w:r>
+    </w:p>
+    <w:p>
+      <w:pPr>
+        <w:rPr>
+          <w:lang w:val="id-ID"/>
+        </w:rPr>
+      </w:pPr>
+      <w:r>
+        <w:rPr>
+          <w:lang w:val="id-ID"/>
+        </w:rPr>
+        <w:t xml:space="preserve">Di antara keenam studi, tidak ada yang melaporkan data dari Indonesia, membandingkan catatan perkembangan harian dengan ringkasan akhir dalam satu episode rawat inap, atau mengambil pedoman sesuai kasus sebagai dasar temuan. Akibatnya, angka kinerja yang dilaporkan tidak dapat dipindahkan begitu saja ke dokumentasi rawat inap kebidanan dan anak di Indonesia. Kinerja itu harus diukur ulang dengan menyertakan dokumen tanpa ketidaksesuaian agar positif palsu dapat dihitung.</w:t>
+      </w:r>
+    </w:p>
+    <w:p>
+      <w:pPr>
+        <w:pStyle w:val="Heading2"/>
+      </w:pPr>
+      <w:r>
+        <w:t xml:space="preserve">Pendekatan Hibrida Berbasis Aturan dan AI/NLP</w:t>
       </w:r>
     </w:p>
     <w:p>
@@ -4486,6 +4785,113 @@
         <w:pStyle w:val="Heading3"/>
       </w:pPr>
       <w:r>
+        <w:t xml:space="preserve">Kekuatan dan Batas Sistem Berbasis Aturan</w:t>
+      </w:r>
+    </w:p>
+    <w:p>
+      <w:pPr>
+        <w:rPr>
+          <w:lang w:val="id-ID"/>
+        </w:rPr>
+      </w:pPr>
+      <w:r>
+        <w:rPr>
+          <w:lang w:val="id-ID"/>
+        </w:rPr>
+        <w:t xml:space="preserve">Kumar dkk. (2026) menilai sistem berbasis aturan (</w:t>
+      </w:r>
+      <w:r>
+        <w:rPr>
+          <w:i/>
+          <w:lang w:val="id-ID"/>
+        </w:rPr>
+        <w:t xml:space="preserve">rule-based</w:t>
+      </w:r>
+      <w:r>
+        <w:rPr>
+          <w:lang w:val="id-ID"/>
+        </w:rPr>
+        <w:t xml:space="preserve">) dan hibrida layak dipakai di layanan kesehatan karena transparan dan dapat ditafsirkan (hlm. 12). Keunggulan utama sistem berbasis aturan ialah hasilnya dapat diprediksi dan mudah divalidasi, terutama pada kondisi klinis yang diatur regulasi (hlm. 12). Kelemahannya, menurut Kumar dkk., sistem itu tidak dapat diskalakan lintas institusi dan spesialisasi karena perbedaan bahasa klinis harus dipelihara secara manual, dan kinerjanya umumnya buruk pada dataset baru atau kebiasaan dokumentasi yang berubah (hlm. 12). Karena itu, sistem tersebut paling cocok untuk tugas berlingkup kecil atau sebagai bagian dari </w:t>
+      </w:r>
+      <w:r>
+        <w:rPr>
+          <w:i/>
+          <w:lang w:val="id-ID"/>
+        </w:rPr>
+        <w:t xml:space="preserve">pipeline</w:t>
+      </w:r>
+      <w:r>
+        <w:rPr>
+          <w:lang w:val="id-ID"/>
+        </w:rPr>
+        <w:t xml:space="preserve"> hibrida, bukan sebagai solusi tunggal (hlm. 12). Chen dkk. (2026) sejalan dengan itu: aturan dan leksikon eksplisit masih efektif untuk subtugas sempit seperti disambiguasi singkatan (hlm. 13).</w:t>
+      </w:r>
+    </w:p>
+    <w:p>
+      <w:pPr>
+        <w:rPr>
+          <w:lang w:val="id-ID"/>
+        </w:rPr>
+      </w:pPr>
+      <w:r>
+        <w:rPr>
+          <w:lang w:val="id-ID"/>
+        </w:rPr>
+        <w:t xml:space="preserve">Domingues (2026) menunjukkan sisi keterlacakan sistem berbasis aturan lewat OnCATs, sistem pendukung keputusan klinis untuk kanker prostat yang mengubah 23 pedoman internasional menjadi 1.236 aturan dalam format JSON (hlm. 1, 2). Setiap rekomendasi disertai jejak pembenaran yang menyebut aturan dan sumber pedoman yang aktif (hlm. 2). Sistem itu diuji pada sepuluh laporan kasus terbitan, dan penulisnya menyebut pengujian itu sebagai uji kelayakan teknis, bukan validasi klinis (hlm. 3, 5). Penulis mengaitkan ketidaksesuaian hasil dengan model harapan hidup yang disederhanakan dan data kasus yang tidak lengkap (hlm. 1), serta memperingatkan bahwa imputasi variabel yang hilang dapat membiaskan rekomendasi dan bahwa pembaruan basis pengetahuan secara manual berisiko tertinggal dari praktik klinis (hlm. 7). Meskipun judul artikelnya menyebut metode berbasis aturan dan AI, yang diuji hanya lapisan berbasis aturan; penulis sendiri menyebut sistemnya "</w:t>
+      </w:r>
+      <w:r>
+        <w:rPr>
+          <w:i/>
+          <w:lang w:val="id-ID"/>
+        </w:rPr>
+        <w:t xml:space="preserve">hybrid-ready</w:t>
+      </w:r>
+      <w:r>
+        <w:rPr>
+          <w:lang w:val="id-ID"/>
+        </w:rPr>
+        <w:t xml:space="preserve">", dengan modul pembelajaran mesin baru direncanakan (hlm. 2). Artikel ini karenanya tidak memberi bukti tentang kinerja sistem hibrida, dan domainnya ialah pedoman terapi onkologi, bukan audit dokumentasi.</w:t>
+      </w:r>
+    </w:p>
+    <w:p>
+      <w:pPr>
+        <w:pStyle w:val="Heading3"/>
+      </w:pPr>
+      <w:r>
+        <w:t xml:space="preserve">Pola Hibrida dan Bukti yang Tersedia</w:t>
+      </w:r>
+    </w:p>
+    <w:p>
+      <w:pPr>
+        <w:rPr>
+          <w:lang w:val="id-ID"/>
+        </w:rPr>
+      </w:pPr>
+      <w:r>
+        <w:rPr>
+          <w:lang w:val="id-ID"/>
+        </w:rPr>
+        <w:t xml:space="preserve">Ijadi Maghsoodi dkk. (2026) menyusun tinjauan naratif kritis atas 101 sumber yang dipilih dari 3.892 rekaman, dengan fokus pada sistem hibrida yang lapisan simboliknya, yaitu aturan, ontologi, atau batasan, disusun atau disetujui pemangku kepentingan (hlm. 1, 4). Salah satu dari setidaknya lima pola rancangan yang mereka identifikasi ialah ekstraksi saraf disertai validasi simbolik, tempat pemeriksaan konsistensi dan aturan dokumentasi memvalidasi keluaran model NLP atau model fondasi untuk abstraksi laporan, pengodean, dan pencatatan registri (hlm. 5). Tinjauan itu menyimpulkan bahwa desain hibrida tampak paling kredibel pada situasi yang terikat aturan, peka terhadap audit, dan bergantung pada alur kerja, termasuk validasi dokumentasi (hlm. 1), serta bahwa bukti empiris lebih kuat untuk tugas terbatas seperti validasi laporan dan ekstraksi informasi daripada untuk klaim yang ambisius tentang penalaran klinis, kalibrasi kepercayaan, atau perbaikan luaran pasien (hlm. 7). Untuk dokumentasi buatan model generatif, penulisnya berargumen bahwa validasi hibrida dapat menegakkan elemen wajib dan mendeteksi inkonsistensi (hlm. 7); ini argumen konseptual, bukan hasil uji.</w:t>
+      </w:r>
+    </w:p>
+    <w:p>
+      <w:pPr>
+        <w:rPr>
+          <w:lang w:val="id-ID"/>
+        </w:rPr>
+      </w:pPr>
+      <w:r>
+        <w:rPr>
+          <w:lang w:val="id-ID"/>
+        </w:rPr>
+        <w:t xml:space="preserve">Penulisnya sendiri membatasi kesimpulan itu. Basis empiris masih terbatas dan bukti prospektif jarang (hlm. 1), dan klaim tentang dampak pada mutu keputusan sebaiknya dibaca sebagai pembangkit hipotesis, bukan temuan konfirmatif (hlm. 6). Lapisan simbolik menimbulkan beban akuisisi pengetahuan, ketidakselarasan ontologi, konflik aturan, dan pemeliharaan (hlm. 1, 9). Proses penyaringan tinjauan itu mengecualikan rekaman nonbahasa Inggris (hlm. 2), dan literaturnya terkonsentrasi pada sistem kesehatan berpendapatan tinggi dan matang secara digital (hlm. 9).</w:t>
+      </w:r>
+    </w:p>
+    <w:p>
+      <w:pPr>
+        <w:pStyle w:val="Heading3"/>
+      </w:pPr>
+      <w:r>
         <w:t xml:space="preserve">Sintesis dan Celah</w:t>
       </w:r>
     </w:p>
@@ -4499,13 +4905,26 @@
         <w:rPr>
           <w:lang w:val="id-ID"/>
         </w:rPr>
-        <w:t xml:space="preserve">Kedelapan sumber menunjukkan bahwa PLM dan LLM telah luas dipakai pada teks klinis, tetapi bukti yang tersedia memiliki tiga keterbatasan bagi penelitian ini. Pertama, tidak ada sumber yang mengevaluasi teks klinis berbahasa Indonesia, dan sebagian menyebut dominasi bahasa Inggris pada penelitian di bidangnya (Chen dkk., 2026, hlm. 8; Kumar dkk., 2026, hlm. 21). Kedua, bukti tentang LLM pada dokumentasi klinis berpusat pada pembuatan dokumen, bukan pemeriksaan kesesuaian antardokumen (Woo dkk., 2026, hlm. 1), dan keandalannya dilaporkan menurun pada kasus kompleks. Ketiga, hasil disambiguasi singkatan yang dikaji di sini berasal dari satu dataset berbahasa Inggris dan turun dari akurasi 0,9228 menjadi 0,7585 pada versi yang memuat lebih banyak derau (Wei dkk., 2026, hlm. 1, 5, 9). Akibatnya, kinerja teknik-teknik ini pada rekam medis rawat inap kebidanan dan anak berbahasa Indonesia tidak dapat diasumsikan dan perlu diukur terhadap pembanding dan ambang yang ditetapkan sebelum eksperimen </w:t>
+        <w:t xml:space="preserve">Sumber-sumber di atas mendukung dua hal yang terbatas: sistem berbasis aturan unggul dalam penelusuran dan validasi tetapi mahal dipelihara, dan kombinasi dengan komponen pembelajaran dinilai paling kredibel untuk validasi dokumentasi menurut satu tinjauan naratif. Keterbatasannya ada tiga. Pertama, di antara sumber yang dibaca, tidak ada yang membandingkan konfigurasi aturan saja dengan aturan ditambah AI/NLP pada audit dokumentasi klinis; satu-satunya sistem yang diuji (Domingues, 2026) hanya berbasis aturan, di bidang onkologi, pada sepuluh kasus. Kedua, dukungan terkuat untuk validasi dokumentasi bersifat konseptual (Ijadi Maghsoodi dkk., 2026, hlm. 7). Ketiga, tidak ada sumber yang menyangkut aturan atau dokumen klaim berbahasa Indonesia. Satu artikel pada daftar sumber, yang judulnya menyebut model hibrida pembelajaran mesin dan sistem pakar untuk identifikasi pemotongan klaim asuransi, belum dapat dibaca karena berkasnya tidak tersedia </w:t>
       </w:r>
       <w:r>
         <w:rPr>
           <w:highlight w:val="yellow"/>
           <w:lang w:val="id-ID"/>
         </w:rPr>
+        <w:t xml:space="preserve">[PERLU VERIFIKASI SUMBER]</w:t>
+      </w:r>
+      <w:r>
+        <w:rPr>
+          <w:lang w:val="id-ID"/>
+        </w:rPr>
+        <w:t xml:space="preserve">. Pembagian kerja antara aturan dan AI/NLP pada penelitian ini karenanya merupakan pilihan rancangan yang perlu dibenarkan lewat perbandingan konfigurasi aturan saja dengan aturan ditambah AI/NLP </w:t>
+      </w:r>
+      <w:r>
+        <w:rPr>
+          <w:highlight w:val="yellow"/>
+          <w:lang w:val="id-ID"/>
+        </w:rPr>
         <w:t xml:space="preserve">[SESUAIKAN DENGAN BAB I: rumusan pertanyaan dan ukuran keberhasilan]</w:t>
       </w:r>
       <w:r>
@@ -4520,20 +4939,7 @@
         <w:pStyle w:val="Heading2"/>
       </w:pPr>
       <w:r>
-        <w:t xml:space="preserve">Audit Otomatis Dokumentasi Klinis dan Kode Diagnosis</w:t>
-      </w:r>
-    </w:p>
-    <w:p>
-      <w:pPr>
-        <w:rPr>
-          <w:lang w:val="id-ID"/>
-        </w:rPr>
-      </w:pPr>
-      <w:r>
-        <w:rPr>
-          <w:lang w:val="id-ID"/>
-        </w:rPr>
-        <w:t xml:space="preserve">Subbab ini menelaah tujuh studi yang memeriksa dokumentasi klinis atau kode diagnosis secara otomatis. Telaah dipusatkan pada jenis ketidaksesuaian yang diuji, cara kinerja diukur, dan batas penerapan hasilnya pada dokumentasi rawat inap kebidanan dan anak.</w:t>
+        <w:t xml:space="preserve">RAG, Penjangkaran Bukti, dan Halusinasi</w:t>
       </w:r>
     </w:p>
     <w:p>
@@ -4541,33 +4947,397 @@
         <w:pStyle w:val="Heading3"/>
       </w:pPr>
       <w:r>
-        <w:t xml:space="preserve">Model Bahasa Besar sebagai Pemeriksa Dokumentasi</w:t>
-      </w:r>
-    </w:p>
-    <w:p>
-      <w:pPr>
-        <w:rPr>
-          <w:lang w:val="id-ID"/>
-        </w:rPr>
-      </w:pPr>
-      <w:r>
-        <w:rPr>
-          <w:lang w:val="id-ID"/>
-        </w:rPr>
-        <w:t xml:space="preserve">Dietrich dan Stubbert (2026) mengevaluasi empat LLM, yaitu Claude Sonnet 4.5, Gemini 2.5 Pro, GPT-5, dan Grok 4, sebagai pemeriksa catatan pemulangan instalasi gawat darurat (IGD). Data berasal dari 600 kunjungan pada basis data MIMIC-IV-ED. Sebanyak 500 catatan masing-masing disisipi satu kesalahan dari lima kategori, dan 100 catatan lain tidak memuat kesalahan (hlm. 95–96). Keempat model menerima perintah sistem (</w:t>
-      </w:r>
+        <w:t xml:space="preserve">RAG pada Teks Klinis</w:t>
+      </w:r>
+    </w:p>
+    <w:p>
+      <w:pPr>
+        <w:rPr>
+          <w:lang w:val="id-ID"/>
+        </w:rPr>
+      </w:pPr>
       <w:r>
         <w:rPr>
           <w:i/>
           <w:lang w:val="id-ID"/>
         </w:rPr>
+        <w:t xml:space="preserve">Retrieval-augmented generation</w:t>
+      </w:r>
+      <w:r>
+        <w:rPr>
+          <w:lang w:val="id-ID"/>
+        </w:rPr>
+        <w:t xml:space="preserve"> (RAG) menyisipkan bukti yang diambil dari sumber luar ke dalam masukan LLM sebelum model membangkitkan jawaban. Yang dkk. (2026) menelaah 251 studi RAG di bidang medis dan menemukan bahwa aplikasinya terkonsentrasi pada tanya jawab, pembuatan laporan, peringkasan teks, dan ekstraksi informasi (hlm. 2). Sumber pengetahuan yang paling sering dipakai ialah korpus ilmiah biomedis (88 studi), pedoman klinis (67 studi), dan rekam medis elektronik (33 studi) (hlm. 3). Dari 188 studi yang memakai </w:t>
+      </w:r>
+      <w:r>
+        <w:rPr>
+          <w:i/>
+          <w:lang w:val="id-ID"/>
+        </w:rPr>
+        <w:t xml:space="preserve">retrieval</w:t>
+      </w:r>
+      <w:r>
+        <w:rPr>
+          <w:lang w:val="id-ID"/>
+        </w:rPr>
+        <w:t xml:space="preserve"> padat, hanya 24 yang secara eksplisit memakai model </w:t>
+      </w:r>
+      <w:r>
+        <w:rPr>
+          <w:i/>
+          <w:lang w:val="id-ID"/>
+        </w:rPr>
+        <w:t xml:space="preserve">embedding</w:t>
+      </w:r>
+      <w:r>
+        <w:rPr>
+          <w:lang w:val="id-ID"/>
+        </w:rPr>
+        <w:t xml:space="preserve"> multibahasa; sisanya memakai model yang berpusat pada bahasa Inggris (hlm. 4). Penulisnya menilai RAG medis masih berada pada tahap awal dan memerlukan validasi klinis serta adaptasi lintas bahasa (hlm. 2). Landolsi dkk. (2026) menelaah 57 studi pada sepuluh bidang medis; hanya enam di antaranya yang memakai sumber nonbarat atau nonbahasa Inggris, dan hanya empat yang divalidasi lintas institusi (hlm. 6, 19).</w:t>
+      </w:r>
+    </w:p>
+    <w:p>
+      <w:pPr>
+        <w:rPr>
+          <w:lang w:val="id-ID"/>
+        </w:rPr>
+      </w:pPr>
+      <w:r>
+        <w:rPr>
+          <w:lang w:val="id-ID"/>
+        </w:rPr>
+        <w:t xml:space="preserve">Zhang dkk. (2026) memberi bukti yang paling dekat dengan catatan klinis sehari-hari. Mereka membandingkan enam strategi </w:t>
+      </w:r>
+      <w:r>
+        <w:rPr>
+          <w:i/>
+          <w:lang w:val="id-ID"/>
+        </w:rPr>
+        <w:t xml:space="preserve">retrieval</w:t>
+      </w:r>
+      <w:r>
+        <w:rPr>
+          <w:lang w:val="id-ID"/>
+        </w:rPr>
+        <w:t xml:space="preserve"> pada catatan keperawatan fasilitas perawatan lansia di Australia, dengan Llama 3.1 8B sebagai pembangkit dan indeks yang dibangun dari segmen catatan itu sendiri, untuk dua tugas ekstraksi entitas yang masing-masing diuji pada 208 rekaman (hlm. 1, 5). Tanpa </w:t>
+      </w:r>
+      <w:r>
+        <w:rPr>
+          <w:i/>
+          <w:lang w:val="id-ID"/>
+        </w:rPr>
+        <w:t xml:space="preserve">retrieval</w:t>
+      </w:r>
+      <w:r>
+        <w:rPr>
+          <w:lang w:val="id-ID"/>
+        </w:rPr>
+        <w:t xml:space="preserve">, F1 jawaban ialah 0,702 untuk gejala agitasi pada demensia dan 0,722 untuk faktor risiko malnutrisi; dengan </w:t>
+      </w:r>
+      <w:r>
+        <w:rPr>
+          <w:i/>
+          <w:lang w:val="id-ID"/>
+        </w:rPr>
+        <w:t xml:space="preserve">dense reranking</w:t>
+      </w:r>
+      <w:r>
+        <w:rPr>
+          <w:lang w:val="id-ID"/>
+        </w:rPr>
+        <w:t xml:space="preserve">, angkanya 0,946 dan 0,953 (hlm. 6). F1 jawaban itu dihitung dengan BERTScore, yaitu kemiripan semantik terhadap anotasi acuan (hlm. 3), bukan kecocokan label persis. Galat yang paling sering ialah fabrikasi intrinsik, yaitu model memutarbalikkan informasi yang ada di teks sumber, disusul fabrikasi ekstrinsik dan negatif palsu (hlm. 8, 9). Penulisnya membatasi kesimpulan pada dua tugas berbasis skema; ekstraksi relasi, penalaran temporal, dan tanya jawab terbuka tidak dievaluasi (hlm. 11). Jia dkk. (2026) menguji agen dengan </w:t>
+      </w:r>
+      <w:r>
+        <w:rPr>
+          <w:i/>
+          <w:lang w:val="id-ID"/>
+        </w:rPr>
+        <w:t xml:space="preserve">retrieval</w:t>
+      </w:r>
+      <w:r>
+        <w:rPr>
+          <w:lang w:val="id-ID"/>
+        </w:rPr>
+        <w:t xml:space="preserve">, </w:t>
+      </w:r>
+      <w:r>
+        <w:rPr>
+          <w:i/>
+          <w:lang w:val="id-ID"/>
+        </w:rPr>
+        <w:t xml:space="preserve">reranking</w:t>
+      </w:r>
+      <w:r>
+        <w:rPr>
+          <w:lang w:val="id-ID"/>
+        </w:rPr>
+        <w:t xml:space="preserve">, dan penjangkaran bukti pada tolok ukur tanya jawab berformat ujian dan melaporkan akurasi 82,98% pada USMLE Step 1, di atas 80,67% untuk GPT-4 (hlm. 2).</w:t>
+      </w:r>
+    </w:p>
+    <w:p>
+      <w:pPr>
+        <w:pStyle w:val="Heading3"/>
+      </w:pPr>
+      <w:r>
+        <w:t xml:space="preserve">Penjangkaran Bukti dan Pengecekan Keluaran</w:t>
+      </w:r>
+    </w:p>
+    <w:p>
+      <w:pPr>
+        <w:rPr>
+          <w:lang w:val="id-ID"/>
+        </w:rPr>
+      </w:pPr>
+      <w:r>
+        <w:rPr>
+          <w:lang w:val="id-ID"/>
+        </w:rPr>
+        <w:t xml:space="preserve">Waqas dkk. (2026) membedakan halusinasi faktual, </w:t>
+      </w:r>
+      <w:r>
+        <w:rPr>
+          <w:i/>
+          <w:lang w:val="id-ID"/>
+        </w:rPr>
+        <w:t xml:space="preserve">faithful</w:t>
+      </w:r>
+      <w:r>
+        <w:rPr>
+          <w:lang w:val="id-ID"/>
+        </w:rPr>
+        <w:t xml:space="preserve"> (tidak sesuai dengan masukan), logis, dan temporal (hlm. 4). Survei atas 90 publikasi itu, yang tidak memakai penilaian risiko bias formal (hlm. 4), mengutip RAGTruth bahwa halusinasi tetap terjadi ketika konteks ambigu atau </w:t>
+      </w:r>
+      <w:r>
+        <w:rPr>
+          <w:i/>
+          <w:lang w:val="id-ID"/>
+        </w:rPr>
+        <w:t xml:space="preserve">retrieval</w:t>
+      </w:r>
+      <w:r>
+        <w:rPr>
+          <w:lang w:val="id-ID"/>
+        </w:rPr>
+        <w:t xml:space="preserve"> gagal menemukan semua bukti yang relevan (hlm. 10), dan menyatakan bahwa bidang kesehatan membutuhkan laju positif palsu yang sangat rendah (hlm. 18). Sun dkk. (2025) menelaah 55 artikel, 15 di antaranya tentang halusinasi, dan menemukan bahwa mitigasi halusinasi sebagian besar dikaji pada tugas tanya jawab, dataset deteksi halusinasi langka, serta evaluasinya bergantung pada penilaian pakar tanpa kerangka baku (hlm. 15, 18).</w:t>
+      </w:r>
+    </w:p>
+    <w:p>
+      <w:pPr>
+        <w:rPr>
+          <w:lang w:val="id-ID"/>
+        </w:rPr>
+      </w:pPr>
+      <w:r>
+        <w:rPr>
+          <w:lang w:val="id-ID"/>
+        </w:rPr>
+        <w:t xml:space="preserve">Li dkk. (2026) mencontohkan penjangkaran bukti pada pendukung keputusan bedah tulang belakang. Pangkalan pengetahuannya memuat pedoman dan literatur yang masing-masing diberi ID, sumber, tahun, dan tingkat bukti, dan diperbarui tiap enam bulan dengan penanda versi (hlm. 3, 4). Empat paragraf teratas disisipkan ke masukan model, keluaran berformat “rekomendasi + paragraf kutipan”, dan model diinstruksikan menjawab </w:t>
+      </w:r>
+      <w:r>
+        <w:rPr>
+          <w:i/>
+          <w:lang w:val="id-ID"/>
+        </w:rPr>
+        <w:t xml:space="preserve">“no clear conclusions available”</w:t>
+      </w:r>
+      <w:r>
+        <w:rPr>
+          <w:lang w:val="id-ID"/>
+        </w:rPr>
+        <w:t xml:space="preserve"> bila literatur tidak memberi jawaban pasti (hlm. 4). Lima ahli bedah menilai 200 kasus dengan rubrik 11 dimensi, termasuk ketepatan bukti yang dikutip (hlm. 1, 5). Namun yang dibandingkan ialah empat agen LLM dalam satu kerangka RAG di satu pusat, bukan RAG terhadap tanpa RAG (hlm. 9), dan artikelnya tidak menguraikan pemeriksaan kutipan otomatis.</w:t>
+      </w:r>
+    </w:p>
+    <w:p>
+      <w:pPr>
+        <w:rPr>
+          <w:lang w:val="id-ID"/>
+        </w:rPr>
+      </w:pPr>
+      <w:r>
+        <w:rPr>
+          <w:lang w:val="id-ID"/>
+        </w:rPr>
+        <w:t xml:space="preserve">Zeba dkk. (2026) menempuh cara lain: modul pemeriksa fakta tanpa LLM yang memeriksa keluaran LLM terhadap rekam medis sumber (hlm. 1). Ringkasan dan rekam medis dipecah menjadi proposisi atomik (hlm. 7), lalu setiap proposisi diberi vonis Didukung atau Tidak Didukung melalui pemeriksaan negasi, implikasi, konsistensi temporal, eksklusivitas bersama, kecocokan numerik, dan keberadaan (hlm. 6, 14). Pada 104 ringkasan yang diekstrak menjadi 3.786 proposisi dan divalidasi dokter, modul itu mencapai presisi 0,8904, </w:t>
+      </w:r>
+      <w:r>
+        <w:rPr>
+          <w:i/>
+          <w:lang w:val="id-ID"/>
+        </w:rPr>
+        <w:t xml:space="preserve">recall</w:t>
+      </w:r>
+      <w:r>
+        <w:rPr>
+          <w:lang w:val="id-ID"/>
+        </w:rPr>
+        <w:t xml:space="preserve"> 0,8234, dan F1 0,8556 (hlm. 1). Tanpa pemeriksaan negasi dan numerik, presisinya turun lebih dari 8% (hlm. 14). Datanya berasal dari MIMIC-III, rekam medis unit perawatan intensif (hlm. 10), dan penulisnya menyatakan sistem kurang andal pada bidang yang kurang terwakili, termasuk gangguan metabolik anak, serta hanya memberi vonis biner tanpa usul perbaikan (hlm. 15).</w:t>
+      </w:r>
+    </w:p>
+    <w:p>
+      <w:pPr>
+        <w:pStyle w:val="Heading3"/>
+      </w:pPr>
+      <w:r>
+        <w:t xml:space="preserve">Sintesis dan Celah</w:t>
+      </w:r>
+    </w:p>
+    <w:p>
+      <w:pPr>
+        <w:rPr>
+          <w:lang w:val="id-ID"/>
+        </w:rPr>
+      </w:pPr>
+      <w:r>
+        <w:rPr>
+          <w:lang w:val="id-ID"/>
+        </w:rPr>
+        <w:t xml:space="preserve">Sumber-sumber di atas menunjukkan bahwa </w:t>
+      </w:r>
+      <w:r>
+        <w:rPr>
+          <w:i/>
+          <w:lang w:val="id-ID"/>
+        </w:rPr>
+        <w:t xml:space="preserve">retrieval</w:t>
+      </w:r>
+      <w:r>
+        <w:rPr>
+          <w:lang w:val="id-ID"/>
+        </w:rPr>
+        <w:t xml:space="preserve"> menaikkan kinerja ekstraksi pada catatan klinis dan bahwa keluaran dapat ditautkan serta diperiksa terhadap sumbernya, tetapi ada empat celah bagi penelitian ini. Pertama, aplikasi RAG terkonsentrasi pada tanya jawab, pembuatan laporan, peringkasan, dan ekstraksi (Yang dkk., 2026, hlm. 2), dan bukti kinerja yang paling mencolok berasal dari soal ujian (Jia dkk., 2026, hlm. 2); di antara sumber yang dibaca, tidak ada yang menguji RAG untuk memeriksa kesesuaian antardokumen dalam satu episode rawat. Kedua, tidak ada sumber yang menguji teks klinis berbahasa Indonesia, dan </w:t>
+      </w:r>
+      <w:r>
+        <w:rPr>
+          <w:i/>
+          <w:lang w:val="id-ID"/>
+        </w:rPr>
+        <w:t xml:space="preserve">retrieval</w:t>
+      </w:r>
+      <w:r>
+        <w:rPr>
+          <w:lang w:val="id-ID"/>
+        </w:rPr>
+        <w:t xml:space="preserve"> umumnya memakai model berpusat pada bahasa Inggris (Yang dkk., 2026, hlm. 4; Landolsi dkk., 2026, hlm. 19). Ketiga, pemeriksaan keluaran terhadap sumber baru didemonstrasikan pada ringkasan LLM atas rekam medis berbahasa Inggris (Zeba dkk., 2026), sedangkan ketepatan kutipan pada Li dkk. (2026) dinilai ahli. Keempat, kontribusi </w:t>
+      </w:r>
+      <w:r>
+        <w:rPr>
+          <w:i/>
+          <w:lang w:val="id-ID"/>
+        </w:rPr>
+        <w:t xml:space="preserve">retrieval</w:t>
+      </w:r>
+      <w:r>
+        <w:rPr>
+          <w:lang w:val="id-ID"/>
+        </w:rPr>
+        <w:t xml:space="preserve"> dibandingkan dengan kondisi tanpa </w:t>
+      </w:r>
+      <w:r>
+        <w:rPr>
+          <w:i/>
+          <w:lang w:val="id-ID"/>
+        </w:rPr>
+        <w:t xml:space="preserve">retrieval</w:t>
+      </w:r>
+      <w:r>
+        <w:rPr>
+          <w:lang w:val="id-ID"/>
+        </w:rPr>
+        <w:t xml:space="preserve"> hanya pada dua tugas ekstraksi berbasis skema (Zhang dkk., 2026, hlm. 6, 11); pada audit, kontribusinya terhadap mutu temuan dan biaya positif palsunya belum diukur. Manfaat RAG pada audit dokumentasi rawat inap kebidanan dan anak karena itu perlu diuji dengan membandingkan konfigurasi dengan dan tanpa </w:t>
+      </w:r>
+      <w:r>
+        <w:rPr>
+          <w:i/>
+          <w:lang w:val="id-ID"/>
+        </w:rPr>
+        <w:t xml:space="preserve">retrieval</w:t>
+      </w:r>
+      <w:r>
+        <w:rPr>
+          <w:lang w:val="id-ID"/>
+        </w:rPr>
+        <w:t xml:space="preserve"> </w:t>
+      </w:r>
+      <w:r>
+        <w:rPr>
+          <w:highlight w:val="yellow"/>
+          <w:lang w:val="id-ID"/>
+        </w:rPr>
+        <w:t xml:space="preserve">[SESUAIKAN DENGAN BAB I: rumusan pertanyaan dan ukuran keberhasilan]</w:t>
+      </w:r>
+      <w:r>
+        <w:rPr>
+          <w:lang w:val="id-ID"/>
+        </w:rPr>
+        <w:t xml:space="preserve">.</w:t>
+      </w:r>
+    </w:p>
+    <w:p>
+      <w:pPr>
+        <w:pStyle w:val="Heading2"/>
+      </w:pPr>
+      <w:r>
+        <w:t xml:space="preserve">De-identifikasi untuk Layanan AI Eksternal</w:t>
+      </w:r>
+    </w:p>
+    <w:p>
+      <w:pPr>
+        <w:pStyle w:val="Heading3"/>
+      </w:pPr>
+      <w:r>
+        <w:t xml:space="preserve">Pendekatan De-identifikasi dan Bukti yang Tersedia</w:t>
+      </w:r>
+    </w:p>
+    <w:p>
+      <w:pPr>
+        <w:rPr>
+          <w:lang w:val="id-ID"/>
+        </w:rPr>
+      </w:pPr>
+      <w:r>
+        <w:rPr>
+          <w:lang w:val="id-ID"/>
+        </w:rPr>
+        <w:t xml:space="preserve">Faustini dkk. (2026) menelaah 83 artikel yang dipilih dari 734 tentang de-identifikasi data klinis berbasis NLP pada tahun 2015–2024, dengan de-identifikasi didefinisikan sebagai pendeteksian, penggantian, atau penghapusan informasi kesehatan yang dilindungi (</w:t>
+      </w:r>
+      <w:r>
+        <w:rPr>
+          <w:i/>
+          <w:lang w:val="id-ID"/>
+        </w:rPr>
+        <w:t xml:space="preserve">protected health information</w:t>
+      </w:r>
+      <w:r>
+        <w:rPr>
+          <w:lang w:val="id-ID"/>
+        </w:rPr>
+        <w:t xml:space="preserve">, PHI) (hlm. 1, 2). Mereka menyimpulkan bahwa penggunaan model bahasa meningkat, bahwa perkakas siap pakai sering perlu disesuaikan, dan bahwa sebagian besar studi menggarap konten berbahasa Inggris karena dataset yang tersedia berbahasa Inggris (hlm. 1). Metode berbasis aturan tetap umum di luar bahasa Inggris (hlm. 6), sedangkan tantangan utamanya ialah campur kode dan kelangkaan dataset yang dapat direproduksi (hlm. 1). Faustini dkk. juga melaporkan temuan studi lain bahwa Presidio kesulitan mengenali nama Slavia serta nama Asia Tengah dan Asia Tenggara dibandingkan nama Inggris (hlm. 5), dan bahwa F1 sebuah LLM dapat turun serendah 0,33 tanpa contoh dan instruksi rinci pada perintah (</w:t>
+      </w:r>
+      <w:r>
+        <w:rPr>
+          <w:i/>
+          <w:lang w:val="id-ID"/>
+        </w:rPr>
         <w:t xml:space="preserve">prompt</w:t>
       </w:r>
       <w:r>
         <w:rPr>
           <w:lang w:val="id-ID"/>
         </w:rPr>
-        <w:t xml:space="preserve">) yang sama, berisi definisi kelima kategori dan kriteria klasifikasi positif maupun negatif (hlm. 97). Akurasi deteksi kesalahan apa pun berkisar 93,2–94,2%, presisi 98,3–99,1%, dan spesifisitas 92,0–96,0% (hlm. 98). Kinerja berbeda menurut kategori. Ketidaksesuaian identitas atau waktu kunjungan serta kesalahan obat dan alergi terdeteksi dengan F1 ≥0,96, sedangkan ketidaksesuaian antara tanda vital atau pemeriksaan fisik dan interpretasi naratif paling sulit, dengan F1 0,75–0,84 yang terutama disebabkan oleh rendahnya </w:t>
+        <w:t xml:space="preserve">), dibandingkan 0,98 dengan perintah rinci (hlm. 6).</w:t>
+      </w:r>
+    </w:p>
+    <w:p>
+      <w:pPr>
+        <w:rPr>
+          <w:lang w:val="id-ID"/>
+        </w:rPr>
+      </w:pPr>
+      <w:r>
+        <w:rPr>
+          <w:lang w:val="id-ID"/>
+        </w:rPr>
+        <w:t xml:space="preserve">Azzam dkk. (2026) mengusulkan sistem agentik yang memisahkan lingkungan pemrosesan: LLM yang dihosting lokal menangani semua langkah sensitif, sedangkan LLM publik hanya menalar atas masukan yang sudah dianonimkan (hlm. 1), dengan pemetaan lokal untuk mengembalikan identitas pada jawaban (hlm. 10). Pada dataset rekam medis sintetis, sistem itu mencapai presisi 1,000 dan </w:t>
       </w:r>
       <w:r>
         <w:rPr>
@@ -4580,59 +5350,33 @@
         <w:rPr>
           <w:lang w:val="id-ID"/>
         </w:rPr>
-        <w:t xml:space="preserve"> (hlm. 98).</w:t>
-      </w:r>
-    </w:p>
-    <w:p>
-      <w:pPr>
-        <w:rPr>
-          <w:lang w:val="id-ID"/>
-        </w:rPr>
-      </w:pPr>
-      <w:r>
-        <w:rPr>
-          <w:lang w:val="id-ID"/>
-        </w:rPr>
-        <w:t xml:space="preserve">Rancangan itu membatasi cakupan kesimpulannya. Kesalahan disisipkan oleh peneliti, bukan muncul secara alami, dan seluruh data berasal dari satu institusi (hlm. 100). Setiap catatan hanya memuat satu kesalahan, dan catatan yang dinilai adalah satu dokumen yang disusun dari elemen data terstruktur kunjungan (hlm. 96). Karena 500 dari 600 catatan memuat kesalahan (hlm. 95), presisi yang tinggi itu tidak dapat langsung dipindahkan ke populasi dengan proporsi ketidaksesuaian yang lebih rendah. Penulis sendiri menyebut kerangka audit berbasis agen yang mengambil pedoman dan memeriksa konsistensi lintas dokumen sebagai arah penelitian lanjutan (hlm. 100).</w:t>
-      </w:r>
-    </w:p>
-    <w:p>
-      <w:pPr>
-        <w:rPr>
-          <w:lang w:val="id-ID"/>
-        </w:rPr>
-      </w:pPr>
-      <w:r>
-        <w:rPr>
-          <w:lang w:val="id-ID"/>
-        </w:rPr>
-        <w:t xml:space="preserve">Skrabic dkk. (2026) menguji tiga model penalaran, yaitu o3, DeepSeek-v3-R1, dan GPT-OSS-120B, sebagai pemeriksa kedua (</w:t>
+        <w:t xml:space="preserve"> 0,936, sedangkan spaCy dan Presidio berpresisi 0,329 dan 0,405 dengan </w:t>
       </w:r>
       <w:r>
         <w:rPr>
           <w:i/>
           <w:lang w:val="id-ID"/>
         </w:rPr>
-        <w:t xml:space="preserve">second reviewer</w:t>
-      </w:r>
-      <w:r>
-        <w:rPr>
-          <w:lang w:val="id-ID"/>
-        </w:rPr>
-        <w:t xml:space="preserve">) pada 102 laporan unit gawat darurat penyakit dalam yang identitasnya telah dihapus (hlm. 1–2). Dua dokter spesialis menyisipkan 99 kesalahan yang realistis dan menandai tiga kesalahan yang sudah ada dalam laporan asli (hlm. 2). Model menerima satu perintah seragam tanpa pengambilan referensi atau pemanggilan fungsi (hlm. 3). Model menemukan lokasi kesalahan dengan benar pada 65,7–79,2% laporan, sedangkan tiga dokter pembanding, yang masing-masing meninjau sepertiga kasus, menemukan 48,0% (hlm. 4). Kategori diagnostik dan pemeriksaan penunjang paling sulit bagi ketiga model (hlm. 4). Selain itu, hampir semua laporan memperoleh isu tambahan yang dinilai berguna secara klinis. Median isu yang dilaporkan sama untuk ketiga model, yaitu tujuh per laporan, dengan maksimum 17 isu pada satu laporan (hlm. 4). Penulis mengingatkan risiko kelelahan terhadap peringatan (</w:t>
-      </w:r>
-      <w:r>
-        <w:rPr>
-          <w:i/>
-          <w:lang w:val="id-ID"/>
-        </w:rPr>
-        <w:t xml:space="preserve">alert fatigue</w:t>
-      </w:r>
-      <w:r>
-        <w:rPr>
-          <w:lang w:val="id-ID"/>
-        </w:rPr>
-        <w:t xml:space="preserve">) bila isu itu tidak diprioritaskan (hlm. 5). Studi ini tidak menyertakan catatan tanpa kesalahan sehingga perilaku positif palsu belum dapat dipastikan, dan datanya berasal dari satu pusat layanan (hlm. 6).</w:t>
+        <w:t xml:space="preserve">recall</w:t>
+      </w:r>
+      <w:r>
+        <w:rPr>
+          <w:lang w:val="id-ID"/>
+        </w:rPr>
+        <w:t xml:space="preserve"> sekitar 0,89 (hlm. 12). Pada 100 catatan MIMIC-III, 98,6% penanda redaksi bawaan dataset berubah bersih; penanda itu dipakai sebagai pengganti label acuan karena catatannya sudah dide-identifikasi (hlm. 1, 15). Kelestarian informasi klinis tidak penuh: sebutan obat terjaga 0,974, tetapi dosis hanya 0,769 (hlm. 12). Penulisnya menyatakan sistem baru mendukung masukan berbahasa Inggris (hlm. 19).</w:t>
+      </w:r>
+    </w:p>
+    <w:p>
+      <w:pPr>
+        <w:rPr>
+          <w:lang w:val="id-ID"/>
+        </w:rPr>
+      </w:pPr>
+      <w:r>
+        <w:rPr>
+          <w:lang w:val="id-ID"/>
+        </w:rPr>
+        <w:t xml:space="preserve">Tchouka dkk. (2024) menguji de-identifikasi pada dokumen medis berbahasa Prancis di sebuah rumah sakit publik, dengan seluruh eksperimen dilakukan di lokasi rumah sakit tanpa ada data yang dibawa keluar (hlm. 2). Tanggal, usia, dan lokasi diganti dengan privasi diferensial lokal berbasis metrik agar aspek kronologis dan geografisnya tidak hilang (hlm. 1, 7). Manfaatnya diukur lewat tugas asosiasi kode ICD-10: skor F1 turun sekitar 12% terhadap korpus asli bila setiap entitas diganti dengan labelnya, yaitu cara yang dinilai paling tahan terhadap serangan re-identifikasi tetapi membuang nilai entitas, dan 6,8% dengan pendekatan itu (hlm. 2, 12, 13). Penulisnya mengingatkan bahwa dataset hasil de-identifikasi tetap tidak kebal terhadap serangan re-identifikasi dan keanggotaan, sehingga tidak dapat disebarluaskan (hlm. 13).</w:t>
       </w:r>
     </w:p>
     <w:p>
@@ -4640,392 +5384,6 @@
         <w:pStyle w:val="Heading3"/>
       </w:pPr>
       <w:r>
-        <w:t xml:space="preserve">Audit Label Diagnosis dan Kesesuaian Kode dengan Catatan Klinis</w:t>
-      </w:r>
-    </w:p>
-    <w:p>
-      <w:pPr>
-        <w:rPr>
-          <w:lang w:val="id-ID"/>
-        </w:rPr>
-      </w:pPr>
-      <w:r>
-        <w:rPr>
-          <w:lang w:val="id-ID"/>
-        </w:rPr>
-        <w:t xml:space="preserve">Du dkk. (2026) memeriksa label diagnosis, bukan kesalahan yang disisipkan. Penelitian itu mengubah klasifikasi multilabel kode diagnosis psikiatri menjadi tugas tanya jawab dan menambahkan deskripsi serta penjelasan kode ke masukan model (hlm. 1, 4). Data berupa 48.492 rekam dari 7.000 pasien di satu klinik psikiatri (hlm. 3, 12), sebagian dikonversi melalui pengenalan karakter optik (</w:t>
-      </w:r>
-      <w:r>
-        <w:rPr>
-          <w:i/>
-          <w:lang w:val="id-ID"/>
-        </w:rPr>
-        <w:t xml:space="preserve">optical character recognition</w:t>
-      </w:r>
-      <w:r>
-        <w:rPr>
-          <w:lang w:val="id-ID"/>
-        </w:rPr>
-        <w:t xml:space="preserve">, OCR) (hlm. 3). Model tanya jawab berbasis BART yang diperkaya penjelasan kode memperoleh sum-F1, yaitu ukuran F1 berbasis ROUGE rancangan penulis (hlm. 6), sebesar 0,7417. Nilai itu terbaik di antara model yang dibandingkan, tetapi hanya 0,013 di atas BERT yang diperkaya penjelasan kode (0,7287), sedangkan Llama 3.3 yang dijalankan tanpa pelatihan tambahan (</w:t>
-      </w:r>
-      <w:r>
-        <w:rPr>
-          <w:i/>
-          <w:lang w:val="id-ID"/>
-        </w:rPr>
-        <w:t xml:space="preserve">zero-shot</w:t>
-      </w:r>
-      <w:r>
-        <w:rPr>
-          <w:lang w:val="id-ID"/>
-        </w:rPr>
-        <w:t xml:space="preserve">) hanya mencapai 0,3785 (hlm. 8). Selisih antara kode klinisi dan keluaran model dikelompokkan menjadi risiko rendah (36,99%), sedang (45,9%), dan tinggi (17,11%) untuk menentukan kasus yang perlu ditinjau manusia (hlm. 7).</w:t>
-      </w:r>
-    </w:p>
-    <w:p>
-      <w:pPr>
-        <w:rPr>
-          <w:lang w:val="id-ID"/>
-        </w:rPr>
-      </w:pPr>
-      <w:r>
-        <w:rPr>
-          <w:lang w:val="id-ID"/>
-        </w:rPr>
-        <w:t xml:space="preserve">Keterbatasan studi ini menentukan kegunaannya sebagai acuan. Acuan penilaiannya adalah diagnosis yang dicatat klinisi, yang menurut penulis dapat mengandung derau (</w:t>
-      </w:r>
-      <w:r>
-        <w:rPr>
-          <w:i/>
-          <w:lang w:val="id-ID"/>
-        </w:rPr>
-        <w:t xml:space="preserve">label noise</w:t>
-      </w:r>
-      <w:r>
-        <w:rPr>
-          <w:lang w:val="id-ID"/>
-        </w:rPr>
-        <w:t xml:space="preserve">), tidak stabil dari waktu ke waktu, dan dipengaruhi tuntutan penagihan serta dokumentasi; derau itu tidak dimodelkan secara eksplisit (hlm. 12). Tingkat risikonya bersifat heuristik dan disusun tanpa keterlibatan psikiater, sedangkan mutu penjelasan model tidak dinilai klinisi (hlm. 13). Pengetahuan acuan yang dimasukkan pun statis, yaitu deskripsi sepuluh kelompok kode yang selalu ditambahkan dalam urutan tetap (hlm. 5), bukan referensi yang diambil sesuai kasus.</w:t>
-      </w:r>
-    </w:p>
-    <w:p>
-      <w:pPr>
-        <w:rPr>
-          <w:lang w:val="id-ID"/>
-        </w:rPr>
-      </w:pPr>
-      <w:r>
-        <w:rPr>
-          <w:lang w:val="id-ID"/>
-        </w:rPr>
-        <w:t xml:space="preserve">Mwogosi dan Mambile (2026) menelaah dari sisi lain, yaitu kesesuaian kode ICD dalam rekam medis elektronik dengan acuan klinis. Tinjauan sistematis dan metaanalisis ini merangkum 17 studi validasi (hlm. 1). Spesifisitas dan nilai prediktif positif kode konsisten tinggi, sering melebihi 90%, tetapi sensitivitas rata-rata hanya 64,5%, dengan catatan sebagian estimasi memakai prevalensi pengodean sebagai proksi sensitivitas (hlm. 1). Mengandalkan kode saja juga membuat kepatuhan terhadap pedoman tampak lebih tinggi daripada hasil penelusuran catatan (hlm. 1). Pada metastasis tulang, misalnya, 76,5% pasien menerima obat penarget tulang yang sesuai menurut abstraksi rekam medis berbantuan teknologi, sedangkan estimasi berbasis kode menghasilkan 89,2% (hlm. 10). Penulis menyimpulkan bahwa pendekatan hibrida yang menggabungkan kode, data klinis, dan narasi diperlukan (hlm. 1), tetapi acuan validasinya, yaitu penelusuran rekam medis, juga dapat bias akibat penyalinan teks dan terbawanya diagnosis usang (hlm. 11). Seluruh studi yang ditinjau berasal dari negara berpenghasilan tinggi, sehingga praktik dokumentasi di negara berpenghasilan rendah dan menengah belum terwakili (hlm. 4–5).</w:t>
-      </w:r>
-    </w:p>
-    <w:p>
-      <w:pPr>
-        <w:pStyle w:val="Heading3"/>
-      </w:pPr>
-      <w:r>
-        <w:t xml:space="preserve">Pengodean ICD Otomatis dan Ketahanannya terhadap Variasi Teks</w:t>
-      </w:r>
-    </w:p>
-    <w:p>
-      <w:pPr>
-        <w:rPr>
-          <w:lang w:val="id-ID"/>
-        </w:rPr>
-      </w:pPr>
-      <w:r>
-        <w:rPr>
-          <w:lang w:val="id-ID"/>
-        </w:rPr>
-        <w:t xml:space="preserve">Hou dkk. (2024) menyatakan bahwa pengodean otomatis umumnya diperlakukan sebagai klasifikasi teks multilabel, yaitu menetapkan kode ICD pada dokumen klinis (hlm. 1). Mereka memakai Clinical-Longformer, penyandi (</w:t>
-      </w:r>
-      <w:r>
-        <w:rPr>
-          <w:i/>
-          <w:lang w:val="id-ID"/>
-        </w:rPr>
-        <w:t xml:space="preserve">encoder</w:t>
-      </w:r>
-      <w:r>
-        <w:rPr>
-          <w:lang w:val="id-ID"/>
-        </w:rPr>
-        <w:t xml:space="preserve">) yang dapat memproses hingga 4.096 token, untuk dokumen panjang, serta mekanisme perhatian per label (</w:t>
-      </w:r>
-      <w:r>
-        <w:rPr>
-          <w:i/>
-          <w:lang w:val="id-ID"/>
-        </w:rPr>
-        <w:t xml:space="preserve">label-wise attention</w:t>
-      </w:r>
-      <w:r>
-        <w:rPr>
-          <w:lang w:val="id-ID"/>
-        </w:rPr>
-        <w:t xml:space="preserve">) agar prediksi dapat diinterpretasi (hlm. 1–2). Pada 50 kode ICD-9 teratas di MIMIC-III, model memperoleh F1 makro 0,688 dan F1 mikro 0,727 (hlm. 2). Penulis menempatkan model ini sebagai alat bantu bagi pemberi kode (hlm. 1–2). Mereka menilai pendekatan berbasis aturan kurang fleksibel dan sulit diperluas karena aturan dapat saling bertentangan seiring bertambahnya kode, dan menyebut bahwa pemotongan dokumen menjadi 512 token pada model sebelumnya menimbulkan kehilangan informasi (hlm. 2).</w:t>
-      </w:r>
-    </w:p>
-    <w:p>
-      <w:pPr>
-        <w:rPr>
-          <w:lang w:val="id-ID"/>
-        </w:rPr>
-      </w:pPr>
-      <w:r>
-        <w:rPr>
-          <w:lang w:val="id-ID"/>
-        </w:rPr>
-        <w:t xml:space="preserve">Lebeña dkk. (2025) menggabungkan lini masa kode ICD dan teks rekam medis untuk memprediksi diagnosis berikutnya, bukan untuk memeriksa konsistensi dokumentasi (hlm. 1). Teks dipangkas dengan pengenalan entitas bernama (</w:t>
-      </w:r>
-      <w:r>
-        <w:rPr>
-          <w:i/>
-          <w:lang w:val="id-ID"/>
-        </w:rPr>
-        <w:t xml:space="preserve">named entity recognition</w:t>
-      </w:r>
-      <w:r>
-        <w:rPr>
-          <w:lang w:val="id-ID"/>
-        </w:rPr>
-        <w:t xml:space="preserve">, NER) lalu diproses dengan Clinical Longformer, dan ansambel berbobot mencapai Precision@5 72,34% serta Precision@20 77,49% pada MIMIC-III (hlm. 4, 7). Penggabungan kedua jenis masukan itu meningkatkan hasil hingga 2% dibandingkan melatih kedua model secara terpisah (hlm. 8). Panjang dokumen menjadi kendala. Hanya sekitar 46% dokumen yang sudah dipangkas muat dalam 512 token, dan batas 1.024 token pada Clinical Longformer memungkinkan lebih dari 95% dokumen diproses tanpa pemotongan (hlm. 5), meskipun sebagian dokumen tetap melampaui batas itu (hlm. 8).</w:t>
-      </w:r>
-    </w:p>
-    <w:p>
-      <w:pPr>
-        <w:rPr>
-          <w:lang w:val="id-ID"/>
-        </w:rPr>
-      </w:pPr>
-      <w:r>
-        <w:rPr>
-          <w:lang w:val="id-ID"/>
-        </w:rPr>
-        <w:t xml:space="preserve">Jaganathan dkk. (2025) menguji ketahanan model pengode ICD, yaitu PLM-ICD, dengan pengujian metamorfik (</w:t>
-      </w:r>
-      <w:r>
-        <w:rPr>
-          <w:i/>
-          <w:lang w:val="id-ID"/>
-        </w:rPr>
-        <w:t xml:space="preserve">metamorphic testing</w:t>
-      </w:r>
-      <w:r>
-        <w:rPr>
-          <w:lang w:val="id-ID"/>
-        </w:rPr>
-        <w:t xml:space="preserve">). Catatan diubah secara sederhana, lalu daftar kode keluarannya dibandingkan dengan keluaran catatan asli. Pada 3.372 catatan uji MIMIC-III, penggantian akronim, penghapusan kata, dan salah ketik menyebabkan perbedaan pada lima kode teratas di 70–81% catatan (hlm. 4); penggantian dua puluh akronim yang paling sering muncul mencapai 80,7% (hlm. 5). Kriteria kegagalannya ketat, yaitu setiap perbedaan pada himpunan lima kode teratas (hlm. 4), sehingga angka itu menunjukkan ketidakstabilan keluaran, bukan persentase kode yang salah. Hanya satu aplikasi yang dapat diuji (hlm. 3).</w:t>
-      </w:r>
-    </w:p>
-    <w:p>
-      <w:pPr>
-        <w:pStyle w:val="Heading3"/>
-      </w:pPr>
-      <w:r>
-        <w:t xml:space="preserve">Sintesis dan Posisi Penelitian</w:t>
-      </w:r>
-    </w:p>
-    <w:p>
-      <w:pPr>
-        <w:rPr>
-          <w:lang w:val="id-ID"/>
-        </w:rPr>
-      </w:pPr>
-      <w:r>
-        <w:rPr>
-          <w:lang w:val="id-ID"/>
-        </w:rPr>
-        <w:t xml:space="preserve">Dua studi yang membedakan kategori kesalahan menunjukkan pola yang sama: pemeriksaan otomatis lebih baik pada kesalahan eksplisit dalam satu dokumen daripada pada kesalahan yang menuntut penilaian klinis. Pada Dietrich dan Stubbert (2026, hlm. 98), ketidaksesuaian temuan klinis memiliki </w:t>
-      </w:r>
-      <w:r>
-        <w:rPr>
-          <w:i/>
-          <w:lang w:val="id-ID"/>
-        </w:rPr>
-        <w:t xml:space="preserve">recall</w:t>
-      </w:r>
-      <w:r>
-        <w:rPr>
-          <w:lang w:val="id-ID"/>
-        </w:rPr>
-        <w:t xml:space="preserve"> terendah, dan pada Skrabic dkk. (2026, hlm. 4), kategori diagnostik dan pemeriksaan penunjang paling sulit. Kategori sejenis, misalnya diagnosis yang tidak sejalan dengan catatan harian, termasuk yang direncanakan ditangani komponen AI/NLP dalam penelitian ini </w:t>
-      </w:r>
-      <w:r>
-        <w:rPr>
-          <w:highlight w:val="yellow"/>
-          <w:lang w:val="id-ID"/>
-        </w:rPr>
-        <w:t xml:space="preserve">[SESUAIKAN DENGAN BAB I]</w:t>
-      </w:r>
-      <w:r>
-        <w:rPr>
-          <w:lang w:val="id-ID"/>
-        </w:rPr>
-        <w:t xml:space="preserve">.</w:t>
-      </w:r>
-    </w:p>
-    <w:p>
-      <w:pPr>
-        <w:rPr>
-          <w:lang w:val="id-ID"/>
-        </w:rPr>
-      </w:pPr>
-      <w:r>
-        <w:rPr>
-          <w:lang w:val="id-ID"/>
-        </w:rPr>
-        <w:t xml:space="preserve">Bukti tentang positif palsu (</w:t>
-      </w:r>
-      <w:r>
-        <w:rPr>
-          <w:i/>
-          <w:lang w:val="id-ID"/>
-        </w:rPr>
-        <w:t xml:space="preserve">false positive</w:t>
-      </w:r>
-      <w:r>
-        <w:rPr>
-          <w:lang w:val="id-ID"/>
-        </w:rPr>
-        <w:t xml:space="preserve">) belum seragam. Hanya Dietrich dan Stubbert (2026, hlm. 95) menyertakan catatan tanpa kesalahan, sebanyak 100 catatan. Skrabic dkk. (2026, hlm. 6) tidak menyertakannya, dan Du dkk. (2026, hlm. 7, 12) menilai selisih terhadap label klinisi yang sendiri dapat mengandung derau. Karena itu, angka presisi dari ketiga studi tidak sebanding. Ketidakstabilan satu model klasifikasi kode terhadap akronim dan salah ketik (Jaganathan dkk., 2025, hlm. 4–5) juga menunjukkan bahwa ketahanan terhadap variasi penulisan, termasuk singkatan lokal, perlu diuji secara khusus, meskipun hasilnya belum tentu berlaku bagi LLM.</w:t>
-      </w:r>
-    </w:p>
-    <w:p>
-      <w:pPr>
-        <w:rPr>
-          <w:lang w:val="id-ID"/>
-        </w:rPr>
-      </w:pPr>
-      <w:r>
-        <w:rPr>
-          <w:lang w:val="id-ID"/>
-        </w:rPr>
-        <w:t xml:space="preserve">Di antara ketujuh studi, tidak ada yang melaporkan data dari Indonesia, membandingkan catatan perkembangan harian dengan ringkasan akhir dalam satu episode rawat inap, atau mengambil pedoman sesuai kasus sebagai dasar temuan. Akibatnya, angka kinerja yang dilaporkan tidak dapat dipindahkan begitu saja ke dokumentasi rawat inap kebidanan dan anak di Indonesia. Kinerja itu harus diukur ulang dengan menyertakan dokumen tanpa ketidaksesuaian agar positif palsu dapat dihitung.</w:t>
-      </w:r>
-    </w:p>
-    <w:p>
-      <w:pPr>
-        <w:pStyle w:val="Heading2"/>
-      </w:pPr>
-      <w:r>
-        <w:t xml:space="preserve">Pendekatan Hibrida Berbasis Aturan dan AI/NLP</w:t>
-      </w:r>
-    </w:p>
-    <w:p>
-      <w:pPr>
-        <w:pStyle w:val="Heading3"/>
-      </w:pPr>
-      <w:r>
-        <w:t xml:space="preserve">Kekuatan dan Batas Sistem Berbasis Aturan</w:t>
-      </w:r>
-    </w:p>
-    <w:p>
-      <w:pPr>
-        <w:rPr>
-          <w:lang w:val="id-ID"/>
-        </w:rPr>
-      </w:pPr>
-      <w:r>
-        <w:rPr>
-          <w:lang w:val="id-ID"/>
-        </w:rPr>
-        <w:t xml:space="preserve">Kumar dkk. (2026) menilai sistem berbasis aturan (</w:t>
-      </w:r>
-      <w:r>
-        <w:rPr>
-          <w:i/>
-          <w:lang w:val="id-ID"/>
-        </w:rPr>
-        <w:t xml:space="preserve">rule-based</w:t>
-      </w:r>
-      <w:r>
-        <w:rPr>
-          <w:lang w:val="id-ID"/>
-        </w:rPr>
-        <w:t xml:space="preserve">) dan hibrida layak dipakai di layanan kesehatan karena transparan dan dapat ditafsirkan (hlm. 12). Keunggulan utama sistem berbasis aturan ialah hasilnya dapat diprediksi dan mudah divalidasi, terutama pada kondisi klinis yang diatur regulasi (hlm. 12). Kelemahannya, menurut Kumar dkk., sistem itu tidak dapat diskalakan lintas institusi dan spesialisasi karena perbedaan bahasa klinis harus dipelihara secara manual, dan kinerjanya umumnya buruk pada dataset baru atau kebiasaan dokumentasi yang berubah (hlm. 12). Karena itu, sistem tersebut paling cocok untuk tugas berlingkup kecil atau sebagai bagian dari </w:t>
-      </w:r>
-      <w:r>
-        <w:rPr>
-          <w:i/>
-          <w:lang w:val="id-ID"/>
-        </w:rPr>
-        <w:t xml:space="preserve">pipeline</w:t>
-      </w:r>
-      <w:r>
-        <w:rPr>
-          <w:lang w:val="id-ID"/>
-        </w:rPr>
-        <w:t xml:space="preserve"> hibrida, bukan sebagai solusi tunggal (hlm. 12). Chen dkk. (2026) sejalan dengan itu: aturan dan leksikon eksplisit masih efektif untuk subtugas sempit seperti disambiguasi singkatan (hlm. 13).</w:t>
-      </w:r>
-    </w:p>
-    <w:p>
-      <w:pPr>
-        <w:rPr>
-          <w:lang w:val="id-ID"/>
-        </w:rPr>
-      </w:pPr>
-      <w:r>
-        <w:rPr>
-          <w:lang w:val="id-ID"/>
-        </w:rPr>
-        <w:t xml:space="preserve">Domingues (2026) menunjukkan sisi keterlacakan sistem berbasis aturan lewat OnCATs, sistem pendukung keputusan klinis untuk kanker prostat yang mengubah 23 pedoman internasional menjadi 1.236 aturan dalam format JSON (hlm. 1, 2). Setiap rekomendasi disertai jejak pembenaran yang menyebut aturan dan sumber pedoman yang aktif (hlm. 2). Sistem itu diuji pada sepuluh laporan kasus terbitan, dan penulisnya menyebut pengujian itu sebagai uji kelayakan teknis, bukan validasi klinis (hlm. 3, 5). Penulis mengaitkan ketidaksesuaian hasil dengan model harapan hidup yang disederhanakan dan data kasus yang tidak lengkap (hlm. 1), serta memperingatkan bahwa imputasi variabel yang hilang dapat membiaskan rekomendasi dan bahwa pembaruan basis pengetahuan secara manual berisiko tertinggal dari praktik klinis (hlm. 7). Meskipun judul artikelnya menyebut metode berbasis aturan dan AI, yang diuji hanya lapisan berbasis aturan; penulis sendiri menyebut sistemnya "</w:t>
-      </w:r>
-      <w:r>
-        <w:rPr>
-          <w:i/>
-          <w:lang w:val="id-ID"/>
-        </w:rPr>
-        <w:t xml:space="preserve">hybrid-ready</w:t>
-      </w:r>
-      <w:r>
-        <w:rPr>
-          <w:lang w:val="id-ID"/>
-        </w:rPr>
-        <w:t xml:space="preserve">", dengan modul pembelajaran mesin baru direncanakan (hlm. 2). Artikel ini karenanya tidak memberi bukti tentang kinerja sistem hibrida, dan domainnya ialah pedoman terapi onkologi, bukan audit dokumentasi.</w:t>
-      </w:r>
-    </w:p>
-    <w:p>
-      <w:pPr>
-        <w:pStyle w:val="Heading3"/>
-      </w:pPr>
-      <w:r>
-        <w:t xml:space="preserve">Pola Hibrida dan Bukti yang Tersedia</w:t>
-      </w:r>
-    </w:p>
-    <w:p>
-      <w:pPr>
-        <w:rPr>
-          <w:lang w:val="id-ID"/>
-        </w:rPr>
-      </w:pPr>
-      <w:r>
-        <w:rPr>
-          <w:lang w:val="id-ID"/>
-        </w:rPr>
-        <w:t xml:space="preserve">Ijadi Maghsoodi dkk. (2026) menyusun tinjauan naratif kritis atas 101 sumber yang dipilih dari 3.892 rekaman, dengan fokus pada sistem hibrida yang lapisan simboliknya, yaitu aturan, ontologi, atau batasan, disusun atau disetujui pemangku kepentingan (hlm. 1, 4). Salah satu dari setidaknya lima pola rancangan yang mereka identifikasi ialah ekstraksi saraf disertai validasi simbolik, tempat pemeriksaan konsistensi dan aturan dokumentasi memvalidasi keluaran model NLP atau model fondasi untuk abstraksi laporan, pengodean, dan pencatatan registri (hlm. 5). Tinjauan itu menyimpulkan bahwa desain hibrida tampak paling kredibel pada situasi yang terikat aturan, peka terhadap audit, dan bergantung pada alur kerja, termasuk validasi dokumentasi (hlm. 1), serta bahwa bukti empiris lebih kuat untuk tugas terbatas seperti validasi laporan dan ekstraksi informasi daripada untuk klaim yang ambisius tentang penalaran klinis, kalibrasi kepercayaan, atau perbaikan luaran pasien (hlm. 7). Untuk dokumentasi buatan model generatif, penulisnya berargumen bahwa validasi hibrida dapat menegakkan elemen wajib dan mendeteksi inkonsistensi (hlm. 7); ini argumen konseptual, bukan hasil uji.</w:t>
-      </w:r>
-    </w:p>
-    <w:p>
-      <w:pPr>
-        <w:rPr>
-          <w:lang w:val="id-ID"/>
-        </w:rPr>
-      </w:pPr>
-      <w:r>
-        <w:rPr>
-          <w:lang w:val="id-ID"/>
-        </w:rPr>
-        <w:t xml:space="preserve">Penulisnya sendiri membatasi kesimpulan itu. Basis empiris masih terbatas dan bukti prospektif jarang (hlm. 1), dan klaim tentang dampak pada mutu keputusan sebaiknya dibaca sebagai pembangkit hipotesis, bukan temuan konfirmatif (hlm. 6). Lapisan simbolik menimbulkan beban akuisisi pengetahuan, ketidakselarasan ontologi, konflik aturan, dan pemeliharaan (hlm. 1, 9). Proses penyaringan tinjauan itu mengecualikan rekaman nonbahasa Inggris (hlm. 2), dan literaturnya terkonsentrasi pada sistem kesehatan berpendapatan tinggi dan matang secara digital (hlm. 9).</w:t>
-      </w:r>
-    </w:p>
-    <w:p>
-      <w:pPr>
-        <w:pStyle w:val="Heading3"/>
-      </w:pPr>
-      <w:r>
         <w:t xml:space="preserve">Sintesis dan Celah</w:t>
       </w:r>
     </w:p>
@@ -5039,499 +5397,7 @@
         <w:rPr>
           <w:lang w:val="id-ID"/>
         </w:rPr>
-        <w:t xml:space="preserve">Sumber-sumber di atas mendukung dua hal yang terbatas: sistem berbasis aturan unggul dalam penelusuran dan validasi tetapi mahal dipelihara, dan kombinasi dengan komponen pembelajaran dinilai paling kredibel untuk validasi dokumentasi menurut satu tinjauan naratif. Keterbatasannya ada tiga. Pertama, di antara sumber yang dibaca, tidak ada yang membandingkan konfigurasi aturan saja dengan aturan ditambah AI/NLP pada audit dokumentasi klinis; satu-satunya sistem yang diuji (Domingues, 2026) hanya berbasis aturan, di bidang onkologi, pada sepuluh kasus. Kedua, dukungan terkuat untuk validasi dokumentasi bersifat konseptual (Ijadi Maghsoodi dkk., 2026, hlm. 7). Ketiga, tidak ada sumber yang menyangkut aturan atau dokumen klaim berbahasa Indonesia. Satu artikel pada daftar sumber, yang judulnya menyebut model hibrida pembelajaran mesin dan sistem pakar untuk identifikasi pemotongan klaim asuransi, belum dapat dibaca karena berkasnya tidak tersedia </w:t>
-      </w:r>
-      <w:r>
-        <w:rPr>
-          <w:highlight w:val="yellow"/>
-          <w:lang w:val="id-ID"/>
-        </w:rPr>
-        <w:t xml:space="preserve">[PERLU VERIFIKASI SUMBER]</w:t>
-      </w:r>
-      <w:r>
-        <w:rPr>
-          <w:lang w:val="id-ID"/>
-        </w:rPr>
-        <w:t xml:space="preserve">. Akibatnya, pembagian kerja antara aturan dan AI/NLP pada penelitian ini merupakan pilihan rancangan yang perlu dibenarkan lewat perbandingan konfigurasi aturan saja dengan aturan ditambah AI/NLP, dengan ukuran dan ambang kegagalan yang ditetapkan sebelum eksperimen </w:t>
-      </w:r>
-      <w:r>
-        <w:rPr>
-          <w:highlight w:val="yellow"/>
-          <w:lang w:val="id-ID"/>
-        </w:rPr>
-        <w:t xml:space="preserve">[SESUAIKAN DENGAN BAB I: rumusan pertanyaan dan ukuran keberhasilan]</w:t>
-      </w:r>
-      <w:r>
-        <w:rPr>
-          <w:lang w:val="id-ID"/>
-        </w:rPr>
-        <w:t xml:space="preserve">.</w:t>
-      </w:r>
-    </w:p>
-    <w:p>
-      <w:pPr>
-        <w:pStyle w:val="Heading2"/>
-      </w:pPr>
-      <w:r>
-        <w:t xml:space="preserve">RAG, Penjangkaran Bukti, dan Halusinasi</w:t>
-      </w:r>
-    </w:p>
-    <w:p>
-      <w:pPr>
-        <w:pStyle w:val="Heading3"/>
-      </w:pPr>
-      <w:r>
-        <w:t xml:space="preserve">RAG pada Teks Klinis</w:t>
-      </w:r>
-    </w:p>
-    <w:p>
-      <w:pPr>
-        <w:rPr>
-          <w:lang w:val="id-ID"/>
-        </w:rPr>
-      </w:pPr>
-      <w:r>
-        <w:rPr>
-          <w:i/>
-          <w:lang w:val="id-ID"/>
-        </w:rPr>
-        <w:t xml:space="preserve">Retrieval-augmented generation</w:t>
-      </w:r>
-      <w:r>
-        <w:rPr>
-          <w:lang w:val="id-ID"/>
-        </w:rPr>
-        <w:t xml:space="preserve"> (RAG) menyisipkan bukti yang diambil dari sumber luar ke dalam masukan LLM sebelum model membangkitkan jawaban. Yang dkk. (2026) menelaah 251 studi RAG di bidang medis dan menemukan bahwa aplikasinya terkonsentrasi pada tanya jawab, pembuatan laporan, peringkasan teks, dan ekstraksi informasi (hlm. 2). Sumber pengetahuan yang paling sering dipakai ialah korpus ilmiah biomedis (88 studi), pedoman klinis (67 studi), dan rekam medis elektronik (33 studi) (hlm. 3). Dari 188 studi yang memakai </w:t>
-      </w:r>
-      <w:r>
-        <w:rPr>
-          <w:i/>
-          <w:lang w:val="id-ID"/>
-        </w:rPr>
-        <w:t xml:space="preserve">retrieval</w:t>
-      </w:r>
-      <w:r>
-        <w:rPr>
-          <w:lang w:val="id-ID"/>
-        </w:rPr>
-        <w:t xml:space="preserve"> padat, hanya 24 yang secara eksplisit memakai model </w:t>
-      </w:r>
-      <w:r>
-        <w:rPr>
-          <w:i/>
-          <w:lang w:val="id-ID"/>
-        </w:rPr>
-        <w:t xml:space="preserve">embedding</w:t>
-      </w:r>
-      <w:r>
-        <w:rPr>
-          <w:lang w:val="id-ID"/>
-        </w:rPr>
-        <w:t xml:space="preserve"> multibahasa; sisanya memakai model yang berpusat pada bahasa Inggris (hlm. 4). Penulisnya menilai RAG medis masih berada pada tahap awal dan memerlukan validasi klinis serta adaptasi lintas bahasa (hlm. 2). Landolsi dkk. (2026) menelaah 57 studi pada sepuluh bidang medis; hanya enam di antaranya yang memakai sumber nonbarat atau nonbahasa Inggris, dan hanya empat yang divalidasi lintas institusi (hlm. 6, 19).</w:t>
-      </w:r>
-    </w:p>
-    <w:p>
-      <w:pPr>
-        <w:rPr>
-          <w:lang w:val="id-ID"/>
-        </w:rPr>
-      </w:pPr>
-      <w:r>
-        <w:rPr>
-          <w:lang w:val="id-ID"/>
-        </w:rPr>
-        <w:t xml:space="preserve">Zhang dkk. (2026) memberi bukti yang paling dekat dengan catatan klinis sehari-hari. Mereka membandingkan enam strategi </w:t>
-      </w:r>
-      <w:r>
-        <w:rPr>
-          <w:i/>
-          <w:lang w:val="id-ID"/>
-        </w:rPr>
-        <w:t xml:space="preserve">retrieval</w:t>
-      </w:r>
-      <w:r>
-        <w:rPr>
-          <w:lang w:val="id-ID"/>
-        </w:rPr>
-        <w:t xml:space="preserve"> pada catatan keperawatan fasilitas perawatan lansia di Australia, dengan Llama 3.1 8B sebagai pembangkit dan indeks yang dibangun dari segmen catatan itu sendiri, untuk dua tugas ekstraksi entitas yang masing-masing diuji pada 208 rekaman (hlm. 1, 5). Tanpa </w:t>
-      </w:r>
-      <w:r>
-        <w:rPr>
-          <w:i/>
-          <w:lang w:val="id-ID"/>
-        </w:rPr>
-        <w:t xml:space="preserve">retrieval</w:t>
-      </w:r>
-      <w:r>
-        <w:rPr>
-          <w:lang w:val="id-ID"/>
-        </w:rPr>
-        <w:t xml:space="preserve">, F1 jawaban ialah 0,702 untuk gejala agitasi pada demensia dan 0,722 untuk faktor risiko malnutrisi; dengan </w:t>
-      </w:r>
-      <w:r>
-        <w:rPr>
-          <w:i/>
-          <w:lang w:val="id-ID"/>
-        </w:rPr>
-        <w:t xml:space="preserve">dense reranking</w:t>
-      </w:r>
-      <w:r>
-        <w:rPr>
-          <w:lang w:val="id-ID"/>
-        </w:rPr>
-        <w:t xml:space="preserve">, angkanya 0,946 dan 0,953 (hlm. 6). F1 jawaban itu dihitung dengan BERTScore, yaitu kemiripan semantik terhadap anotasi acuan (hlm. 3), bukan kecocokan label persis. Galat yang paling sering ialah fabrikasi intrinsik, yaitu model memutarbalikkan informasi yang ada di teks sumber, disusul fabrikasi ekstrinsik dan negatif palsu (hlm. 8, 9). Penulisnya membatasi kesimpulan pada dua tugas berbasis skema; ekstraksi relasi, penalaran temporal, dan tanya jawab terbuka tidak dievaluasi (hlm. 11). Jia dkk. (2026) menguji agen dengan </w:t>
-      </w:r>
-      <w:r>
-        <w:rPr>
-          <w:i/>
-          <w:lang w:val="id-ID"/>
-        </w:rPr>
-        <w:t xml:space="preserve">retrieval</w:t>
-      </w:r>
-      <w:r>
-        <w:rPr>
-          <w:lang w:val="id-ID"/>
-        </w:rPr>
-        <w:t xml:space="preserve">, </w:t>
-      </w:r>
-      <w:r>
-        <w:rPr>
-          <w:i/>
-          <w:lang w:val="id-ID"/>
-        </w:rPr>
-        <w:t xml:space="preserve">reranking</w:t>
-      </w:r>
-      <w:r>
-        <w:rPr>
-          <w:lang w:val="id-ID"/>
-        </w:rPr>
-        <w:t xml:space="preserve">, dan penjangkaran bukti pada tolok ukur tanya jawab berformat ujian dan melaporkan akurasi 82,98% pada USMLE Step 1, di atas 80,67% untuk GPT-4 (hlm. 2).</w:t>
-      </w:r>
-    </w:p>
-    <w:p>
-      <w:pPr>
-        <w:pStyle w:val="Heading3"/>
-      </w:pPr>
-      <w:r>
-        <w:t xml:space="preserve">Penjangkaran Bukti dan Pengecekan Keluaran</w:t>
-      </w:r>
-    </w:p>
-    <w:p>
-      <w:pPr>
-        <w:rPr>
-          <w:lang w:val="id-ID"/>
-        </w:rPr>
-      </w:pPr>
-      <w:r>
-        <w:rPr>
-          <w:lang w:val="id-ID"/>
-        </w:rPr>
-        <w:t xml:space="preserve">Waqas dkk. (2026) membedakan halusinasi faktual, </w:t>
-      </w:r>
-      <w:r>
-        <w:rPr>
-          <w:i/>
-          <w:lang w:val="id-ID"/>
-        </w:rPr>
-        <w:t xml:space="preserve">faithful</w:t>
-      </w:r>
-      <w:r>
-        <w:rPr>
-          <w:lang w:val="id-ID"/>
-        </w:rPr>
-        <w:t xml:space="preserve"> (tidak sesuai dengan masukan), logis, dan temporal (hlm. 4). Survei atas 90 publikasi itu, yang tidak memakai penilaian risiko bias formal (hlm. 4), mengutip RAGTruth bahwa halusinasi tetap terjadi ketika konteks ambigu atau </w:t>
-      </w:r>
-      <w:r>
-        <w:rPr>
-          <w:i/>
-          <w:lang w:val="id-ID"/>
-        </w:rPr>
-        <w:t xml:space="preserve">retrieval</w:t>
-      </w:r>
-      <w:r>
-        <w:rPr>
-          <w:lang w:val="id-ID"/>
-        </w:rPr>
-        <w:t xml:space="preserve"> gagal menemukan semua bukti yang relevan (hlm. 10), dan menyatakan bahwa bidang kesehatan membutuhkan laju positif palsu yang sangat rendah (hlm. 18). Sun dkk. (2025) menelaah 55 artikel, 15 di antaranya tentang halusinasi, dan menemukan bahwa mitigasi halusinasi sebagian besar dikaji pada tugas tanya jawab, dataset deteksi halusinasi langka, serta evaluasinya bergantung pada penilaian pakar tanpa kerangka baku (hlm. 15, 18).</w:t>
-      </w:r>
-    </w:p>
-    <w:p>
-      <w:pPr>
-        <w:rPr>
-          <w:lang w:val="id-ID"/>
-        </w:rPr>
-      </w:pPr>
-      <w:r>
-        <w:rPr>
-          <w:lang w:val="id-ID"/>
-        </w:rPr>
-        <w:t xml:space="preserve">Li dkk. (2026) mencontohkan penjangkaran bukti pada pendukung keputusan bedah tulang belakang. Pangkalan pengetahuannya memuat pedoman dan literatur yang masing-masing diberi ID, sumber, tahun, dan tingkat bukti, dan diperbarui tiap enam bulan dengan penanda versi (hlm. 3, 4). Empat paragraf teratas disisipkan ke masukan model, keluaran berformat “rekomendasi + paragraf kutipan”, dan model diinstruksikan menjawab </w:t>
-      </w:r>
-      <w:r>
-        <w:rPr>
-          <w:i/>
-          <w:lang w:val="id-ID"/>
-        </w:rPr>
-        <w:t xml:space="preserve">“no clear conclusions available”</w:t>
-      </w:r>
-      <w:r>
-        <w:rPr>
-          <w:lang w:val="id-ID"/>
-        </w:rPr>
-        <w:t xml:space="preserve"> bila literatur tidak memberi jawaban pasti (hlm. 4). Lima ahli bedah menilai 200 kasus dengan rubrik 11 dimensi, termasuk ketepatan bukti yang dikutip (hlm. 1, 5). Namun yang dibandingkan ialah empat agen LLM dalam satu kerangka RAG di satu pusat, bukan RAG terhadap tanpa RAG (hlm. 9), dan artikelnya tidak menguraikan pemeriksaan kutipan otomatis.</w:t>
-      </w:r>
-    </w:p>
-    <w:p>
-      <w:pPr>
-        <w:rPr>
-          <w:lang w:val="id-ID"/>
-        </w:rPr>
-      </w:pPr>
-      <w:r>
-        <w:rPr>
-          <w:lang w:val="id-ID"/>
-        </w:rPr>
-        <w:t xml:space="preserve">Zeba dkk. (2026) menempuh cara lain: modul pemeriksa fakta tanpa LLM yang memeriksa keluaran LLM terhadap rekam medis sumber (hlm. 1). Ringkasan dan rekam medis dipecah menjadi proposisi atomik (hlm. 7), lalu setiap proposisi diberi vonis Didukung atau Tidak Didukung melalui pemeriksaan negasi, implikasi, konsistensi temporal, eksklusivitas bersama, kecocokan numerik, dan keberadaan (hlm. 6, 14). Pada 104 ringkasan yang diekstrak menjadi 3.786 proposisi dan divalidasi dokter, modul itu mencapai presisi 0,8904, </w:t>
-      </w:r>
-      <w:r>
-        <w:rPr>
-          <w:i/>
-          <w:lang w:val="id-ID"/>
-        </w:rPr>
-        <w:t xml:space="preserve">recall</w:t>
-      </w:r>
-      <w:r>
-        <w:rPr>
-          <w:lang w:val="id-ID"/>
-        </w:rPr>
-        <w:t xml:space="preserve"> 0,8234, dan F1 0,8556 (hlm. 1). Tanpa pemeriksaan negasi dan numerik, presisinya turun lebih dari 8% (hlm. 14). Datanya berasal dari MIMIC-III, rekam medis unit perawatan intensif (hlm. 10), dan penulisnya menyatakan sistem kurang andal pada bidang yang kurang terwakili, termasuk gangguan metabolik anak, serta hanya memberi vonis biner tanpa usul perbaikan (hlm. 15).</w:t>
-      </w:r>
-    </w:p>
-    <w:p>
-      <w:pPr>
-        <w:pStyle w:val="Heading3"/>
-      </w:pPr>
-      <w:r>
-        <w:t xml:space="preserve">Sintesis dan Celah</w:t>
-      </w:r>
-    </w:p>
-    <w:p>
-      <w:pPr>
-        <w:rPr>
-          <w:lang w:val="id-ID"/>
-        </w:rPr>
-      </w:pPr>
-      <w:r>
-        <w:rPr>
-          <w:lang w:val="id-ID"/>
-        </w:rPr>
-        <w:t xml:space="preserve">Sumber-sumber di atas menunjukkan bahwa </w:t>
-      </w:r>
-      <w:r>
-        <w:rPr>
-          <w:i/>
-          <w:lang w:val="id-ID"/>
-        </w:rPr>
-        <w:t xml:space="preserve">retrieval</w:t>
-      </w:r>
-      <w:r>
-        <w:rPr>
-          <w:lang w:val="id-ID"/>
-        </w:rPr>
-        <w:t xml:space="preserve"> menaikkan kinerja ekstraksi pada catatan klinis dan bahwa keluaran dapat ditautkan serta diperiksa terhadap sumbernya, tetapi ada empat celah bagi penelitian ini. Pertama, aplikasi RAG terkonsentrasi pada tanya jawab, pembuatan laporan, peringkasan, dan ekstraksi (Yang dkk., 2026, hlm. 2), dan bukti kinerja yang paling mencolok berasal dari soal ujian (Jia dkk., 2026, hlm. 2); di antara sumber yang dibaca, tidak ada yang menguji RAG untuk memeriksa kesesuaian antardokumen dalam satu episode rawat. Kedua, tidak ada sumber yang menguji teks klinis berbahasa Indonesia, dan </w:t>
-      </w:r>
-      <w:r>
-        <w:rPr>
-          <w:i/>
-          <w:lang w:val="id-ID"/>
-        </w:rPr>
-        <w:t xml:space="preserve">retrieval</w:t>
-      </w:r>
-      <w:r>
-        <w:rPr>
-          <w:lang w:val="id-ID"/>
-        </w:rPr>
-        <w:t xml:space="preserve"> umumnya memakai model berpusat pada bahasa Inggris (Yang dkk., 2026, hlm. 4; Landolsi dkk., 2026, hlm. 19). Ketiga, pemeriksaan keluaran terhadap sumber baru didemonstrasikan pada ringkasan LLM atas rekam medis berbahasa Inggris (Zeba dkk., 2026), sedangkan ketepatan kutipan pada Li dkk. (2026) dinilai ahli. Keempat, kontribusi </w:t>
-      </w:r>
-      <w:r>
-        <w:rPr>
-          <w:i/>
-          <w:lang w:val="id-ID"/>
-        </w:rPr>
-        <w:t xml:space="preserve">retrieval</w:t>
-      </w:r>
-      <w:r>
-        <w:rPr>
-          <w:lang w:val="id-ID"/>
-        </w:rPr>
-        <w:t xml:space="preserve"> dibandingkan dengan kondisi tanpa </w:t>
-      </w:r>
-      <w:r>
-        <w:rPr>
-          <w:i/>
-          <w:lang w:val="id-ID"/>
-        </w:rPr>
-        <w:t xml:space="preserve">retrieval</w:t>
-      </w:r>
-      <w:r>
-        <w:rPr>
-          <w:lang w:val="id-ID"/>
-        </w:rPr>
-        <w:t xml:space="preserve"> hanya pada dua tugas ekstraksi berbasis skema (Zhang dkk., 2026, hlm. 6, 11); pada audit, kontribusinya terhadap mutu temuan dan biaya positif palsunya belum diukur. Akibatnya, manfaat RAG pada audit dokumentasi rawat inap kebidanan dan anak perlu diuji dengan membandingkan konfigurasi dengan dan tanpa </w:t>
-      </w:r>
-      <w:r>
-        <w:rPr>
-          <w:i/>
-          <w:lang w:val="id-ID"/>
-        </w:rPr>
-        <w:t xml:space="preserve">retrieval</w:t>
-      </w:r>
-      <w:r>
-        <w:rPr>
-          <w:lang w:val="id-ID"/>
-        </w:rPr>
-        <w:t xml:space="preserve">, memakai ukuran dan ambang kegagalan yang ditetapkan sebelum eksperimen </w:t>
-      </w:r>
-      <w:r>
-        <w:rPr>
-          <w:highlight w:val="yellow"/>
-          <w:lang w:val="id-ID"/>
-        </w:rPr>
-        <w:t xml:space="preserve">[SESUAIKAN DENGAN BAB I: rumusan pertanyaan dan ukuran keberhasilan]</w:t>
-      </w:r>
-      <w:r>
-        <w:rPr>
-          <w:lang w:val="id-ID"/>
-        </w:rPr>
-        <w:t xml:space="preserve">.</w:t>
-      </w:r>
-    </w:p>
-    <w:p>
-      <w:pPr>
-        <w:pStyle w:val="Heading2"/>
-      </w:pPr>
-      <w:r>
-        <w:t xml:space="preserve">De-identifikasi untuk Layanan AI Eksternal</w:t>
-      </w:r>
-    </w:p>
-    <w:p>
-      <w:pPr>
-        <w:pStyle w:val="Heading3"/>
-      </w:pPr>
-      <w:r>
-        <w:t xml:space="preserve">Pendekatan De-identifikasi dan Bukti yang Tersedia</w:t>
-      </w:r>
-    </w:p>
-    <w:p>
-      <w:pPr>
-        <w:rPr>
-          <w:lang w:val="id-ID"/>
-        </w:rPr>
-      </w:pPr>
-      <w:r>
-        <w:rPr>
-          <w:lang w:val="id-ID"/>
-        </w:rPr>
-        <w:t xml:space="preserve">Faustini dkk. (2026) menelaah 83 artikel yang dipilih dari 734 tentang de-identifikasi data klinis berbasis NLP pada tahun 2015–2024, dengan de-identifikasi didefinisikan sebagai pendeteksian, penggantian, atau penghapusan informasi kesehatan yang dilindungi (</w:t>
-      </w:r>
-      <w:r>
-        <w:rPr>
-          <w:i/>
-          <w:lang w:val="id-ID"/>
-        </w:rPr>
-        <w:t xml:space="preserve">protected health information</w:t>
-      </w:r>
-      <w:r>
-        <w:rPr>
-          <w:lang w:val="id-ID"/>
-        </w:rPr>
-        <w:t xml:space="preserve">, PHI) (hlm. 1, 2). Mereka menyimpulkan bahwa penggunaan model bahasa meningkat, bahwa perkakas siap pakai sering perlu disesuaikan, dan bahwa sebagian besar studi menggarap konten berbahasa Inggris karena dataset yang tersedia berbahasa Inggris (hlm. 1). Metode berbasis aturan tetap umum di luar bahasa Inggris (hlm. 6), sedangkan tantangan utamanya ialah campur kode dan kelangkaan dataset yang dapat direproduksi (hlm. 1). Faustini dkk. juga melaporkan temuan studi lain bahwa Presidio kesulitan mengenali nama Slavia serta nama Asia Tengah dan Asia Tenggara dibandingkan nama Inggris (hlm. 5), dan bahwa F1 sebuah LLM dapat turun serendah 0,33 tanpa contoh dan instruksi rinci pada perintah (</w:t>
-      </w:r>
-      <w:r>
-        <w:rPr>
-          <w:i/>
-          <w:lang w:val="id-ID"/>
-        </w:rPr>
-        <w:t xml:space="preserve">prompt</w:t>
-      </w:r>
-      <w:r>
-        <w:rPr>
-          <w:lang w:val="id-ID"/>
-        </w:rPr>
-        <w:t xml:space="preserve">), dibandingkan 0,98 dengan perintah rinci (hlm. 6).</w:t>
-      </w:r>
-    </w:p>
-    <w:p>
-      <w:pPr>
-        <w:rPr>
-          <w:lang w:val="id-ID"/>
-        </w:rPr>
-      </w:pPr>
-      <w:r>
-        <w:rPr>
-          <w:lang w:val="id-ID"/>
-        </w:rPr>
-        <w:t xml:space="preserve">Azzam dkk. (2026) mengusulkan sistem agentik yang memisahkan lingkungan pemrosesan: LLM yang dihosting lokal menangani semua langkah sensitif, sedangkan LLM publik hanya menalar atas masukan yang sudah dianonimkan (hlm. 1), dengan pemetaan lokal untuk mengembalikan identitas pada jawaban (hlm. 10). Pada dataset rekam medis sintetis, sistem itu mencapai presisi 1,000 dan </w:t>
-      </w:r>
-      <w:r>
-        <w:rPr>
-          <w:i/>
-          <w:lang w:val="id-ID"/>
-        </w:rPr>
-        <w:t xml:space="preserve">recall</w:t>
-      </w:r>
-      <w:r>
-        <w:rPr>
-          <w:lang w:val="id-ID"/>
-        </w:rPr>
-        <w:t xml:space="preserve"> 0,936, sedangkan spaCy dan Presidio berpresisi 0,329 dan 0,405 dengan </w:t>
-      </w:r>
-      <w:r>
-        <w:rPr>
-          <w:i/>
-          <w:lang w:val="id-ID"/>
-        </w:rPr>
-        <w:t xml:space="preserve">recall</w:t>
-      </w:r>
-      <w:r>
-        <w:rPr>
-          <w:lang w:val="id-ID"/>
-        </w:rPr>
-        <w:t xml:space="preserve"> sekitar 0,89 (hlm. 12). Pada 100 catatan MIMIC-III, 98,6% penanda redaksi bawaan dataset berubah bersih; penanda itu dipakai sebagai pengganti label acuan karena catatannya sudah dide-identifikasi (hlm. 1, 15). Kelestarian informasi klinis tidak penuh: sebutan obat terjaga 0,974, tetapi dosis hanya 0,769 (hlm. 12). Penulisnya menyatakan sistem baru mendukung masukan berbahasa Inggris (hlm. 19).</w:t>
-      </w:r>
-    </w:p>
-    <w:p>
-      <w:pPr>
-        <w:rPr>
-          <w:lang w:val="id-ID"/>
-        </w:rPr>
-      </w:pPr>
-      <w:r>
-        <w:rPr>
-          <w:lang w:val="id-ID"/>
-        </w:rPr>
-        <w:t xml:space="preserve">Tchouka dkk. (2024) menguji de-identifikasi pada dokumen medis berbahasa Prancis di sebuah rumah sakit publik, dengan seluruh eksperimen dilakukan di lokasi rumah sakit tanpa ada data yang dibawa keluar (hlm. 2). Tanggal, usia, dan lokasi diganti dengan privasi diferensial lokal berbasis metrik agar aspek kronologis dan geografisnya tidak hilang (hlm. 1, 7). Manfaatnya diukur lewat tugas asosiasi kode ICD-10: skor F1 turun sekitar 12% terhadap korpus asli bila setiap entitas diganti dengan labelnya, yaitu cara yang dinilai paling tahan terhadap serangan re-identifikasi tetapi membuang nilai entitas, dan 6,8% dengan pendekatan itu (hlm. 2, 12, 13). Penulisnya mengingatkan bahwa dataset hasil de-identifikasi tetap tidak kebal terhadap serangan re-identifikasi dan keanggotaan, sehingga tidak dapat disebarluaskan (hlm. 13).</w:t>
-      </w:r>
-    </w:p>
-    <w:p>
-      <w:pPr>
-        <w:pStyle w:val="Heading3"/>
-      </w:pPr>
-      <w:r>
-        <w:t xml:space="preserve">Sintesis dan Celah</w:t>
-      </w:r>
-    </w:p>
-    <w:p>
-      <w:pPr>
-        <w:rPr>
-          <w:lang w:val="id-ID"/>
-        </w:rPr>
-      </w:pPr>
-      <w:r>
-        <w:rPr>
-          <w:lang w:val="id-ID"/>
-        </w:rPr>
-        <w:t xml:space="preserve">Sumber-sumber di atas mendukung dua hal yang terbatas: de-identifikasi oleh LLM lokal dapat memisahkan data sensitif dari LLM publik pada pengujian awal, dan penggantian yang memperhatikan utilitas mengurangi kehilangan kinerja pada tugas hilir berbasis kode. Keterbatasannya ada tiga. Pertama, tidak ada sumber yang menguji teks klinis berbahasa Indonesia atau pengenal khas Indonesia seperti NIK dan nomor rekam medis; temuan tentang nama Asia Tenggara bersifat sekunder dan menyangkut perkakas yang diuji pada data lain (Faustini dkk., 2026, hlm. 5). Kedua, bukti untuk pendekatan berbasis LLM lokal berasal dari data sintetis dan catatan berbahasa Inggris yang sudah dide-identifikasi (Azzam dkk., 2026, hlm. 15), sehingga kebocoran PHI pada catatan baru yang belum diredaksi belum terukur. Ketiga, kehilangan utilitas baru diukur pada asosiasi kode ICD-10 (Tchouka dkk., 2024, hlm. 13) atau pada sebutan obat dan dosis (Azzam dkk., 2026, hlm. 12); dampak de-identifikasi terhadap temuan audit yang bergantung pada tanggal, dosis, dan urutan waktu belum diukur. Akibatnya, de-identifikasi pada penelitian ini perlu diuji pada data berbahasa Indonesia, dengan ukuran kebocoran pengenal dan dampaknya pada mutu temuan serta ambang kegagalan yang ditetapkan sebelum eksperimen </w:t>
+        <w:t xml:space="preserve">Sumber-sumber di atas mendukung dua hal yang terbatas: de-identifikasi oleh LLM lokal dapat memisahkan data sensitif dari LLM publik pada pengujian awal, dan penggantian yang memperhatikan utilitas mengurangi kehilangan kinerja pada tugas hilir berbasis kode. Keterbatasannya ada tiga. Pertama, tidak ada sumber yang menguji teks klinis berbahasa Indonesia atau pengenal khas Indonesia seperti NIK dan nomor rekam medis; temuan tentang nama Asia Tenggara bersifat sekunder dan menyangkut perkakas yang diuji pada data lain (Faustini dkk., 2026, hlm. 5). Kedua, bukti untuk pendekatan berbasis LLM lokal berasal dari data sintetis dan catatan berbahasa Inggris yang sudah dide-identifikasi (Azzam dkk., 2026, hlm. 15), sehingga kebocoran PHI pada catatan baru yang belum diredaksi belum terukur. Ketiga, kehilangan utilitas baru diukur pada asosiasi kode ICD-10 (Tchouka dkk., 2024, hlm. 13) atau pada sebutan obat dan dosis (Azzam dkk., 2026, hlm. 12); dampak de-identifikasi terhadap temuan audit yang bergantung pada tanggal, dosis, dan urutan waktu belum diukur. De-identifikasi pada penelitian ini perlu diuji pada data berbahasa Indonesia, dengan ukuran kebocoran pengenal dan dampaknya pada mutu temuan </w:t>
       </w:r>
       <w:r>
         <w:rPr>
@@ -6666,7 +6532,7 @@
         <w:rPr>
           <w:lang w:val="id-ID"/>
         </w:rPr>
-        <w:t xml:space="preserve">Dari 34 sumber yang dirujuk dalam bab ini, empat celah berulang. Pertama, tidak ada studi NLP atau AI yang menguji teks klinis berbahasa Indonesia, termasuk singkatan dan pengenal lokalnya (subbab II.2, II.3, II.6). Kedua, tidak ada yang memeriksa kesesuaian antardokumen dalam satu episode rawat inap sebelum klaim diajukan, misalnya membandingkan catatan perkembangan harian dengan ringkasan akhir atau memakai pedoman sebagai dasar temuan (II.1, II.3, II.5). Ketiga, di antara sumber yang dibaca, tidak ada yang membandingkan konfigurasi aturan saja dengan aturan ditambah AI/NLP berbasis RAG pada tugas ini, dan ketepatan kutipan bukti belum diperiksa secara otomatis (II.4, II.5). Keempat, acuan penilaian untuk audit, yaitu unit temuan, perlakuan kasus ambigu, dan ukuran kesepakatan penilai, belum dirancang pada sumber mana pun, padahal ketidaksepakatan antarpenilai dapat mencapai 29,0% pada ekstraksi klinis (II.7). Pernyataan "tidak ada" ini berlaku pada 34 sumber tersebut, bukan pada seluruh literatur. Penelitian ini mengisi celah itu dengan menguji audit dokumentasi rawat inap kebidanan dan anak berbahasa Indonesia terhadap pembanding, ukuran, dan ambang kegagalan yang ditetapkan sebelum eksperimen </w:t>
+        <w:t xml:space="preserve">Dari 33 sumber yang dirujuk dalam bab ini, empat celah berulang. Pertama, tidak ada studi NLP atau AI yang menguji teks klinis berbahasa Indonesia, termasuk singkatan dan pengenal lokalnya (subbab II.2, II.3, II.6). Kedua, tidak ada yang memeriksa kesesuaian antardokumen dalam satu episode rawat inap sebelum klaim diajukan, misalnya membandingkan catatan perkembangan harian dengan ringkasan akhir atau memakai pedoman sebagai dasar temuan (II.1, II.3, II.5). Ketiga, di antara sumber yang dibaca, tidak ada yang membandingkan konfigurasi aturan saja dengan aturan ditambah AI/NLP berbasis RAG pada tugas ini, dan ketepatan kutipan bukti belum diperiksa secara otomatis (II.4, II.5). Keempat, acuan penilaian untuk audit, yaitu unit temuan, perlakuan kasus ambigu, dan ukuran kesepakatan penilai, belum dirancang pada sumber mana pun, padahal ketidaksepakatan antarpenilai dapat mencapai 29,0% pada ekstraksi klinis (II.7). Pernyataan "tidak ada" ini berlaku pada 33 sumber tersebut, bukan pada seluruh literatur. Penelitian ini mengisi celah itu dengan menguji audit dokumentasi rawat inap kebidanan dan anak berbahasa Indonesia terhadap pembanding, ukuran, dan ambang kegagalan yang ditetapkan sebelum eksperimen </w:t>
       </w:r>
       <w:r>
         <w:rPr>
@@ -7590,38 +7456,6 @@
           <w:lang w:val="id-ID"/>
         </w:rPr>
         <w:t xml:space="preserve">, 115912.</w:t>
-      </w:r>
-    </w:p>
-    <w:p>
-      <w:pPr>
-        <w:spacing w:line="240" w:lineRule="auto"/>
-        <w:ind w:left="720" w:hanging="720"/>
-        <w:rPr>
-          <w:noProof/>
-          <w:lang w:val="id-ID" w:eastAsia="en-US"/>
-        </w:rPr>
-      </w:pPr>
-      <w:r>
-        <w:rPr>
-          <w:noProof/>
-          <w:lang w:val="id-ID"/>
-        </w:rPr>
-        <w:t xml:space="preserve">Lebeña, N., Casillas, A., &amp; Pérez, A. (2025). Large language models aided patient progression documentation according to the ICD standard. </w:t>
-      </w:r>
-      <w:r>
-        <w:rPr>
-          <w:i/>
-          <w:noProof/>
-          <w:lang w:val="id-ID"/>
-        </w:rPr>
-        <w:t xml:space="preserve">Informatics in Medicine Unlocked, 55</w:t>
-      </w:r>
-      <w:r>
-        <w:rPr>
-          <w:noProof/>
-          <w:lang w:val="id-ID"/>
-        </w:rPr>
-        <w:t xml:space="preserve">, 101637.</w:t>
       </w:r>
     </w:p>
     <w:p>

</xml_diff>

<commit_message>
refactor: review sub-subbab structure and add Barsasella, Schwieger, Mehri (draft 3)
- II.1 now has II.1.1 and II.1.2; II.2 gets a new II.2.2 on LLM
  documentation and discharge summaries (Woo moved there), so the
  synthesis becomes II.2.4. II.3-II.8 keep their structure.
- Add three listed sources from source/ with page-verified claims:
  Barsasella et al. (II.1), Schwieger et al. and Mehri et al. (II.2).
- Trim secondary details in II.2-II.7 to keep Bab II at 18.56 pages;
  update II.8.2 (36 sources), appendices, claims files and
  CONTEXT_TRANSFER.md. All seven claims files pass.

Co-Authored-By: Claude Sonnet 5.5 <noreply@anthropic.com>
Claude-Session: https://claude.ai/code/session_014py9jkTgHZJ9tfrTkQ4xwY
</commit_message>
<xml_diff>
--- a/bab2/Proposal-IF4091-Capstone-Utama-2026_Draft-Bab2.docx
+++ b/bab2/Proposal-IF4091-Capstone-Utama-2026_Draft-Bab2.docx
@@ -4052,6 +4052,14 @@
     </w:p>
     <w:p>
       <w:pPr>
+        <w:pStyle w:val="Heading3"/>
+      </w:pPr>
+      <w:r>
+        <w:t xml:space="preserve">Alur Klaim JKN dan Studi tentang Klaim Rawat Inap</w:t>
+      </w:r>
+    </w:p>
+    <w:p>
+      <w:pPr>
         <w:rPr>
           <w:lang w:val="id-ID"/>
         </w:rPr>
@@ -4125,7 +4133,7 @@
         <w:rPr>
           <w:lang w:val="id-ID"/>
         </w:rPr>
-        <w:t xml:space="preserve">Dua studi lain membahas klaim JKN dari sudut berbeda. Rachmawaty dkk. (2021) menganalisis basis data e-klaim BPJS satu rumah sakit ibu dan anak di Makassar, dengan 2.870 rawat inap pada 2019 dan 1.533 pada Januari–Juni 2020. Kerugian finansial rumah sakit terjadi pada 42,9% rawat inap tahun 2019 dan 61,3% tahun 2020 (hlm. S613). Penulis mengaitkan kerugian itu terutama dengan tarif rumah sakit yang lebih tinggi daripada tarif BPJS, dan menyebut tidak adanya audit rekam medis pasien secara rutin oleh manajer sebagai salah satu alasan variasi lama rawat (hlm. S617). Studi ini tidak menilai mutu dokumentasi. Nilasari dan Soelistijanto (2026) berfokus pada kecurangan klaim. Mereka menyebut kategori Kementerian Kesehatan yang mencakup </w:t>
+        <w:t xml:space="preserve">Tiga studi lain membahas klaim JKN dari sudut berbeda. Rachmawaty dkk. (2021) menganalisis basis data e-klaim BPJS satu rumah sakit ibu dan anak di Makassar, dengan 2.870 rawat inap pada 2019 dan 1.533 pada Januari–Juni 2020. Kerugian finansial rumah sakit terjadi pada 42,9% rawat inap tahun 2019 dan 61,3% tahun 2020 (hlm. S613). Penulis mengaitkan kerugian itu terutama dengan tarif rumah sakit yang lebih tinggi daripada tarif BPJS, dan menyebut tidak adanya audit rekam medis pasien secara rutin oleh manajer sebagai salah satu alasan variasi lama rawat (hlm. S617). Studi ini tidak menilai mutu dokumentasi. Barsasella dkk. (2021) memakai data klaim INA-CBG 4.376 pasien rawat inap diabetes melitus tipe 2 atau hipertensi di satu rumah sakit di Tasikmalaya (2016–2019) untuk memprediksi lama rawat dan kematian dengan pembelajaran mesin (hlm. 1). Variabelnya antara lain kode diagnosis, kode prosedur, kode INA-CBG, dan status pulang (hlm. 2); teks klinis tidak dibahas. Nilasari dan Soelistijanto (2026) berfokus pada kecurangan klaim. Mereka menyebut kategori Kementerian Kesehatan yang mencakup </w:t>
       </w:r>
       <w:r>
         <w:rPr>
@@ -4143,15 +4151,23 @@
     </w:p>
     <w:p>
       <w:pPr>
-        <w:rPr>
-          <w:lang w:val="id-ID"/>
-        </w:rPr>
-      </w:pPr>
-      <w:r>
-        <w:rPr>
-          <w:lang w:val="id-ID"/>
-        </w:rPr>
-        <w:t xml:space="preserve">Sumber-sumber tersebut menunjukkan bahwa dokumentasi medis, kode diagnosis, dan keputusan klaim saling terkait dalam JKN. Di antara sumber itu, tidak ada yang mengukur ketidaksesuaian di dalam dokumen klinis sebelum klaim diajukan. Ulasan Simbolon dan Gani (2023) merangkum faktor penyebab dari artikel lain, Rachmawaty dkk. (2021) menganalisis biaya dan mutu layanan, dan Nilasari dan Soelistijanto (2026) merancang audit di sisi BPJS tanpa evaluasi. Ringkasan Muroli dkk. (2020) dalam ulasan itu memberi proporsi berkas yang tidak lengkap atau tidak tepat, tetapi tidak merinci jenis ketidaksesuaian antardokumen, misalnya diagnosis pada resume yang tidak sejalan dengan catatan harian.</w:t>
+        <w:pStyle w:val="Heading3"/>
+      </w:pPr>
+      <w:r>
+        <w:t xml:space="preserve">Sintesis dan Celah</w:t>
+      </w:r>
+    </w:p>
+    <w:p>
+      <w:pPr>
+        <w:rPr>
+          <w:lang w:val="id-ID"/>
+        </w:rPr>
+      </w:pPr>
+      <w:r>
+        <w:rPr>
+          <w:lang w:val="id-ID"/>
+        </w:rPr>
+        <w:t xml:space="preserve">Sumber-sumber tersebut menunjukkan bahwa dokumentasi medis, kode diagnosis, dan keputusan klaim saling terkait dalam JKN. Di antara sumber itu, tidak ada yang mengukur ketidaksesuaian di dalam dokumen klinis sebelum klaim diajukan. Ulasan Simbolon dan Gani (2023) merangkum faktor penyebab dari artikel lain, Rachmawaty dkk. (2021) menganalisis biaya dan mutu layanan, Barsasella dkk. (2021) memodelkan luaran pasien dari variabel klaim terstruktur, dan Nilasari dan Soelistijanto (2026) merancang audit di sisi BPJS tanpa evaluasi. Ringkasan Muroli dkk. (2020) dalam ulasan itu memberi proporsi berkas yang tidak lengkap atau tidak tepat, tetapi tidak merinci jenis ketidaksesuaian antardokumen, misalnya diagnosis pada resume yang tidak sejalan dengan catatan harian.</w:t>
       </w:r>
     </w:p>
     <w:p>
@@ -4219,7 +4235,20 @@
         <w:rPr>
           <w:lang w:val="id-ID"/>
         </w:rPr>
-        <w:t xml:space="preserve">, NER), dan ekstraksi informasi (hlm. 1). Elvas dkk. (2025) meninjau 31 studi tahun 2019–2024 yang berfokus pada NER dan melaporkan bahwa pendekatan berbasis BERT, jaringan saraf, serta CRF/LSTM mendominasi dengan F1 di atas 85% (hlm. 1). Kajian itu tidak menilai mutu studi secara formal dan sengaja mengecualikan model bahasa besar (hlm. 2), sehingga tidak menggambarkan penggunaan model generatif.</w:t>
+        <w:t xml:space="preserve">, NER), dan ekstraksi informasi (hlm. 1). Elvas dkk. (2025) meninjau 31 studi tahun 2019–2024 yang berfokus pada NER dan melaporkan bahwa pendekatan berbasis BERT, jaringan saraf, serta CRF/LSTM mendominasi dengan F1 di atas 85% (hlm. 1). Kajian itu tidak menilai mutu studi secara formal dan sengaja mengecualikan model bahasa besar (</w:t>
+      </w:r>
+      <w:r>
+        <w:rPr>
+          <w:i/>
+          <w:lang w:val="id-ID"/>
+        </w:rPr>
+        <w:t xml:space="preserve">large language model</w:t>
+      </w:r>
+      <w:r>
+        <w:rPr>
+          <w:lang w:val="id-ID"/>
+        </w:rPr>
+        <w:t xml:space="preserve">, LLM) (hlm. 2), sehingga tidak menggambarkan penggunaan model generatif.</w:t>
       </w:r>
     </w:p>
     <w:p>
@@ -4250,28 +4279,148 @@
     </w:p>
     <w:p>
       <w:pPr>
-        <w:rPr>
-          <w:lang w:val="id-ID"/>
-        </w:rPr>
-      </w:pPr>
-      <w:r>
-        <w:rPr>
-          <w:lang w:val="id-ID"/>
-        </w:rPr>
-        <w:t xml:space="preserve">Pada sisi model bahasa besar (</w:t>
+        <w:pStyle w:val="Heading3"/>
+      </w:pPr>
+      <w:r>
+        <w:t xml:space="preserve">LLM untuk Dokumentasi Klinis dan Ringkasan Pulang</w:t>
+      </w:r>
+    </w:p>
+    <w:p>
+      <w:pPr>
+        <w:rPr>
+          <w:lang w:val="id-ID"/>
+        </w:rPr>
+      </w:pPr>
+      <w:r>
+        <w:rPr>
+          <w:lang w:val="id-ID"/>
+        </w:rPr>
+        <w:t xml:space="preserve">Woo dkk. (2026) menelaah 41 studi penggunaan LLM untuk dokumentasi klinis, terutama pembuatan catatan klinis, ringkasan pulang, dan dokumentasi pertemuan tenaga kesehatan dan pasien (hlm. 1). Sebagian studi melaporkan penghematan waktu hingga 40%, tetapi ketidakakuratan faktual, halusinasi, dan penurunan kinerja pada kasus kompleks sering ditemukan (hlm. 1). Cakupan kajian ini terbatas: 17 dari 41 studi berasal dari Amerika Serikat (hlm. 4), studi nonbahasa Inggris dikecualikan, dan menurut penulisnya sebagian besar studi dilakukan pada lingkungan terkendali atau simulasi (hlm. 11).</w:t>
+      </w:r>
+    </w:p>
+    <w:p>
+      <w:pPr>
+        <w:rPr>
+          <w:lang w:val="id-ID"/>
+        </w:rPr>
+      </w:pPr>
+      <w:r>
+        <w:rPr>
+          <w:lang w:val="id-ID"/>
+        </w:rPr>
+        <w:t xml:space="preserve">Dua studi primer membandingkan ringkasan pulang buatan LLM dengan tulisan dokter, dan hasilnya berbeda. Schwieger dkk. (2024) membandingkan 20 ringkasan pulang rawat inap psikiatri tulisan dokter residen dengan ringkasan buatan ChatGPT-4 dari catatan residen yang telah dipseudonimkan (hlm. 1). Delapan spesialis psikiatri yang tidak mengetahui sumbernya memberi skor rata-rata 3,78 untuk tulisan residen dan 3,12 untuk ChatGPT-4, dan halusinasi ditemukan pada 40% ringkasan ChatGPT-4 (hlm. 1); peneliti memeriksanya dengan membandingkan kedua versi ringkasan dengan rekam medis elektronik pasien (hlm. 2). Mehri dkk. (2026) menilai 292 pasang ringkasan pulang dari 16 departemen di satu rumah sakit akademik Belanda, dengan versi LLM dibuat otomatis oleh sistem yang terintegrasi dengan rekam medis elektronik (hlm. 1, 5). Kelengkapan versi LLM lebih rendah (median 4,5 terhadap 5,0), ketepatannya serupa, dan skor total tidak berbeda; kedua penilai mempercayai 249 ringkasan LLM (85,3%), dibandingkan 279 ringkasan dokter (95,5%) (hlm. 6). Penilai menyatakan tidak menemukan halusinasi atau informasi yang tidak masuk akal secara klinis, tetapi halusinasi tidak dinilai sebagai domain tersendiri (hlm. 9).</w:t>
+      </w:r>
+    </w:p>
+    <w:p>
+      <w:pPr>
+        <w:rPr>
+          <w:lang w:val="id-ID"/>
+        </w:rPr>
+      </w:pPr>
+      <w:r>
+        <w:rPr>
+          <w:lang w:val="id-ID"/>
+        </w:rPr>
+        <w:t xml:space="preserve">Schwieger dkk. menyebut sampel kecil dan kesepakatan antarpenilai yang rendah sampai sedang sebagai batasan (hlm. 8). Mehri dkk. membatasi diri pada satu rumah sakit dan ringkasan berbahasa Belanda (hlm. 9); dari 292 pasang, 12 berasal dari kebidanan dan kandungan serta 29 dari pediatri (hlm. 6). Penilaian pada kedua studi dilakukan oleh manusia dengan tulisan dokter sebagai pembanding, bukan melalui pemeriksaan otomatis kesesuaian ringkasan dengan catatan sumbernya, dan keduanya tidak memakai data berbahasa Indonesia.</w:t>
+      </w:r>
+    </w:p>
+    <w:p>
+      <w:pPr>
+        <w:pStyle w:val="Heading3"/>
+      </w:pPr>
+      <w:r>
+        <w:t xml:space="preserve">Singkatan, Normalisasi Istilah, dan Penalaran Temporal</w:t>
+      </w:r>
+    </w:p>
+    <w:p>
+      <w:pPr>
+        <w:rPr>
+          <w:lang w:val="id-ID"/>
+        </w:rPr>
+      </w:pPr>
+      <w:r>
+        <w:rPr>
+          <w:lang w:val="id-ID"/>
+        </w:rPr>
+        <w:t xml:space="preserve">Jafarpour dkk. (2025) menyebut kalimat tidak gramatikal, singkatan, akronim, karakter khusus yang bermakna, negasi, dan salah ketik sesekali sebagai ciri catatan rekam medis elektronik naratif (hlm. 1). Ambiguitas singkatan menjadi salah satu persoalan praktisnya. Wei dkk. (2026) mengubah disambiguasi singkatan klinis dari pembangkitan terbuka menjadi pemilihan terbatas, yaitu model memilih satu ekspansi dari tujuh kandidat yang dibangun lewat dua jalur (hlm. 1). Pada dataset CASI berbahasa Inggris versi bersih buatan Adams, Gemma-2-9B-IT mencapai akurasi 0,9228 dan Macro-F1 0,9279, sedangkan pada versi asli yang memuat lebih banyak derau (</w:t>
       </w:r>
       <w:r>
         <w:rPr>
           <w:i/>
           <w:lang w:val="id-ID"/>
         </w:rPr>
-        <w:t xml:space="preserve">large language model</w:t>
-      </w:r>
-      <w:r>
-        <w:rPr>
-          <w:lang w:val="id-ID"/>
-        </w:rPr>
-        <w:t xml:space="preserve">, LLM), Woo dkk. (2026) menelaah 41 studi penggunaan LLM untuk dokumentasi klinis, terutama pembuatan catatan klinis, ringkasan pulang, dan dokumentasi pertemuan tenaga kesehatan dan pasien (hlm. 1). Sebagian studi melaporkan penghematan waktu hingga 40%, tetapi ketidakakuratan faktual, halusinasi, dan penurunan kinerja pada kasus kompleks sering ditemukan (hlm. 1). Woo dkk. mencontohkan satu studi yang menemukan informasi keliru pada 36% dokumen buatan ChatGPT dan studi lain yang menemukan bahwa ringkasan pulang buatan LLM hanya mengambil 61% isinya dari catatan rawat inap (hlm. 9); kedua angka itu bersifat sekunder karena Woo dkk. mengutipnya dari studi lain. Cakupan kajian ini terbatas: 17 dari 41 studi berasal dari Amerika Serikat (hlm. 4), studi nonbahasa Inggris dikecualikan, dan menurut penulisnya sebagian besar studi dilakukan pada lingkungan terkendali atau simulasi (hlm. 11). Karena objek telaahnya adalah LLM sebagai penulis dokumen, hasil tersebut tidak menunjukkan seberapa andal LLM sebagai pembaca atau pemeriksa dokumen. Hasil itu hanya memperingatkan bahwa keluaran LLM yang berbasis teks klinis dapat memuat kesalahan faktual dan penghilangan informasi.</w:t>
+        <w:t xml:space="preserve">noise</w:t>
+      </w:r>
+      <w:r>
+        <w:rPr>
+          <w:lang w:val="id-ID"/>
+        </w:rPr>
+        <w:t xml:space="preserve">) akurasinya 0,7585 (hlm. 1, 5). Pada model dan dataset bersih yang sama, pembangkitan langsung tanpa tahap seleksi hanya mencapai akurasi 0,6304 (hlm. 7). Penulisnya menyatakan tiga keterbatasan: akurasi bergantung pada inventori makna sehingga istilah di luar inventori dan istilah baru sulit ditangani, seleksi peka terhadap mutu konteks, dan evaluasi hanya memakai satu tolok ukur sehingga korpus klinis nonbahasa Inggris belum diuji (hlm. 9). Kajian itu juga membatasi singkatan pada bentuk pendek berhuruf kapital yang berasal dari huruf atau suku kata awal (hlm. 5).</w:t>
+      </w:r>
+    </w:p>
+    <w:p>
+      <w:pPr>
+        <w:rPr>
+          <w:lang w:val="id-ID"/>
+        </w:rPr>
+      </w:pPr>
+      <w:r>
+        <w:rPr>
+          <w:lang w:val="id-ID"/>
+        </w:rPr>
+        <w:t xml:space="preserve">Normalisasi istilah ke konsep baku berkaitan erat dengan persoalan itu. Chen dkk. (2026) mensurvei </w:t>
+      </w:r>
+      <w:r>
+        <w:rPr>
+          <w:i/>
+          <w:lang w:val="id-ID"/>
+        </w:rPr>
+        <w:t xml:space="preserve">medical concept normalization</w:t>
+      </w:r>
+      <w:r>
+        <w:rPr>
+          <w:lang w:val="id-ID"/>
+        </w:rPr>
+        <w:t xml:space="preserve"> (MCN), yaitu pemetaan frasa medis informal ke konsep baku dalam basis terstandar seperti UMLS, SNOMED CT, atau MeSH (hlm. 1, 4); UMLS memuat ICD (hlm. 6). Untuk subtugas sempit seperti disambiguasi singkatan, aturan dan leksikon eksplisit dinilai masih andal (hlm. 13). Survei yang sama menilai korpus berbahasa Inggris mendominasi penelitian MCN, sedangkan penggabungan sumber multibahasa terhambat oleh pedoman anotasi yang berbeda antarbahasa, granularitas ontologi yang berbeda, dan terjemahan harfiah yang menghilangkan nuansa (hlm. 8).</w:t>
+      </w:r>
+    </w:p>
+    <w:p>
+      <w:pPr>
+        <w:rPr>
+          <w:lang w:val="id-ID"/>
+        </w:rPr>
+      </w:pPr>
+      <w:r>
+        <w:rPr>
+          <w:lang w:val="id-ID"/>
+        </w:rPr>
+        <w:t xml:space="preserve">Penalaran temporal merupakan komponen kunci NLP klinis karena pemahaman riwayat pasien sangat bergantung pada kemampuan mengidentifikasi dan menalar informasi temporal (Olex &amp; McInnes, 2021, hlm. 1). Olex dan McInnes memaparkan lima cara informasi temporal dinyatakan dalam teks menurut Lim dkk., yaitu eksplisit, implisit, relatif, kabur, dan </w:t>
+      </w:r>
+      <w:r>
+        <w:rPr>
+          <w:i/>
+          <w:lang w:val="id-ID"/>
+        </w:rPr>
+        <w:t xml:space="preserve">non-consuming</w:t>
+      </w:r>
+      <w:r>
+        <w:rPr>
+          <w:lang w:val="id-ID"/>
+        </w:rPr>
+        <w:t xml:space="preserve"> (hlm. 2); ungkapan “3 hari lalu” bergantung pada waktu pembuatan dokumen, sedangkan “2 jam setelah minum obat” bergantung pada kejadian lain (hlm. 2). Mereka menyimpulkan bahwa sistem ekstraksi lini masa belum cukup baik untuk praktik klinis; penanganan ungkapan temporal relatif dan implisit termasuk bidang yang memerlukan solusi baru (hlm. 1). Pada tugas bersama (</w:t>
+      </w:r>
+      <w:r>
+        <w:rPr>
+          <w:i/>
+          <w:lang w:val="id-ID"/>
+        </w:rPr>
+        <w:t xml:space="preserve">shared task</w:t>
+      </w:r>
+      <w:r>
+        <w:rPr>
+          <w:lang w:val="id-ID"/>
+        </w:rPr>
+        <w:t xml:space="preserve">) yang mereka tinjau, sistem berbasis aturan terbaik untuk mengenali dan menormalkan ekspresi temporal, sedangkan metode pembelajaran mesin statistik unggul untuk mengenali kejadian dan mengklasifikasi relasi temporal (hlm. 2). Tinjauan itu terbit tahun 2021 dan tidak menyebut LLM. Untuk LLM, Woo dkk. (2026) melaporkan bahwa GPT-4o dalam salah satu studi yang mereka rangkum andal pada konsultasi neurovaskular tetapi kesulitan pada lintasan pasien yang kompleks secara temporal (hlm. 9). Menurut Jafarpour dkk. (2025), yang menelaah deteksi kejadian tidak diharapkan di rumah sakit dengan teks berbahasa Inggris (hlm. 1, 4), ketiadaan informasi temporal dapat membuat model keliru membedakan kejadian sebelum dan selama rawat inap (hlm. 9).</w:t>
       </w:r>
     </w:p>
     <w:p>
@@ -4279,98 +4428,153 @@
         <w:pStyle w:val="Heading3"/>
       </w:pPr>
       <w:r>
-        <w:t xml:space="preserve">Singkatan, Normalisasi Istilah, dan Penalaran Temporal</w:t>
-      </w:r>
-    </w:p>
-    <w:p>
-      <w:pPr>
-        <w:rPr>
-          <w:lang w:val="id-ID"/>
-        </w:rPr>
-      </w:pPr>
-      <w:r>
-        <w:rPr>
-          <w:lang w:val="id-ID"/>
-        </w:rPr>
-        <w:t xml:space="preserve">Jafarpour dkk. (2025) menyebut kalimat tidak gramatikal, singkatan, akronim, karakter khusus yang bermakna, negasi, dan salah ketik sesekali sebagai ciri catatan rekam medis elektronik naratif (hlm. 1). Ambiguitas singkatan menjadi salah satu persoalan praktisnya. Wei dkk. (2026) mengubah disambiguasi singkatan klinis dari pembangkitan terbuka menjadi pemilihan terbatas, yaitu model memilih satu ekspansi dari tujuh kandidat yang dibangun lewat dua jalur (hlm. 1). Pada dataset CASI berbahasa Inggris versi bersih buatan Adams, Gemma-2-9B-IT mencapai akurasi 0,9228 dan Macro-F1 0,9279, sedangkan pada versi asli yang memuat lebih banyak derau (</w:t>
+        <w:t xml:space="preserve">Sintesis dan Celah</w:t>
+      </w:r>
+    </w:p>
+    <w:p>
+      <w:pPr>
+        <w:rPr>
+          <w:lang w:val="id-ID"/>
+        </w:rPr>
+      </w:pPr>
+      <w:r>
+        <w:rPr>
+          <w:lang w:val="id-ID"/>
+        </w:rPr>
+        <w:t xml:space="preserve">Kesepuluh sumber menunjukkan bahwa PLM dan LLM telah luas dipakai pada teks klinis, tetapi bukti yang tersedia memiliki tiga keterbatasan bagi penelitian ini. Pertama, tidak ada sumber yang mengevaluasi teks klinis berbahasa Indonesia, dan sebagian menyebut dominasi bahasa Inggris pada penelitian di bidangnya (Chen dkk., 2026, hlm. 8; Kumar dkk., 2026, hlm. 21). Kedua, bukti tentang LLM pada dokumentasi klinis berpusat pada pembuatan dokumen, bukan pemeriksaan kesesuaian antardokumen (Woo dkk., 2026, hlm. 1), dan hasilnya tidak seragam: halusinasi ditemukan pada 40% ringkasan pulang dalam satu studi (Schwieger dkk., 2024, hlm. 1), sedangkan penilai pada studi lain tidak menemukannya (Mehri dkk., 2026, hlm. 9). Ketiga, hasil disambiguasi singkatan yang dikaji di sini berasal dari satu dataset berbahasa Inggris dan turun dari akurasi 0,9228 menjadi 0,7585 pada versi yang memuat lebih banyak derau (Wei dkk., 2026, hlm. 1, 5, 9). Karena itu, kinerja teknik-teknik ini pada rekam medis rawat inap kebidanan dan anak berbahasa Indonesia tidak dapat diasumsikan dan harus diukur langsung pada data tersebut </w:t>
+      </w:r>
+      <w:r>
+        <w:rPr>
+          <w:highlight w:val="yellow"/>
+          <w:lang w:val="id-ID"/>
+        </w:rPr>
+        <w:t xml:space="preserve">[SESUAIKAN DENGAN BAB I: rumusan pertanyaan dan ukuran keberhasilan]</w:t>
+      </w:r>
+      <w:r>
+        <w:rPr>
+          <w:lang w:val="id-ID"/>
+        </w:rPr>
+        <w:t xml:space="preserve">.</w:t>
+      </w:r>
+    </w:p>
+    <w:p>
+      <w:pPr>
+        <w:pStyle w:val="Heading2"/>
+      </w:pPr>
+      <w:r>
+        <w:t xml:space="preserve">Audit Otomatis Dokumentasi Klinis dan Kode Diagnosis</w:t>
+      </w:r>
+    </w:p>
+    <w:p>
+      <w:pPr>
+        <w:rPr>
+          <w:lang w:val="id-ID"/>
+        </w:rPr>
+      </w:pPr>
+      <w:r>
+        <w:rPr>
+          <w:lang w:val="id-ID"/>
+        </w:rPr>
+        <w:t xml:space="preserve">Subbab ini menelaah enam studi yang memeriksa dokumentasi klinis atau kode diagnosis secara otomatis. Telaah dipusatkan pada jenis ketidaksesuaian yang diuji, cara kinerja diukur, dan batas penerapan hasilnya pada dokumentasi rawat inap kebidanan dan anak.</w:t>
+      </w:r>
+    </w:p>
+    <w:p>
+      <w:pPr>
+        <w:pStyle w:val="Heading3"/>
+      </w:pPr>
+      <w:r>
+        <w:t xml:space="preserve">Model Bahasa Besar sebagai Pemeriksa Dokumentasi</w:t>
+      </w:r>
+    </w:p>
+    <w:p>
+      <w:pPr>
+        <w:rPr>
+          <w:lang w:val="id-ID"/>
+        </w:rPr>
+      </w:pPr>
+      <w:r>
+        <w:rPr>
+          <w:lang w:val="id-ID"/>
+        </w:rPr>
+        <w:t xml:space="preserve">Dietrich dan Stubbert (2026) mengevaluasi empat LLM, yaitu Claude Sonnet 4.5, Gemini 2.5 Pro, GPT-5, dan Grok 4, sebagai pemeriksa catatan pemulangan instalasi gawat darurat (IGD). Data berasal dari 600 kunjungan pada basis data MIMIC-IV-ED. Sebanyak 500 catatan masing-masing disisipi satu kesalahan dari lima kategori, dan 100 catatan lain tidak memuat kesalahan (hlm. 95–96). Keempat model menerima perintah sistem (</w:t>
       </w:r>
       <w:r>
         <w:rPr>
           <w:i/>
           <w:lang w:val="id-ID"/>
         </w:rPr>
-        <w:t xml:space="preserve">noise</w:t>
-      </w:r>
-      <w:r>
-        <w:rPr>
-          <w:lang w:val="id-ID"/>
-        </w:rPr>
-        <w:t xml:space="preserve">) akurasinya 0,7585 (hlm. 1, 5). Pada model dan dataset bersih yang sama, pembangkitan langsung tanpa tahap seleksi hanya mencapai akurasi 0,6304 (hlm. 7). Penulisnya menyatakan tiga keterbatasan: akurasi bergantung pada inventori makna sehingga istilah di luar inventori dan istilah baru sulit ditangani, seleksi peka terhadap mutu konteks, dan evaluasi hanya memakai satu tolok ukur sehingga korpus klinis nonbahasa Inggris belum diuji (hlm. 9). Kajian itu juga membatasi singkatan pada bentuk pendek berhuruf kapital yang berasal dari huruf atau suku kata awal (hlm. 5).</w:t>
-      </w:r>
-    </w:p>
-    <w:p>
-      <w:pPr>
-        <w:rPr>
-          <w:lang w:val="id-ID"/>
-        </w:rPr>
-      </w:pPr>
-      <w:r>
-        <w:rPr>
-          <w:lang w:val="id-ID"/>
-        </w:rPr>
-        <w:t xml:space="preserve">Normalisasi istilah ke konsep baku berkaitan erat dengan persoalan itu. Chen dkk. (2026) mensurvei </w:t>
+        <w:t xml:space="preserve">prompt</w:t>
+      </w:r>
+      <w:r>
+        <w:rPr>
+          <w:lang w:val="id-ID"/>
+        </w:rPr>
+        <w:t xml:space="preserve">) yang sama, berisi definisi kelima kategori dan kriteria klasifikasi positif maupun negatif (hlm. 97). Akurasi deteksi kesalahan apa pun berkisar 93,2–94,2%, presisi 98,3–99,1%, dan spesifisitas 92,0–96,0% (hlm. 98). Kinerja berbeda menurut kategori. Ketidaksesuaian identitas atau waktu kunjungan serta kesalahan obat dan alergi terdeteksi dengan F1 ≥0,96, sedangkan ketidaksesuaian antara tanda vital atau pemeriksaan fisik dan interpretasi naratif paling sulit, dengan F1 0,75–0,84 yang terutama disebabkan oleh rendahnya </w:t>
       </w:r>
       <w:r>
         <w:rPr>
           <w:i/>
           <w:lang w:val="id-ID"/>
         </w:rPr>
-        <w:t xml:space="preserve">medical concept normalization</w:t>
-      </w:r>
-      <w:r>
-        <w:rPr>
-          <w:lang w:val="id-ID"/>
-        </w:rPr>
-        <w:t xml:space="preserve"> (MCN), yaitu pemetaan frasa medis informal ke konsep baku dalam basis terstandar seperti UMLS, SNOMED CT, atau MeSH (hlm. 1, 4); UMLS memuat ICD (hlm. 6). Untuk subtugas sempit seperti disambiguasi singkatan, aturan dan leksikon eksplisit dinilai masih andal (hlm. 13). Survei yang sama menilai korpus berbahasa Inggris mendominasi penelitian MCN, sedangkan penggabungan sumber multibahasa terhambat oleh pedoman anotasi yang berbeda antarbahasa, granularitas ontologi yang berbeda, dan terjemahan harfiah yang menghilangkan nuansa (hlm. 8).</w:t>
-      </w:r>
-    </w:p>
-    <w:p>
-      <w:pPr>
-        <w:rPr>
-          <w:lang w:val="id-ID"/>
-        </w:rPr>
-      </w:pPr>
-      <w:r>
-        <w:rPr>
-          <w:lang w:val="id-ID"/>
-        </w:rPr>
-        <w:t xml:space="preserve">Penalaran temporal merupakan komponen kunci NLP klinis karena pemahaman riwayat pasien sangat bergantung pada kemampuan mengidentifikasi dan menalar informasi temporal (Olex &amp; McInnes, 2021, hlm. 1). Olex dan McInnes memaparkan lima cara informasi temporal dinyatakan dalam teks menurut Lim dkk., yaitu eksplisit, implisit, relatif, kabur, dan </w:t>
+        <w:t xml:space="preserve">recall</w:t>
+      </w:r>
+      <w:r>
+        <w:rPr>
+          <w:lang w:val="id-ID"/>
+        </w:rPr>
+        <w:t xml:space="preserve"> (hlm. 98).</w:t>
+      </w:r>
+    </w:p>
+    <w:p>
+      <w:pPr>
+        <w:rPr>
+          <w:lang w:val="id-ID"/>
+        </w:rPr>
+      </w:pPr>
+      <w:r>
+        <w:rPr>
+          <w:lang w:val="id-ID"/>
+        </w:rPr>
+        <w:t xml:space="preserve">Rancangan itu membatasi cakupan kesimpulannya. Kesalahan disisipkan oleh peneliti, bukan muncul secara alami, dan seluruh data berasal dari satu institusi (hlm. 100). Setiap catatan hanya memuat satu kesalahan, dan catatan yang dinilai adalah satu dokumen yang disusun dari elemen data terstruktur kunjungan (hlm. 96). Karena 500 dari 600 catatan memuat kesalahan (hlm. 95), presisi yang tinggi itu tidak dapat langsung dipindahkan ke populasi dengan proporsi ketidaksesuaian yang lebih rendah. Penulis sendiri menyebut kerangka audit berbasis agen yang mengambil pedoman dan memeriksa konsistensi lintas dokumen sebagai arah penelitian lanjutan (hlm. 100).</w:t>
+      </w:r>
+    </w:p>
+    <w:p>
+      <w:pPr>
+        <w:rPr>
+          <w:lang w:val="id-ID"/>
+        </w:rPr>
+      </w:pPr>
+      <w:r>
+        <w:rPr>
+          <w:lang w:val="id-ID"/>
+        </w:rPr>
+        <w:t xml:space="preserve">Skrabic dkk. (2026) menguji tiga model penalaran, yaitu o3, DeepSeek-v3-R1, dan GPT-OSS-120B, sebagai pemeriksa kedua (</w:t>
       </w:r>
       <w:r>
         <w:rPr>
           <w:i/>
           <w:lang w:val="id-ID"/>
         </w:rPr>
-        <w:t xml:space="preserve">non-consuming</w:t>
-      </w:r>
-      <w:r>
-        <w:rPr>
-          <w:lang w:val="id-ID"/>
-        </w:rPr>
-        <w:t xml:space="preserve"> (hlm. 2); ungkapan “3 hari lalu” bergantung pada waktu pembuatan dokumen, sedangkan “2 jam setelah minum obat” bergantung pada kejadian lain (hlm. 2). Mereka menyimpulkan bahwa sistem ekstraksi lini masa belum cukup baik untuk praktik klinis; penanganan ungkapan temporal relatif dan implisit termasuk bidang yang memerlukan solusi baru (hlm. 1). Pada tugas bersama (</w:t>
+        <w:t xml:space="preserve">second reviewer</w:t>
+      </w:r>
+      <w:r>
+        <w:rPr>
+          <w:lang w:val="id-ID"/>
+        </w:rPr>
+        <w:t xml:space="preserve">) pada 102 laporan unit gawat darurat penyakit dalam yang identitasnya telah dihapus (hlm. 1–2). Dua dokter spesialis menyisipkan 99 kesalahan yang realistis dan menandai tiga kesalahan yang sudah ada dalam laporan asli (hlm. 2). Model menerima satu perintah seragam tanpa pengambilan referensi atau pemanggilan fungsi (hlm. 3). Model menemukan lokasi kesalahan dengan benar pada 65,7–79,2% laporan, sedangkan tiga dokter pembanding, yang masing-masing meninjau sepertiga kasus, menemukan 48,0% (hlm. 4). Kategori diagnostik dan pemeriksaan penunjang paling sulit bagi ketiga model (hlm. 4). Selain itu, hampir semua laporan memperoleh isu tambahan yang dinilai berguna secara klinis. Penulis mengingatkan risiko kelelahan terhadap peringatan (</w:t>
       </w:r>
       <w:r>
         <w:rPr>
           <w:i/>
           <w:lang w:val="id-ID"/>
         </w:rPr>
-        <w:t xml:space="preserve">shared task</w:t>
-      </w:r>
-      <w:r>
-        <w:rPr>
-          <w:lang w:val="id-ID"/>
-        </w:rPr>
-        <w:t xml:space="preserve">) yang mereka tinjau, sistem berbasis aturan terbaik untuk mengenali dan menormalkan ekspresi temporal, sedangkan metode pembelajaran mesin statistik unggul untuk mengenali kejadian dan mengklasifikasi relasi temporal (hlm. 2). Tinjauan itu terbit tahun 2021 dan tidak menyebut LLM. Untuk LLM, Woo dkk. (2026) melaporkan bahwa GPT-4o dalam salah satu studi yang mereka rangkum andal pada konsultasi neurovaskular tetapi kesulitan pada lintasan pasien yang kompleks secara temporal (hlm. 9). Teks panjang menambah kesulitan: menurut Jafarpour dkk. (2025), yang menelaah deteksi kejadian tidak diharapkan di rumah sakit dengan teks berbahasa Inggris (hlm. 1, 4), laporan naratif sering melampaui batas masukan model seperti BERT, yang memproses maksimum 512 kata sekaligus. Informasi penting dapat hilang atau terpecah, dan ketiadaan informasi temporal dapat membuat model keliru membedakan kejadian sebelum dan selama rawat inap (hlm. 9).</w:t>
+        <w:t xml:space="preserve">alert fatigue</w:t>
+      </w:r>
+      <w:r>
+        <w:rPr>
+          <w:lang w:val="id-ID"/>
+        </w:rPr>
+        <w:t xml:space="preserve">) bila isu itu tidak diprioritaskan (hlm. 5). Studi ini tidak menyertakan catatan tanpa kesalahan sehingga perilaku positif palsu belum dapat dipastikan, dan datanya berasal dari satu pusat layanan (hlm. 6).</w:t>
       </w:r>
     </w:p>
     <w:p>
@@ -4378,6 +4582,366 @@
         <w:pStyle w:val="Heading3"/>
       </w:pPr>
       <w:r>
+        <w:t xml:space="preserve">Audit Label Diagnosis dan Kesesuaian Kode dengan Catatan Klinis</w:t>
+      </w:r>
+    </w:p>
+    <w:p>
+      <w:pPr>
+        <w:rPr>
+          <w:lang w:val="id-ID"/>
+        </w:rPr>
+      </w:pPr>
+      <w:r>
+        <w:rPr>
+          <w:lang w:val="id-ID"/>
+        </w:rPr>
+        <w:t xml:space="preserve">Du dkk. (2026) memeriksa label diagnosis, bukan kesalahan yang disisipkan. Penelitian itu mengubah klasifikasi multilabel kode diagnosis psikiatri menjadi tugas tanya jawab dan menambahkan deskripsi serta penjelasan kode ke masukan model (hlm. 1, 4). Data berupa 48.492 rekam dari 7.000 pasien di satu klinik psikiatri (hlm. 3, 12), sebagian dikonversi melalui pengenalan karakter optik (</w:t>
+      </w:r>
+      <w:r>
+        <w:rPr>
+          <w:i/>
+          <w:lang w:val="id-ID"/>
+        </w:rPr>
+        <w:t xml:space="preserve">optical character recognition</w:t>
+      </w:r>
+      <w:r>
+        <w:rPr>
+          <w:lang w:val="id-ID"/>
+        </w:rPr>
+        <w:t xml:space="preserve">, OCR) (hlm. 3). Model tanya jawab berbasis BART yang diperkaya penjelasan kode memperoleh sum-F1, yaitu ukuran F1 berbasis ROUGE rancangan penulis (hlm. 6), sebesar 0,7417. Nilai itu terbaik di antara model yang dibandingkan, tetapi hanya 0,013 di atas BERT yang diperkaya penjelasan kode (0,7287), sedangkan Llama 3.3 yang dijalankan tanpa pelatihan tambahan (</w:t>
+      </w:r>
+      <w:r>
+        <w:rPr>
+          <w:i/>
+          <w:lang w:val="id-ID"/>
+        </w:rPr>
+        <w:t xml:space="preserve">zero-shot</w:t>
+      </w:r>
+      <w:r>
+        <w:rPr>
+          <w:lang w:val="id-ID"/>
+        </w:rPr>
+        <w:t xml:space="preserve">) hanya mencapai 0,3785 (hlm. 8). Selisih antara kode klinisi dan keluaran model dikelompokkan menjadi tiga tingkat risiko untuk menentukan kasus yang perlu ditinjau manusia (hlm. 7).</w:t>
+      </w:r>
+    </w:p>
+    <w:p>
+      <w:pPr>
+        <w:rPr>
+          <w:lang w:val="id-ID"/>
+        </w:rPr>
+      </w:pPr>
+      <w:r>
+        <w:rPr>
+          <w:lang w:val="id-ID"/>
+        </w:rPr>
+        <w:t xml:space="preserve">Keterbatasan studi ini menentukan kegunaannya sebagai acuan. Acuan penilaiannya adalah diagnosis yang dicatat klinisi, yang menurut penulis dapat mengandung derau (</w:t>
+      </w:r>
+      <w:r>
+        <w:rPr>
+          <w:i/>
+          <w:lang w:val="id-ID"/>
+        </w:rPr>
+        <w:t xml:space="preserve">label noise</w:t>
+      </w:r>
+      <w:r>
+        <w:rPr>
+          <w:lang w:val="id-ID"/>
+        </w:rPr>
+        <w:t xml:space="preserve">), tidak stabil dari waktu ke waktu, dan dipengaruhi tuntutan penagihan serta dokumentasi; derau itu tidak dimodelkan secara eksplisit (hlm. 12). Tingkat risikonya bersifat heuristik dan disusun tanpa keterlibatan psikiater, sedangkan mutu penjelasan model tidak dinilai klinisi (hlm. 13). Pengetahuan acuan yang dimasukkan pun statis, yaitu deskripsi sepuluh kelompok kode yang selalu ditambahkan dalam urutan tetap (hlm. 5), bukan referensi yang diambil sesuai kasus.</w:t>
+      </w:r>
+    </w:p>
+    <w:p>
+      <w:pPr>
+        <w:rPr>
+          <w:lang w:val="id-ID"/>
+        </w:rPr>
+      </w:pPr>
+      <w:r>
+        <w:rPr>
+          <w:lang w:val="id-ID"/>
+        </w:rPr>
+        <w:t xml:space="preserve">Mwogosi dan Mambile (2026) menelaah dari sisi lain, yaitu kesesuaian kode ICD dalam rekam medis elektronik dengan acuan klinis. Tinjauan sistematis dan metaanalisis ini merangkum 17 studi validasi (hlm. 1). Spesifisitas dan nilai prediktif positif kode konsisten tinggi, sering melebihi 90%, tetapi sensitivitas rata-rata hanya 64,5%, dengan catatan sebagian estimasi memakai prevalensi pengodean sebagai proksi sensitivitas (hlm. 1). Penulis menyimpulkan bahwa pendekatan hibrida yang menggabungkan kode, data klinis, dan narasi diperlukan (hlm. 1), tetapi acuan validasinya, yaitu penelusuran rekam medis, juga dapat bias akibat penyalinan teks dan terbawanya diagnosis usang (hlm. 11). Seluruh studi yang ditinjau berasal dari negara berpenghasilan tinggi (hlm. 4–5).</w:t>
+      </w:r>
+    </w:p>
+    <w:p>
+      <w:pPr>
+        <w:pStyle w:val="Heading3"/>
+      </w:pPr>
+      <w:r>
+        <w:t xml:space="preserve">Pengodean ICD Otomatis dan Ketahanannya terhadap Variasi Teks</w:t>
+      </w:r>
+    </w:p>
+    <w:p>
+      <w:pPr>
+        <w:rPr>
+          <w:lang w:val="id-ID"/>
+        </w:rPr>
+      </w:pPr>
+      <w:r>
+        <w:rPr>
+          <w:lang w:val="id-ID"/>
+        </w:rPr>
+        <w:t xml:space="preserve">Hou dkk. (2024) menyatakan bahwa pengodean otomatis umumnya diperlakukan sebagai klasifikasi teks multilabel, yaitu menetapkan kode ICD pada dokumen klinis (hlm. 1). Mereka memakai Clinical-Longformer, penyandi (</w:t>
+      </w:r>
+      <w:r>
+        <w:rPr>
+          <w:i/>
+          <w:lang w:val="id-ID"/>
+        </w:rPr>
+        <w:t xml:space="preserve">encoder</w:t>
+      </w:r>
+      <w:r>
+        <w:rPr>
+          <w:lang w:val="id-ID"/>
+        </w:rPr>
+        <w:t xml:space="preserve">) yang dapat memproses hingga 4.096 token, untuk dokumen panjang, serta mekanisme perhatian per label (</w:t>
+      </w:r>
+      <w:r>
+        <w:rPr>
+          <w:i/>
+          <w:lang w:val="id-ID"/>
+        </w:rPr>
+        <w:t xml:space="preserve">label-wise attention</w:t>
+      </w:r>
+      <w:r>
+        <w:rPr>
+          <w:lang w:val="id-ID"/>
+        </w:rPr>
+        <w:t xml:space="preserve">) agar prediksi dapat diinterpretasi (hlm. 1–2). Pada 50 kode ICD-9 teratas di MIMIC-III, model memperoleh F1 makro 0,688 dan F1 mikro 0,727 (hlm. 2). Penulis menempatkan model ini sebagai alat bantu bagi pemberi kode (hlm. 1–2). Mereka menilai pendekatan berbasis aturan kurang fleksibel dan sulit diperluas karena aturan dapat saling bertentangan seiring bertambahnya kode (hlm. 2).</w:t>
+      </w:r>
+    </w:p>
+    <w:p>
+      <w:pPr>
+        <w:rPr>
+          <w:lang w:val="id-ID"/>
+        </w:rPr>
+      </w:pPr>
+      <w:r>
+        <w:rPr>
+          <w:lang w:val="id-ID"/>
+        </w:rPr>
+        <w:t xml:space="preserve">Jaganathan dkk. (2025) menguji ketahanan model pengode ICD, yaitu PLM-ICD, dengan pengujian metamorfik (</w:t>
+      </w:r>
+      <w:r>
+        <w:rPr>
+          <w:i/>
+          <w:lang w:val="id-ID"/>
+        </w:rPr>
+        <w:t xml:space="preserve">metamorphic testing</w:t>
+      </w:r>
+      <w:r>
+        <w:rPr>
+          <w:lang w:val="id-ID"/>
+        </w:rPr>
+        <w:t xml:space="preserve">). Catatan diubah secara sederhana, lalu daftar kode keluarannya dibandingkan dengan keluaran catatan asli. Pada 3.372 catatan uji MIMIC-III, penggantian akronim, penghapusan kata, dan salah ketik menyebabkan perbedaan pada lima kode teratas di 70–81% catatan (hlm. 4); penggantian dua puluh akronim yang paling sering muncul mencapai 80,7% (hlm. 5). Kriteria kegagalannya ketat, yaitu setiap perbedaan pada himpunan lima kode teratas (hlm. 4), sehingga angka itu menunjukkan ketidakstabilan keluaran, bukan persentase kode yang salah. Hanya satu aplikasi yang dapat diuji (hlm. 3).</w:t>
+      </w:r>
+    </w:p>
+    <w:p>
+      <w:pPr>
+        <w:pStyle w:val="Heading3"/>
+      </w:pPr>
+      <w:r>
+        <w:t xml:space="preserve">Sintesis dan Posisi Penelitian</w:t>
+      </w:r>
+    </w:p>
+    <w:p>
+      <w:pPr>
+        <w:rPr>
+          <w:lang w:val="id-ID"/>
+        </w:rPr>
+      </w:pPr>
+      <w:r>
+        <w:rPr>
+          <w:lang w:val="id-ID"/>
+        </w:rPr>
+        <w:t xml:space="preserve">Dua studi yang membedakan kategori kesalahan menunjukkan pola yang sama: pemeriksaan otomatis lebih baik pada kesalahan eksplisit dalam satu dokumen daripada pada kesalahan yang menuntut penilaian klinis. Pada Dietrich dan Stubbert (2026, hlm. 98), ketidaksesuaian temuan klinis memiliki </w:t>
+      </w:r>
+      <w:r>
+        <w:rPr>
+          <w:i/>
+          <w:lang w:val="id-ID"/>
+        </w:rPr>
+        <w:t xml:space="preserve">recall</w:t>
+      </w:r>
+      <w:r>
+        <w:rPr>
+          <w:lang w:val="id-ID"/>
+        </w:rPr>
+        <w:t xml:space="preserve"> terendah, dan pada Skrabic dkk. (2026, hlm. 4), kategori diagnostik dan pemeriksaan penunjang paling sulit. Kategori sejenis, misalnya diagnosis yang tidak sejalan dengan catatan harian, termasuk yang direncanakan ditangani komponen AI/NLP dalam penelitian ini </w:t>
+      </w:r>
+      <w:r>
+        <w:rPr>
+          <w:highlight w:val="yellow"/>
+          <w:lang w:val="id-ID"/>
+        </w:rPr>
+        <w:t xml:space="preserve">[SESUAIKAN DENGAN BAB I]</w:t>
+      </w:r>
+      <w:r>
+        <w:rPr>
+          <w:lang w:val="id-ID"/>
+        </w:rPr>
+        <w:t xml:space="preserve">.</w:t>
+      </w:r>
+    </w:p>
+    <w:p>
+      <w:pPr>
+        <w:rPr>
+          <w:lang w:val="id-ID"/>
+        </w:rPr>
+      </w:pPr>
+      <w:r>
+        <w:rPr>
+          <w:lang w:val="id-ID"/>
+        </w:rPr>
+        <w:t xml:space="preserve">Bukti tentang positif palsu (</w:t>
+      </w:r>
+      <w:r>
+        <w:rPr>
+          <w:i/>
+          <w:lang w:val="id-ID"/>
+        </w:rPr>
+        <w:t xml:space="preserve">false positive</w:t>
+      </w:r>
+      <w:r>
+        <w:rPr>
+          <w:lang w:val="id-ID"/>
+        </w:rPr>
+        <w:t xml:space="preserve">) belum seragam. Hanya Dietrich dan Stubbert (2026, hlm. 95) menyertakan catatan tanpa kesalahan, sebanyak 100 catatan. Skrabic dkk. (2026, hlm. 6) tidak menyertakannya, dan Du dkk. (2026, hlm. 7, 12) menilai selisih terhadap label klinisi yang sendiri dapat mengandung derau. Karena itu, angka presisi dari ketiga studi tidak sebanding. Ketidakstabilan satu model klasifikasi kode terhadap akronim dan salah ketik (Jaganathan dkk., 2025, hlm. 4–5) juga menunjukkan bahwa ketahanan terhadap variasi penulisan, termasuk singkatan lokal, perlu diuji secara khusus, meskipun hasilnya belum tentu berlaku bagi LLM.</w:t>
+      </w:r>
+    </w:p>
+    <w:p>
+      <w:pPr>
+        <w:rPr>
+          <w:lang w:val="id-ID"/>
+        </w:rPr>
+      </w:pPr>
+      <w:r>
+        <w:rPr>
+          <w:lang w:val="id-ID"/>
+        </w:rPr>
+        <w:t xml:space="preserve">Di antara keenam studi, tidak ada yang melaporkan data dari Indonesia, membandingkan catatan perkembangan harian dengan ringkasan akhir dalam satu episode rawat inap, atau mengambil pedoman sesuai kasus sebagai dasar temuan. Akibatnya, angka kinerja yang dilaporkan tidak dapat dipindahkan begitu saja ke dokumentasi rawat inap kebidanan dan anak di Indonesia. Kinerja itu harus diukur ulang dengan menyertakan dokumen tanpa ketidaksesuaian agar positif palsu dapat dihitung.</w:t>
+      </w:r>
+    </w:p>
+    <w:p>
+      <w:pPr>
+        <w:pStyle w:val="Heading2"/>
+      </w:pPr>
+      <w:r>
+        <w:t xml:space="preserve">Pendekatan Hibrida Berbasis Aturan dan AI/NLP</w:t>
+      </w:r>
+    </w:p>
+    <w:p>
+      <w:pPr>
+        <w:pStyle w:val="Heading3"/>
+      </w:pPr>
+      <w:r>
+        <w:t xml:space="preserve">Kekuatan dan Batas Sistem Berbasis Aturan</w:t>
+      </w:r>
+    </w:p>
+    <w:p>
+      <w:pPr>
+        <w:rPr>
+          <w:lang w:val="id-ID"/>
+        </w:rPr>
+      </w:pPr>
+      <w:r>
+        <w:rPr>
+          <w:lang w:val="id-ID"/>
+        </w:rPr>
+        <w:t xml:space="preserve">Kumar dkk. (2026) menilai sistem berbasis aturan (</w:t>
+      </w:r>
+      <w:r>
+        <w:rPr>
+          <w:i/>
+          <w:lang w:val="id-ID"/>
+        </w:rPr>
+        <w:t xml:space="preserve">rule-based</w:t>
+      </w:r>
+      <w:r>
+        <w:rPr>
+          <w:lang w:val="id-ID"/>
+        </w:rPr>
+        <w:t xml:space="preserve">) dan hibrida layak dipakai di layanan kesehatan karena transparan dan dapat ditafsirkan (hlm. 12). Keunggulan utama sistem berbasis aturan ialah hasilnya dapat diprediksi dan mudah divalidasi, terutama pada kondisi klinis yang diatur regulasi (hlm. 12). Kelemahannya, menurut Kumar dkk., sistem itu tidak dapat diskalakan lintas institusi dan spesialisasi karena perbedaan bahasa klinis harus dipelihara secara manual, dan kinerjanya umumnya buruk pada dataset baru atau kebiasaan dokumentasi yang berubah (hlm. 12). Karena itu, sistem tersebut paling cocok untuk tugas berlingkup kecil atau sebagai bagian dari </w:t>
+      </w:r>
+      <w:r>
+        <w:rPr>
+          <w:i/>
+          <w:lang w:val="id-ID"/>
+        </w:rPr>
+        <w:t xml:space="preserve">pipeline</w:t>
+      </w:r>
+      <w:r>
+        <w:rPr>
+          <w:lang w:val="id-ID"/>
+        </w:rPr>
+        <w:t xml:space="preserve"> hibrida, bukan sebagai solusi tunggal (hlm. 12). Chen dkk. (2026) sejalan dengan itu: aturan dan leksikon eksplisit masih efektif untuk subtugas sempit seperti disambiguasi singkatan (hlm. 13).</w:t>
+      </w:r>
+    </w:p>
+    <w:p>
+      <w:pPr>
+        <w:rPr>
+          <w:lang w:val="id-ID"/>
+        </w:rPr>
+      </w:pPr>
+      <w:r>
+        <w:rPr>
+          <w:lang w:val="id-ID"/>
+        </w:rPr>
+        <w:t xml:space="preserve">Domingues (2026) menunjukkan sisi keterlacakan sistem berbasis aturan lewat OnCATs, sistem pendukung keputusan klinis untuk kanker prostat yang mengubah 23 pedoman internasional menjadi 1.236 aturan dalam format JSON (hlm. 1, 2). Setiap rekomendasi disertai jejak pembenaran yang menyebut aturan dan sumber pedoman yang aktif (hlm. 2). Sistem itu diuji pada sepuluh laporan kasus terbitan, dan penulisnya menyebut pengujian itu sebagai uji kelayakan teknis, bukan validasi klinis (hlm. 3, 5). Penulis memperingatkan bahwa pembaruan basis pengetahuan secara manual berisiko tertinggal dari praktik klinis (hlm. 7). Meskipun judul artikelnya menyebut metode berbasis aturan dan AI, yang diuji hanya lapisan berbasis aturan; penulis sendiri menyebut sistemnya "</w:t>
+      </w:r>
+      <w:r>
+        <w:rPr>
+          <w:i/>
+          <w:lang w:val="id-ID"/>
+        </w:rPr>
+        <w:t xml:space="preserve">hybrid-ready</w:t>
+      </w:r>
+      <w:r>
+        <w:rPr>
+          <w:lang w:val="id-ID"/>
+        </w:rPr>
+        <w:t xml:space="preserve">", dengan modul pembelajaran mesin baru direncanakan (hlm. 2). Artikel ini karenanya tidak memberi bukti tentang kinerja sistem hibrida, dan domainnya ialah pedoman terapi onkologi, bukan audit dokumentasi.</w:t>
+      </w:r>
+    </w:p>
+    <w:p>
+      <w:pPr>
+        <w:pStyle w:val="Heading3"/>
+      </w:pPr>
+      <w:r>
+        <w:t xml:space="preserve">Pola Hibrida dan Bukti yang Tersedia</w:t>
+      </w:r>
+    </w:p>
+    <w:p>
+      <w:pPr>
+        <w:rPr>
+          <w:lang w:val="id-ID"/>
+        </w:rPr>
+      </w:pPr>
+      <w:r>
+        <w:rPr>
+          <w:lang w:val="id-ID"/>
+        </w:rPr>
+        <w:t xml:space="preserve">Ijadi Maghsoodi dkk. (2026) menyusun tinjauan naratif kritis atas 101 sumber yang dipilih dari 3.892 rekaman, dengan fokus pada sistem hibrida yang lapisan simboliknya, yaitu aturan, ontologi, atau batasan, disusun atau disetujui pemangku kepentingan (hlm. 1, 4). Salah satu dari setidaknya lima pola rancangan yang mereka identifikasi ialah ekstraksi saraf disertai validasi simbolik, tempat pemeriksaan konsistensi dan aturan dokumentasi memvalidasi keluaran model NLP atau model fondasi untuk abstraksi laporan, pengodean, dan pencatatan registri (hlm. 5). Tinjauan itu menyimpulkan bahwa desain hibrida tampak paling kredibel pada situasi yang terikat aturan, peka terhadap audit, dan bergantung pada alur kerja, termasuk validasi dokumentasi (hlm. 1), serta bahwa bukti empiris lebih kuat untuk tugas terbatas seperti validasi laporan dan ekstraksi informasi daripada untuk klaim yang ambisius tentang penalaran klinis, kalibrasi kepercayaan, atau perbaikan luaran pasien (hlm. 7). Untuk dokumentasi buatan model generatif, penulisnya berargumen bahwa validasi hibrida dapat menegakkan elemen wajib dan mendeteksi inkonsistensi (hlm. 7); ini argumen konseptual, bukan hasil uji.</w:t>
+      </w:r>
+    </w:p>
+    <w:p>
+      <w:pPr>
+        <w:rPr>
+          <w:lang w:val="id-ID"/>
+        </w:rPr>
+      </w:pPr>
+      <w:r>
+        <w:rPr>
+          <w:lang w:val="id-ID"/>
+        </w:rPr>
+        <w:t xml:space="preserve">Penulisnya sendiri membatasi kesimpulan itu. Basis empiris masih terbatas dan bukti prospektif jarang (hlm. 1), dan klaim tentang dampak pada mutu keputusan sebaiknya dibaca sebagai pembangkit hipotesis, bukan temuan konfirmatif (hlm. 6). Lapisan simbolik menimbulkan beban akuisisi pengetahuan, ketidakselarasan ontologi, konflik aturan, dan pemeliharaan (hlm. 1, 9). Proses penyaringan tinjauan itu mengecualikan rekaman nonbahasa Inggris (hlm. 2), dan literaturnya terkonsentrasi pada sistem kesehatan berpendapatan tinggi dan matang secara digital (hlm. 9).</w:t>
+      </w:r>
+    </w:p>
+    <w:p>
+      <w:pPr>
+        <w:pStyle w:val="Heading3"/>
+      </w:pPr>
+      <w:r>
         <w:t xml:space="preserve">Sintesis dan Celah</w:t>
       </w:r>
     </w:p>
@@ -4391,13 +4955,26 @@
         <w:rPr>
           <w:lang w:val="id-ID"/>
         </w:rPr>
-        <w:t xml:space="preserve">Kedelapan sumber menunjukkan bahwa PLM dan LLM telah luas dipakai pada teks klinis, tetapi bukti yang tersedia memiliki tiga keterbatasan bagi penelitian ini. Pertama, tidak ada sumber yang mengevaluasi teks klinis berbahasa Indonesia, dan sebagian menyebut dominasi bahasa Inggris pada penelitian di bidangnya (Chen dkk., 2026, hlm. 8; Kumar dkk., 2026, hlm. 21). Kedua, bukti tentang LLM pada dokumentasi klinis berpusat pada pembuatan dokumen, bukan pemeriksaan kesesuaian antardokumen (Woo dkk., 2026, hlm. 1), dan keandalannya dilaporkan menurun pada kasus kompleks. Ketiga, hasil disambiguasi singkatan yang dikaji di sini berasal dari satu dataset berbahasa Inggris dan turun dari akurasi 0,9228 menjadi 0,7585 pada versi yang memuat lebih banyak derau (Wei dkk., 2026, hlm. 1, 5, 9). Karena itu, kinerja teknik-teknik ini pada rekam medis rawat inap kebidanan dan anak berbahasa Indonesia tidak dapat diasumsikan dan harus diukur langsung pada data tersebut </w:t>
+        <w:t xml:space="preserve">Sumber-sumber di atas mendukung dua hal yang terbatas: sistem berbasis aturan unggul dalam penelusuran dan validasi tetapi mahal dipelihara, dan kombinasi dengan komponen pembelajaran dinilai paling kredibel untuk validasi dokumentasi menurut satu tinjauan naratif. Keterbatasannya ada tiga. Pertama, di antara sumber yang dibaca, tidak ada yang membandingkan konfigurasi aturan saja dengan aturan ditambah AI/NLP pada audit dokumentasi klinis; satu-satunya sistem yang diuji (Domingues, 2026) hanya berbasis aturan, di bidang onkologi, pada sepuluh kasus. Kedua, dukungan terkuat untuk validasi dokumentasi bersifat konseptual (Ijadi Maghsoodi dkk., 2026, hlm. 7). Ketiga, tidak ada sumber yang menyangkut aturan atau dokumen klaim berbahasa Indonesia. Satu artikel pada daftar sumber, yang judulnya menyebut model hibrida pembelajaran mesin dan sistem pakar untuk identifikasi pemotongan klaim asuransi, belum dapat dibaca karena berkasnya tidak tersedia </w:t>
       </w:r>
       <w:r>
         <w:rPr>
           <w:highlight w:val="yellow"/>
           <w:lang w:val="id-ID"/>
         </w:rPr>
+        <w:t xml:space="preserve">[PERLU VERIFIKASI SUMBER]</w:t>
+      </w:r>
+      <w:r>
+        <w:rPr>
+          <w:lang w:val="id-ID"/>
+        </w:rPr>
+        <w:t xml:space="preserve">. Pembagian kerja antara aturan dan AI/NLP pada penelitian ini karenanya merupakan pilihan rancangan yang perlu dibenarkan lewat perbandingan konfigurasi aturan saja dengan aturan ditambah AI/NLP </w:t>
+      </w:r>
+      <w:r>
+        <w:rPr>
+          <w:highlight w:val="yellow"/>
+          <w:lang w:val="id-ID"/>
+        </w:rPr>
         <w:t xml:space="preserve">[SESUAIKAN DENGAN BAB I: rumusan pertanyaan dan ukuran keberhasilan]</w:t>
       </w:r>
       <w:r>
@@ -4412,20 +4989,7 @@
         <w:pStyle w:val="Heading2"/>
       </w:pPr>
       <w:r>
-        <w:t xml:space="preserve">Audit Otomatis Dokumentasi Klinis dan Kode Diagnosis</w:t>
-      </w:r>
-    </w:p>
-    <w:p>
-      <w:pPr>
-        <w:rPr>
-          <w:lang w:val="id-ID"/>
-        </w:rPr>
-      </w:pPr>
-      <w:r>
-        <w:rPr>
-          <w:lang w:val="id-ID"/>
-        </w:rPr>
-        <w:t xml:space="preserve">Subbab ini menelaah enam studi yang memeriksa dokumentasi klinis atau kode diagnosis secara otomatis. Telaah dipusatkan pada jenis ketidaksesuaian yang diuji, cara kinerja diukur, dan batas penerapan hasilnya pada dokumentasi rawat inap kebidanan dan anak.</w:t>
+        <w:t xml:space="preserve">RAG, Penjangkaran Bukti, dan Halusinasi</w:t>
       </w:r>
     </w:p>
     <w:p>
@@ -4433,98 +4997,337 @@
         <w:pStyle w:val="Heading3"/>
       </w:pPr>
       <w:r>
-        <w:t xml:space="preserve">Model Bahasa Besar sebagai Pemeriksa Dokumentasi</w:t>
-      </w:r>
-    </w:p>
-    <w:p>
-      <w:pPr>
-        <w:rPr>
-          <w:lang w:val="id-ID"/>
-        </w:rPr>
-      </w:pPr>
-      <w:r>
-        <w:rPr>
-          <w:lang w:val="id-ID"/>
-        </w:rPr>
-        <w:t xml:space="preserve">Dietrich dan Stubbert (2026) mengevaluasi empat LLM, yaitu Claude Sonnet 4.5, Gemini 2.5 Pro, GPT-5, dan Grok 4, sebagai pemeriksa catatan pemulangan instalasi gawat darurat (IGD). Data berasal dari 600 kunjungan pada basis data MIMIC-IV-ED. Sebanyak 500 catatan masing-masing disisipi satu kesalahan dari lima kategori, dan 100 catatan lain tidak memuat kesalahan (hlm. 95–96). Keempat model menerima perintah sistem (</w:t>
-      </w:r>
+        <w:t xml:space="preserve">RAG pada Teks Klinis</w:t>
+      </w:r>
+    </w:p>
+    <w:p>
+      <w:pPr>
+        <w:rPr>
+          <w:lang w:val="id-ID"/>
+        </w:rPr>
+      </w:pPr>
       <w:r>
         <w:rPr>
           <w:i/>
           <w:lang w:val="id-ID"/>
         </w:rPr>
-        <w:t xml:space="preserve">prompt</w:t>
-      </w:r>
-      <w:r>
-        <w:rPr>
-          <w:lang w:val="id-ID"/>
-        </w:rPr>
-        <w:t xml:space="preserve">) yang sama, berisi definisi kelima kategori dan kriteria klasifikasi positif maupun negatif (hlm. 97). Akurasi deteksi kesalahan apa pun berkisar 93,2–94,2%, presisi 98,3–99,1%, dan spesifisitas 92,0–96,0% (hlm. 98). Kinerja berbeda menurut kategori. Ketidaksesuaian identitas atau waktu kunjungan serta kesalahan obat dan alergi terdeteksi dengan F1 ≥0,96, sedangkan ketidaksesuaian antara tanda vital atau pemeriksaan fisik dan interpretasi naratif paling sulit, dengan F1 0,75–0,84 yang terutama disebabkan oleh rendahnya </w:t>
+        <w:t xml:space="preserve">Retrieval-augmented generation</w:t>
+      </w:r>
+      <w:r>
+        <w:rPr>
+          <w:lang w:val="id-ID"/>
+        </w:rPr>
+        <w:t xml:space="preserve"> (RAG) menyisipkan bukti yang diambil dari sumber luar ke dalam masukan LLM sebelum model membangkitkan jawaban. Yang dkk. (2026) menelaah 251 studi RAG di bidang medis dan menemukan bahwa aplikasinya terkonsentrasi pada tanya jawab, pembuatan laporan, peringkasan teks, dan ekstraksi informasi (hlm. 2). Dari 188 studi yang memakai </w:t>
       </w:r>
       <w:r>
         <w:rPr>
           <w:i/>
           <w:lang w:val="id-ID"/>
         </w:rPr>
+        <w:t xml:space="preserve">retrieval</w:t>
+      </w:r>
+      <w:r>
+        <w:rPr>
+          <w:lang w:val="id-ID"/>
+        </w:rPr>
+        <w:t xml:space="preserve"> padat, hanya 24 yang secara eksplisit memakai model </w:t>
+      </w:r>
+      <w:r>
+        <w:rPr>
+          <w:i/>
+          <w:lang w:val="id-ID"/>
+        </w:rPr>
+        <w:t xml:space="preserve">embedding</w:t>
+      </w:r>
+      <w:r>
+        <w:rPr>
+          <w:lang w:val="id-ID"/>
+        </w:rPr>
+        <w:t xml:space="preserve"> multibahasa; sisanya memakai model yang berpusat pada bahasa Inggris (hlm. 4). Penulisnya menilai RAG medis masih berada pada tahap awal dan memerlukan validasi klinis serta adaptasi lintas bahasa (hlm. 2). Landolsi dkk. (2026) menelaah 57 studi pada sepuluh bidang medis; hanya enam di antaranya yang memakai sumber nonbarat atau nonbahasa Inggris, dan hanya empat yang divalidasi lintas institusi (hlm. 6, 19).</w:t>
+      </w:r>
+    </w:p>
+    <w:p>
+      <w:pPr>
+        <w:rPr>
+          <w:lang w:val="id-ID"/>
+        </w:rPr>
+      </w:pPr>
+      <w:r>
+        <w:rPr>
+          <w:lang w:val="id-ID"/>
+        </w:rPr>
+        <w:t xml:space="preserve">Zhang dkk. (2026) memberi bukti yang paling dekat dengan catatan klinis sehari-hari. Mereka membandingkan enam strategi </w:t>
+      </w:r>
+      <w:r>
+        <w:rPr>
+          <w:i/>
+          <w:lang w:val="id-ID"/>
+        </w:rPr>
+        <w:t xml:space="preserve">retrieval</w:t>
+      </w:r>
+      <w:r>
+        <w:rPr>
+          <w:lang w:val="id-ID"/>
+        </w:rPr>
+        <w:t xml:space="preserve"> pada catatan keperawatan fasilitas perawatan lansia di Australia, dengan Llama 3.1 8B sebagai pembangkit dan indeks yang dibangun dari segmen catatan itu sendiri, untuk dua tugas ekstraksi entitas yang masing-masing diuji pada 208 rekaman (hlm. 1, 5). Tanpa </w:t>
+      </w:r>
+      <w:r>
+        <w:rPr>
+          <w:i/>
+          <w:lang w:val="id-ID"/>
+        </w:rPr>
+        <w:t xml:space="preserve">retrieval</w:t>
+      </w:r>
+      <w:r>
+        <w:rPr>
+          <w:lang w:val="id-ID"/>
+        </w:rPr>
+        <w:t xml:space="preserve">, F1 jawaban ialah 0,702 untuk gejala agitasi pada demensia dan 0,722 untuk faktor risiko malnutrisi; dengan </w:t>
+      </w:r>
+      <w:r>
+        <w:rPr>
+          <w:i/>
+          <w:lang w:val="id-ID"/>
+        </w:rPr>
+        <w:t xml:space="preserve">dense reranking</w:t>
+      </w:r>
+      <w:r>
+        <w:rPr>
+          <w:lang w:val="id-ID"/>
+        </w:rPr>
+        <w:t xml:space="preserve">, angkanya 0,946 dan 0,953 (hlm. 6). F1 jawaban itu dihitung dengan BERTScore, yaitu kemiripan semantik terhadap anotasi acuan (hlm. 3), bukan kecocokan label persis. Penulisnya membatasi kesimpulan pada dua tugas berbasis skema; ekstraksi relasi, penalaran temporal, dan tanya jawab terbuka tidak dievaluasi (hlm. 11). Jia dkk. (2026) menguji agen dengan </w:t>
+      </w:r>
+      <w:r>
+        <w:rPr>
+          <w:i/>
+          <w:lang w:val="id-ID"/>
+        </w:rPr>
+        <w:t xml:space="preserve">retrieval</w:t>
+      </w:r>
+      <w:r>
+        <w:rPr>
+          <w:lang w:val="id-ID"/>
+        </w:rPr>
+        <w:t xml:space="preserve">, </w:t>
+      </w:r>
+      <w:r>
+        <w:rPr>
+          <w:i/>
+          <w:lang w:val="id-ID"/>
+        </w:rPr>
+        <w:t xml:space="preserve">reranking</w:t>
+      </w:r>
+      <w:r>
+        <w:rPr>
+          <w:lang w:val="id-ID"/>
+        </w:rPr>
+        <w:t xml:space="preserve">, dan penjangkaran bukti pada tolok ukur tanya jawab berformat ujian dan melaporkan akurasi 82,98% pada USMLE Step 1, di atas 80,67% untuk GPT-4 (hlm. 2).</w:t>
+      </w:r>
+    </w:p>
+    <w:p>
+      <w:pPr>
+        <w:pStyle w:val="Heading3"/>
+      </w:pPr>
+      <w:r>
+        <w:t xml:space="preserve">Penjangkaran Bukti dan Pengecekan Keluaran</w:t>
+      </w:r>
+    </w:p>
+    <w:p>
+      <w:pPr>
+        <w:rPr>
+          <w:lang w:val="id-ID"/>
+        </w:rPr>
+      </w:pPr>
+      <w:r>
+        <w:rPr>
+          <w:lang w:val="id-ID"/>
+        </w:rPr>
+        <w:t xml:space="preserve">Waqas dkk. (2026) membedakan halusinasi faktual, </w:t>
+      </w:r>
+      <w:r>
+        <w:rPr>
+          <w:i/>
+          <w:lang w:val="id-ID"/>
+        </w:rPr>
+        <w:t xml:space="preserve">faithful</w:t>
+      </w:r>
+      <w:r>
+        <w:rPr>
+          <w:lang w:val="id-ID"/>
+        </w:rPr>
+        <w:t xml:space="preserve"> (tidak sesuai dengan masukan), logis, dan temporal (hlm. 4). Survei atas 90 publikasi itu, yang tidak memakai penilaian risiko bias formal (hlm. 4), mengutip RAGTruth bahwa halusinasi tetap terjadi ketika konteks ambigu atau </w:t>
+      </w:r>
+      <w:r>
+        <w:rPr>
+          <w:i/>
+          <w:lang w:val="id-ID"/>
+        </w:rPr>
+        <w:t xml:space="preserve">retrieval</w:t>
+      </w:r>
+      <w:r>
+        <w:rPr>
+          <w:lang w:val="id-ID"/>
+        </w:rPr>
+        <w:t xml:space="preserve"> gagal menemukan semua bukti yang relevan (hlm. 10), dan menyatakan bahwa bidang kesehatan membutuhkan laju positif palsu yang sangat rendah (hlm. 18). Sun dkk. (2025) menelaah 55 artikel, 15 di antaranya tentang halusinasi, dan menemukan bahwa mitigasi halusinasi sebagian besar dikaji pada tugas tanya jawab, dataset deteksi halusinasi langka, serta evaluasinya bergantung pada penilaian pakar tanpa kerangka baku (hlm. 15, 18).</w:t>
+      </w:r>
+    </w:p>
+    <w:p>
+      <w:pPr>
+        <w:rPr>
+          <w:lang w:val="id-ID"/>
+        </w:rPr>
+      </w:pPr>
+      <w:r>
+        <w:rPr>
+          <w:lang w:val="id-ID"/>
+        </w:rPr>
+        <w:t xml:space="preserve">Li dkk. (2026) mencontohkan penjangkaran bukti pada pendukung keputusan bedah tulang belakang. Pangkalan pengetahuannya memuat pedoman dan literatur yang masing-masing diberi ID, sumber, tahun, dan tingkat bukti (hlm. 3). Empat paragraf teratas disisipkan ke masukan model, keluaran berformat “rekomendasi + paragraf kutipan”, dan model diinstruksikan menjawab </w:t>
+      </w:r>
+      <w:r>
+        <w:rPr>
+          <w:i/>
+          <w:lang w:val="id-ID"/>
+        </w:rPr>
+        <w:t xml:space="preserve">“no clear conclusions available”</w:t>
+      </w:r>
+      <w:r>
+        <w:rPr>
+          <w:lang w:val="id-ID"/>
+        </w:rPr>
+        <w:t xml:space="preserve"> bila literatur tidak memberi jawaban pasti (hlm. 4). Lima ahli bedah menilai 200 kasus dengan rubrik 11 dimensi, termasuk ketepatan bukti yang dikutip (hlm. 1, 5). Namun yang dibandingkan ialah empat agen LLM dalam satu kerangka RAG di satu pusat, bukan RAG terhadap tanpa RAG (hlm. 9), dan artikelnya tidak menguraikan pemeriksaan kutipan otomatis.</w:t>
+      </w:r>
+    </w:p>
+    <w:p>
+      <w:pPr>
+        <w:rPr>
+          <w:lang w:val="id-ID"/>
+        </w:rPr>
+      </w:pPr>
+      <w:r>
+        <w:rPr>
+          <w:lang w:val="id-ID"/>
+        </w:rPr>
+        <w:t xml:space="preserve">Zeba dkk. (2026) menempuh cara lain: modul pemeriksa fakta tanpa LLM yang memeriksa keluaran LLM terhadap rekam medis sumber (hlm. 1). Ringkasan dan rekam medis dipecah menjadi proposisi atomik (hlm. 7), lalu setiap proposisi diberi vonis Didukung atau Tidak Didukung melalui pemeriksaan negasi, implikasi, konsistensi temporal, eksklusivitas bersama, kecocokan numerik, dan keberadaan (hlm. 6, 14). Pada 104 ringkasan yang diekstrak menjadi 3.786 proposisi dan divalidasi dokter, modul itu mencapai presisi 0,8904, </w:t>
+      </w:r>
+      <w:r>
+        <w:rPr>
+          <w:i/>
+          <w:lang w:val="id-ID"/>
+        </w:rPr>
         <w:t xml:space="preserve">recall</w:t>
       </w:r>
       <w:r>
         <w:rPr>
           <w:lang w:val="id-ID"/>
         </w:rPr>
-        <w:t xml:space="preserve"> (hlm. 98).</w:t>
-      </w:r>
-    </w:p>
-    <w:p>
-      <w:pPr>
-        <w:rPr>
-          <w:lang w:val="id-ID"/>
-        </w:rPr>
-      </w:pPr>
-      <w:r>
-        <w:rPr>
-          <w:lang w:val="id-ID"/>
-        </w:rPr>
-        <w:t xml:space="preserve">Rancangan itu membatasi cakupan kesimpulannya. Kesalahan disisipkan oleh peneliti, bukan muncul secara alami, dan seluruh data berasal dari satu institusi (hlm. 100). Setiap catatan hanya memuat satu kesalahan, dan catatan yang dinilai adalah satu dokumen yang disusun dari elemen data terstruktur kunjungan (hlm. 96). Karena 500 dari 600 catatan memuat kesalahan (hlm. 95), presisi yang tinggi itu tidak dapat langsung dipindahkan ke populasi dengan proporsi ketidaksesuaian yang lebih rendah. Penulis sendiri menyebut kerangka audit berbasis agen yang mengambil pedoman dan memeriksa konsistensi lintas dokumen sebagai arah penelitian lanjutan (hlm. 100).</w:t>
-      </w:r>
-    </w:p>
-    <w:p>
-      <w:pPr>
-        <w:rPr>
-          <w:lang w:val="id-ID"/>
-        </w:rPr>
-      </w:pPr>
-      <w:r>
-        <w:rPr>
-          <w:lang w:val="id-ID"/>
-        </w:rPr>
-        <w:t xml:space="preserve">Skrabic dkk. (2026) menguji tiga model penalaran, yaitu o3, DeepSeek-v3-R1, dan GPT-OSS-120B, sebagai pemeriksa kedua (</w:t>
+        <w:t xml:space="preserve"> 0,8234, dan F1 0,8556 (hlm. 1). Datanya berasal dari MIMIC-III, rekam medis unit perawatan intensif (hlm. 10), dan penulisnya menyatakan sistem kurang andal pada bidang yang kurang terwakili, termasuk gangguan metabolik anak, serta hanya memberi vonis biner tanpa usul perbaikan (hlm. 15).</w:t>
+      </w:r>
+    </w:p>
+    <w:p>
+      <w:pPr>
+        <w:pStyle w:val="Heading3"/>
+      </w:pPr>
+      <w:r>
+        <w:t xml:space="preserve">Sintesis dan Celah</w:t>
+      </w:r>
+    </w:p>
+    <w:p>
+      <w:pPr>
+        <w:rPr>
+          <w:lang w:val="id-ID"/>
+        </w:rPr>
+      </w:pPr>
+      <w:r>
+        <w:rPr>
+          <w:lang w:val="id-ID"/>
+        </w:rPr>
+        <w:t xml:space="preserve">Sumber-sumber di atas menunjukkan bahwa </w:t>
       </w:r>
       <w:r>
         <w:rPr>
           <w:i/>
           <w:lang w:val="id-ID"/>
         </w:rPr>
-        <w:t xml:space="preserve">second reviewer</w:t>
-      </w:r>
-      <w:r>
-        <w:rPr>
-          <w:lang w:val="id-ID"/>
-        </w:rPr>
-        <w:t xml:space="preserve">) pada 102 laporan unit gawat darurat penyakit dalam yang identitasnya telah dihapus (hlm. 1–2). Dua dokter spesialis menyisipkan 99 kesalahan yang realistis dan menandai tiga kesalahan yang sudah ada dalam laporan asli (hlm. 2). Model menerima satu perintah seragam tanpa pengambilan referensi atau pemanggilan fungsi (hlm. 3). Model menemukan lokasi kesalahan dengan benar pada 65,7–79,2% laporan, sedangkan tiga dokter pembanding, yang masing-masing meninjau sepertiga kasus, menemukan 48,0% (hlm. 4). Kategori diagnostik dan pemeriksaan penunjang paling sulit bagi ketiga model (hlm. 4). Selain itu, hampir semua laporan memperoleh isu tambahan yang dinilai berguna secara klinis. Penulis mengingatkan risiko kelelahan terhadap peringatan (</w:t>
+        <w:t xml:space="preserve">retrieval</w:t>
+      </w:r>
+      <w:r>
+        <w:rPr>
+          <w:lang w:val="id-ID"/>
+        </w:rPr>
+        <w:t xml:space="preserve"> menaikkan kinerja ekstraksi pada catatan klinis dan bahwa keluaran dapat ditautkan serta diperiksa terhadap sumbernya, tetapi ada empat celah bagi penelitian ini. Pertama, aplikasi RAG terkonsentrasi pada tanya jawab, pembuatan laporan, peringkasan, dan ekstraksi (Yang dkk., 2026, hlm. 2), dan bukti kinerja yang paling mencolok berasal dari soal ujian (Jia dkk., 2026, hlm. 2); di antara sumber yang dibaca, tidak ada yang menguji RAG untuk memeriksa kesesuaian antardokumen dalam satu episode rawat. Kedua, tidak ada sumber yang menguji teks klinis berbahasa Indonesia, dan </w:t>
       </w:r>
       <w:r>
         <w:rPr>
           <w:i/>
           <w:lang w:val="id-ID"/>
         </w:rPr>
-        <w:t xml:space="preserve">alert fatigue</w:t>
-      </w:r>
-      <w:r>
-        <w:rPr>
-          <w:lang w:val="id-ID"/>
-        </w:rPr>
-        <w:t xml:space="preserve">) bila isu itu tidak diprioritaskan (hlm. 5). Studi ini tidak menyertakan catatan tanpa kesalahan sehingga perilaku positif palsu belum dapat dipastikan, dan datanya berasal dari satu pusat layanan (hlm. 6).</w:t>
+        <w:t xml:space="preserve">retrieval</w:t>
+      </w:r>
+      <w:r>
+        <w:rPr>
+          <w:lang w:val="id-ID"/>
+        </w:rPr>
+        <w:t xml:space="preserve"> umumnya memakai model berpusat pada bahasa Inggris (Yang dkk., 2026, hlm. 4; Landolsi dkk., 2026, hlm. 19). Ketiga, pemeriksaan keluaran terhadap sumber baru didemonstrasikan pada ringkasan LLM atas rekam medis berbahasa Inggris (Zeba dkk., 2026), sedangkan ketepatan kutipan pada Li dkk. (2026) dinilai ahli. Keempat, kontribusi </w:t>
+      </w:r>
+      <w:r>
+        <w:rPr>
+          <w:i/>
+          <w:lang w:val="id-ID"/>
+        </w:rPr>
+        <w:t xml:space="preserve">retrieval</w:t>
+      </w:r>
+      <w:r>
+        <w:rPr>
+          <w:lang w:val="id-ID"/>
+        </w:rPr>
+        <w:t xml:space="preserve"> dibandingkan dengan kondisi tanpa </w:t>
+      </w:r>
+      <w:r>
+        <w:rPr>
+          <w:i/>
+          <w:lang w:val="id-ID"/>
+        </w:rPr>
+        <w:t xml:space="preserve">retrieval</w:t>
+      </w:r>
+      <w:r>
+        <w:rPr>
+          <w:lang w:val="id-ID"/>
+        </w:rPr>
+        <w:t xml:space="preserve"> hanya pada dua tugas ekstraksi berbasis skema (Zhang dkk., 2026, hlm. 6, 11); pada audit, kontribusinya terhadap mutu temuan dan biaya positif palsunya belum diukur. Manfaat RAG pada audit dokumentasi rawat inap kebidanan dan anak karena itu perlu diuji dengan membandingkan konfigurasi dengan dan tanpa </w:t>
+      </w:r>
+      <w:r>
+        <w:rPr>
+          <w:i/>
+          <w:lang w:val="id-ID"/>
+        </w:rPr>
+        <w:t xml:space="preserve">retrieval</w:t>
+      </w:r>
+      <w:r>
+        <w:rPr>
+          <w:lang w:val="id-ID"/>
+        </w:rPr>
+        <w:t xml:space="preserve"> </w:t>
+      </w:r>
+      <w:r>
+        <w:rPr>
+          <w:highlight w:val="yellow"/>
+          <w:lang w:val="id-ID"/>
+        </w:rPr>
+        <w:t xml:space="preserve">[SESUAIKAN DENGAN BAB I: rumusan pertanyaan dan ukuran keberhasilan]</w:t>
+      </w:r>
+      <w:r>
+        <w:rPr>
+          <w:lang w:val="id-ID"/>
+        </w:rPr>
+        <w:t xml:space="preserve">.</w:t>
+      </w:r>
+    </w:p>
+    <w:p>
+      <w:pPr>
+        <w:pStyle w:val="Heading2"/>
+      </w:pPr>
+      <w:r>
+        <w:t xml:space="preserve">De-identifikasi untuk Layanan AI Eksternal</w:t>
       </w:r>
     </w:p>
     <w:p>
@@ -4532,85 +5335,85 @@
         <w:pStyle w:val="Heading3"/>
       </w:pPr>
       <w:r>
-        <w:t xml:space="preserve">Audit Label Diagnosis dan Kesesuaian Kode dengan Catatan Klinis</w:t>
-      </w:r>
-    </w:p>
-    <w:p>
-      <w:pPr>
-        <w:rPr>
-          <w:lang w:val="id-ID"/>
-        </w:rPr>
-      </w:pPr>
-      <w:r>
-        <w:rPr>
-          <w:lang w:val="id-ID"/>
-        </w:rPr>
-        <w:t xml:space="preserve">Du dkk. (2026) memeriksa label diagnosis, bukan kesalahan yang disisipkan. Penelitian itu mengubah klasifikasi multilabel kode diagnosis psikiatri menjadi tugas tanya jawab dan menambahkan deskripsi serta penjelasan kode ke masukan model (hlm. 1, 4). Data berupa 48.492 rekam dari 7.000 pasien di satu klinik psikiatri (hlm. 3, 12), sebagian dikonversi melalui pengenalan karakter optik (</w:t>
+        <w:t xml:space="preserve">Pendekatan De-identifikasi dan Bukti yang Tersedia</w:t>
+      </w:r>
+    </w:p>
+    <w:p>
+      <w:pPr>
+        <w:rPr>
+          <w:lang w:val="id-ID"/>
+        </w:rPr>
+      </w:pPr>
+      <w:r>
+        <w:rPr>
+          <w:lang w:val="id-ID"/>
+        </w:rPr>
+        <w:t xml:space="preserve">Faustini dkk. (2026) menelaah 83 artikel yang dipilih dari 734 tentang de-identifikasi data klinis berbasis NLP pada tahun 2015–2024, dengan de-identifikasi didefinisikan sebagai pendeteksian, penggantian, atau penghapusan informasi kesehatan yang dilindungi (</w:t>
       </w:r>
       <w:r>
         <w:rPr>
           <w:i/>
           <w:lang w:val="id-ID"/>
         </w:rPr>
-        <w:t xml:space="preserve">optical character recognition</w:t>
-      </w:r>
-      <w:r>
-        <w:rPr>
-          <w:lang w:val="id-ID"/>
-        </w:rPr>
-        <w:t xml:space="preserve">, OCR) (hlm. 3). Model tanya jawab berbasis BART yang diperkaya penjelasan kode memperoleh sum-F1, yaitu ukuran F1 berbasis ROUGE rancangan penulis (hlm. 6), sebesar 0,7417. Nilai itu terbaik di antara model yang dibandingkan, tetapi hanya 0,013 di atas BERT yang diperkaya penjelasan kode (0,7287), sedangkan Llama 3.3 yang dijalankan tanpa pelatihan tambahan (</w:t>
+        <w:t xml:space="preserve">protected health information</w:t>
+      </w:r>
+      <w:r>
+        <w:rPr>
+          <w:lang w:val="id-ID"/>
+        </w:rPr>
+        <w:t xml:space="preserve">, PHI) (hlm. 1, 2). Mereka menyimpulkan bahwa penggunaan model bahasa meningkat, bahwa perkakas siap pakai sering perlu disesuaikan, dan bahwa sebagian besar studi menggarap konten berbahasa Inggris karena dataset yang tersedia berbahasa Inggris (hlm. 1). Metode berbasis aturan tetap umum di luar bahasa Inggris (hlm. 6), sedangkan tantangan utamanya ialah campur kode dan kelangkaan dataset yang dapat direproduksi (hlm. 1). Faustini dkk. juga melaporkan temuan studi lain bahwa Presidio kesulitan mengenali nama Slavia serta nama Asia Tengah dan Asia Tenggara dibandingkan nama Inggris (hlm. 5).</w:t>
+      </w:r>
+    </w:p>
+    <w:p>
+      <w:pPr>
+        <w:rPr>
+          <w:lang w:val="id-ID"/>
+        </w:rPr>
+      </w:pPr>
+      <w:r>
+        <w:rPr>
+          <w:lang w:val="id-ID"/>
+        </w:rPr>
+        <w:t xml:space="preserve">Azzam dkk. (2026) mengusulkan sistem agentik yang memisahkan lingkungan pemrosesan: LLM yang dihosting lokal menangani semua langkah sensitif, sedangkan LLM publik hanya menalar atas masukan yang sudah dianonimkan (hlm. 1), dengan pemetaan lokal untuk mengembalikan identitas pada jawaban (hlm. 10). Pada dataset rekam medis sintetis, sistem itu mencapai presisi 1,000 dan </w:t>
       </w:r>
       <w:r>
         <w:rPr>
           <w:i/>
           <w:lang w:val="id-ID"/>
         </w:rPr>
-        <w:t xml:space="preserve">zero-shot</w:t>
-      </w:r>
-      <w:r>
-        <w:rPr>
-          <w:lang w:val="id-ID"/>
-        </w:rPr>
-        <w:t xml:space="preserve">) hanya mencapai 0,3785 (hlm. 8). Selisih antara kode klinisi dan keluaran model dikelompokkan menjadi risiko rendah (36,99%), sedang (45,9%), dan tinggi (17,11%) untuk menentukan kasus yang perlu ditinjau manusia (hlm. 7).</w:t>
-      </w:r>
-    </w:p>
-    <w:p>
-      <w:pPr>
-        <w:rPr>
-          <w:lang w:val="id-ID"/>
-        </w:rPr>
-      </w:pPr>
-      <w:r>
-        <w:rPr>
-          <w:lang w:val="id-ID"/>
-        </w:rPr>
-        <w:t xml:space="preserve">Keterbatasan studi ini menentukan kegunaannya sebagai acuan. Acuan penilaiannya adalah diagnosis yang dicatat klinisi, yang menurut penulis dapat mengandung derau (</w:t>
+        <w:t xml:space="preserve">recall</w:t>
+      </w:r>
+      <w:r>
+        <w:rPr>
+          <w:lang w:val="id-ID"/>
+        </w:rPr>
+        <w:t xml:space="preserve"> 0,936, sedangkan spaCy dan Presidio berpresisi 0,329 dan 0,405 dengan </w:t>
       </w:r>
       <w:r>
         <w:rPr>
           <w:i/>
           <w:lang w:val="id-ID"/>
         </w:rPr>
-        <w:t xml:space="preserve">label noise</w:t>
-      </w:r>
-      <w:r>
-        <w:rPr>
-          <w:lang w:val="id-ID"/>
-        </w:rPr>
-        <w:t xml:space="preserve">), tidak stabil dari waktu ke waktu, dan dipengaruhi tuntutan penagihan serta dokumentasi; derau itu tidak dimodelkan secara eksplisit (hlm. 12). Tingkat risikonya bersifat heuristik dan disusun tanpa keterlibatan psikiater, sedangkan mutu penjelasan model tidak dinilai klinisi (hlm. 13). Pengetahuan acuan yang dimasukkan pun statis, yaitu deskripsi sepuluh kelompok kode yang selalu ditambahkan dalam urutan tetap (hlm. 5), bukan referensi yang diambil sesuai kasus.</w:t>
-      </w:r>
-    </w:p>
-    <w:p>
-      <w:pPr>
-        <w:rPr>
-          <w:lang w:val="id-ID"/>
-        </w:rPr>
-      </w:pPr>
-      <w:r>
-        <w:rPr>
-          <w:lang w:val="id-ID"/>
-        </w:rPr>
-        <w:t xml:space="preserve">Mwogosi dan Mambile (2026) menelaah dari sisi lain, yaitu kesesuaian kode ICD dalam rekam medis elektronik dengan acuan klinis. Tinjauan sistematis dan metaanalisis ini merangkum 17 studi validasi (hlm. 1). Spesifisitas dan nilai prediktif positif kode konsisten tinggi, sering melebihi 90%, tetapi sensitivitas rata-rata hanya 64,5%, dengan catatan sebagian estimasi memakai prevalensi pengodean sebagai proksi sensitivitas (hlm. 1). Mengandalkan kode saja juga membuat kepatuhan terhadap pedoman tampak lebih tinggi daripada hasil penelusuran catatan (hlm. 1). Penulis menyimpulkan bahwa pendekatan hibrida yang menggabungkan kode, data klinis, dan narasi diperlukan (hlm. 1), tetapi acuan validasinya, yaitu penelusuran rekam medis, juga dapat bias akibat penyalinan teks dan terbawanya diagnosis usang (hlm. 11). Seluruh studi yang ditinjau berasal dari negara berpenghasilan tinggi (hlm. 4–5).</w:t>
+        <w:t xml:space="preserve">recall</w:t>
+      </w:r>
+      <w:r>
+        <w:rPr>
+          <w:lang w:val="id-ID"/>
+        </w:rPr>
+        <w:t xml:space="preserve"> sekitar 0,89 (hlm. 12). Pada 100 catatan MIMIC-III, 98,6% penanda redaksi bawaan dataset berubah bersih; penanda itu dipakai sebagai pengganti label acuan karena catatannya sudah dide-identifikasi (hlm. 1, 15). Kelestarian informasi klinis tidak penuh: sebutan obat terjaga 0,974, tetapi dosis hanya 0,769 (hlm. 12). Penulisnya menyatakan sistem baru mendukung masukan berbahasa Inggris (hlm. 19).</w:t>
+      </w:r>
+    </w:p>
+    <w:p>
+      <w:pPr>
+        <w:rPr>
+          <w:lang w:val="id-ID"/>
+        </w:rPr>
+      </w:pPr>
+      <w:r>
+        <w:rPr>
+          <w:lang w:val="id-ID"/>
+        </w:rPr>
+        <w:t xml:space="preserve">Tchouka dkk. (2024) menguji de-identifikasi pada dokumen medis berbahasa Prancis di sebuah rumah sakit publik, dengan seluruh eksperimen dilakukan di lokasi rumah sakit tanpa ada data yang dibawa keluar (hlm. 2). Tanggal, usia, dan lokasi diganti dengan privasi diferensial lokal berbasis metrik agar aspek kronologis dan geografisnya tidak hilang (hlm. 1, 7). Manfaatnya diukur lewat tugas asosiasi kode ICD-10: skor F1 turun sekitar 12% terhadap korpus asli bila setiap entitas diganti dengan labelnya, yaitu cara yang dinilai paling tahan terhadap serangan re-identifikasi tetapi membuang nilai entitas, dan 6,8% dengan pendekatan itu (hlm. 2, 12, 13). Penulisnya mengingatkan bahwa dataset hasil de-identifikasi tetap tidak kebal terhadap serangan re-identifikasi dan keanggotaan, sehingga tidak dapat disebarluaskan (hlm. 13).</w:t>
       </w:r>
     </w:p>
     <w:p>
@@ -4618,72 +5421,88 @@
         <w:pStyle w:val="Heading3"/>
       </w:pPr>
       <w:r>
-        <w:t xml:space="preserve">Pengodean ICD Otomatis dan Ketahanannya terhadap Variasi Teks</w:t>
-      </w:r>
-    </w:p>
-    <w:p>
-      <w:pPr>
-        <w:rPr>
-          <w:lang w:val="id-ID"/>
-        </w:rPr>
-      </w:pPr>
-      <w:r>
-        <w:rPr>
-          <w:lang w:val="id-ID"/>
-        </w:rPr>
-        <w:t xml:space="preserve">Hou dkk. (2024) menyatakan bahwa pengodean otomatis umumnya diperlakukan sebagai klasifikasi teks multilabel, yaitu menetapkan kode ICD pada dokumen klinis (hlm. 1). Mereka memakai Clinical-Longformer, penyandi (</w:t>
+        <w:t xml:space="preserve">Sintesis dan Celah</w:t>
+      </w:r>
+    </w:p>
+    <w:p>
+      <w:pPr>
+        <w:rPr>
+          <w:lang w:val="id-ID"/>
+        </w:rPr>
+      </w:pPr>
+      <w:r>
+        <w:rPr>
+          <w:lang w:val="id-ID"/>
+        </w:rPr>
+        <w:t xml:space="preserve">Sumber-sumber di atas mendukung dua hal yang terbatas: de-identifikasi oleh LLM lokal dapat memisahkan data sensitif dari LLM publik pada pengujian awal, dan penggantian yang memperhatikan utilitas mengurangi kehilangan kinerja pada tugas hilir berbasis kode. Bukti itu memiliki tiga keterbatasan. Pertama, tidak ada sumber yang menguji teks klinis berbahasa Indonesia atau pengenal khas Indonesia seperti NIK dan nomor rekam medis; temuan tentang nama Asia Tenggara bersifat sekunder dan menyangkut perkakas yang diuji pada data lain (Faustini dkk., 2026, hlm. 5). Kedua, bukti untuk pendekatan berbasis LLM lokal berasal dari data sintetis dan catatan berbahasa Inggris yang sudah dide-identifikasi (Azzam dkk., 2026, hlm. 15), sehingga kebocoran PHI pada catatan baru yang belum diredaksi belum terukur. Ketiga, kehilangan utilitas baru diukur pada asosiasi kode ICD-10 (Tchouka dkk., 2024, hlm. 13) atau pada sebutan obat dan dosis (Azzam dkk., 2026, hlm. 12); dampak de-identifikasi terhadap temuan audit yang bergantung pada tanggal, dosis, dan urutan waktu belum diukur. De-identifikasi pada penelitian ini perlu diuji pada data berbahasa Indonesia, dengan ukuran kebocoran pengenal dan dampaknya pada mutu temuan </w:t>
+      </w:r>
+      <w:r>
+        <w:rPr>
+          <w:highlight w:val="yellow"/>
+          <w:lang w:val="id-ID"/>
+        </w:rPr>
+        <w:t xml:space="preserve">[SESUAIKAN DENGAN BAB I: rumusan pertanyaan dan ukuran keberhasilan]</w:t>
+      </w:r>
+      <w:r>
+        <w:rPr>
+          <w:lang w:val="id-ID"/>
+        </w:rPr>
+        <w:t xml:space="preserve">.</w:t>
+      </w:r>
+    </w:p>
+    <w:p>
+      <w:pPr>
+        <w:pStyle w:val="Heading2"/>
+      </w:pPr>
+      <w:r>
+        <w:t xml:space="preserve">Evaluasi Sistem NLP Klinis</w:t>
+      </w:r>
+    </w:p>
+    <w:p>
+      <w:pPr>
+        <w:pStyle w:val="Heading3"/>
+      </w:pPr>
+      <w:r>
+        <w:t xml:space="preserve">Acuan Penilaian dan Variabilitas Penilai</w:t>
+      </w:r>
+    </w:p>
+    <w:p>
+      <w:pPr>
+        <w:rPr>
+          <w:lang w:val="id-ID"/>
+        </w:rPr>
+      </w:pPr>
+      <w:r>
+        <w:rPr>
+          <w:lang w:val="id-ID"/>
+        </w:rPr>
+        <w:t xml:space="preserve">Becker dkk. (2025) memperluas korpus CARDIO:DE, yaitu 500 surat dokter berbahasa Jerman di bidang kardiovaskular (hlm. 2), dengan lima label entitas: diagnosis, tindakan diagnostik, obat, temuan medis, dan terapi (hlm. 1). Seorang apoteker dan seorang ekonom kesehatan mula-mula menganotasi sekitar 15% korpus secara tumpang tindih, membahas ketidaksesuaiannya, lalu menganotasi 5% tambahan secara tumpang tindih, dengan ambang kesepakatan Krippendorff's alpha </w:t>
       </w:r>
       <w:r>
         <w:rPr>
           <w:i/>
           <w:lang w:val="id-ID"/>
         </w:rPr>
-        <w:t xml:space="preserve">encoder</w:t>
-      </w:r>
-      <w:r>
-        <w:rPr>
-          <w:lang w:val="id-ID"/>
-        </w:rPr>
-        <w:t xml:space="preserve">) yang dapat memproses hingga 4.096 token, untuk dokumen panjang, serta mekanisme perhatian per label (</w:t>
-      </w:r>
-      <w:r>
-        <w:rPr>
-          <w:i/>
-          <w:lang w:val="id-ID"/>
-        </w:rPr>
-        <w:t xml:space="preserve">label-wise attention</w:t>
-      </w:r>
-      <w:r>
-        <w:rPr>
-          <w:lang w:val="id-ID"/>
-        </w:rPr>
-        <w:t xml:space="preserve">) agar prediksi dapat diinterpretasi (hlm. 1–2). Pada 50 kode ICD-9 teratas di MIMIC-III, model memperoleh F1 makro 0,688 dan F1 mikro 0,727 (hlm. 2). Penulis menempatkan model ini sebagai alat bantu bagi pemberi kode (hlm. 1–2). Mereka menilai pendekatan berbasis aturan kurang fleksibel dan sulit diperluas karena aturan dapat saling bertentangan seiring bertambahnya kode, dan menyebut bahwa pemotongan dokumen menjadi 512 token pada model sebelumnya menimbulkan kehilangan informasi (hlm. 2).</w:t>
-      </w:r>
-    </w:p>
-    <w:p>
-      <w:pPr>
-        <w:rPr>
-          <w:lang w:val="id-ID"/>
-        </w:rPr>
-      </w:pPr>
-      <w:r>
-        <w:rPr>
-          <w:lang w:val="id-ID"/>
-        </w:rPr>
-        <w:t xml:space="preserve">Jaganathan dkk. (2025) menguji ketahanan model pengode ICD, yaitu PLM-ICD, dengan pengujian metamorfik (</w:t>
-      </w:r>
-      <w:r>
-        <w:rPr>
-          <w:i/>
-          <w:lang w:val="id-ID"/>
-        </w:rPr>
-        <w:t xml:space="preserve">metamorphic testing</w:t>
-      </w:r>
-      <w:r>
-        <w:rPr>
-          <w:lang w:val="id-ID"/>
-        </w:rPr>
-        <w:t xml:space="preserve">). Catatan diubah secara sederhana, lalu daftar kode keluarannya dibandingkan dengan keluaran catatan asli. Pada 3.372 catatan uji MIMIC-III, penggantian akronim, penghapusan kata, dan salah ketik menyebabkan perbedaan pada lima kode teratas di 70–81% catatan (hlm. 4); penggantian dua puluh akronim yang paling sering muncul mencapai 80,7% (hlm. 5). Kriteria kegagalannya ketat, yaitu setiap perbedaan pada himpunan lima kode teratas (hlm. 4), sehingga angka itu menunjukkan ketidakstabilan keluaran, bukan persentase kode yang salah. Hanya satu aplikasi yang dapat diuji (hlm. 3).</w:t>
+        <w:t xml:space="preserve">unitizing</w:t>
+      </w:r>
+      <w:r>
+        <w:rPr>
+          <w:lang w:val="id-ID"/>
+        </w:rPr>
+        <w:t xml:space="preserve"> 0,85 yang ditetapkan sebelumnya (hlm. 2). Kesepakatan mencapai 0,98 pada beberapa subset (hlm. 1), tetapi seluruh proses memakan tujuh bulan dan 10–40 menit per dokumen (hlm. 2). Empat model diuji, dan semuanya sering menukar temuan medis dengan diagnosis (hlm. 4); penulisnya menunjukkan bahwa frasa seperti "80 % main stem stenosis" dapat dilabeli keduanya bergantung pada konteks (hlm. 3).</w:t>
+      </w:r>
+    </w:p>
+    <w:p>
+      <w:pPr>
+        <w:rPr>
+          <w:lang w:val="id-ID"/>
+        </w:rPr>
+      </w:pPr>
+      <w:r>
+        <w:rPr>
+          <w:lang w:val="id-ID"/>
+        </w:rPr>
+        <w:t xml:space="preserve">van Koevorden dkk. (2026) memvalidasi ekstraksi data oleh LLM sumber terbuka pada 1.482 halaman dokumen klinis 60 pasien onkologi kepala dan leher untuk 29 kategori, dengan enam pakar menilai 2.555 nilai: penilaian cocok atau tidak cocok secara buta, lalu pengkategorian galat (hlm. 1). Akurasi per kategori berkisar 74% sampai 90%, dan penulis menegaskan bahwa metrik itu adalah metrik yang ditetapkan pakar karena keluaran model berupa teks bebas, bukan prediksi kategorikal (hlm. 1, 4). Dua dokter yang mengekstraksi secara independen berselisih pada 29,0% nilai, sedangkan LLM berselisih dari konsensus mereka pada 41,4% dalam pemetaan awal (hlm. 4). Setelah peninjauan, lebih dari separuh keluaran LLM yang semula dinilai berbeda dinyatakan cocok (hlm. 5), dan dari 65 keluaran yang semula dikategorikan halusinasi hanya empat yang terkonfirmasi setelah dicek ke dokumen asli (hlm. 6). Penilaian dampak galat juga tidak seragam: satu dari enam penilai menandai 61 dari 68 galat sebagai berdampak tinggi (hlm. 5). Penulisnya menyimpulkan bahwa taksonomi galat dan metrik saja tidak cukup untuk menilai konsekuensi klinis (hlm. 5), dan bahwa jumlah ekstraktor manusia yang kecil membatasi estimasi variabilitas antarpenilai (hlm. 7).</w:t>
       </w:r>
     </w:p>
     <w:p>
@@ -4691,207 +5510,6 @@
         <w:pStyle w:val="Heading3"/>
       </w:pPr>
       <w:r>
-        <w:t xml:space="preserve">Sintesis dan Posisi Penelitian</w:t>
-      </w:r>
-    </w:p>
-    <w:p>
-      <w:pPr>
-        <w:rPr>
-          <w:lang w:val="id-ID"/>
-        </w:rPr>
-      </w:pPr>
-      <w:r>
-        <w:rPr>
-          <w:lang w:val="id-ID"/>
-        </w:rPr>
-        <w:t xml:space="preserve">Dua studi yang membedakan kategori kesalahan menunjukkan pola yang sama: pemeriksaan otomatis lebih baik pada kesalahan eksplisit dalam satu dokumen daripada pada kesalahan yang menuntut penilaian klinis. Pada Dietrich dan Stubbert (2026, hlm. 98), ketidaksesuaian temuan klinis memiliki </w:t>
-      </w:r>
-      <w:r>
-        <w:rPr>
-          <w:i/>
-          <w:lang w:val="id-ID"/>
-        </w:rPr>
-        <w:t xml:space="preserve">recall</w:t>
-      </w:r>
-      <w:r>
-        <w:rPr>
-          <w:lang w:val="id-ID"/>
-        </w:rPr>
-        <w:t xml:space="preserve"> terendah, dan pada Skrabic dkk. (2026, hlm. 4), kategori diagnostik dan pemeriksaan penunjang paling sulit. Kategori sejenis, misalnya diagnosis yang tidak sejalan dengan catatan harian, termasuk yang direncanakan ditangani komponen AI/NLP dalam penelitian ini </w:t>
-      </w:r>
-      <w:r>
-        <w:rPr>
-          <w:highlight w:val="yellow"/>
-          <w:lang w:val="id-ID"/>
-        </w:rPr>
-        <w:t xml:space="preserve">[SESUAIKAN DENGAN BAB I]</w:t>
-      </w:r>
-      <w:r>
-        <w:rPr>
-          <w:lang w:val="id-ID"/>
-        </w:rPr>
-        <w:t xml:space="preserve">.</w:t>
-      </w:r>
-    </w:p>
-    <w:p>
-      <w:pPr>
-        <w:rPr>
-          <w:lang w:val="id-ID"/>
-        </w:rPr>
-      </w:pPr>
-      <w:r>
-        <w:rPr>
-          <w:lang w:val="id-ID"/>
-        </w:rPr>
-        <w:t xml:space="preserve">Bukti tentang positif palsu (</w:t>
-      </w:r>
-      <w:r>
-        <w:rPr>
-          <w:i/>
-          <w:lang w:val="id-ID"/>
-        </w:rPr>
-        <w:t xml:space="preserve">false positive</w:t>
-      </w:r>
-      <w:r>
-        <w:rPr>
-          <w:lang w:val="id-ID"/>
-        </w:rPr>
-        <w:t xml:space="preserve">) belum seragam. Hanya Dietrich dan Stubbert (2026, hlm. 95) menyertakan catatan tanpa kesalahan, sebanyak 100 catatan. Skrabic dkk. (2026, hlm. 6) tidak menyertakannya, dan Du dkk. (2026, hlm. 7, 12) menilai selisih terhadap label klinisi yang sendiri dapat mengandung derau. Karena itu, angka presisi dari ketiga studi tidak sebanding. Ketidakstabilan satu model klasifikasi kode terhadap akronim dan salah ketik (Jaganathan dkk., 2025, hlm. 4–5) juga menunjukkan bahwa ketahanan terhadap variasi penulisan, termasuk singkatan lokal, perlu diuji secara khusus, meskipun hasilnya belum tentu berlaku bagi LLM.</w:t>
-      </w:r>
-    </w:p>
-    <w:p>
-      <w:pPr>
-        <w:rPr>
-          <w:lang w:val="id-ID"/>
-        </w:rPr>
-      </w:pPr>
-      <w:r>
-        <w:rPr>
-          <w:lang w:val="id-ID"/>
-        </w:rPr>
-        <w:t xml:space="preserve">Di antara keenam studi, tidak ada yang melaporkan data dari Indonesia, membandingkan catatan perkembangan harian dengan ringkasan akhir dalam satu episode rawat inap, atau mengambil pedoman sesuai kasus sebagai dasar temuan. Akibatnya, angka kinerja yang dilaporkan tidak dapat dipindahkan begitu saja ke dokumentasi rawat inap kebidanan dan anak di Indonesia. Kinerja itu harus diukur ulang dengan menyertakan dokumen tanpa ketidaksesuaian agar positif palsu dapat dihitung.</w:t>
-      </w:r>
-    </w:p>
-    <w:p>
-      <w:pPr>
-        <w:pStyle w:val="Heading2"/>
-      </w:pPr>
-      <w:r>
-        <w:t xml:space="preserve">Pendekatan Hibrida Berbasis Aturan dan AI/NLP</w:t>
-      </w:r>
-    </w:p>
-    <w:p>
-      <w:pPr>
-        <w:pStyle w:val="Heading3"/>
-      </w:pPr>
-      <w:r>
-        <w:t xml:space="preserve">Kekuatan dan Batas Sistem Berbasis Aturan</w:t>
-      </w:r>
-    </w:p>
-    <w:p>
-      <w:pPr>
-        <w:rPr>
-          <w:lang w:val="id-ID"/>
-        </w:rPr>
-      </w:pPr>
-      <w:r>
-        <w:rPr>
-          <w:lang w:val="id-ID"/>
-        </w:rPr>
-        <w:t xml:space="preserve">Kumar dkk. (2026) menilai sistem berbasis aturan (</w:t>
-      </w:r>
-      <w:r>
-        <w:rPr>
-          <w:i/>
-          <w:lang w:val="id-ID"/>
-        </w:rPr>
-        <w:t xml:space="preserve">rule-based</w:t>
-      </w:r>
-      <w:r>
-        <w:rPr>
-          <w:lang w:val="id-ID"/>
-        </w:rPr>
-        <w:t xml:space="preserve">) dan hibrida layak dipakai di layanan kesehatan karena transparan dan dapat ditafsirkan (hlm. 12). Keunggulan utama sistem berbasis aturan ialah hasilnya dapat diprediksi dan mudah divalidasi, terutama pada kondisi klinis yang diatur regulasi (hlm. 12). Kelemahannya, menurut Kumar dkk., sistem itu tidak dapat diskalakan lintas institusi dan spesialisasi karena perbedaan bahasa klinis harus dipelihara secara manual, dan kinerjanya umumnya buruk pada dataset baru atau kebiasaan dokumentasi yang berubah (hlm. 12). Karena itu, sistem tersebut paling cocok untuk tugas berlingkup kecil atau sebagai bagian dari </w:t>
-      </w:r>
-      <w:r>
-        <w:rPr>
-          <w:i/>
-          <w:lang w:val="id-ID"/>
-        </w:rPr>
-        <w:t xml:space="preserve">pipeline</w:t>
-      </w:r>
-      <w:r>
-        <w:rPr>
-          <w:lang w:val="id-ID"/>
-        </w:rPr>
-        <w:t xml:space="preserve"> hibrida, bukan sebagai solusi tunggal (hlm. 12). Chen dkk. (2026) sejalan dengan itu: aturan dan leksikon eksplisit masih efektif untuk subtugas sempit seperti disambiguasi singkatan (hlm. 13).</w:t>
-      </w:r>
-    </w:p>
-    <w:p>
-      <w:pPr>
-        <w:rPr>
-          <w:lang w:val="id-ID"/>
-        </w:rPr>
-      </w:pPr>
-      <w:r>
-        <w:rPr>
-          <w:lang w:val="id-ID"/>
-        </w:rPr>
-        <w:t xml:space="preserve">Domingues (2026) menunjukkan sisi keterlacakan sistem berbasis aturan lewat OnCATs, sistem pendukung keputusan klinis untuk kanker prostat yang mengubah 23 pedoman internasional menjadi 1.236 aturan dalam format JSON (hlm. 1, 2). Setiap rekomendasi disertai jejak pembenaran yang menyebut aturan dan sumber pedoman yang aktif (hlm. 2). Sistem itu diuji pada sepuluh laporan kasus terbitan, dan penulisnya menyebut pengujian itu sebagai uji kelayakan teknis, bukan validasi klinis (hlm. 3, 5). Penulis mengaitkan ketidaksesuaian hasil dengan model harapan hidup yang disederhanakan dan data kasus yang tidak lengkap (hlm. 1), serta memperingatkan bahwa imputasi variabel yang hilang dapat membiaskan rekomendasi dan bahwa pembaruan basis pengetahuan secara manual berisiko tertinggal dari praktik klinis (hlm. 7). Meskipun judul artikelnya menyebut metode berbasis aturan dan AI, yang diuji hanya lapisan berbasis aturan; penulis sendiri menyebut sistemnya "</w:t>
-      </w:r>
-      <w:r>
-        <w:rPr>
-          <w:i/>
-          <w:lang w:val="id-ID"/>
-        </w:rPr>
-        <w:t xml:space="preserve">hybrid-ready</w:t>
-      </w:r>
-      <w:r>
-        <w:rPr>
-          <w:lang w:val="id-ID"/>
-        </w:rPr>
-        <w:t xml:space="preserve">", dengan modul pembelajaran mesin baru direncanakan (hlm. 2). Artikel ini karenanya tidak memberi bukti tentang kinerja sistem hibrida, dan domainnya ialah pedoman terapi onkologi, bukan audit dokumentasi.</w:t>
-      </w:r>
-    </w:p>
-    <w:p>
-      <w:pPr>
-        <w:pStyle w:val="Heading3"/>
-      </w:pPr>
-      <w:r>
-        <w:t xml:space="preserve">Pola Hibrida dan Bukti yang Tersedia</w:t>
-      </w:r>
-    </w:p>
-    <w:p>
-      <w:pPr>
-        <w:rPr>
-          <w:lang w:val="id-ID"/>
-        </w:rPr>
-      </w:pPr>
-      <w:r>
-        <w:rPr>
-          <w:lang w:val="id-ID"/>
-        </w:rPr>
-        <w:t xml:space="preserve">Ijadi Maghsoodi dkk. (2026) menyusun tinjauan naratif kritis atas 101 sumber yang dipilih dari 3.892 rekaman, dengan fokus pada sistem hibrida yang lapisan simboliknya, yaitu aturan, ontologi, atau batasan, disusun atau disetujui pemangku kepentingan (hlm. 1, 4). Salah satu dari setidaknya lima pola rancangan yang mereka identifikasi ialah ekstraksi saraf disertai validasi simbolik, tempat pemeriksaan konsistensi dan aturan dokumentasi memvalidasi keluaran model NLP atau model fondasi untuk abstraksi laporan, pengodean, dan pencatatan registri (hlm. 5). Tinjauan itu menyimpulkan bahwa desain hibrida tampak paling kredibel pada situasi yang terikat aturan, peka terhadap audit, dan bergantung pada alur kerja, termasuk validasi dokumentasi (hlm. 1), serta bahwa bukti empiris lebih kuat untuk tugas terbatas seperti validasi laporan dan ekstraksi informasi daripada untuk klaim yang ambisius tentang penalaran klinis, kalibrasi kepercayaan, atau perbaikan luaran pasien (hlm. 7). Untuk dokumentasi buatan model generatif, penulisnya berargumen bahwa validasi hibrida dapat menegakkan elemen wajib dan mendeteksi inkonsistensi (hlm. 7); ini argumen konseptual, bukan hasil uji.</w:t>
-      </w:r>
-    </w:p>
-    <w:p>
-      <w:pPr>
-        <w:rPr>
-          <w:lang w:val="id-ID"/>
-        </w:rPr>
-      </w:pPr>
-      <w:r>
-        <w:rPr>
-          <w:lang w:val="id-ID"/>
-        </w:rPr>
-        <w:t xml:space="preserve">Penulisnya sendiri membatasi kesimpulan itu. Basis empiris masih terbatas dan bukti prospektif jarang (hlm. 1), dan klaim tentang dampak pada mutu keputusan sebaiknya dibaca sebagai pembangkit hipotesis, bukan temuan konfirmatif (hlm. 6). Lapisan simbolik menimbulkan beban akuisisi pengetahuan, ketidakselarasan ontologi, konflik aturan, dan pemeliharaan (hlm. 1, 9). Proses penyaringan tinjauan itu mengecualikan rekaman nonbahasa Inggris (hlm. 2), dan literaturnya terkonsentrasi pada sistem kesehatan berpendapatan tinggi dan matang secara digital (hlm. 9).</w:t>
-      </w:r>
-    </w:p>
-    <w:p>
-      <w:pPr>
-        <w:pStyle w:val="Heading3"/>
-      </w:pPr>
-      <w:r>
         <w:t xml:space="preserve">Sintesis dan Celah</w:t>
       </w:r>
     </w:p>
@@ -4905,588 +5523,7 @@
         <w:rPr>
           <w:lang w:val="id-ID"/>
         </w:rPr>
-        <w:t xml:space="preserve">Sumber-sumber di atas mendukung dua hal yang terbatas: sistem berbasis aturan unggul dalam penelusuran dan validasi tetapi mahal dipelihara, dan kombinasi dengan komponen pembelajaran dinilai paling kredibel untuk validasi dokumentasi menurut satu tinjauan naratif. Keterbatasannya ada tiga. Pertama, di antara sumber yang dibaca, tidak ada yang membandingkan konfigurasi aturan saja dengan aturan ditambah AI/NLP pada audit dokumentasi klinis; satu-satunya sistem yang diuji (Domingues, 2026) hanya berbasis aturan, di bidang onkologi, pada sepuluh kasus. Kedua, dukungan terkuat untuk validasi dokumentasi bersifat konseptual (Ijadi Maghsoodi dkk., 2026, hlm. 7). Ketiga, tidak ada sumber yang menyangkut aturan atau dokumen klaim berbahasa Indonesia. Satu artikel pada daftar sumber, yang judulnya menyebut model hibrida pembelajaran mesin dan sistem pakar untuk identifikasi pemotongan klaim asuransi, belum dapat dibaca karena berkasnya tidak tersedia </w:t>
-      </w:r>
-      <w:r>
-        <w:rPr>
-          <w:highlight w:val="yellow"/>
-          <w:lang w:val="id-ID"/>
-        </w:rPr>
-        <w:t xml:space="preserve">[PERLU VERIFIKASI SUMBER]</w:t>
-      </w:r>
-      <w:r>
-        <w:rPr>
-          <w:lang w:val="id-ID"/>
-        </w:rPr>
-        <w:t xml:space="preserve">. Pembagian kerja antara aturan dan AI/NLP pada penelitian ini karenanya merupakan pilihan rancangan yang perlu dibenarkan lewat perbandingan konfigurasi aturan saja dengan aturan ditambah AI/NLP </w:t>
-      </w:r>
-      <w:r>
-        <w:rPr>
-          <w:highlight w:val="yellow"/>
-          <w:lang w:val="id-ID"/>
-        </w:rPr>
-        <w:t xml:space="preserve">[SESUAIKAN DENGAN BAB I: rumusan pertanyaan dan ukuran keberhasilan]</w:t>
-      </w:r>
-      <w:r>
-        <w:rPr>
-          <w:lang w:val="id-ID"/>
-        </w:rPr>
-        <w:t xml:space="preserve">.</w:t>
-      </w:r>
-    </w:p>
-    <w:p>
-      <w:pPr>
-        <w:pStyle w:val="Heading2"/>
-      </w:pPr>
-      <w:r>
-        <w:t xml:space="preserve">RAG, Penjangkaran Bukti, dan Halusinasi</w:t>
-      </w:r>
-    </w:p>
-    <w:p>
-      <w:pPr>
-        <w:pStyle w:val="Heading3"/>
-      </w:pPr>
-      <w:r>
-        <w:t xml:space="preserve">RAG pada Teks Klinis</w:t>
-      </w:r>
-    </w:p>
-    <w:p>
-      <w:pPr>
-        <w:rPr>
-          <w:lang w:val="id-ID"/>
-        </w:rPr>
-      </w:pPr>
-      <w:r>
-        <w:rPr>
-          <w:i/>
-          <w:lang w:val="id-ID"/>
-        </w:rPr>
-        <w:t xml:space="preserve">Retrieval-augmented generation</w:t>
-      </w:r>
-      <w:r>
-        <w:rPr>
-          <w:lang w:val="id-ID"/>
-        </w:rPr>
-        <w:t xml:space="preserve"> (RAG) menyisipkan bukti yang diambil dari sumber luar ke dalam masukan LLM sebelum model membangkitkan jawaban. Yang dkk. (2026) menelaah 251 studi RAG di bidang medis dan menemukan bahwa aplikasinya terkonsentrasi pada tanya jawab, pembuatan laporan, peringkasan teks, dan ekstraksi informasi (hlm. 2). Sumber pengetahuan yang paling sering dipakai ialah korpus ilmiah biomedis (88 studi), pedoman klinis (67 studi), dan rekam medis elektronik (33 studi) (hlm. 3). Dari 188 studi yang memakai </w:t>
-      </w:r>
-      <w:r>
-        <w:rPr>
-          <w:i/>
-          <w:lang w:val="id-ID"/>
-        </w:rPr>
-        <w:t xml:space="preserve">retrieval</w:t>
-      </w:r>
-      <w:r>
-        <w:rPr>
-          <w:lang w:val="id-ID"/>
-        </w:rPr>
-        <w:t xml:space="preserve"> padat, hanya 24 yang secara eksplisit memakai model </w:t>
-      </w:r>
-      <w:r>
-        <w:rPr>
-          <w:i/>
-          <w:lang w:val="id-ID"/>
-        </w:rPr>
-        <w:t xml:space="preserve">embedding</w:t>
-      </w:r>
-      <w:r>
-        <w:rPr>
-          <w:lang w:val="id-ID"/>
-        </w:rPr>
-        <w:t xml:space="preserve"> multibahasa; sisanya memakai model yang berpusat pada bahasa Inggris (hlm. 4). Penulisnya menilai RAG medis masih berada pada tahap awal dan memerlukan validasi klinis serta adaptasi lintas bahasa (hlm. 2). Landolsi dkk. (2026) menelaah 57 studi pada sepuluh bidang medis; hanya enam di antaranya yang memakai sumber nonbarat atau nonbahasa Inggris, dan hanya empat yang divalidasi lintas institusi (hlm. 6, 19).</w:t>
-      </w:r>
-    </w:p>
-    <w:p>
-      <w:pPr>
-        <w:rPr>
-          <w:lang w:val="id-ID"/>
-        </w:rPr>
-      </w:pPr>
-      <w:r>
-        <w:rPr>
-          <w:lang w:val="id-ID"/>
-        </w:rPr>
-        <w:t xml:space="preserve">Zhang dkk. (2026) memberi bukti yang paling dekat dengan catatan klinis sehari-hari. Mereka membandingkan enam strategi </w:t>
-      </w:r>
-      <w:r>
-        <w:rPr>
-          <w:i/>
-          <w:lang w:val="id-ID"/>
-        </w:rPr>
-        <w:t xml:space="preserve">retrieval</w:t>
-      </w:r>
-      <w:r>
-        <w:rPr>
-          <w:lang w:val="id-ID"/>
-        </w:rPr>
-        <w:t xml:space="preserve"> pada catatan keperawatan fasilitas perawatan lansia di Australia, dengan Llama 3.1 8B sebagai pembangkit dan indeks yang dibangun dari segmen catatan itu sendiri, untuk dua tugas ekstraksi entitas yang masing-masing diuji pada 208 rekaman (hlm. 1, 5). Tanpa </w:t>
-      </w:r>
-      <w:r>
-        <w:rPr>
-          <w:i/>
-          <w:lang w:val="id-ID"/>
-        </w:rPr>
-        <w:t xml:space="preserve">retrieval</w:t>
-      </w:r>
-      <w:r>
-        <w:rPr>
-          <w:lang w:val="id-ID"/>
-        </w:rPr>
-        <w:t xml:space="preserve">, F1 jawaban ialah 0,702 untuk gejala agitasi pada demensia dan 0,722 untuk faktor risiko malnutrisi; dengan </w:t>
-      </w:r>
-      <w:r>
-        <w:rPr>
-          <w:i/>
-          <w:lang w:val="id-ID"/>
-        </w:rPr>
-        <w:t xml:space="preserve">dense reranking</w:t>
-      </w:r>
-      <w:r>
-        <w:rPr>
-          <w:lang w:val="id-ID"/>
-        </w:rPr>
-        <w:t xml:space="preserve">, angkanya 0,946 dan 0,953 (hlm. 6). F1 jawaban itu dihitung dengan BERTScore, yaitu kemiripan semantik terhadap anotasi acuan (hlm. 3), bukan kecocokan label persis. Galat yang paling sering ialah fabrikasi intrinsik, yaitu model memutarbalikkan informasi yang ada di teks sumber, disusul fabrikasi ekstrinsik dan negatif palsu (hlm. 8, 9). Penulisnya membatasi kesimpulan pada dua tugas berbasis skema; ekstraksi relasi, penalaran temporal, dan tanya jawab terbuka tidak dievaluasi (hlm. 11). Jia dkk. (2026) menguji agen dengan </w:t>
-      </w:r>
-      <w:r>
-        <w:rPr>
-          <w:i/>
-          <w:lang w:val="id-ID"/>
-        </w:rPr>
-        <w:t xml:space="preserve">retrieval</w:t>
-      </w:r>
-      <w:r>
-        <w:rPr>
-          <w:lang w:val="id-ID"/>
-        </w:rPr>
-        <w:t xml:space="preserve">, </w:t>
-      </w:r>
-      <w:r>
-        <w:rPr>
-          <w:i/>
-          <w:lang w:val="id-ID"/>
-        </w:rPr>
-        <w:t xml:space="preserve">reranking</w:t>
-      </w:r>
-      <w:r>
-        <w:rPr>
-          <w:lang w:val="id-ID"/>
-        </w:rPr>
-        <w:t xml:space="preserve">, dan penjangkaran bukti pada tolok ukur tanya jawab berformat ujian dan melaporkan akurasi 82,98% pada USMLE Step 1, di atas 80,67% untuk GPT-4 (hlm. 2).</w:t>
-      </w:r>
-    </w:p>
-    <w:p>
-      <w:pPr>
-        <w:pStyle w:val="Heading3"/>
-      </w:pPr>
-      <w:r>
-        <w:t xml:space="preserve">Penjangkaran Bukti dan Pengecekan Keluaran</w:t>
-      </w:r>
-    </w:p>
-    <w:p>
-      <w:pPr>
-        <w:rPr>
-          <w:lang w:val="id-ID"/>
-        </w:rPr>
-      </w:pPr>
-      <w:r>
-        <w:rPr>
-          <w:lang w:val="id-ID"/>
-        </w:rPr>
-        <w:t xml:space="preserve">Waqas dkk. (2026) membedakan halusinasi faktual, </w:t>
-      </w:r>
-      <w:r>
-        <w:rPr>
-          <w:i/>
-          <w:lang w:val="id-ID"/>
-        </w:rPr>
-        <w:t xml:space="preserve">faithful</w:t>
-      </w:r>
-      <w:r>
-        <w:rPr>
-          <w:lang w:val="id-ID"/>
-        </w:rPr>
-        <w:t xml:space="preserve"> (tidak sesuai dengan masukan), logis, dan temporal (hlm. 4). Survei atas 90 publikasi itu, yang tidak memakai penilaian risiko bias formal (hlm. 4), mengutip RAGTruth bahwa halusinasi tetap terjadi ketika konteks ambigu atau </w:t>
-      </w:r>
-      <w:r>
-        <w:rPr>
-          <w:i/>
-          <w:lang w:val="id-ID"/>
-        </w:rPr>
-        <w:t xml:space="preserve">retrieval</w:t>
-      </w:r>
-      <w:r>
-        <w:rPr>
-          <w:lang w:val="id-ID"/>
-        </w:rPr>
-        <w:t xml:space="preserve"> gagal menemukan semua bukti yang relevan (hlm. 10), dan menyatakan bahwa bidang kesehatan membutuhkan laju positif palsu yang sangat rendah (hlm. 18). Sun dkk. (2025) menelaah 55 artikel, 15 di antaranya tentang halusinasi, dan menemukan bahwa mitigasi halusinasi sebagian besar dikaji pada tugas tanya jawab, dataset deteksi halusinasi langka, serta evaluasinya bergantung pada penilaian pakar tanpa kerangka baku (hlm. 15, 18).</w:t>
-      </w:r>
-    </w:p>
-    <w:p>
-      <w:pPr>
-        <w:rPr>
-          <w:lang w:val="id-ID"/>
-        </w:rPr>
-      </w:pPr>
-      <w:r>
-        <w:rPr>
-          <w:lang w:val="id-ID"/>
-        </w:rPr>
-        <w:t xml:space="preserve">Li dkk. (2026) mencontohkan penjangkaran bukti pada pendukung keputusan bedah tulang belakang. Pangkalan pengetahuannya memuat pedoman dan literatur yang masing-masing diberi ID, sumber, tahun, dan tingkat bukti, dan diperbarui tiap enam bulan dengan penanda versi (hlm. 3, 4). Empat paragraf teratas disisipkan ke masukan model, keluaran berformat “rekomendasi + paragraf kutipan”, dan model diinstruksikan menjawab </w:t>
-      </w:r>
-      <w:r>
-        <w:rPr>
-          <w:i/>
-          <w:lang w:val="id-ID"/>
-        </w:rPr>
-        <w:t xml:space="preserve">“no clear conclusions available”</w:t>
-      </w:r>
-      <w:r>
-        <w:rPr>
-          <w:lang w:val="id-ID"/>
-        </w:rPr>
-        <w:t xml:space="preserve"> bila literatur tidak memberi jawaban pasti (hlm. 4). Lima ahli bedah menilai 200 kasus dengan rubrik 11 dimensi, termasuk ketepatan bukti yang dikutip (hlm. 1, 5). Namun yang dibandingkan ialah empat agen LLM dalam satu kerangka RAG di satu pusat, bukan RAG terhadap tanpa RAG (hlm. 9), dan artikelnya tidak menguraikan pemeriksaan kutipan otomatis.</w:t>
-      </w:r>
-    </w:p>
-    <w:p>
-      <w:pPr>
-        <w:rPr>
-          <w:lang w:val="id-ID"/>
-        </w:rPr>
-      </w:pPr>
-      <w:r>
-        <w:rPr>
-          <w:lang w:val="id-ID"/>
-        </w:rPr>
-        <w:t xml:space="preserve">Zeba dkk. (2026) menempuh cara lain: modul pemeriksa fakta tanpa LLM yang memeriksa keluaran LLM terhadap rekam medis sumber (hlm. 1). Ringkasan dan rekam medis dipecah menjadi proposisi atomik (hlm. 7), lalu setiap proposisi diberi vonis Didukung atau Tidak Didukung melalui pemeriksaan negasi, implikasi, konsistensi temporal, eksklusivitas bersama, kecocokan numerik, dan keberadaan (hlm. 6, 14). Pada 104 ringkasan yang diekstrak menjadi 3.786 proposisi dan divalidasi dokter, modul itu mencapai presisi 0,8904, </w:t>
-      </w:r>
-      <w:r>
-        <w:rPr>
-          <w:i/>
-          <w:lang w:val="id-ID"/>
-        </w:rPr>
-        <w:t xml:space="preserve">recall</w:t>
-      </w:r>
-      <w:r>
-        <w:rPr>
-          <w:lang w:val="id-ID"/>
-        </w:rPr>
-        <w:t xml:space="preserve"> 0,8234, dan F1 0,8556 (hlm. 1). Tanpa pemeriksaan negasi dan numerik, presisinya turun lebih dari 8% (hlm. 14). Datanya berasal dari MIMIC-III, rekam medis unit perawatan intensif (hlm. 10), dan penulisnya menyatakan sistem kurang andal pada bidang yang kurang terwakili, termasuk gangguan metabolik anak, serta hanya memberi vonis biner tanpa usul perbaikan (hlm. 15).</w:t>
-      </w:r>
-    </w:p>
-    <w:p>
-      <w:pPr>
-        <w:pStyle w:val="Heading3"/>
-      </w:pPr>
-      <w:r>
-        <w:t xml:space="preserve">Sintesis dan Celah</w:t>
-      </w:r>
-    </w:p>
-    <w:p>
-      <w:pPr>
-        <w:rPr>
-          <w:lang w:val="id-ID"/>
-        </w:rPr>
-      </w:pPr>
-      <w:r>
-        <w:rPr>
-          <w:lang w:val="id-ID"/>
-        </w:rPr>
-        <w:t xml:space="preserve">Sumber-sumber di atas menunjukkan bahwa </w:t>
-      </w:r>
-      <w:r>
-        <w:rPr>
-          <w:i/>
-          <w:lang w:val="id-ID"/>
-        </w:rPr>
-        <w:t xml:space="preserve">retrieval</w:t>
-      </w:r>
-      <w:r>
-        <w:rPr>
-          <w:lang w:val="id-ID"/>
-        </w:rPr>
-        <w:t xml:space="preserve"> menaikkan kinerja ekstraksi pada catatan klinis dan bahwa keluaran dapat ditautkan serta diperiksa terhadap sumbernya, tetapi ada empat celah bagi penelitian ini. Pertama, aplikasi RAG terkonsentrasi pada tanya jawab, pembuatan laporan, peringkasan, dan ekstraksi (Yang dkk., 2026, hlm. 2), dan bukti kinerja yang paling mencolok berasal dari soal ujian (Jia dkk., 2026, hlm. 2); di antara sumber yang dibaca, tidak ada yang menguji RAG untuk memeriksa kesesuaian antardokumen dalam satu episode rawat. Kedua, tidak ada sumber yang menguji teks klinis berbahasa Indonesia, dan </w:t>
-      </w:r>
-      <w:r>
-        <w:rPr>
-          <w:i/>
-          <w:lang w:val="id-ID"/>
-        </w:rPr>
-        <w:t xml:space="preserve">retrieval</w:t>
-      </w:r>
-      <w:r>
-        <w:rPr>
-          <w:lang w:val="id-ID"/>
-        </w:rPr>
-        <w:t xml:space="preserve"> umumnya memakai model berpusat pada bahasa Inggris (Yang dkk., 2026, hlm. 4; Landolsi dkk., 2026, hlm. 19). Ketiga, pemeriksaan keluaran terhadap sumber baru didemonstrasikan pada ringkasan LLM atas rekam medis berbahasa Inggris (Zeba dkk., 2026), sedangkan ketepatan kutipan pada Li dkk. (2026) dinilai ahli. Keempat, kontribusi </w:t>
-      </w:r>
-      <w:r>
-        <w:rPr>
-          <w:i/>
-          <w:lang w:val="id-ID"/>
-        </w:rPr>
-        <w:t xml:space="preserve">retrieval</w:t>
-      </w:r>
-      <w:r>
-        <w:rPr>
-          <w:lang w:val="id-ID"/>
-        </w:rPr>
-        <w:t xml:space="preserve"> dibandingkan dengan kondisi tanpa </w:t>
-      </w:r>
-      <w:r>
-        <w:rPr>
-          <w:i/>
-          <w:lang w:val="id-ID"/>
-        </w:rPr>
-        <w:t xml:space="preserve">retrieval</w:t>
-      </w:r>
-      <w:r>
-        <w:rPr>
-          <w:lang w:val="id-ID"/>
-        </w:rPr>
-        <w:t xml:space="preserve"> hanya pada dua tugas ekstraksi berbasis skema (Zhang dkk., 2026, hlm. 6, 11); pada audit, kontribusinya terhadap mutu temuan dan biaya positif palsunya belum diukur. Manfaat RAG pada audit dokumentasi rawat inap kebidanan dan anak karena itu perlu diuji dengan membandingkan konfigurasi dengan dan tanpa </w:t>
-      </w:r>
-      <w:r>
-        <w:rPr>
-          <w:i/>
-          <w:lang w:val="id-ID"/>
-        </w:rPr>
-        <w:t xml:space="preserve">retrieval</w:t>
-      </w:r>
-      <w:r>
-        <w:rPr>
-          <w:lang w:val="id-ID"/>
-        </w:rPr>
-        <w:t xml:space="preserve"> </w:t>
-      </w:r>
-      <w:r>
-        <w:rPr>
-          <w:highlight w:val="yellow"/>
-          <w:lang w:val="id-ID"/>
-        </w:rPr>
-        <w:t xml:space="preserve">[SESUAIKAN DENGAN BAB I: rumusan pertanyaan dan ukuran keberhasilan]</w:t>
-      </w:r>
-      <w:r>
-        <w:rPr>
-          <w:lang w:val="id-ID"/>
-        </w:rPr>
-        <w:t xml:space="preserve">.</w:t>
-      </w:r>
-    </w:p>
-    <w:p>
-      <w:pPr>
-        <w:pStyle w:val="Heading2"/>
-      </w:pPr>
-      <w:r>
-        <w:t xml:space="preserve">De-identifikasi untuk Layanan AI Eksternal</w:t>
-      </w:r>
-    </w:p>
-    <w:p>
-      <w:pPr>
-        <w:pStyle w:val="Heading3"/>
-      </w:pPr>
-      <w:r>
-        <w:t xml:space="preserve">Pendekatan De-identifikasi dan Bukti yang Tersedia</w:t>
-      </w:r>
-    </w:p>
-    <w:p>
-      <w:pPr>
-        <w:rPr>
-          <w:lang w:val="id-ID"/>
-        </w:rPr>
-      </w:pPr>
-      <w:r>
-        <w:rPr>
-          <w:lang w:val="id-ID"/>
-        </w:rPr>
-        <w:t xml:space="preserve">Faustini dkk. (2026) menelaah 83 artikel yang dipilih dari 734 tentang de-identifikasi data klinis berbasis NLP pada tahun 2015–2024, dengan de-identifikasi didefinisikan sebagai pendeteksian, penggantian, atau penghapusan informasi kesehatan yang dilindungi (</w:t>
-      </w:r>
-      <w:r>
-        <w:rPr>
-          <w:i/>
-          <w:lang w:val="id-ID"/>
-        </w:rPr>
-        <w:t xml:space="preserve">protected health information</w:t>
-      </w:r>
-      <w:r>
-        <w:rPr>
-          <w:lang w:val="id-ID"/>
-        </w:rPr>
-        <w:t xml:space="preserve">, PHI) (hlm. 1, 2). Mereka menyimpulkan bahwa penggunaan model bahasa meningkat, bahwa perkakas siap pakai sering perlu disesuaikan, dan bahwa sebagian besar studi menggarap konten berbahasa Inggris karena dataset yang tersedia berbahasa Inggris (hlm. 1). Metode berbasis aturan tetap umum di luar bahasa Inggris (hlm. 6), sedangkan tantangan utamanya ialah campur kode dan kelangkaan dataset yang dapat direproduksi (hlm. 1). Faustini dkk. juga melaporkan temuan studi lain bahwa Presidio kesulitan mengenali nama Slavia serta nama Asia Tengah dan Asia Tenggara dibandingkan nama Inggris (hlm. 5), dan bahwa F1 sebuah LLM dapat turun serendah 0,33 tanpa contoh dan instruksi rinci pada perintah (</w:t>
-      </w:r>
-      <w:r>
-        <w:rPr>
-          <w:i/>
-          <w:lang w:val="id-ID"/>
-        </w:rPr>
-        <w:t xml:space="preserve">prompt</w:t>
-      </w:r>
-      <w:r>
-        <w:rPr>
-          <w:lang w:val="id-ID"/>
-        </w:rPr>
-        <w:t xml:space="preserve">), dibandingkan 0,98 dengan perintah rinci (hlm. 6).</w:t>
-      </w:r>
-    </w:p>
-    <w:p>
-      <w:pPr>
-        <w:rPr>
-          <w:lang w:val="id-ID"/>
-        </w:rPr>
-      </w:pPr>
-      <w:r>
-        <w:rPr>
-          <w:lang w:val="id-ID"/>
-        </w:rPr>
-        <w:t xml:space="preserve">Azzam dkk. (2026) mengusulkan sistem agentik yang memisahkan lingkungan pemrosesan: LLM yang dihosting lokal menangani semua langkah sensitif, sedangkan LLM publik hanya menalar atas masukan yang sudah dianonimkan (hlm. 1), dengan pemetaan lokal untuk mengembalikan identitas pada jawaban (hlm. 10). Pada dataset rekam medis sintetis, sistem itu mencapai presisi 1,000 dan </w:t>
-      </w:r>
-      <w:r>
-        <w:rPr>
-          <w:i/>
-          <w:lang w:val="id-ID"/>
-        </w:rPr>
-        <w:t xml:space="preserve">recall</w:t>
-      </w:r>
-      <w:r>
-        <w:rPr>
-          <w:lang w:val="id-ID"/>
-        </w:rPr>
-        <w:t xml:space="preserve"> 0,936, sedangkan spaCy dan Presidio berpresisi 0,329 dan 0,405 dengan </w:t>
-      </w:r>
-      <w:r>
-        <w:rPr>
-          <w:i/>
-          <w:lang w:val="id-ID"/>
-        </w:rPr>
-        <w:t xml:space="preserve">recall</w:t>
-      </w:r>
-      <w:r>
-        <w:rPr>
-          <w:lang w:val="id-ID"/>
-        </w:rPr>
-        <w:t xml:space="preserve"> sekitar 0,89 (hlm. 12). Pada 100 catatan MIMIC-III, 98,6% penanda redaksi bawaan dataset berubah bersih; penanda itu dipakai sebagai pengganti label acuan karena catatannya sudah dide-identifikasi (hlm. 1, 15). Kelestarian informasi klinis tidak penuh: sebutan obat terjaga 0,974, tetapi dosis hanya 0,769 (hlm. 12). Penulisnya menyatakan sistem baru mendukung masukan berbahasa Inggris (hlm. 19).</w:t>
-      </w:r>
-    </w:p>
-    <w:p>
-      <w:pPr>
-        <w:rPr>
-          <w:lang w:val="id-ID"/>
-        </w:rPr>
-      </w:pPr>
-      <w:r>
-        <w:rPr>
-          <w:lang w:val="id-ID"/>
-        </w:rPr>
-        <w:t xml:space="preserve">Tchouka dkk. (2024) menguji de-identifikasi pada dokumen medis berbahasa Prancis di sebuah rumah sakit publik, dengan seluruh eksperimen dilakukan di lokasi rumah sakit tanpa ada data yang dibawa keluar (hlm. 2). Tanggal, usia, dan lokasi diganti dengan privasi diferensial lokal berbasis metrik agar aspek kronologis dan geografisnya tidak hilang (hlm. 1, 7). Manfaatnya diukur lewat tugas asosiasi kode ICD-10: skor F1 turun sekitar 12% terhadap korpus asli bila setiap entitas diganti dengan labelnya, yaitu cara yang dinilai paling tahan terhadap serangan re-identifikasi tetapi membuang nilai entitas, dan 6,8% dengan pendekatan itu (hlm. 2, 12, 13). Penulisnya mengingatkan bahwa dataset hasil de-identifikasi tetap tidak kebal terhadap serangan re-identifikasi dan keanggotaan, sehingga tidak dapat disebarluaskan (hlm. 13).</w:t>
-      </w:r>
-    </w:p>
-    <w:p>
-      <w:pPr>
-        <w:pStyle w:val="Heading3"/>
-      </w:pPr>
-      <w:r>
-        <w:t xml:space="preserve">Sintesis dan Celah</w:t>
-      </w:r>
-    </w:p>
-    <w:p>
-      <w:pPr>
-        <w:rPr>
-          <w:lang w:val="id-ID"/>
-        </w:rPr>
-      </w:pPr>
-      <w:r>
-        <w:rPr>
-          <w:lang w:val="id-ID"/>
-        </w:rPr>
-        <w:t xml:space="preserve">Sumber-sumber di atas mendukung dua hal yang terbatas: de-identifikasi oleh LLM lokal dapat memisahkan data sensitif dari LLM publik pada pengujian awal, dan penggantian yang memperhatikan utilitas mengurangi kehilangan kinerja pada tugas hilir berbasis kode. Keterbatasannya ada tiga. Pertama, tidak ada sumber yang menguji teks klinis berbahasa Indonesia atau pengenal khas Indonesia seperti NIK dan nomor rekam medis; temuan tentang nama Asia Tenggara bersifat sekunder dan menyangkut perkakas yang diuji pada data lain (Faustini dkk., 2026, hlm. 5). Kedua, bukti untuk pendekatan berbasis LLM lokal berasal dari data sintetis dan catatan berbahasa Inggris yang sudah dide-identifikasi (Azzam dkk., 2026, hlm. 15), sehingga kebocoran PHI pada catatan baru yang belum diredaksi belum terukur. Ketiga, kehilangan utilitas baru diukur pada asosiasi kode ICD-10 (Tchouka dkk., 2024, hlm. 13) atau pada sebutan obat dan dosis (Azzam dkk., 2026, hlm. 12); dampak de-identifikasi terhadap temuan audit yang bergantung pada tanggal, dosis, dan urutan waktu belum diukur. De-identifikasi pada penelitian ini perlu diuji pada data berbahasa Indonesia, dengan ukuran kebocoran pengenal dan dampaknya pada mutu temuan </w:t>
-      </w:r>
-      <w:r>
-        <w:rPr>
-          <w:highlight w:val="yellow"/>
-          <w:lang w:val="id-ID"/>
-        </w:rPr>
-        <w:t xml:space="preserve">[SESUAIKAN DENGAN BAB I: rumusan pertanyaan dan ukuran keberhasilan]</w:t>
-      </w:r>
-      <w:r>
-        <w:rPr>
-          <w:lang w:val="id-ID"/>
-        </w:rPr>
-        <w:t xml:space="preserve">.</w:t>
-      </w:r>
-    </w:p>
-    <w:p>
-      <w:pPr>
-        <w:pStyle w:val="Heading2"/>
-      </w:pPr>
-      <w:r>
-        <w:t xml:space="preserve">Evaluasi Sistem NLP Klinis</w:t>
-      </w:r>
-    </w:p>
-    <w:p>
-      <w:pPr>
-        <w:pStyle w:val="Heading3"/>
-      </w:pPr>
-      <w:r>
-        <w:t xml:space="preserve">Acuan Penilaian dan Variabilitas Penilai</w:t>
-      </w:r>
-    </w:p>
-    <w:p>
-      <w:pPr>
-        <w:rPr>
-          <w:lang w:val="id-ID"/>
-        </w:rPr>
-      </w:pPr>
-      <w:r>
-        <w:rPr>
-          <w:lang w:val="id-ID"/>
-        </w:rPr>
-        <w:t xml:space="preserve">Becker dkk. (2025) memperluas korpus CARDIO:DE, yaitu 500 surat dokter berbahasa Jerman di bidang kardiovaskular (hlm. 2), dengan lima label entitas: diagnosis, tindakan diagnostik, obat, temuan medis, dan terapi (hlm. 1). Seorang apoteker dan seorang ekonom kesehatan mula-mula menganotasi sekitar 15% korpus secara tumpang tindih, membahas ketidaksesuaiannya, lalu menganotasi 5% tambahan secara tumpang tindih, dengan ambang kesepakatan Krippendorff's alpha </w:t>
-      </w:r>
-      <w:r>
-        <w:rPr>
-          <w:i/>
-          <w:lang w:val="id-ID"/>
-        </w:rPr>
-        <w:t xml:space="preserve">unitizing</w:t>
-      </w:r>
-      <w:r>
-        <w:rPr>
-          <w:lang w:val="id-ID"/>
-        </w:rPr>
-        <w:t xml:space="preserve"> 0,85 yang ditetapkan sebelumnya (hlm. 2). Kesepakatan mencapai 0,98 pada beberapa subset (hlm. 1), tetapi seluruh proses memakan tujuh bulan dan 10–40 menit per dokumen (hlm. 2). Empat model diuji dengan pencocokan entitas yang sangat menekankan batas entitas (hlm. 4), dan TinyLlama menghasilkan F1 makro 0,845 (hlm. 1). Semua model sering menukar temuan medis dengan diagnosis (hlm. 4), dan penulisnya menunjukkan bahwa frasa seperti "80 % main stem stenosis" dapat dilabeli keduanya bergantung pada konteks (hlm. 3).</w:t>
-      </w:r>
-    </w:p>
-    <w:p>
-      <w:pPr>
-        <w:rPr>
-          <w:lang w:val="id-ID"/>
-        </w:rPr>
-      </w:pPr>
-      <w:r>
-        <w:rPr>
-          <w:lang w:val="id-ID"/>
-        </w:rPr>
-        <w:t xml:space="preserve">van Koevorden dkk. (2026) memvalidasi ekstraksi data oleh LLM sumber terbuka pada 1.482 halaman dokumen klinis 60 pasien onkologi kepala dan leher untuk 29 kategori, dengan enam pakar menilai 2.555 nilai: penilaian cocok atau tidak cocok secara buta, lalu pengkategorian galat (hlm. 1). Akurasi per kategori berkisar 74% sampai 90%, dan penulis menegaskan bahwa metrik itu adalah metrik yang ditetapkan pakar karena keluaran model berupa teks bebas, bukan prediksi kategorikal (hlm. 1, 4). Dua dokter yang mengekstraksi secara independen berselisih pada 29,0% nilai, sedangkan LLM berselisih dari konsensus mereka pada 41,4% dalam pemetaan awal (hlm. 4). Setelah peninjauan, lebih dari separuh keluaran LLM yang semula dinilai berbeda dinyatakan cocok (hlm. 5), dan dari 65 keluaran yang semula dikategorikan halusinasi hanya empat yang terkonfirmasi setelah dicek ke dokumen asli (hlm. 6). Penilaian dampak galat juga tidak seragam: satu dari enam penilai menandai 61 dari 68 galat sebagai berdampak tinggi (hlm. 5). Penulisnya menyimpulkan bahwa taksonomi galat dan metrik saja tidak cukup untuk menilai konsekuensi klinis (hlm. 5), dan bahwa jumlah ekstraktor manusia yang kecil membatasi estimasi variabilitas antarpenilai (hlm. 7). Sun dkk. (2025) juga mencatat bahwa evaluasi halusinasi bergantung pada penilaian pakar yang dapat bersifat subjektif dan berbeda antarstudi (hlm. 18).</w:t>
-      </w:r>
-    </w:p>
-    <w:p>
-      <w:pPr>
-        <w:pStyle w:val="Heading3"/>
-      </w:pPr>
-      <w:r>
-        <w:t xml:space="preserve">Sintesis dan Celah</w:t>
-      </w:r>
-    </w:p>
-    <w:p>
-      <w:pPr>
-        <w:rPr>
-          <w:lang w:val="id-ID"/>
-        </w:rPr>
-      </w:pPr>
-      <w:r>
-        <w:rPr>
-          <w:lang w:val="id-ID"/>
-        </w:rPr>
-        <w:t xml:space="preserve">Kedua sumber menunjukkan bahwa acuan penilaian perlu dirancang dan diukur, bukan diasumsikan: kesepakatan antarpenilai dapat diukur dengan ambang yang ditetapkan sebelumnya (Becker dkk., 2025, hlm. 2), dan ketidaksepakatan antarmanusia dapat mencapai 29,0% pada ekstraksi klinis (van Koevorden dkk., 2026, hlm. 4). Keterbatasannya ada tiga. Pertama, keduanya mengevaluasi ekstraksi entitas atau nilai dari satu dokumen, bukan temuan ketidaksesuaian antardokumen. Kedua, teks yang dievaluasi berbahasa Jerman dan Belanda (Becker dkk., 2025, hlm. 2; van Koevorden dkk., 2026, hlm. 7), bukan Indonesia, dan van Koevorden dkk. membatasi generalisasi pada satu pusat rujukan tersier (hlm. 8). Ketiga, hanya Becker dkk. yang mengukur kesepakatan antarpenilai secara formal; pada van Koevorden dkk. jumlah penilai manusia terlalu kecil untuk estimasi itu. Akibatnya, evaluasi audit dokumentasi perlu menetapkan unit temuan, perlakuan kasus ambigu, ukuran kesepakatan penilai, serta ukuran dan ambang kegagalan sebelum eksperimen; acuan yang ditetapkan satu penilai tidak dapat memperkirakan variabilitas antarpenilai </w:t>
+        <w:t xml:space="preserve">Kedua sumber menunjukkan bahwa acuan penilaian perlu dirancang dan diukur, bukan diasumsikan: kesepakatan antarpenilai dapat diukur dengan ambang yang ditetapkan sebelumnya (Becker dkk., 2025, hlm. 2), dan ketidaksepakatan antarmanusia dapat mencapai 29,0% pada ekstraksi klinis (van Koevorden dkk., 2026, hlm. 4). Namun, ada tiga keterbatasan. Pertama, keduanya mengevaluasi ekstraksi entitas atau nilai dari satu dokumen, bukan temuan ketidaksesuaian antardokumen. Kedua, teks yang dievaluasi berbahasa Jerman dan Belanda (Becker dkk., 2025, hlm. 2; van Koevorden dkk., 2026, hlm. 7), bukan Indonesia, dan van Koevorden dkk. membatasi generalisasi pada satu pusat rujukan tersier (hlm. 8). Ketiga, hanya Becker dkk. yang mengukur kesepakatan antarpenilai secara formal; pada van Koevorden dkk. jumlah penilai manusia terlalu kecil untuk estimasi itu. Akibatnya, evaluasi audit dokumentasi perlu menetapkan unit temuan, perlakuan kasus ambigu, ukuran kesepakatan penilai, serta ukuran dan ambang kegagalan sebelum eksperimen; acuan yang ditetapkan satu penilai tidak dapat memperkirakan variabilitas antarpenilai </w:t>
       </w:r>
       <w:r>
         <w:rPr>
@@ -6532,7 +6569,7 @@
         <w:rPr>
           <w:lang w:val="id-ID"/>
         </w:rPr>
-        <w:t xml:space="preserve">Dari 33 sumber yang dirujuk dalam bab ini, empat celah berulang. Pertama, tidak ada studi NLP atau AI yang menguji teks klinis berbahasa Indonesia, termasuk singkatan dan pengenal lokalnya (subbab II.2, II.3, II.6). Kedua, tidak ada yang memeriksa kesesuaian antardokumen dalam satu episode rawat inap sebelum klaim diajukan, misalnya membandingkan catatan perkembangan harian dengan ringkasan akhir atau memakai pedoman sebagai dasar temuan (II.1, II.3, II.5). Ketiga, di antara sumber yang dibaca, tidak ada yang membandingkan konfigurasi aturan saja dengan aturan ditambah AI/NLP berbasis RAG pada tugas ini, dan ketepatan kutipan bukti belum diperiksa secara otomatis (II.4, II.5). Keempat, acuan penilaian untuk audit, yaitu unit temuan, perlakuan kasus ambigu, dan ukuran kesepakatan penilai, belum dirancang pada sumber mana pun, padahal ketidaksepakatan antarpenilai dapat mencapai 29,0% pada ekstraksi klinis (II.7). Pernyataan "tidak ada" ini berlaku pada 33 sumber tersebut, bukan pada seluruh literatur. Penelitian ini mengisi celah itu dengan menguji audit dokumentasi rawat inap kebidanan dan anak berbahasa Indonesia terhadap pembanding, ukuran, dan ambang kegagalan yang ditetapkan sebelum eksperimen </w:t>
+        <w:t xml:space="preserve">Dari 36 sumber yang dirujuk dalam bab ini, empat celah berulang. Pertama, tidak ada studi NLP atau AI yang menguji teks klinis berbahasa Indonesia, termasuk singkatan dan pengenal lokalnya (subbab II.2, II.3, II.6); studi pembelajaran mesin pada data Indonesia dalam sumber ini, yaitu Barsasella dkk. (2021), memakai variabel klaim terstruktur (II.1). Kedua, tidak ada yang memeriksa kesesuaian antardokumen dalam satu episode rawat inap sebelum klaim diajukan, misalnya membandingkan catatan perkembangan harian dengan ringkasan akhir atau memakai pedoman sebagai dasar temuan (II.1, II.3, II.5). Ketiga, di antara sumber yang dibaca, tidak ada yang membandingkan konfigurasi aturan saja dengan aturan ditambah AI/NLP berbasis RAG pada tugas ini, dan ketepatan kutipan bukti belum diperiksa secara otomatis (II.4, II.5). Keempat, acuan penilaian untuk audit, yaitu unit temuan, perlakuan kasus ambigu, dan ukuran kesepakatan penilai, belum dirancang pada sumber mana pun, padahal ketidaksepakatan antarpenilai dapat mencapai 29,0% pada ekstraksi klinis (II.7). Pernyataan "tidak ada" ini berlaku pada 36 sumber tersebut, bukan pada seluruh literatur. Penelitian ini mengisi celah itu dengan menguji audit dokumentasi rawat inap kebidanan dan anak berbahasa Indonesia terhadap pembanding, ukuran, dan ambang kegagalan yang ditetapkan sebelum eksperimen </w:t>
       </w:r>
       <w:r>
         <w:rPr>
@@ -7024,7 +7061,7 @@
           <w:noProof/>
           <w:lang w:val="id-ID"/>
         </w:rPr>
-        <w:t xml:space="preserve">Becker, M., Krumscheid, M., Knobelspies, A., Seydel, M., Richter-Pechanski, P., &amp; Karl, A. (2025). Extending CARDIO:DE: Additional annotation guidelines and evaluation of NLP approaches for clinical applications. </w:t>
+        <w:t xml:space="preserve">Barsasella, D., Gupta, S., Malwade, S., Aminin, Susanti, Y., Tirmadi, B., Mutamakin, A., Jonnagaddala, J., &amp; Syed-Abdul, S. (2021). Predicting length of stay and mortality among hospitalized patients with type 2 diabetes mellitus and hypertension. </w:t>
       </w:r>
       <w:r>
         <w:rPr>
@@ -7032,14 +7069,14 @@
           <w:noProof/>
           <w:lang w:val="id-ID"/>
         </w:rPr>
-        <w:t xml:space="preserve">International Journal of Medical Informatics, 203</w:t>
-      </w:r>
-      <w:r>
-        <w:rPr>
-          <w:noProof/>
-          <w:lang w:val="id-ID"/>
-        </w:rPr>
-        <w:t xml:space="preserve">, 106009.</w:t>
+        <w:t xml:space="preserve">International Journal of Medical Informatics, 154</w:t>
+      </w:r>
+      <w:r>
+        <w:rPr>
+          <w:noProof/>
+          <w:lang w:val="id-ID"/>
+        </w:rPr>
+        <w:t xml:space="preserve">, 104569.</w:t>
       </w:r>
     </w:p>
     <w:p>
@@ -7056,7 +7093,7 @@
           <w:noProof/>
           <w:lang w:val="id-ID"/>
         </w:rPr>
-        <w:t xml:space="preserve">Chen, H., Zhou, Y., Li, R., Illa, A. M., Cleveland, A., &amp; Ding, J. (2026). A comprehensive survey on medical concept normalization: Datasets, techniques, applications, and future directions. </w:t>
+        <w:t xml:space="preserve">Becker, M., Krumscheid, M., Knobelspies, A., Seydel, M., Richter-Pechanski, P., &amp; Karl, A. (2025). Extending CARDIO:DE: Additional annotation guidelines and evaluation of NLP approaches for clinical applications. </w:t>
       </w:r>
       <w:r>
         <w:rPr>
@@ -7064,14 +7101,14 @@
           <w:noProof/>
           <w:lang w:val="id-ID"/>
         </w:rPr>
-        <w:t xml:space="preserve">Journal of Biomedical Informatics, 178</w:t>
-      </w:r>
-      <w:r>
-        <w:rPr>
-          <w:noProof/>
-          <w:lang w:val="id-ID"/>
-        </w:rPr>
-        <w:t xml:space="preserve">, 105005.</w:t>
+        <w:t xml:space="preserve">International Journal of Medical Informatics, 203</w:t>
+      </w:r>
+      <w:r>
+        <w:rPr>
+          <w:noProof/>
+          <w:lang w:val="id-ID"/>
+        </w:rPr>
+        <w:t xml:space="preserve">, 106009.</w:t>
       </w:r>
     </w:p>
     <w:p>
@@ -7088,7 +7125,7 @@
           <w:noProof/>
           <w:lang w:val="id-ID"/>
         </w:rPr>
-        <w:t xml:space="preserve">Dietrich, N., &amp; Stubbert, B. (2026). Automated auditing of emergency department documentation using large language models. </w:t>
+        <w:t xml:space="preserve">Chen, H., Zhou, Y., Li, R., Illa, A. M., Cleveland, A., &amp; Ding, J. (2026). A comprehensive survey on medical concept normalization: Datasets, techniques, applications, and future directions. </w:t>
       </w:r>
       <w:r>
         <w:rPr>
@@ -7096,14 +7133,14 @@
           <w:noProof/>
           <w:lang w:val="id-ID"/>
         </w:rPr>
-        <w:t xml:space="preserve">American Journal of Emergency Medicine, 104</w:t>
-      </w:r>
-      <w:r>
-        <w:rPr>
-          <w:noProof/>
-          <w:lang w:val="id-ID"/>
-        </w:rPr>
-        <w:t xml:space="preserve">, 95–101.</w:t>
+        <w:t xml:space="preserve">Journal of Biomedical Informatics, 178</w:t>
+      </w:r>
+      <w:r>
+        <w:rPr>
+          <w:noProof/>
+          <w:lang w:val="id-ID"/>
+        </w:rPr>
+        <w:t xml:space="preserve">, 105005.</w:t>
       </w:r>
     </w:p>
     <w:p>
@@ -7120,7 +7157,7 @@
           <w:noProof/>
           <w:lang w:val="id-ID"/>
         </w:rPr>
-        <w:t xml:space="preserve">Domingues, N. S. (2026). A hybrid decision support system using rule-based and AI methods: The OnCATs knowledge-based framework. </w:t>
+        <w:t xml:space="preserve">Dietrich, N., &amp; Stubbert, B. (2026). Automated auditing of emergency department documentation using large language models. </w:t>
       </w:r>
       <w:r>
         <w:rPr>
@@ -7128,14 +7165,14 @@
           <w:noProof/>
           <w:lang w:val="id-ID"/>
         </w:rPr>
-        <w:t xml:space="preserve">International Journal of Medical Informatics, 206</w:t>
-      </w:r>
-      <w:r>
-        <w:rPr>
-          <w:noProof/>
-          <w:lang w:val="id-ID"/>
-        </w:rPr>
-        <w:t xml:space="preserve">, 106144.</w:t>
+        <w:t xml:space="preserve">American Journal of Emergency Medicine, 104</w:t>
+      </w:r>
+      <w:r>
+        <w:rPr>
+          <w:noProof/>
+          <w:lang w:val="id-ID"/>
+        </w:rPr>
+        <w:t xml:space="preserve">, 95–101.</w:t>
       </w:r>
     </w:p>
     <w:p>
@@ -7152,7 +7189,7 @@
           <w:noProof/>
           <w:lang w:val="id-ID"/>
         </w:rPr>
-        <w:t xml:space="preserve">Du, W. (H.), Wang, G., Xu, J. (N.), &amp; Vasarhelyi, M. A. (2026). Information systems auditing of psychiatric diagnoses using context-enriched QA-based language models. </w:t>
+        <w:t xml:space="preserve">Domingues, N. S. (2026). A hybrid decision support system using rule-based and AI methods: The OnCATs knowledge-based framework. </w:t>
       </w:r>
       <w:r>
         <w:rPr>
@@ -7160,14 +7197,14 @@
           <w:noProof/>
           <w:lang w:val="id-ID"/>
         </w:rPr>
-        <w:t xml:space="preserve">Data Science and Management, 9</w:t>
-      </w:r>
-      <w:r>
-        <w:rPr>
-          <w:noProof/>
-          <w:lang w:val="id-ID"/>
-        </w:rPr>
-        <w:t xml:space="preserve">, 100177.</w:t>
+        <w:t xml:space="preserve">International Journal of Medical Informatics, 206</w:t>
+      </w:r>
+      <w:r>
+        <w:rPr>
+          <w:noProof/>
+          <w:lang w:val="id-ID"/>
+        </w:rPr>
+        <w:t xml:space="preserve">, 106144.</w:t>
       </w:r>
     </w:p>
     <w:p>
@@ -7184,7 +7221,7 @@
           <w:noProof/>
           <w:lang w:val="id-ID"/>
         </w:rPr>
-        <w:t xml:space="preserve">Elvas, L. B., Almeida, A., &amp; Ferreira, J. C. (2025). Natural language processing in medical text processing: A scoping literature review. </w:t>
+        <w:t xml:space="preserve">Du, W. (H.), Wang, G., Xu, J. (N.), &amp; Vasarhelyi, M. A. (2026). Information systems auditing of psychiatric diagnoses using context-enriched QA-based language models. </w:t>
       </w:r>
       <w:r>
         <w:rPr>
@@ -7192,14 +7229,14 @@
           <w:noProof/>
           <w:lang w:val="id-ID"/>
         </w:rPr>
-        <w:t xml:space="preserve">International Journal of Medical Informatics, 204</w:t>
-      </w:r>
-      <w:r>
-        <w:rPr>
-          <w:noProof/>
-          <w:lang w:val="id-ID"/>
-        </w:rPr>
-        <w:t xml:space="preserve">, 106049.</w:t>
+        <w:t xml:space="preserve">Data Science and Management, 9</w:t>
+      </w:r>
+      <w:r>
+        <w:rPr>
+          <w:noProof/>
+          <w:lang w:val="id-ID"/>
+        </w:rPr>
+        <w:t xml:space="preserve">, 100177.</w:t>
       </w:r>
     </w:p>
     <w:p>
@@ -7216,7 +7253,7 @@
           <w:noProof/>
           <w:lang w:val="id-ID"/>
         </w:rPr>
-        <w:t xml:space="preserve">Faustini, P., McIver, A., Sullivan, R., &amp; Dras, M. (2026). De-identification of clinical data: A systematic review of free text, image and tabular data approaches. </w:t>
+        <w:t xml:space="preserve">Elvas, L. B., Almeida, A., &amp; Ferreira, J. C. (2025). Natural language processing in medical text processing: A scoping literature review. </w:t>
       </w:r>
       <w:r>
         <w:rPr>
@@ -7224,14 +7261,14 @@
           <w:noProof/>
           <w:lang w:val="id-ID"/>
         </w:rPr>
-        <w:t xml:space="preserve">International Journal of Medical Informatics, 208</w:t>
-      </w:r>
-      <w:r>
-        <w:rPr>
-          <w:noProof/>
-          <w:lang w:val="id-ID"/>
-        </w:rPr>
-        <w:t xml:space="preserve">, 106225.</w:t>
+        <w:t xml:space="preserve">International Journal of Medical Informatics, 204</w:t>
+      </w:r>
+      <w:r>
+        <w:rPr>
+          <w:noProof/>
+          <w:lang w:val="id-ID"/>
+        </w:rPr>
+        <w:t xml:space="preserve">, 106049.</w:t>
       </w:r>
     </w:p>
     <w:p>
@@ -7248,7 +7285,7 @@
           <w:noProof/>
           <w:lang w:val="id-ID"/>
         </w:rPr>
-        <w:t xml:space="preserve">Hou, W.-h., Wang, X.-k., Wang, Y.-n., Wang, J.-q., &amp; Xiao, F. (2024). Modelling long medical documents and code associations for explainable automatic ICD coding. </w:t>
+        <w:t xml:space="preserve">Faustini, P., McIver, A., Sullivan, R., &amp; Dras, M. (2026). De-identification of clinical data: A systematic review of free text, image and tabular data approaches. </w:t>
       </w:r>
       <w:r>
         <w:rPr>
@@ -7256,14 +7293,14 @@
           <w:noProof/>
           <w:lang w:val="id-ID"/>
         </w:rPr>
-        <w:t xml:space="preserve">Expert Systems with Applications, 249</w:t>
-      </w:r>
-      <w:r>
-        <w:rPr>
-          <w:noProof/>
-          <w:lang w:val="id-ID"/>
-        </w:rPr>
-        <w:t xml:space="preserve">, 123519.</w:t>
+        <w:t xml:space="preserve">International Journal of Medical Informatics, 208</w:t>
+      </w:r>
+      <w:r>
+        <w:rPr>
+          <w:noProof/>
+          <w:lang w:val="id-ID"/>
+        </w:rPr>
+        <w:t xml:space="preserve">, 106225.</w:t>
       </w:r>
     </w:p>
     <w:p>
@@ -7280,7 +7317,7 @@
           <w:noProof/>
           <w:lang w:val="id-ID"/>
         </w:rPr>
-        <w:t xml:space="preserve">Ijadi Maghsoodi, A., Kurz, J., Lawrenson, R., Parsons, M., Walker, C., O'Sullivan, M., &amp; Rouse, P. (2026). Artificial intelligence for decision-making in healthcare: A critical review of decision-maker-governed hybrid systems across clinical, operational, and policy settings. </w:t>
+        <w:t xml:space="preserve">Hou, W.-h., Wang, X.-k., Wang, Y.-n., Wang, J.-q., &amp; Xiao, F. (2024). Modelling long medical documents and code associations for explainable automatic ICD coding. </w:t>
       </w:r>
       <w:r>
         <w:rPr>
@@ -7288,14 +7325,14 @@
           <w:noProof/>
           <w:lang w:val="id-ID"/>
         </w:rPr>
-        <w:t xml:space="preserve">Health Policy and Technology, 15</w:t>
-      </w:r>
-      <w:r>
-        <w:rPr>
-          <w:noProof/>
-          <w:lang w:val="id-ID"/>
-        </w:rPr>
-        <w:t xml:space="preserve">, 101292.</w:t>
+        <w:t xml:space="preserve">Expert Systems with Applications, 249</w:t>
+      </w:r>
+      <w:r>
+        <w:rPr>
+          <w:noProof/>
+          <w:lang w:val="id-ID"/>
+        </w:rPr>
+        <w:t xml:space="preserve">, 123519.</w:t>
       </w:r>
     </w:p>
     <w:p>
@@ -7312,7 +7349,7 @@
           <w:noProof/>
           <w:lang w:val="id-ID"/>
         </w:rPr>
-        <w:t xml:space="preserve">Jafarpour, H., Wu, G., Cheligeer, C., Yan, J., Xu, Y., Southern, D. A., Eastwood, C. A., Zeng, Y., &amp; Quan, H. (2025). Preprocessing narrative texts in electronic medical records to identify hospital adverse events: A scoping review. </w:t>
+        <w:t xml:space="preserve">Ijadi Maghsoodi, A., Kurz, J., Lawrenson, R., Parsons, M., Walker, C., O'Sullivan, M., &amp; Rouse, P. (2026). Artificial intelligence for decision-making in healthcare: A critical review of decision-maker-governed hybrid systems across clinical, operational, and policy settings. </w:t>
       </w:r>
       <w:r>
         <w:rPr>
@@ -7320,14 +7357,14 @@
           <w:noProof/>
           <w:lang w:val="id-ID"/>
         </w:rPr>
-        <w:t xml:space="preserve">Artificial Intelligence in Medicine, 170</w:t>
-      </w:r>
-      <w:r>
-        <w:rPr>
-          <w:noProof/>
-          <w:lang w:val="id-ID"/>
-        </w:rPr>
-        <w:t xml:space="preserve">, 103281.</w:t>
+        <w:t xml:space="preserve">Health Policy and Technology, 15</w:t>
+      </w:r>
+      <w:r>
+        <w:rPr>
+          <w:noProof/>
+          <w:lang w:val="id-ID"/>
+        </w:rPr>
+        <w:t xml:space="preserve">, 101292.</w:t>
       </w:r>
     </w:p>
     <w:p>
@@ -7344,7 +7381,7 @@
           <w:noProof/>
           <w:lang w:val="id-ID"/>
         </w:rPr>
-        <w:t xml:space="preserve">Jaganathan, G. S., Kahanda, I., &amp; Kanewala, U. (2025). Metamorphic testing for robustness and fairness evaluation of LLM-based automated ICD coding applications. </w:t>
+        <w:t xml:space="preserve">Jafarpour, H., Wu, G., Cheligeer, C., Yan, J., Xu, Y., Southern, D. A., Eastwood, C. A., Zeng, Y., &amp; Quan, H. (2025). Preprocessing narrative texts in electronic medical records to identify hospital adverse events: A scoping review. </w:t>
       </w:r>
       <w:r>
         <w:rPr>
@@ -7352,14 +7389,14 @@
           <w:noProof/>
           <w:lang w:val="id-ID"/>
         </w:rPr>
-        <w:t xml:space="preserve">Smart Health, 36</w:t>
-      </w:r>
-      <w:r>
-        <w:rPr>
-          <w:noProof/>
-          <w:lang w:val="id-ID"/>
-        </w:rPr>
-        <w:t xml:space="preserve">, 100564.</w:t>
+        <w:t xml:space="preserve">Artificial Intelligence in Medicine, 170</w:t>
+      </w:r>
+      <w:r>
+        <w:rPr>
+          <w:noProof/>
+          <w:lang w:val="id-ID"/>
+        </w:rPr>
+        <w:t xml:space="preserve">, 103281.</w:t>
       </w:r>
     </w:p>
     <w:p>
@@ -7376,7 +7413,7 @@
           <w:noProof/>
           <w:lang w:val="id-ID"/>
         </w:rPr>
-        <w:t xml:space="preserve">Jia, S., Bit, S., Jasodanand, V. H., Liu, Y., &amp; Kolachalama, V. B. (2026). Agentic memory-augmented retrieval and evidence grounding for medical question-answering tasks. </w:t>
+        <w:t xml:space="preserve">Jaganathan, G. S., Kahanda, I., &amp; Kanewala, U. (2025). Metamorphic testing for robustness and fairness evaluation of LLM-based automated ICD coding applications. </w:t>
       </w:r>
       <w:r>
         <w:rPr>
@@ -7384,14 +7421,14 @@
           <w:noProof/>
           <w:lang w:val="id-ID"/>
         </w:rPr>
-        <w:t xml:space="preserve">International Journal of Medical Informatics, 212</w:t>
-      </w:r>
-      <w:r>
-        <w:rPr>
-          <w:noProof/>
-          <w:lang w:val="id-ID"/>
-        </w:rPr>
-        <w:t xml:space="preserve">, 106339.</w:t>
+        <w:t xml:space="preserve">Smart Health, 36</w:t>
+      </w:r>
+      <w:r>
+        <w:rPr>
+          <w:noProof/>
+          <w:lang w:val="id-ID"/>
+        </w:rPr>
+        <w:t xml:space="preserve">, 100564.</w:t>
       </w:r>
     </w:p>
     <w:p>
@@ -7408,7 +7445,7 @@
           <w:noProof/>
           <w:lang w:val="id-ID"/>
         </w:rPr>
-        <w:t xml:space="preserve">Kumar, D., Choudhary, N., Gupta, V., Tanwar, R., Behmani, K., Antal, S., Jarora, S., Gupta, S., Shaikh, M. S., Webster, T. J., &amp; Faiyazuddin, M. (2026). Natural language processing in healthcare: From unstructured data to clinical intelligence. </w:t>
+        <w:t xml:space="preserve">Jia, S., Bit, S., Jasodanand, V. H., Liu, Y., &amp; Kolachalama, V. B. (2026). Agentic memory-augmented retrieval and evidence grounding for medical question-answering tasks. </w:t>
       </w:r>
       <w:r>
         <w:rPr>
@@ -7416,14 +7453,14 @@
           <w:noProof/>
           <w:lang w:val="id-ID"/>
         </w:rPr>
-        <w:t xml:space="preserve">Intelligent Systems with Applications, 31</w:t>
-      </w:r>
-      <w:r>
-        <w:rPr>
-          <w:noProof/>
-          <w:lang w:val="id-ID"/>
-        </w:rPr>
-        <w:t xml:space="preserve">, 200698.</w:t>
+        <w:t xml:space="preserve">International Journal of Medical Informatics, 212</w:t>
+      </w:r>
+      <w:r>
+        <w:rPr>
+          <w:noProof/>
+          <w:lang w:val="id-ID"/>
+        </w:rPr>
+        <w:t xml:space="preserve">, 106339.</w:t>
       </w:r>
     </w:p>
     <w:p>
@@ -7440,7 +7477,7 @@
           <w:noProof/>
           <w:lang w:val="id-ID"/>
         </w:rPr>
-        <w:t xml:space="preserve">Landolsi, M. Y., Fadhli, I., Boufaied, A., &amp; Ben Romdhane, L. (2026). Recent trends of retrieval-augmented generation in healthcare: A systematic review. </w:t>
+        <w:t xml:space="preserve">Kumar, D., Choudhary, N., Gupta, V., Tanwar, R., Behmani, K., Antal, S., Jarora, S., Gupta, S., Shaikh, M. S., Webster, T. J., &amp; Faiyazuddin, M. (2026). Natural language processing in healthcare: From unstructured data to clinical intelligence. </w:t>
       </w:r>
       <w:r>
         <w:rPr>
@@ -7448,14 +7485,14 @@
           <w:noProof/>
           <w:lang w:val="id-ID"/>
         </w:rPr>
-        <w:t xml:space="preserve">Engineering Applications of Artificial Intelligence, 182</w:t>
-      </w:r>
-      <w:r>
-        <w:rPr>
-          <w:noProof/>
-          <w:lang w:val="id-ID"/>
-        </w:rPr>
-        <w:t xml:space="preserve">, 115912.</w:t>
+        <w:t xml:space="preserve">Intelligent Systems with Applications, 31</w:t>
+      </w:r>
+      <w:r>
+        <w:rPr>
+          <w:noProof/>
+          <w:lang w:val="id-ID"/>
+        </w:rPr>
+        <w:t xml:space="preserve">, 200698.</w:t>
       </w:r>
     </w:p>
     <w:p>
@@ -7472,7 +7509,7 @@
           <w:noProof/>
           <w:lang w:val="id-ID"/>
         </w:rPr>
-        <w:t xml:space="preserve">Li, Y., Lv, M., Cheng, L., Xie, Y., Gu, Q., He, H., Chen, Z., Fang, D., &amp; Zhou, X. (2026). Explainable and evidence-linked recommendations for spine surgery via a retrieval-augmented LLM agent. </w:t>
+        <w:t xml:space="preserve">Landolsi, M. Y., Fadhli, I., Boufaied, A., &amp; Ben Romdhane, L. (2026). Recent trends of retrieval-augmented generation in healthcare: A systematic review. </w:t>
       </w:r>
       <w:r>
         <w:rPr>
@@ -7480,14 +7517,14 @@
           <w:noProof/>
           <w:lang w:val="id-ID"/>
         </w:rPr>
-        <w:t xml:space="preserve">European Journal of Radiology, 197</w:t>
-      </w:r>
-      <w:r>
-        <w:rPr>
-          <w:noProof/>
-          <w:lang w:val="id-ID"/>
-        </w:rPr>
-        <w:t xml:space="preserve">, 112734.</w:t>
+        <w:t xml:space="preserve">Engineering Applications of Artificial Intelligence, 182</w:t>
+      </w:r>
+      <w:r>
+        <w:rPr>
+          <w:noProof/>
+          <w:lang w:val="id-ID"/>
+        </w:rPr>
+        <w:t xml:space="preserve">, 115912.</w:t>
       </w:r>
     </w:p>
     <w:p>
@@ -7504,7 +7541,7 @@
           <w:noProof/>
           <w:lang w:val="id-ID"/>
         </w:rPr>
-        <w:t xml:space="preserve">Luo, X., Deng, Z., Yang, B., &amp; Luo, M. Y. (2024). Pre-trained language models in medicine: A survey. </w:t>
+        <w:t xml:space="preserve">Li, Y., Lv, M., Cheng, L., Xie, Y., Gu, Q., He, H., Chen, Z., Fang, D., &amp; Zhou, X. (2026). Explainable and evidence-linked recommendations for spine surgery via a retrieval-augmented LLM agent. </w:t>
       </w:r>
       <w:r>
         <w:rPr>
@@ -7512,14 +7549,14 @@
           <w:noProof/>
           <w:lang w:val="id-ID"/>
         </w:rPr>
-        <w:t xml:space="preserve">Artificial Intelligence in Medicine, 154</w:t>
-      </w:r>
-      <w:r>
-        <w:rPr>
-          <w:noProof/>
-          <w:lang w:val="id-ID"/>
-        </w:rPr>
-        <w:t xml:space="preserve">, 102904.</w:t>
+        <w:t xml:space="preserve">European Journal of Radiology, 197</w:t>
+      </w:r>
+      <w:r>
+        <w:rPr>
+          <w:noProof/>
+          <w:lang w:val="id-ID"/>
+        </w:rPr>
+        <w:t xml:space="preserve">, 112734.</w:t>
       </w:r>
     </w:p>
     <w:p>
@@ -7536,7 +7573,7 @@
           <w:noProof/>
           <w:lang w:val="id-ID"/>
         </w:rPr>
-        <w:t xml:space="preserve">Mwogosi, A., &amp; Mambile, C. (2026). Concordance of electronic health record data with ICD classification and evidence-based treatment guidelines: A systematic review and meta-analysis. </w:t>
+        <w:t xml:space="preserve">Luo, X., Deng, Z., Yang, B., &amp; Luo, M. Y. (2024). Pre-trained language models in medicine: A survey. </w:t>
       </w:r>
       <w:r>
         <w:rPr>
@@ -7544,14 +7581,14 @@
           <w:noProof/>
           <w:lang w:val="id-ID"/>
         </w:rPr>
-        <w:t xml:space="preserve">Health Policy and Technology, 15</w:t>
-      </w:r>
-      <w:r>
-        <w:rPr>
-          <w:noProof/>
-          <w:lang w:val="id-ID"/>
-        </w:rPr>
-        <w:t xml:space="preserve">, 101213.</w:t>
+        <w:t xml:space="preserve">Artificial Intelligence in Medicine, 154</w:t>
+      </w:r>
+      <w:r>
+        <w:rPr>
+          <w:noProof/>
+          <w:lang w:val="id-ID"/>
+        </w:rPr>
+        <w:t xml:space="preserve">, 102904.</w:t>
       </w:r>
     </w:p>
     <w:p>
@@ -7568,7 +7605,7 @@
           <w:noProof/>
           <w:lang w:val="id-ID"/>
         </w:rPr>
-        <w:t xml:space="preserve">Nilasari, E. V., &amp; Soelistijanto, B. (2026). A preliminary study on mitigating upcoding in Indonesia's national health insurance using multi-agent multi-armed bandits. </w:t>
+        <w:t xml:space="preserve">Mehri, T., Nadalini, T., Hoekman, A. H., van der Laan, T. P., Kagialari, K., Wagner, R. K., Doornberg, J. N., Schoonbeek, R. C., &amp; Bootsma-Robroeks, C. M. H. H. T. (2026). Assessing the quality of AI-generated and physician-written discharge summaries: Evaluation of an EHR-integrated tool in a Dutch academic hospital. </w:t>
       </w:r>
       <w:r>
         <w:rPr>
@@ -7576,14 +7613,14 @@
           <w:noProof/>
           <w:lang w:val="id-ID"/>
         </w:rPr>
-        <w:t xml:space="preserve">Procedia Computer Science, 289</w:t>
-      </w:r>
-      <w:r>
-        <w:rPr>
-          <w:noProof/>
-          <w:lang w:val="id-ID"/>
-        </w:rPr>
-        <w:t xml:space="preserve">, 851–858.</w:t>
+        <w:t xml:space="preserve">eBioMedicine, 127</w:t>
+      </w:r>
+      <w:r>
+        <w:rPr>
+          <w:noProof/>
+          <w:lang w:val="id-ID"/>
+        </w:rPr>
+        <w:t xml:space="preserve">, 106247.</w:t>
       </w:r>
     </w:p>
     <w:p>
@@ -7600,7 +7637,7 @@
           <w:noProof/>
           <w:lang w:val="id-ID"/>
         </w:rPr>
-        <w:t xml:space="preserve">Olex, A. L., &amp; McInnes, B. T. (2021). Review of temporal reasoning in the clinical domain for timeline extraction: Where we are and where we need to be. </w:t>
+        <w:t xml:space="preserve">Mwogosi, A., &amp; Mambile, C. (2026). Concordance of electronic health record data with ICD classification and evidence-based treatment guidelines: A systematic review and meta-analysis. </w:t>
       </w:r>
       <w:r>
         <w:rPr>
@@ -7608,14 +7645,14 @@
           <w:noProof/>
           <w:lang w:val="id-ID"/>
         </w:rPr>
-        <w:t xml:space="preserve">Journal of Biomedical Informatics, 118</w:t>
-      </w:r>
-      <w:r>
-        <w:rPr>
-          <w:noProof/>
-          <w:lang w:val="id-ID"/>
-        </w:rPr>
-        <w:t xml:space="preserve">, 103784.</w:t>
+        <w:t xml:space="preserve">Health Policy and Technology, 15</w:t>
+      </w:r>
+      <w:r>
+        <w:rPr>
+          <w:noProof/>
+          <w:lang w:val="id-ID"/>
+        </w:rPr>
+        <w:t xml:space="preserve">, 101213.</w:t>
       </w:r>
     </w:p>
     <w:p>
@@ -7632,6 +7669,70 @@
           <w:noProof/>
           <w:lang w:val="id-ID"/>
         </w:rPr>
+        <w:t xml:space="preserve">Nilasari, E. V., &amp; Soelistijanto, B. (2026). A preliminary study on mitigating upcoding in Indonesia's national health insurance using multi-agent multi-armed bandits. </w:t>
+      </w:r>
+      <w:r>
+        <w:rPr>
+          <w:i/>
+          <w:noProof/>
+          <w:lang w:val="id-ID"/>
+        </w:rPr>
+        <w:t xml:space="preserve">Procedia Computer Science, 289</w:t>
+      </w:r>
+      <w:r>
+        <w:rPr>
+          <w:noProof/>
+          <w:lang w:val="id-ID"/>
+        </w:rPr>
+        <w:t xml:space="preserve">, 851–858.</w:t>
+      </w:r>
+    </w:p>
+    <w:p>
+      <w:pPr>
+        <w:spacing w:line="240" w:lineRule="auto"/>
+        <w:ind w:left="720" w:hanging="720"/>
+        <w:rPr>
+          <w:noProof/>
+          <w:lang w:val="id-ID" w:eastAsia="en-US"/>
+        </w:rPr>
+      </w:pPr>
+      <w:r>
+        <w:rPr>
+          <w:noProof/>
+          <w:lang w:val="id-ID"/>
+        </w:rPr>
+        <w:t xml:space="preserve">Olex, A. L., &amp; McInnes, B. T. (2021). Review of temporal reasoning in the clinical domain for timeline extraction: Where we are and where we need to be. </w:t>
+      </w:r>
+      <w:r>
+        <w:rPr>
+          <w:i/>
+          <w:noProof/>
+          <w:lang w:val="id-ID"/>
+        </w:rPr>
+        <w:t xml:space="preserve">Journal of Biomedical Informatics, 118</w:t>
+      </w:r>
+      <w:r>
+        <w:rPr>
+          <w:noProof/>
+          <w:lang w:val="id-ID"/>
+        </w:rPr>
+        <w:t xml:space="preserve">, 103784.</w:t>
+      </w:r>
+    </w:p>
+    <w:p>
+      <w:pPr>
+        <w:spacing w:line="240" w:lineRule="auto"/>
+        <w:ind w:left="720" w:hanging="720"/>
+        <w:rPr>
+          <w:noProof/>
+          <w:lang w:val="id-ID" w:eastAsia="en-US"/>
+        </w:rPr>
+      </w:pPr>
+      <w:r>
+        <w:rPr>
+          <w:noProof/>
+          <w:lang w:val="id-ID"/>
+        </w:rPr>
         <w:t xml:space="preserve">Rachmawaty, R., Sinrang, A. W., Wahyudin, E., &amp; Bukhari, A. (2021). Evaluation of health care quality among insured patients in Indonesian mother &amp; child hospital: A secondary data analysis. </w:t>
       </w:r>
       <w:r>
@@ -7648,6 +7749,38 @@
           <w:lang w:val="id-ID"/>
         </w:rPr>
         <w:t xml:space="preserve">(S2), S613–S618.</w:t>
+      </w:r>
+    </w:p>
+    <w:p>
+      <w:pPr>
+        <w:spacing w:line="240" w:lineRule="auto"/>
+        <w:ind w:left="720" w:hanging="720"/>
+        <w:rPr>
+          <w:noProof/>
+          <w:lang w:val="id-ID" w:eastAsia="en-US"/>
+        </w:rPr>
+      </w:pPr>
+      <w:r>
+        <w:rPr>
+          <w:noProof/>
+          <w:lang w:val="id-ID"/>
+        </w:rPr>
+        <w:t xml:space="preserve">Schwieger, A., Angst, K., de Bardeci, M., Burrer, A., Cathomas, F., Ferrea, S., Grätz, F., Knorr, M., Kronenberg, G., Spiller, T., Troi, D., Seifritz, E., Weber, S., &amp; Olbrich, S. (2024). Large language models can support generation of standardized discharge summaries: A retrospective study utilizing ChatGPT-4 and electronic health records. </w:t>
+      </w:r>
+      <w:r>
+        <w:rPr>
+          <w:i/>
+          <w:noProof/>
+          <w:lang w:val="id-ID"/>
+        </w:rPr>
+        <w:t xml:space="preserve">International Journal of Medical Informatics, 192</w:t>
+      </w:r>
+      <w:r>
+        <w:rPr>
+          <w:noProof/>
+          <w:lang w:val="id-ID"/>
+        </w:rPr>
+        <w:t xml:space="preserve">, 105654.</w:t>
       </w:r>
     </w:p>
     <w:p>

</xml_diff>